<commit_message>
Ponder Indexer and Seasons display implemented.
</commit_message>
<xml_diff>
--- a/content/Whitepaper.docx
+++ b/content/Whitepaper.docx
@@ -3693,17 +3693,17 @@
       </w:r>
       <w:r>
         <w:br/>
-        <w:t>The simulation’s status is quantified in real-time via an on-chain calculation of the </w:t>
-      </w:r>
-      <w:r>
-        <w:rPr>
-          <w:b/>
-          <w:bCs/>
-        </w:rPr>
-        <w:t>Gini Coefficient</w:t>
-      </w:r>
-      <w:r>
-        <w:t>. This metric serves as the impartial arbiter of the economy’s health, ranging from a coefficient of 0 (Absolute Egalitarianism, representing the decentralized ideal) to 1 (Absolute Consolidation, representing the prevailing market reality).</w:t>
+      </w:r>
+      <w:r>
+        <w:t xml:space="preserve">The simulation’s status is quantified by the Gini Coefficient. To maintain Credible Neutrality and gas efficiency, the Gini Coefficient is not calculated on every trade. Instead, its final verification is performed by an incentivized off-chain solver and </w:t>
+      </w:r>
+      <w:proofErr w:type="spellStart"/>
+      <w:r>
+        <w:t>trustless</w:t>
+      </w:r>
+      <w:proofErr w:type="spellEnd"/>
+      <w:r>
+        <w:t xml:space="preserve"> on-chain verification before the final state is declared.</w:t>
       </w:r>
     </w:p>
     <w:p>
@@ -3810,7 +3810,7 @@
         <w:spacing w:after="120"/>
       </w:pPr>
       <w:r>
-        <w:t>To prevent manipulation by single actors operating multiple wallets ("Sybil attacks"), the protocol enforces a cost to participation. Eligibility to trade requires the staking of the protocol’s governance asset ($RTD). This creates a capital-backed identity for every participant, ensuring that all actors have verifiable "skin in the game" and making large-scale manipulation prohibitively expensive.</w:t>
+        <w:t>Sybil Resistance via Collateralized Identity (High-Water Mark): To prevent manipulation, eligibility to trade requires the staking of the protocol’s governance asset (RTD). This commitment operates on a High-Water Mark (MAX) basis, allowing a single stake to collateralize multiple active seasons, maximizing capital efficiency while maintaining strict Sybil Resistance.</w:t>
       </w:r>
     </w:p>
     <w:p>
@@ -3881,6 +3881,34 @@
     </w:p>
     <w:p>
       <w:pPr>
+        <w:spacing w:after="120"/>
+      </w:pPr>
+      <w:r>
+        <w:t>The final distribution logic is designed to reward progress. In a partial victory or stalemate, the payout is a blend: a </w:t>
+      </w:r>
+      <w:r>
+        <w:rPr>
+          <w:b/>
+          <w:bCs/>
+        </w:rPr>
+        <w:t>Progress Share</w:t>
+      </w:r>
+      <w:r>
+        <w:t> is distributed according to the leading ideology's rules (Oligarchy or Solidarity Fund logic), and a </w:t>
+      </w:r>
+      <w:r>
+        <w:rPr>
+          <w:b/>
+          <w:bCs/>
+        </w:rPr>
+        <w:t>Residual Share</w:t>
+      </w:r>
+      <w:r>
+        <w:t> is returned to all players proportionally, ensuring every marginal strategic action is financially meaningful.</w:t>
+      </w:r>
+    </w:p>
+    <w:p>
+      <w:pPr>
         <w:pStyle w:val="Heading2"/>
         <w:spacing w:after="120"/>
       </w:pPr>
@@ -3986,7 +4014,11 @@
         <w:spacing w:after="120"/>
       </w:pPr>
       <w:r>
-        <w:t>Upon entry, the typical participant—conditioned by the individualistic accumulation narratives of the broader market—will invariably default to a competitive strategy. The "Oligarchy" payout functions as the bait, mirroring the aspirational promise of crypto wealth. However, the game’s "Gini-aware" microstructure creates a barrier to entry for this strategy: affecting the Gini Coefficient toward concentration requires disproportionate capital dominance. The average participant quickly discovers that in a non-cooperative game state (Capitalism), their individual agency is negligible against larger, capitalized actors. Furthermore, the payout logic reinforces that a Capitalist victory creates no "winning faction," but only a winning </w:t>
+        <w:t xml:space="preserve">Upon entry, the typical participant—conditioned by the individualistic accumulation narratives of the broader market—will invariably default to a competitive strategy. The "Oligarchy" payout functions as the bait, mirroring the aspirational promise of crypto wealth. However, the game’s "Gini-aware" microstructure creates a barrier to entry for this strategy: affecting the Gini Coefficient toward </w:t>
+      </w:r>
+      <w:r>
+        <w:lastRenderedPageBreak/>
+        <w:t>concentration requires disproportionate capital dominance. The average participant quickly discovers that in a non-cooperative game state (Capitalism), their individual agency is negligible against larger, capitalized actors. Furthermore, the payout logic reinforces that a Capitalist victory creates no "winning faction," but only a winning </w:t>
       </w:r>
       <w:r>
         <w:rPr>
@@ -4004,7 +4036,6 @@
         <w:spacing w:after="120"/>
       </w:pPr>
       <w:r>
-        <w:lastRenderedPageBreak/>
         <w:t>This realization forces a </w:t>
       </w:r>
       <w:r>
@@ -4137,7 +4168,11 @@
         <w:spacing w:after="120"/>
       </w:pPr>
       <w:r>
-        <w:t>Our objective is to substantiate the alternative paradigm of Algorithmic Coordination. This framework, enabled by programmable smart contracts, posits that the primary utility of the technology is disintermediation. In traditional markets, a central intermediary captures the surplus value generated by network activity. In a DAO-governed system, this rent-seeking layer is removed. The protocol is programmed to automate the clearing of value, ensuring that the surplus generated by the ecosystem is distributed directly to the participants who created it.</w:t>
+        <w:t xml:space="preserve">Our objective is to substantiate the alternative paradigm of Algorithmic Coordination. This framework, enabled by programmable smart contracts, posits that the primary utility of the technology is disintermediation. In traditional markets, a central intermediary captures the surplus value generated by network activity. In a DAO-governed system, this rent-seeking layer is removed. </w:t>
+      </w:r>
+      <w:r>
+        <w:lastRenderedPageBreak/>
+        <w:t>The protocol is programmed to automate the clearing of value, ensuring that the surplus generated by the ecosystem is distributed directly to the participants who created it.</w:t>
       </w:r>
     </w:p>
     <w:p>
@@ -4154,11 +4189,7 @@
       </w:r>
       <w:proofErr w:type="spellEnd"/>
       <w:r>
-        <w:t xml:space="preserve"> Games represents the practical application of this shift. It is a proof-of-concept designed to demonstrate that the highest utility of distributed ledger technology lies not in speculative </w:t>
-      </w:r>
-      <w:r>
-        <w:lastRenderedPageBreak/>
-        <w:t>accumulation, but in the capacity to engineer more equitable, self-governing systems of human organization.</w:t>
+        <w:t xml:space="preserve"> Games represents the practical application of this shift. It is a proof-of-concept designed to demonstrate that the highest utility of distributed ledger technology lies not in speculative accumulation, but in the capacity to engineer more equitable, self-governing systems of human organization.</w:t>
       </w:r>
     </w:p>
     <w:p>
@@ -6846,56 +6877,34 @@
         <w:rPr>
           <w:b/>
           <w:bCs/>
-          <w:lang w:val="en-DE"/>
         </w:rPr>
       </w:pPr>
       <w:r>
         <w:rPr>
           <w:b/>
           <w:bCs/>
-          <w:lang w:val="en-DE"/>
         </w:rPr>
         <w:t>Scenario C: Settlement by Proportional Progress (The Blended Outcome)</w:t>
       </w:r>
     </w:p>
     <w:p>
-      <w:pPr>
-        <w:rPr>
-          <w:lang w:val="en-DE"/>
-        </w:rPr>
-      </w:pPr>
-      <w:r>
-        <w:rPr>
-          <w:lang w:val="en-DE"/>
-        </w:rPr>
+      <w:r>
         <w:t xml:space="preserve">If the quarterly timer expires before either faction achieves the full </w:t>
       </w:r>
       <w:proofErr w:type="spellStart"/>
       <w:r>
-        <w:rPr>
-          <w:lang w:val="en-DE"/>
-        </w:rPr>
         <w:t>V_thresh</w:t>
       </w:r>
       <w:proofErr w:type="spellEnd"/>
       <w:r>
-        <w:rPr>
-          <w:lang w:val="en-DE"/>
-        </w:rPr>
         <w:t xml:space="preserve"> (25% progress), the contract executes a Proportional Blended Payout. This system rewards the progress made by the faction that moved the Gini Coefficient furthest in its </w:t>
       </w:r>
       <w:proofErr w:type="spellStart"/>
       <w:r>
-        <w:rPr>
-          <w:lang w:val="en-DE"/>
-        </w:rPr>
         <w:t>favor</w:t>
       </w:r>
       <w:proofErr w:type="spellEnd"/>
       <w:r>
-        <w:rPr>
-          <w:lang w:val="en-DE"/>
-        </w:rPr>
         <w:t>.</w:t>
       </w:r>
     </w:p>
@@ -6905,42 +6914,24 @@
           <w:ilvl w:val="0"/>
           <w:numId w:val="183"/>
         </w:numPr>
-        <w:rPr>
-          <w:lang w:val="en-DE"/>
-        </w:rPr>
-      </w:pPr>
-      <w:r>
-        <w:rPr>
-          <w:lang w:val="en-DE"/>
-        </w:rPr>
+      </w:pPr>
+      <w:r>
         <w:t>Progress Calculation: The contract first calculates the Final Progress Percentage (</w:t>
       </w:r>
       <w:proofErr w:type="spellStart"/>
       <w:r>
-        <w:rPr>
-          <w:lang w:val="en-DE"/>
-        </w:rPr>
         <w:t>P_final</w:t>
       </w:r>
       <w:proofErr w:type="spellEnd"/>
       <w:r>
-        <w:rPr>
-          <w:lang w:val="en-DE"/>
-        </w:rPr>
         <w:t xml:space="preserve">) toward the </w:t>
       </w:r>
       <w:proofErr w:type="spellStart"/>
       <w:r>
-        <w:rPr>
-          <w:lang w:val="en-DE"/>
-        </w:rPr>
         <w:t>favored</w:t>
       </w:r>
       <w:proofErr w:type="spellEnd"/>
       <w:r>
-        <w:rPr>
-          <w:lang w:val="en-DE"/>
-        </w:rPr>
         <w:t xml:space="preserve"> pole.</w:t>
       </w:r>
     </w:p>
@@ -6950,42 +6941,24 @@
           <w:ilvl w:val="1"/>
           <w:numId w:val="183"/>
         </w:numPr>
-        <w:rPr>
-          <w:lang w:val="en-DE"/>
-        </w:rPr>
-      </w:pPr>
-      <w:r>
-        <w:rPr>
-          <w:lang w:val="en-DE"/>
-        </w:rPr>
+      </w:pPr>
+      <w:r>
         <w:t xml:space="preserve">Let </w:t>
       </w:r>
       <w:proofErr w:type="spellStart"/>
       <w:r>
-        <w:rPr>
-          <w:lang w:val="en-DE"/>
-        </w:rPr>
         <w:t>P_Cap</w:t>
       </w:r>
       <w:proofErr w:type="spellEnd"/>
       <w:r>
-        <w:rPr>
-          <w:lang w:val="en-DE"/>
-        </w:rPr>
         <w:t xml:space="preserve"> be the Capitalist progress and </w:t>
       </w:r>
       <w:proofErr w:type="spellStart"/>
       <w:r>
-        <w:rPr>
-          <w:lang w:val="en-DE"/>
-        </w:rPr>
         <w:t>P_Soc</w:t>
       </w:r>
       <w:proofErr w:type="spellEnd"/>
       <w:r>
-        <w:rPr>
-          <w:lang w:val="en-DE"/>
-        </w:rPr>
         <w:t xml:space="preserve"> be the Socialist progress.</w:t>
       </w:r>
     </w:p>
@@ -6995,14 +6968,8 @@
           <w:ilvl w:val="1"/>
           <w:numId w:val="183"/>
         </w:numPr>
-        <w:rPr>
-          <w:lang w:val="en-DE"/>
-        </w:rPr>
-      </w:pPr>
-      <w:r>
-        <w:rPr>
-          <w:lang w:val="en-DE"/>
-        </w:rPr>
+      </w:pPr>
+      <w:r>
         <w:t>The overall progress is determined by the greater of the two.</w:t>
       </w:r>
     </w:p>
@@ -7012,14 +6979,8 @@
           <w:ilvl w:val="0"/>
           <w:numId w:val="183"/>
         </w:numPr>
-        <w:rPr>
-          <w:lang w:val="en-DE"/>
-        </w:rPr>
-      </w:pPr>
-      <w:r>
-        <w:rPr>
-          <w:lang w:val="en-DE"/>
-        </w:rPr>
+      </w:pPr>
+      <w:r>
         <w:t>Blended Payout Mechanism: The final distribution logic is blended proportionally:</w:t>
       </w:r>
     </w:p>
@@ -7029,83 +6990,45 @@
           <w:ilvl w:val="1"/>
           <w:numId w:val="183"/>
         </w:numPr>
-        <w:rPr>
-          <w:lang w:val="en-DE"/>
-        </w:rPr>
-      </w:pPr>
-      <w:r>
-        <w:rPr>
-          <w:lang w:val="en-DE"/>
-        </w:rPr>
+      </w:pPr>
+      <w:r>
         <w:t>The Prize Pool is split into two parts: a Progress Share (</w:t>
       </w:r>
       <w:proofErr w:type="spellStart"/>
       <w:r>
-        <w:rPr>
-          <w:lang w:val="en-DE"/>
-        </w:rPr>
         <w:t>P_final</w:t>
       </w:r>
       <w:proofErr w:type="spellEnd"/>
       <w:r>
-        <w:rPr>
-          <w:lang w:val="en-DE"/>
-        </w:rPr>
         <w:t xml:space="preserve">) and a Residual Share (1 - </w:t>
       </w:r>
       <w:proofErr w:type="spellStart"/>
       <w:r>
-        <w:rPr>
-          <w:lang w:val="en-DE"/>
-        </w:rPr>
         <w:t>P_final</w:t>
       </w:r>
       <w:proofErr w:type="spellEnd"/>
-      <w:r>
-        <w:rPr>
-          <w:lang w:val="en-DE"/>
-        </w:rPr>
-        <w:t>).</w:t>
-      </w:r>
-    </w:p>
-    <w:p>
-      <w:pPr>
-        <w:rPr>
-          <w:lang w:val="en-DE"/>
-        </w:rPr>
-      </w:pPr>
-      <w:r>
-        <w:rPr>
-          <w:lang w:val="en-DE"/>
-        </w:rPr>
-        <w:t>Payout = (</w:t>
+      <w:proofErr w:type="gramStart"/>
+      <w:r>
+        <w:t>).Payout</w:t>
+      </w:r>
+      <w:proofErr w:type="gramEnd"/>
+      <w:r>
+        <w:t xml:space="preserve"> = (</w:t>
       </w:r>
       <w:proofErr w:type="spellStart"/>
       <w:r>
-        <w:rPr>
-          <w:lang w:val="en-DE"/>
-        </w:rPr>
         <w:t>P_final</w:t>
       </w:r>
       <w:proofErr w:type="spellEnd"/>
       <w:r>
-        <w:rPr>
-          <w:lang w:val="en-DE"/>
-        </w:rPr>
         <w:t xml:space="preserve"> * Winning Payout Logic) + ((1 - </w:t>
       </w:r>
       <w:proofErr w:type="spellStart"/>
       <w:r>
-        <w:rPr>
-          <w:lang w:val="en-DE"/>
-        </w:rPr>
         <w:t>P_final</w:t>
       </w:r>
       <w:proofErr w:type="spellEnd"/>
       <w:r>
-        <w:rPr>
-          <w:lang w:val="en-DE"/>
-        </w:rPr>
         <w:t>) * Draw Payout Logic)</w:t>
       </w:r>
     </w:p>
@@ -7115,14 +7038,8 @@
           <w:ilvl w:val="0"/>
           <w:numId w:val="184"/>
         </w:numPr>
-        <w:rPr>
-          <w:lang w:val="en-DE"/>
-        </w:rPr>
-      </w:pPr>
-      <w:r>
-        <w:rPr>
-          <w:lang w:val="en-DE"/>
-        </w:rPr>
+      </w:pPr>
+      <w:r>
         <w:t>Winning Payout Logic (The Progress Share): This portion of the Prize Pool is paid out entirely according to the rules of the </w:t>
       </w:r>
       <w:proofErr w:type="spellStart"/>
@@ -7130,15 +7047,11 @@
         <w:rPr>
           <w:i/>
           <w:iCs/>
-          <w:lang w:val="en-DE"/>
         </w:rPr>
         <w:t>favored</w:t>
       </w:r>
       <w:proofErr w:type="spellEnd"/>
       <w:r>
-        <w:rPr>
-          <w:lang w:val="en-DE"/>
-        </w:rPr>
         <w:t> ideology (either the Oligarchy or the Solidarity Fund).</w:t>
       </w:r>
     </w:p>
@@ -7148,34 +7061,21 @@
           <w:ilvl w:val="0"/>
           <w:numId w:val="184"/>
         </w:numPr>
-        <w:rPr>
-          <w:lang w:val="en-DE"/>
-        </w:rPr>
-      </w:pPr>
-      <w:r>
-        <w:rPr>
-          <w:lang w:val="en-DE"/>
-        </w:rPr>
+      </w:pPr>
+      <w:r>
         <w:t>Draw Payout Logic (The Residual Share): This remaining portion is paid out according to the original Draw condition: returned to all players proportionally based on their final </w:t>
       </w:r>
       <w:r>
         <w:rPr>
           <w:i/>
           <w:iCs/>
-          <w:lang w:val="en-DE"/>
         </w:rPr>
         <w:t>FIM</w:t>
       </w:r>
       <w:r>
-        <w:rPr>
-          <w:lang w:val="en-DE"/>
-        </w:rPr>
         <w:t xml:space="preserve"> </w:t>
       </w:r>
       <w:r>
-        <w:rPr>
-          <w:lang w:val="en-DE"/>
-        </w:rPr>
         <w:t>holdings.</w:t>
       </w:r>
     </w:p>
@@ -7184,13 +7084,9 @@
         <w:rPr>
           <w:b/>
           <w:bCs/>
-          <w:lang w:val="en-DE"/>
-        </w:rPr>
-      </w:pPr>
-      <w:r>
-        <w:rPr>
-          <w:lang w:val="en-DE"/>
-        </w:rPr>
+        </w:rPr>
+      </w:pPr>
+      <w:r>
         <w:t>This ensures that even in a stalemate, every marginal unit of progress is financially meaningful, and the resulting distribution is an objective reflection of the strategic pressure applied by the players.</w:t>
       </w:r>
       <w:r>
@@ -7415,6 +7311,13 @@
         </w:rPr>
         <w:t> $RTD serves a critical security function as the collateral anchor for the game. The contract provides view functions used by seasonal contracts to verify that a participant holds the required 10% collateral ratio relative to their seasonal game exposure.</w:t>
       </w:r>
+      <w:r>
+        <w:rPr>
+          <w:rFonts w:cstheme="minorHAnsi"/>
+          <w:color w:val="000000" w:themeColor="text1"/>
+        </w:rPr>
+        <w:t xml:space="preserve"> </w:t>
+      </w:r>
     </w:p>
     <w:p>
       <w:pPr>
@@ -7484,6 +7387,7 @@
         <w:rPr>
           <w:rFonts w:cstheme="minorHAnsi"/>
           <w:color w:val="000000" w:themeColor="text1"/>
+          <w:lang w:val="en-DE"/>
         </w:rPr>
       </w:pPr>
       <w:r>
@@ -7501,6 +7405,57 @@
           <w:color w:val="000000" w:themeColor="text1"/>
         </w:rPr>
         <w:t> This contract is the cornerstone of protocol security. It manages the staking of $RTD to enforce the "Skin in the Game" rule and track voting power.</w:t>
+      </w:r>
+      <w:r>
+        <w:rPr>
+          <w:rFonts w:cstheme="minorHAnsi"/>
+          <w:color w:val="000000" w:themeColor="text1"/>
+        </w:rPr>
+        <w:t xml:space="preserve"> It </w:t>
+      </w:r>
+      <w:r>
+        <w:rPr>
+          <w:rFonts w:cstheme="minorHAnsi"/>
+          <w:color w:val="000000" w:themeColor="text1"/>
+          <w:lang w:val="en-DE"/>
+        </w:rPr>
+        <w:t>enforces the </w:t>
+      </w:r>
+      <w:r>
+        <w:rPr>
+          <w:rFonts w:cstheme="minorHAnsi"/>
+          <w:b/>
+          <w:bCs/>
+          <w:color w:val="000000" w:themeColor="text1"/>
+          <w:lang w:val="en-DE"/>
+        </w:rPr>
+        <w:t>High-Water Mark (MAX)</w:t>
+      </w:r>
+      <w:r>
+        <w:rPr>
+          <w:rFonts w:cstheme="minorHAnsi"/>
+          <w:color w:val="000000" w:themeColor="text1"/>
+          <w:lang w:val="en-DE"/>
+        </w:rPr>
+        <w:t> rule. It uses a price oracle (Uniswap V3) to calculate the RTD</w:t>
+      </w:r>
+      <w:r>
+        <w:rPr>
+          <w:rFonts w:cstheme="minorHAnsi"/>
+          <w:i/>
+          <w:iCs/>
+          <w:color w:val="000000" w:themeColor="text1"/>
+          <w:lang w:val="en-DE"/>
+        </w:rPr>
+        <w:t xml:space="preserve"> </w:t>
+      </w:r>
+      <w:r>
+        <w:rPr>
+          <w:rFonts w:cstheme="minorHAnsi"/>
+          <w:color w:val="000000" w:themeColor="text1"/>
+          <w:lang w:val="en-DE"/>
+        </w:rPr>
+        <w:t>collateral requirement. A single RTD stake can collateralize multiple active seasons up to the highest required amount.</w:t>
       </w:r>
     </w:p>
     <w:p>
@@ -7886,30 +7841,15 @@
           <w:bCs/>
           <w:color w:val="000000" w:themeColor="text1"/>
         </w:rPr>
-        <w:t>Strategic Policy:</w:t>
+        <w:lastRenderedPageBreak/>
+        <w:t>Credible Policy:</w:t>
       </w:r>
       <w:r>
         <w:rPr>
           <w:rFonts w:cstheme="minorHAnsi"/>
           <w:color w:val="000000" w:themeColor="text1"/>
         </w:rPr>
-        <w:t> The contract stores and executes the </w:t>
-      </w:r>
-      <w:proofErr w:type="spellStart"/>
-      <w:r>
-        <w:rPr>
-          <w:rFonts w:cstheme="minorHAnsi"/>
-          <w:color w:val="000000" w:themeColor="text1"/>
-        </w:rPr>
-        <w:t>RevenueAllocationPolicy</w:t>
-      </w:r>
-      <w:proofErr w:type="spellEnd"/>
-      <w:r>
-        <w:rPr>
-          <w:rFonts w:cstheme="minorHAnsi"/>
-          <w:color w:val="000000" w:themeColor="text1"/>
-        </w:rPr>
-        <w:t>. This policy, set by the Execution Council, defines how protocol revenue is split between Deflationary Buybacks, Liquidity Provision, and Reinvestment.</w:t>
+        <w:t xml:space="preserve"> The Treasury manages yield generation via external DeFi protocols. Multi-Ledger Accounting tracks individual season principals separately.</w:t>
       </w:r>
     </w:p>
     <w:p>
@@ -7931,31 +7871,14 @@
           <w:bCs/>
           <w:color w:val="000000" w:themeColor="text1"/>
         </w:rPr>
-        <w:lastRenderedPageBreak/>
-        <w:t>Execution-Only Logic:</w:t>
+        <w:t>Policy Snapshotting:</w:t>
       </w:r>
       <w:r>
         <w:rPr>
           <w:rFonts w:cstheme="minorHAnsi"/>
           <w:color w:val="000000" w:themeColor="text1"/>
         </w:rPr>
-        <w:t> The Treasury acts as a deterministic execution engine. It autonomously processes payout instructions received from the authenticated </w:t>
-      </w:r>
-      <w:proofErr w:type="spellStart"/>
-      <w:r>
-        <w:rPr>
-          <w:rFonts w:cstheme="minorHAnsi"/>
-          <w:color w:val="000000" w:themeColor="text1"/>
-        </w:rPr>
-        <w:t>GameSeason</w:t>
-      </w:r>
-      <w:proofErr w:type="spellEnd"/>
-      <w:r>
-        <w:rPr>
-          <w:rFonts w:cstheme="minorHAnsi"/>
-          <w:color w:val="000000" w:themeColor="text1"/>
-        </w:rPr>
-        <w:t> contract and applies the revenue policy without manual intervention.</w:t>
+        <w:t xml:space="preserve"> Economic rules (e.g., Buyback %, Reinvest %) are snapshotted at the start of each season, ensuring the payout policy cannot be retroactively changed by the DAO during the game.</w:t>
       </w:r>
     </w:p>
     <w:p>
@@ -8568,67 +8491,78 @@
           <w:color w:val="000000" w:themeColor="text1"/>
         </w:rPr>
       </w:pPr>
-      <w:r>
-        <w:rPr>
-          <w:rFonts w:cstheme="minorHAnsi"/>
-          <w:b/>
-          <w:bCs/>
-          <w:color w:val="000000" w:themeColor="text1"/>
-        </w:rPr>
-        <w:t>The Multiplier Logic:</w:t>
-      </w:r>
+      <w:proofErr w:type="spellStart"/>
       <w:r>
         <w:rPr>
           <w:rFonts w:cstheme="minorHAnsi"/>
           <w:color w:val="000000" w:themeColor="text1"/>
         </w:rPr>
-        <w:t> It calculates the win condition dynamically. For the Socialist faction, it applies the compensation formula M=1.4+(1−Ginitial)2</w:t>
-      </w:r>
-      <w:r>
-        <w:rPr>
-          <w:rFonts w:cstheme="minorHAnsi"/>
-          <w:i/>
-          <w:iCs/>
-          <w:color w:val="000000" w:themeColor="text1"/>
-        </w:rPr>
-        <w:t>M</w:t>
-      </w:r>
+        <w:t>Trustless</w:t>
+      </w:r>
+      <w:proofErr w:type="spellEnd"/>
       <w:r>
         <w:rPr>
           <w:rFonts w:cstheme="minorHAnsi"/>
           <w:color w:val="000000" w:themeColor="text1"/>
         </w:rPr>
-        <w:t>=1.4+(1−</w:t>
-      </w:r>
-      <w:r>
-        <w:rPr>
-          <w:rFonts w:cstheme="minorHAnsi"/>
-          <w:i/>
-          <w:iCs/>
-          <w:color w:val="000000" w:themeColor="text1"/>
-        </w:rPr>
-        <w:t>Ginitial</w:t>
-      </w:r>
-      <w:r>
+        <w:t xml:space="preserve"> Verification (The Arbitrator): The contract does not calculate the Gini Coefficient on every trade. Instead, any external actor (a Keeper bot) can trigger the complex calculation by submitting a sorted batch of all player balances.</w:t>
+      </w:r>
+    </w:p>
+    <w:p>
+      <w:pPr>
+        <w:numPr>
+          <w:ilvl w:val="1"/>
+          <w:numId w:val="162"/>
+        </w:numPr>
+        <w:spacing w:after="120"/>
         <w:rPr>
           <w:rFonts w:cstheme="minorHAnsi"/>
           <w:color w:val="000000" w:themeColor="text1"/>
         </w:rPr>
-        <w:t>​)2</w:t>
-      </w:r>
+      </w:pPr>
       <w:r>
         <w:rPr>
           <w:rFonts w:cstheme="minorHAnsi"/>
           <w:color w:val="000000" w:themeColor="text1"/>
         </w:rPr>
-        <w:t xml:space="preserve"> </w:t>
-      </w:r>
+        <w:lastRenderedPageBreak/>
+        <w:t xml:space="preserve">The contract performs a </w:t>
+      </w:r>
+      <w:proofErr w:type="spellStart"/>
       <w:r>
         <w:rPr>
           <w:rFonts w:cstheme="minorHAnsi"/>
           <w:color w:val="000000" w:themeColor="text1"/>
         </w:rPr>
-        <w:t>to the progress metric.</w:t>
+        <w:t>Trustless</w:t>
+      </w:r>
+      <w:proofErr w:type="spellEnd"/>
+      <w:r>
+        <w:rPr>
+          <w:rFonts w:cstheme="minorHAnsi"/>
+          <w:color w:val="000000" w:themeColor="text1"/>
+        </w:rPr>
+        <w:t xml:space="preserve"> Verification Check: It verifies that the submitted data is correctly sorted, complete, and mathematically consistent with the known total supply.</w:t>
+      </w:r>
+    </w:p>
+    <w:p>
+      <w:pPr>
+        <w:numPr>
+          <w:ilvl w:val="1"/>
+          <w:numId w:val="162"/>
+        </w:numPr>
+        <w:spacing w:after="120"/>
+        <w:rPr>
+          <w:rFonts w:cstheme="minorHAnsi"/>
+          <w:color w:val="000000" w:themeColor="text1"/>
+        </w:rPr>
+      </w:pPr>
+      <w:r>
+        <w:rPr>
+          <w:rFonts w:cstheme="minorHAnsi"/>
+          <w:color w:val="000000" w:themeColor="text1"/>
+        </w:rPr>
+        <w:t>If the check passes and the victory threshold is met, the game is finalized.</w:t>
       </w:r>
     </w:p>
     <w:p>
@@ -8646,6 +8580,101 @@
       <w:r>
         <w:rPr>
           <w:rFonts w:cstheme="minorHAnsi"/>
+          <w:color w:val="000000" w:themeColor="text1"/>
+        </w:rPr>
+        <w:t>Rationale: This Batch/Sort-Verification model externalizes the gas-intensive computation while maintaining the cryptographic guarantee of an immutable arbiter.</w:t>
+      </w:r>
+    </w:p>
+    <w:p>
+      <w:pPr>
+        <w:numPr>
+          <w:ilvl w:val="0"/>
+          <w:numId w:val="162"/>
+        </w:numPr>
+        <w:spacing w:after="120"/>
+        <w:rPr>
+          <w:rFonts w:cstheme="minorHAnsi"/>
+          <w:color w:val="000000" w:themeColor="text1"/>
+        </w:rPr>
+      </w:pPr>
+      <w:r>
+        <w:rPr>
+          <w:rFonts w:cstheme="minorHAnsi"/>
+          <w:b/>
+          <w:bCs/>
+          <w:color w:val="000000" w:themeColor="text1"/>
+        </w:rPr>
+        <w:t>The Multiplier Logic:</w:t>
+      </w:r>
+      <w:r>
+        <w:rPr>
+          <w:rFonts w:cstheme="minorHAnsi"/>
+          <w:color w:val="000000" w:themeColor="text1"/>
+        </w:rPr>
+        <w:t> It calculates the win condition dynamically. For the Socialist faction, it applies the compensation formula M=1.4+(1−Ginitial)2</w:t>
+      </w:r>
+      <w:r>
+        <w:rPr>
+          <w:rFonts w:cstheme="minorHAnsi"/>
+          <w:i/>
+          <w:iCs/>
+          <w:color w:val="000000" w:themeColor="text1"/>
+        </w:rPr>
+        <w:t>M</w:t>
+      </w:r>
+      <w:r>
+        <w:rPr>
+          <w:rFonts w:cstheme="minorHAnsi"/>
+          <w:color w:val="000000" w:themeColor="text1"/>
+        </w:rPr>
+        <w:t>=1.4+(1−</w:t>
+      </w:r>
+      <w:r>
+        <w:rPr>
+          <w:rFonts w:cstheme="minorHAnsi"/>
+          <w:i/>
+          <w:iCs/>
+          <w:color w:val="000000" w:themeColor="text1"/>
+        </w:rPr>
+        <w:t>Ginitial</w:t>
+      </w:r>
+      <w:r>
+        <w:rPr>
+          <w:rFonts w:cstheme="minorHAnsi"/>
+          <w:color w:val="000000" w:themeColor="text1"/>
+        </w:rPr>
+        <w:t>​)2</w:t>
+      </w:r>
+      <w:r>
+        <w:rPr>
+          <w:rFonts w:cstheme="minorHAnsi"/>
+          <w:color w:val="000000" w:themeColor="text1"/>
+        </w:rPr>
+        <w:t xml:space="preserve"> </w:t>
+      </w:r>
+      <w:r>
+        <w:rPr>
+          <w:rFonts w:cstheme="minorHAnsi"/>
+          <w:color w:val="000000" w:themeColor="text1"/>
+        </w:rPr>
+        <w:t>to the progress metric.</w:t>
+      </w:r>
+    </w:p>
+    <w:p>
+      <w:pPr>
+        <w:numPr>
+          <w:ilvl w:val="0"/>
+          <w:numId w:val="162"/>
+        </w:numPr>
+        <w:spacing w:after="120"/>
+        <w:rPr>
+          <w:rFonts w:cstheme="minorHAnsi"/>
+          <w:color w:val="000000" w:themeColor="text1"/>
+        </w:rPr>
+      </w:pPr>
+      <w:r>
+        <w:rPr>
+          <w:rFonts w:cstheme="minorHAnsi"/>
           <w:b/>
           <w:bCs/>
           <w:color w:val="000000" w:themeColor="text1"/>
@@ -8745,7 +8774,6 @@
           <w:bCs/>
           <w:color w:val="000000" w:themeColor="text1"/>
         </w:rPr>
-        <w:lastRenderedPageBreak/>
         <w:t>Solidarity Calculation (Socialist Win):</w:t>
       </w:r>
     </w:p>
@@ -9083,52 +9111,43 @@
         <w:rPr>
           <w:rFonts w:cstheme="minorHAnsi"/>
           <w:color w:val="000000" w:themeColor="text1"/>
+          <w:lang w:val="en-DE"/>
         </w:rPr>
       </w:pPr>
       <w:r>
         <w:rPr>
           <w:rFonts w:cstheme="minorHAnsi"/>
           <w:color w:val="000000" w:themeColor="text1"/>
-        </w:rPr>
-        <w:t>Due to the non-autonomous nature of state transitions... the protocol relies on an external Keeper Network to trigger time-sensitive functions, including continuous victory verification and end-of-season settlement.</w:t>
-      </w:r>
-    </w:p>
-    <w:p>
-      <w:pPr>
-        <w:spacing w:after="120"/>
-        <w:rPr>
-          <w:rFonts w:cstheme="minorHAnsi"/>
-          <w:color w:val="000000" w:themeColor="text1"/>
-        </w:rPr>
-      </w:pPr>
+          <w:lang w:val="en-DE"/>
+        </w:rPr>
+        <w:t>The protocol relies on an external </w:t>
+      </w:r>
       <w:r>
         <w:rPr>
           <w:rFonts w:cstheme="minorHAnsi"/>
           <w:b/>
           <w:bCs/>
           <w:color w:val="000000" w:themeColor="text1"/>
-        </w:rPr>
-        <w:t>The Keeper Strategy</w:t>
+          <w:lang w:val="en-DE"/>
+        </w:rPr>
+        <w:t>Keeper Network</w:t>
       </w:r>
       <w:r>
         <w:rPr>
           <w:rFonts w:cstheme="minorHAnsi"/>
           <w:color w:val="000000" w:themeColor="text1"/>
-        </w:rPr>
-        <w:br/>
-        <w:t>To ensure operational reliability during the protocol’s nascent phase, the automation infrastructure follows a progressive decentralization roadmap:</w:t>
-      </w:r>
-    </w:p>
-    <w:p>
-      <w:pPr>
-        <w:numPr>
-          <w:ilvl w:val="0"/>
-          <w:numId w:val="164"/>
-        </w:numPr>
+          <w:lang w:val="en-DE"/>
+        </w:rPr>
+        <w:t> to trigger state-changing functions, including continuous victory verification and end-of-season settlement.</w:t>
+      </w:r>
+    </w:p>
+    <w:p>
+      <w:pPr>
         <w:spacing w:after="120"/>
         <w:rPr>
           <w:rFonts w:cstheme="minorHAnsi"/>
           <w:color w:val="000000" w:themeColor="text1"/>
+          <w:lang w:val="en-DE"/>
         </w:rPr>
       </w:pPr>
       <w:r>
@@ -9137,88 +9156,81 @@
           <w:b/>
           <w:bCs/>
           <w:color w:val="000000" w:themeColor="text1"/>
-        </w:rPr>
-        <w:t>Bootstrap Phase (Federated Automation):</w:t>
+          <w:lang w:val="en-DE"/>
+        </w:rPr>
+        <w:t>The Keeper Strategy and Progressive Decentralization</w:t>
       </w:r>
       <w:r>
         <w:rPr>
           <w:rFonts w:cstheme="minorHAnsi"/>
           <w:color w:val="000000" w:themeColor="text1"/>
-        </w:rPr>
-        <w:t> The </w:t>
-      </w:r>
+          <w:lang w:val="en-DE"/>
+        </w:rPr>
+        <w:br/>
+        <w:t>To ensure operational reliability during the protocol’s nascent phase, the automation infrastructure follows a progressive decentralization roadmap:</w:t>
+      </w:r>
+    </w:p>
+    <w:p>
+      <w:pPr>
+        <w:numPr>
+          <w:ilvl w:val="0"/>
+          <w:numId w:val="185"/>
+        </w:numPr>
+        <w:spacing w:after="120"/>
+        <w:rPr>
+          <w:rFonts w:cstheme="minorHAnsi"/>
+          <w:color w:val="000000" w:themeColor="text1"/>
+          <w:lang w:val="en-DE"/>
+        </w:rPr>
+      </w:pPr>
       <w:r>
         <w:rPr>
           <w:rFonts w:cstheme="minorHAnsi"/>
           <w:b/>
           <w:bCs/>
           <w:color w:val="000000" w:themeColor="text1"/>
-        </w:rPr>
-        <w:t>Protocol Administrators (DAO LLC)</w:t>
+          <w:lang w:val="en-DE"/>
+        </w:rPr>
+        <w:t>Bootstrap Phase (Federated Automation):</w:t>
       </w:r>
       <w:r>
         <w:rPr>
           <w:rFonts w:cstheme="minorHAnsi"/>
           <w:color w:val="000000" w:themeColor="text1"/>
-        </w:rPr>
-        <w:t> operate the primary Keeper nodes. This guarantees 100% uptime for critical functions (e.g., </w:t>
-      </w:r>
-      <w:proofErr w:type="spellStart"/>
-      <w:r>
-        <w:rPr>
-          <w:rFonts w:cstheme="minorHAnsi"/>
-          <w:color w:val="000000" w:themeColor="text1"/>
-        </w:rPr>
-        <w:t>finalizeGame</w:t>
-      </w:r>
-      <w:proofErr w:type="spellEnd"/>
-      <w:r>
-        <w:rPr>
-          <w:rFonts w:cstheme="minorHAnsi"/>
-          <w:color w:val="000000" w:themeColor="text1"/>
-        </w:rPr>
-        <w:t>) during early seasons. The bounty rewards generated by these actions are routed back to the DAO treasury.</w:t>
-      </w:r>
-    </w:p>
-    <w:p>
-      <w:pPr>
-        <w:numPr>
-          <w:ilvl w:val="0"/>
-          <w:numId w:val="164"/>
-        </w:numPr>
-        <w:spacing w:after="120"/>
-        <w:rPr>
-          <w:rFonts w:cstheme="minorHAnsi"/>
-          <w:color w:val="000000" w:themeColor="text1"/>
-        </w:rPr>
-      </w:pPr>
+          <w:lang w:val="en-DE"/>
+        </w:rPr>
+        <w:t> The </w:t>
+      </w:r>
       <w:r>
         <w:rPr>
           <w:rFonts w:cstheme="minorHAnsi"/>
           <w:b/>
           <w:bCs/>
           <w:color w:val="000000" w:themeColor="text1"/>
-        </w:rPr>
-        <w:t>Maturity Phase (Open Competition):</w:t>
+          <w:lang w:val="en-DE"/>
+        </w:rPr>
+        <w:t>Protocol Administrators (DAO LLC)</w:t>
       </w:r>
       <w:r>
         <w:rPr>
           <w:rFonts w:cstheme="minorHAnsi"/>
           <w:color w:val="000000" w:themeColor="text1"/>
-        </w:rPr>
-        <w:t> As the ecosystem stabilizes, the Keeper functions are exposed to the public market. The protocol allows any external actor to execute these functions in exchange for the programmatic bounty.</w:t>
+          <w:lang w:val="en-DE"/>
+        </w:rPr>
+        <w:t> operate the primary Keeper nodes. This guarantees 100% uptime for critical functions. The bounty rewards generated are routed back to the DAO treasury.</w:t>
       </w:r>
     </w:p>
     <w:p>
       <w:pPr>
         <w:numPr>
           <w:ilvl w:val="0"/>
-          <w:numId w:val="164"/>
+          <w:numId w:val="185"/>
         </w:numPr>
         <w:spacing w:after="120"/>
         <w:rPr>
           <w:rFonts w:cstheme="minorHAnsi"/>
           <w:color w:val="000000" w:themeColor="text1"/>
+          <w:lang w:val="en-DE"/>
         </w:rPr>
       </w:pPr>
       <w:r>
@@ -9227,31 +9239,325 @@
           <w:b/>
           <w:bCs/>
           <w:color w:val="000000" w:themeColor="text1"/>
-        </w:rPr>
-        <w:t>Institutional Phase (Network Integration):</w:t>
+          <w:lang w:val="en-DE"/>
+        </w:rPr>
+        <w:t>Maturity Phase (Open Competition):</w:t>
       </w:r>
       <w:r>
         <w:rPr>
           <w:rFonts w:cstheme="minorHAnsi"/>
           <w:color w:val="000000" w:themeColor="text1"/>
-        </w:rPr>
-        <w:t xml:space="preserve"> Ultimately, the DAO may vote to integrate with decentralized automation networks (e.g., </w:t>
-      </w:r>
-      <w:proofErr w:type="spellStart"/>
-      <w:r>
+          <w:lang w:val="en-DE"/>
+        </w:rPr>
+        <w:t> The Keeper functions are exposed to the public market. The protocol allows any external actor to execute these functions in exchange for the programmatic bounty.</w:t>
+      </w:r>
+    </w:p>
+    <w:p>
+      <w:pPr>
+        <w:numPr>
+          <w:ilvl w:val="0"/>
+          <w:numId w:val="185"/>
+        </w:numPr>
+        <w:spacing w:after="120"/>
         <w:rPr>
           <w:rFonts w:cstheme="minorHAnsi"/>
           <w:color w:val="000000" w:themeColor="text1"/>
-        </w:rPr>
-        <w:t>Chainlink</w:t>
-      </w:r>
-      <w:proofErr w:type="spellEnd"/>
+          <w:lang w:val="en-DE"/>
+        </w:rPr>
+      </w:pPr>
+      <w:r>
+        <w:rPr>
+          <w:rFonts w:cstheme="minorHAnsi"/>
+          <w:b/>
+          <w:bCs/>
+          <w:color w:val="000000" w:themeColor="text1"/>
+          <w:lang w:val="en-DE"/>
+        </w:rPr>
+        <w:t>Institutional Phase (Network Integration):</w:t>
+      </w:r>
       <w:r>
         <w:rPr>
           <w:rFonts w:cstheme="minorHAnsi"/>
           <w:color w:val="000000" w:themeColor="text1"/>
+          <w:lang w:val="en-DE"/>
+        </w:rPr>
+        <w:t xml:space="preserve"> The DAO may vote to integrate with decentralized automation networks (e.g., </w:t>
+      </w:r>
+      <w:proofErr w:type="spellStart"/>
+      <w:r>
+        <w:rPr>
+          <w:rFonts w:cstheme="minorHAnsi"/>
+          <w:color w:val="000000" w:themeColor="text1"/>
+          <w:lang w:val="en-DE"/>
+        </w:rPr>
+        <w:t>Chainlink</w:t>
+      </w:r>
+      <w:proofErr w:type="spellEnd"/>
+      <w:r>
+        <w:rPr>
+          <w:rFonts w:cstheme="minorHAnsi"/>
+          <w:color w:val="000000" w:themeColor="text1"/>
+          <w:lang w:val="en-DE"/>
         </w:rPr>
         <w:t xml:space="preserve"> Automation), removing reliance on specific private actors entirely.</w:t>
+      </w:r>
+    </w:p>
+    <w:p>
+      <w:pPr>
+        <w:spacing w:after="120"/>
+        <w:rPr>
+          <w:rFonts w:cstheme="minorHAnsi"/>
+          <w:color w:val="000000" w:themeColor="text1"/>
+          <w:lang w:val="en-DE"/>
+        </w:rPr>
+      </w:pPr>
+      <w:r>
+        <w:rPr>
+          <w:rFonts w:cstheme="minorHAnsi"/>
+          <w:b/>
+          <w:bCs/>
+          <w:color w:val="000000" w:themeColor="text1"/>
+          <w:lang w:val="en-DE"/>
+        </w:rPr>
+        <w:lastRenderedPageBreak/>
+        <w:t xml:space="preserve">The </w:t>
+      </w:r>
+      <w:proofErr w:type="spellStart"/>
+      <w:r>
+        <w:rPr>
+          <w:rFonts w:cstheme="minorHAnsi"/>
+          <w:b/>
+          <w:bCs/>
+          <w:color w:val="000000" w:themeColor="text1"/>
+          <w:lang w:val="en-DE"/>
+        </w:rPr>
+        <w:t>Trustless</w:t>
+      </w:r>
+      <w:proofErr w:type="spellEnd"/>
+      <w:r>
+        <w:rPr>
+          <w:rFonts w:cstheme="minorHAnsi"/>
+          <w:b/>
+          <w:bCs/>
+          <w:color w:val="000000" w:themeColor="text1"/>
+          <w:lang w:val="en-DE"/>
+        </w:rPr>
+        <w:t xml:space="preserve"> Verification Model</w:t>
+      </w:r>
+      <w:r>
+        <w:rPr>
+          <w:rFonts w:cstheme="minorHAnsi"/>
+          <w:color w:val="000000" w:themeColor="text1"/>
+          <w:lang w:val="en-DE"/>
+        </w:rPr>
+        <w:br/>
+        <w:t>The core function of the Keeper is to run the computationally expensive Gini calculation off-chain and submit the results for verification:</w:t>
+      </w:r>
+    </w:p>
+    <w:p>
+      <w:pPr>
+        <w:numPr>
+          <w:ilvl w:val="0"/>
+          <w:numId w:val="186"/>
+        </w:numPr>
+        <w:spacing w:after="120"/>
+        <w:rPr>
+          <w:rFonts w:cstheme="minorHAnsi"/>
+          <w:color w:val="000000" w:themeColor="text1"/>
+          <w:lang w:val="en-DE"/>
+        </w:rPr>
+      </w:pPr>
+      <w:r>
+        <w:rPr>
+          <w:rFonts w:cstheme="minorHAnsi"/>
+          <w:b/>
+          <w:bCs/>
+          <w:color w:val="000000" w:themeColor="text1"/>
+          <w:lang w:val="en-DE"/>
+        </w:rPr>
+        <w:t>The Solver Bot:</w:t>
+      </w:r>
+      <w:r>
+        <w:rPr>
+          <w:rFonts w:cstheme="minorHAnsi"/>
+          <w:color w:val="000000" w:themeColor="text1"/>
+          <w:lang w:val="en-DE"/>
+        </w:rPr>
+        <w:t> A specialized software agent (the Keeper) runs the O(</w:t>
+      </w:r>
+      <w:proofErr w:type="spellStart"/>
+      <w:r>
+        <w:rPr>
+          <w:rFonts w:cstheme="minorHAnsi"/>
+          <w:color w:val="000000" w:themeColor="text1"/>
+          <w:lang w:val="en-DE"/>
+        </w:rPr>
+        <w:t>nlogn</w:t>
+      </w:r>
+      <w:proofErr w:type="spellEnd"/>
+      <w:r>
+        <w:rPr>
+          <w:rFonts w:cstheme="minorHAnsi"/>
+          <w:color w:val="000000" w:themeColor="text1"/>
+          <w:lang w:val="en-DE"/>
+        </w:rPr>
+        <w:t>) sorting and calculation of the Gini Coefficient off-chain.</w:t>
+      </w:r>
+    </w:p>
+    <w:p>
+      <w:pPr>
+        <w:numPr>
+          <w:ilvl w:val="0"/>
+          <w:numId w:val="186"/>
+        </w:numPr>
+        <w:spacing w:after="120"/>
+        <w:rPr>
+          <w:rFonts w:cstheme="minorHAnsi"/>
+          <w:color w:val="000000" w:themeColor="text1"/>
+          <w:lang w:val="en-DE"/>
+        </w:rPr>
+      </w:pPr>
+      <w:r>
+        <w:rPr>
+          <w:rFonts w:cstheme="minorHAnsi"/>
+          <w:b/>
+          <w:bCs/>
+          <w:color w:val="000000" w:themeColor="text1"/>
+          <w:lang w:val="en-DE"/>
+        </w:rPr>
+        <w:t>The Check:</w:t>
+      </w:r>
+      <w:r>
+        <w:rPr>
+          <w:rFonts w:cstheme="minorHAnsi"/>
+          <w:color w:val="000000" w:themeColor="text1"/>
+          <w:lang w:val="en-DE"/>
+        </w:rPr>
+        <w:t> The bot calls the </w:t>
+      </w:r>
+      <w:proofErr w:type="spellStart"/>
+      <w:proofErr w:type="gramStart"/>
+      <w:r>
+        <w:rPr>
+          <w:rFonts w:cstheme="minorHAnsi"/>
+          <w:b/>
+          <w:bCs/>
+          <w:color w:val="000000" w:themeColor="text1"/>
+          <w:lang w:val="en-DE"/>
+        </w:rPr>
+        <w:t>checkAndExecuteVictory</w:t>
+      </w:r>
+      <w:proofErr w:type="spellEnd"/>
+      <w:r>
+        <w:rPr>
+          <w:rFonts w:cstheme="minorHAnsi"/>
+          <w:b/>
+          <w:bCs/>
+          <w:color w:val="000000" w:themeColor="text1"/>
+          <w:lang w:val="en-DE"/>
+        </w:rPr>
+        <w:t>(</w:t>
+      </w:r>
+      <w:proofErr w:type="gramEnd"/>
+      <w:r>
+        <w:rPr>
+          <w:rFonts w:cstheme="minorHAnsi"/>
+          <w:b/>
+          <w:bCs/>
+          <w:color w:val="000000" w:themeColor="text1"/>
+          <w:lang w:val="en-DE"/>
+        </w:rPr>
+        <w:t>)</w:t>
+      </w:r>
+      <w:r>
+        <w:rPr>
+          <w:rFonts w:cstheme="minorHAnsi"/>
+          <w:color w:val="000000" w:themeColor="text1"/>
+          <w:lang w:val="en-DE"/>
+        </w:rPr>
+        <w:t> function on the </w:t>
+      </w:r>
+      <w:proofErr w:type="spellStart"/>
+      <w:r>
+        <w:rPr>
+          <w:rFonts w:cstheme="minorHAnsi"/>
+          <w:color w:val="000000" w:themeColor="text1"/>
+          <w:lang w:val="en-DE"/>
+        </w:rPr>
+        <w:t>GameSeason</w:t>
+      </w:r>
+      <w:proofErr w:type="spellEnd"/>
+      <w:r>
+        <w:rPr>
+          <w:rFonts w:cstheme="minorHAnsi"/>
+          <w:color w:val="000000" w:themeColor="text1"/>
+          <w:lang w:val="en-DE"/>
+        </w:rPr>
+        <w:t> contract, submitting the sorted data and a 100 USDC bond.</w:t>
+      </w:r>
+    </w:p>
+    <w:p>
+      <w:pPr>
+        <w:numPr>
+          <w:ilvl w:val="0"/>
+          <w:numId w:val="186"/>
+        </w:numPr>
+        <w:spacing w:after="120"/>
+        <w:rPr>
+          <w:rFonts w:cstheme="minorHAnsi"/>
+          <w:color w:val="000000" w:themeColor="text1"/>
+          <w:lang w:val="en-DE"/>
+        </w:rPr>
+      </w:pPr>
+      <w:r>
+        <w:rPr>
+          <w:rFonts w:cstheme="minorHAnsi"/>
+          <w:b/>
+          <w:bCs/>
+          <w:color w:val="000000" w:themeColor="text1"/>
+          <w:lang w:val="en-DE"/>
+        </w:rPr>
+        <w:t>On-Chain Verification:</w:t>
+      </w:r>
+      <w:r>
+        <w:rPr>
+          <w:rFonts w:cstheme="minorHAnsi"/>
+          <w:color w:val="000000" w:themeColor="text1"/>
+          <w:lang w:val="en-DE"/>
+        </w:rPr>
+        <w:t> The smart contract performs a quick, low-cost verification of the submitted data (checking sort order and mathematical completeness). If the check passes and the victory threshold is met, the system is immediately finalized.</w:t>
+      </w:r>
+    </w:p>
+    <w:p>
+      <w:pPr>
+        <w:numPr>
+          <w:ilvl w:val="0"/>
+          <w:numId w:val="186"/>
+        </w:numPr>
+        <w:spacing w:after="120"/>
+        <w:rPr>
+          <w:rFonts w:cstheme="minorHAnsi"/>
+          <w:color w:val="000000" w:themeColor="text1"/>
+          <w:lang w:val="en-DE"/>
+        </w:rPr>
+      </w:pPr>
+      <w:r>
+        <w:rPr>
+          <w:rFonts w:cstheme="minorHAnsi"/>
+          <w:b/>
+          <w:bCs/>
+          <w:color w:val="000000" w:themeColor="text1"/>
+          <w:lang w:val="en-DE"/>
+        </w:rPr>
+        <w:t>Incentivization:</w:t>
+      </w:r>
+      <w:r>
+        <w:rPr>
+          <w:rFonts w:cstheme="minorHAnsi"/>
+          <w:color w:val="000000" w:themeColor="text1"/>
+          <w:lang w:val="en-DE"/>
+        </w:rPr>
+        <w:t> The Keeper earns a bounty for successful execution, ensuring the system is always incentivized to progress without manual intervention.</w:t>
       </w:r>
     </w:p>
     <w:p>
@@ -9466,7 +9772,6 @@
           <w:bCs/>
           <w:color w:val="000000" w:themeColor="text1"/>
         </w:rPr>
-        <w:lastRenderedPageBreak/>
         <w:t>Treasury Routing:</w:t>
       </w:r>
       <w:r>
@@ -17265,6 +17570,155 @@
     </w:lvl>
   </w:abstractNum>
   <w:abstractNum w:abstractNumId="17" w15:restartNumberingAfterBreak="0">
+    <w:nsid w:val="0CFA0DB6"/>
+    <w:multiLevelType w:val="multilevel"/>
+    <w:tmpl w:val="517694B2"/>
+    <w:lvl w:ilvl="0">
+      <w:start w:val="1"/>
+      <w:numFmt w:val="bullet"/>
+      <w:lvlText w:val=""/>
+      <w:lvlJc w:val="left"/>
+      <w:pPr>
+        <w:tabs>
+          <w:tab w:val="num" w:pos="720"/>
+        </w:tabs>
+        <w:ind w:left="720" w:hanging="360"/>
+      </w:pPr>
+      <w:rPr>
+        <w:rFonts w:ascii="Symbol" w:hAnsi="Symbol" w:hint="default"/>
+        <w:sz w:val="20"/>
+      </w:rPr>
+    </w:lvl>
+    <w:lvl w:ilvl="1" w:tentative="1">
+      <w:start w:val="1"/>
+      <w:numFmt w:val="bullet"/>
+      <w:lvlText w:val="o"/>
+      <w:lvlJc w:val="left"/>
+      <w:pPr>
+        <w:tabs>
+          <w:tab w:val="num" w:pos="1440"/>
+        </w:tabs>
+        <w:ind w:left="1440" w:hanging="360"/>
+      </w:pPr>
+      <w:rPr>
+        <w:rFonts w:ascii="Courier New" w:hAnsi="Courier New" w:hint="default"/>
+        <w:sz w:val="20"/>
+      </w:rPr>
+    </w:lvl>
+    <w:lvl w:ilvl="2" w:tentative="1">
+      <w:start w:val="1"/>
+      <w:numFmt w:val="bullet"/>
+      <w:lvlText w:val=""/>
+      <w:lvlJc w:val="left"/>
+      <w:pPr>
+        <w:tabs>
+          <w:tab w:val="num" w:pos="2160"/>
+        </w:tabs>
+        <w:ind w:left="2160" w:hanging="360"/>
+      </w:pPr>
+      <w:rPr>
+        <w:rFonts w:ascii="Wingdings" w:hAnsi="Wingdings" w:hint="default"/>
+        <w:sz w:val="20"/>
+      </w:rPr>
+    </w:lvl>
+    <w:lvl w:ilvl="3" w:tentative="1">
+      <w:start w:val="1"/>
+      <w:numFmt w:val="bullet"/>
+      <w:lvlText w:val=""/>
+      <w:lvlJc w:val="left"/>
+      <w:pPr>
+        <w:tabs>
+          <w:tab w:val="num" w:pos="2880"/>
+        </w:tabs>
+        <w:ind w:left="2880" w:hanging="360"/>
+      </w:pPr>
+      <w:rPr>
+        <w:rFonts w:ascii="Wingdings" w:hAnsi="Wingdings" w:hint="default"/>
+        <w:sz w:val="20"/>
+      </w:rPr>
+    </w:lvl>
+    <w:lvl w:ilvl="4" w:tentative="1">
+      <w:start w:val="1"/>
+      <w:numFmt w:val="bullet"/>
+      <w:lvlText w:val=""/>
+      <w:lvlJc w:val="left"/>
+      <w:pPr>
+        <w:tabs>
+          <w:tab w:val="num" w:pos="3600"/>
+        </w:tabs>
+        <w:ind w:left="3600" w:hanging="360"/>
+      </w:pPr>
+      <w:rPr>
+        <w:rFonts w:ascii="Wingdings" w:hAnsi="Wingdings" w:hint="default"/>
+        <w:sz w:val="20"/>
+      </w:rPr>
+    </w:lvl>
+    <w:lvl w:ilvl="5" w:tentative="1">
+      <w:start w:val="1"/>
+      <w:numFmt w:val="bullet"/>
+      <w:lvlText w:val=""/>
+      <w:lvlJc w:val="left"/>
+      <w:pPr>
+        <w:tabs>
+          <w:tab w:val="num" w:pos="4320"/>
+        </w:tabs>
+        <w:ind w:left="4320" w:hanging="360"/>
+      </w:pPr>
+      <w:rPr>
+        <w:rFonts w:ascii="Wingdings" w:hAnsi="Wingdings" w:hint="default"/>
+        <w:sz w:val="20"/>
+      </w:rPr>
+    </w:lvl>
+    <w:lvl w:ilvl="6" w:tentative="1">
+      <w:start w:val="1"/>
+      <w:numFmt w:val="bullet"/>
+      <w:lvlText w:val=""/>
+      <w:lvlJc w:val="left"/>
+      <w:pPr>
+        <w:tabs>
+          <w:tab w:val="num" w:pos="5040"/>
+        </w:tabs>
+        <w:ind w:left="5040" w:hanging="360"/>
+      </w:pPr>
+      <w:rPr>
+        <w:rFonts w:ascii="Wingdings" w:hAnsi="Wingdings" w:hint="default"/>
+        <w:sz w:val="20"/>
+      </w:rPr>
+    </w:lvl>
+    <w:lvl w:ilvl="7" w:tentative="1">
+      <w:start w:val="1"/>
+      <w:numFmt w:val="bullet"/>
+      <w:lvlText w:val=""/>
+      <w:lvlJc w:val="left"/>
+      <w:pPr>
+        <w:tabs>
+          <w:tab w:val="num" w:pos="5760"/>
+        </w:tabs>
+        <w:ind w:left="5760" w:hanging="360"/>
+      </w:pPr>
+      <w:rPr>
+        <w:rFonts w:ascii="Wingdings" w:hAnsi="Wingdings" w:hint="default"/>
+        <w:sz w:val="20"/>
+      </w:rPr>
+    </w:lvl>
+    <w:lvl w:ilvl="8" w:tentative="1">
+      <w:start w:val="1"/>
+      <w:numFmt w:val="bullet"/>
+      <w:lvlText w:val=""/>
+      <w:lvlJc w:val="left"/>
+      <w:pPr>
+        <w:tabs>
+          <w:tab w:val="num" w:pos="6480"/>
+        </w:tabs>
+        <w:ind w:left="6480" w:hanging="360"/>
+      </w:pPr>
+      <w:rPr>
+        <w:rFonts w:ascii="Wingdings" w:hAnsi="Wingdings" w:hint="default"/>
+        <w:sz w:val="20"/>
+      </w:rPr>
+    </w:lvl>
+  </w:abstractNum>
+  <w:abstractNum w:abstractNumId="18" w15:restartNumberingAfterBreak="0">
     <w:nsid w:val="0F3B088B"/>
     <w:multiLevelType w:val="multilevel"/>
     <w:tmpl w:val="EADA5CEE"/>
@@ -17413,7 +17867,7 @@
       </w:rPr>
     </w:lvl>
   </w:abstractNum>
-  <w:abstractNum w:abstractNumId="18" w15:restartNumberingAfterBreak="0">
+  <w:abstractNum w:abstractNumId="19" w15:restartNumberingAfterBreak="0">
     <w:nsid w:val="0F7771DC"/>
     <w:multiLevelType w:val="multilevel"/>
     <w:tmpl w:val="C20E2ABA"/>
@@ -17558,7 +18012,7 @@
       </w:rPr>
     </w:lvl>
   </w:abstractNum>
-  <w:abstractNum w:abstractNumId="19" w15:restartNumberingAfterBreak="0">
+  <w:abstractNum w:abstractNumId="20" w15:restartNumberingAfterBreak="0">
     <w:nsid w:val="10443A7B"/>
     <w:multiLevelType w:val="multilevel"/>
     <w:tmpl w:val="D00ABF8C"/>
@@ -17700,7 +18154,7 @@
       </w:rPr>
     </w:lvl>
   </w:abstractNum>
-  <w:abstractNum w:abstractNumId="20" w15:restartNumberingAfterBreak="0">
+  <w:abstractNum w:abstractNumId="21" w15:restartNumberingAfterBreak="0">
     <w:nsid w:val="10F076D0"/>
     <w:multiLevelType w:val="multilevel"/>
     <w:tmpl w:val="9D844276"/>
@@ -17849,7 +18303,7 @@
       </w:rPr>
     </w:lvl>
   </w:abstractNum>
-  <w:abstractNum w:abstractNumId="21" w15:restartNumberingAfterBreak="0">
+  <w:abstractNum w:abstractNumId="22" w15:restartNumberingAfterBreak="0">
     <w:nsid w:val="11077CA2"/>
     <w:multiLevelType w:val="multilevel"/>
     <w:tmpl w:val="66A2AA9E"/>
@@ -17998,7 +18452,7 @@
       </w:rPr>
     </w:lvl>
   </w:abstractNum>
-  <w:abstractNum w:abstractNumId="22" w15:restartNumberingAfterBreak="0">
+  <w:abstractNum w:abstractNumId="23" w15:restartNumberingAfterBreak="0">
     <w:nsid w:val="118B398C"/>
     <w:multiLevelType w:val="multilevel"/>
     <w:tmpl w:val="FF08A21E"/>
@@ -18147,7 +18601,7 @@
       </w:rPr>
     </w:lvl>
   </w:abstractNum>
-  <w:abstractNum w:abstractNumId="23" w15:restartNumberingAfterBreak="0">
+  <w:abstractNum w:abstractNumId="24" w15:restartNumberingAfterBreak="0">
     <w:nsid w:val="120A4162"/>
     <w:multiLevelType w:val="multilevel"/>
     <w:tmpl w:val="0EECB6CE"/>
@@ -18296,7 +18750,7 @@
       </w:rPr>
     </w:lvl>
   </w:abstractNum>
-  <w:abstractNum w:abstractNumId="24" w15:restartNumberingAfterBreak="0">
+  <w:abstractNum w:abstractNumId="25" w15:restartNumberingAfterBreak="0">
     <w:nsid w:val="12D77CA9"/>
     <w:multiLevelType w:val="multilevel"/>
     <w:tmpl w:val="6114B78C"/>
@@ -18445,7 +18899,7 @@
       </w:rPr>
     </w:lvl>
   </w:abstractNum>
-  <w:abstractNum w:abstractNumId="25" w15:restartNumberingAfterBreak="0">
+  <w:abstractNum w:abstractNumId="26" w15:restartNumberingAfterBreak="0">
     <w:nsid w:val="12E5133E"/>
     <w:multiLevelType w:val="multilevel"/>
     <w:tmpl w:val="C95EC376"/>
@@ -18594,7 +19048,7 @@
       </w:rPr>
     </w:lvl>
   </w:abstractNum>
-  <w:abstractNum w:abstractNumId="26" w15:restartNumberingAfterBreak="0">
+  <w:abstractNum w:abstractNumId="27" w15:restartNumberingAfterBreak="0">
     <w:nsid w:val="13D61BBF"/>
     <w:multiLevelType w:val="multilevel"/>
     <w:tmpl w:val="B7B07996"/>
@@ -18743,7 +19197,7 @@
       </w:rPr>
     </w:lvl>
   </w:abstractNum>
-  <w:abstractNum w:abstractNumId="27" w15:restartNumberingAfterBreak="0">
+  <w:abstractNum w:abstractNumId="28" w15:restartNumberingAfterBreak="0">
     <w:nsid w:val="155E6938"/>
     <w:multiLevelType w:val="multilevel"/>
     <w:tmpl w:val="D1100FB2"/>
@@ -18856,7 +19310,7 @@
       </w:rPr>
     </w:lvl>
   </w:abstractNum>
-  <w:abstractNum w:abstractNumId="28" w15:restartNumberingAfterBreak="0">
+  <w:abstractNum w:abstractNumId="29" w15:restartNumberingAfterBreak="0">
     <w:nsid w:val="165865F1"/>
     <w:multiLevelType w:val="hybridMultilevel"/>
     <w:tmpl w:val="F43676DE"/>
@@ -18945,7 +19399,7 @@
       </w:pPr>
     </w:lvl>
   </w:abstractNum>
-  <w:abstractNum w:abstractNumId="29" w15:restartNumberingAfterBreak="0">
+  <w:abstractNum w:abstractNumId="30" w15:restartNumberingAfterBreak="0">
     <w:nsid w:val="165F6815"/>
     <w:multiLevelType w:val="multilevel"/>
     <w:tmpl w:val="83607B18"/>
@@ -19094,7 +19548,7 @@
       </w:rPr>
     </w:lvl>
   </w:abstractNum>
-  <w:abstractNum w:abstractNumId="30" w15:restartNumberingAfterBreak="0">
+  <w:abstractNum w:abstractNumId="31" w15:restartNumberingAfterBreak="0">
     <w:nsid w:val="16D219A5"/>
     <w:multiLevelType w:val="multilevel"/>
     <w:tmpl w:val="1488EA72"/>
@@ -19243,7 +19697,7 @@
       </w:rPr>
     </w:lvl>
   </w:abstractNum>
-  <w:abstractNum w:abstractNumId="31" w15:restartNumberingAfterBreak="0">
+  <w:abstractNum w:abstractNumId="32" w15:restartNumberingAfterBreak="0">
     <w:nsid w:val="17AF512B"/>
     <w:multiLevelType w:val="multilevel"/>
     <w:tmpl w:val="5A725766"/>
@@ -19392,7 +19846,7 @@
       </w:rPr>
     </w:lvl>
   </w:abstractNum>
-  <w:abstractNum w:abstractNumId="32" w15:restartNumberingAfterBreak="0">
+  <w:abstractNum w:abstractNumId="33" w15:restartNumberingAfterBreak="0">
     <w:nsid w:val="17DA404D"/>
     <w:multiLevelType w:val="multilevel"/>
     <w:tmpl w:val="0D42D7EA"/>
@@ -19505,7 +19959,7 @@
       </w:pPr>
     </w:lvl>
   </w:abstractNum>
-  <w:abstractNum w:abstractNumId="33" w15:restartNumberingAfterBreak="0">
+  <w:abstractNum w:abstractNumId="34" w15:restartNumberingAfterBreak="0">
     <w:nsid w:val="180935ED"/>
     <w:multiLevelType w:val="multilevel"/>
     <w:tmpl w:val="04C67A76"/>
@@ -19654,7 +20108,7 @@
       </w:rPr>
     </w:lvl>
   </w:abstractNum>
-  <w:abstractNum w:abstractNumId="34" w15:restartNumberingAfterBreak="0">
+  <w:abstractNum w:abstractNumId="35" w15:restartNumberingAfterBreak="0">
     <w:nsid w:val="18CE562C"/>
     <w:multiLevelType w:val="multilevel"/>
     <w:tmpl w:val="5BB6E9A6"/>
@@ -19803,7 +20257,7 @@
       </w:rPr>
     </w:lvl>
   </w:abstractNum>
-  <w:abstractNum w:abstractNumId="35" w15:restartNumberingAfterBreak="0">
+  <w:abstractNum w:abstractNumId="36" w15:restartNumberingAfterBreak="0">
     <w:nsid w:val="19713313"/>
     <w:multiLevelType w:val="multilevel"/>
     <w:tmpl w:val="43E61F12"/>
@@ -19952,7 +20406,7 @@
       </w:rPr>
     </w:lvl>
   </w:abstractNum>
-  <w:abstractNum w:abstractNumId="36" w15:restartNumberingAfterBreak="0">
+  <w:abstractNum w:abstractNumId="37" w15:restartNumberingAfterBreak="0">
     <w:nsid w:val="1B500A97"/>
     <w:multiLevelType w:val="multilevel"/>
     <w:tmpl w:val="E45E7D28"/>
@@ -20097,7 +20551,7 @@
       </w:rPr>
     </w:lvl>
   </w:abstractNum>
-  <w:abstractNum w:abstractNumId="37" w15:restartNumberingAfterBreak="0">
+  <w:abstractNum w:abstractNumId="38" w15:restartNumberingAfterBreak="0">
     <w:nsid w:val="1C065A0D"/>
     <w:multiLevelType w:val="multilevel"/>
     <w:tmpl w:val="D640E8B8"/>
@@ -20242,7 +20696,7 @@
       </w:rPr>
     </w:lvl>
   </w:abstractNum>
-  <w:abstractNum w:abstractNumId="38" w15:restartNumberingAfterBreak="0">
+  <w:abstractNum w:abstractNumId="39" w15:restartNumberingAfterBreak="0">
     <w:nsid w:val="1C2A2263"/>
     <w:multiLevelType w:val="multilevel"/>
     <w:tmpl w:val="F2880E4C"/>
@@ -20391,7 +20845,7 @@
       </w:rPr>
     </w:lvl>
   </w:abstractNum>
-  <w:abstractNum w:abstractNumId="39" w15:restartNumberingAfterBreak="0">
+  <w:abstractNum w:abstractNumId="40" w15:restartNumberingAfterBreak="0">
     <w:nsid w:val="1C2F7DA3"/>
     <w:multiLevelType w:val="multilevel"/>
     <w:tmpl w:val="488235EC"/>
@@ -20540,7 +20994,7 @@
       </w:rPr>
     </w:lvl>
   </w:abstractNum>
-  <w:abstractNum w:abstractNumId="40" w15:restartNumberingAfterBreak="0">
+  <w:abstractNum w:abstractNumId="41" w15:restartNumberingAfterBreak="0">
     <w:nsid w:val="1C464FFB"/>
     <w:multiLevelType w:val="multilevel"/>
     <w:tmpl w:val="4A6451CA"/>
@@ -20689,7 +21143,7 @@
       </w:rPr>
     </w:lvl>
   </w:abstractNum>
-  <w:abstractNum w:abstractNumId="41" w15:restartNumberingAfterBreak="0">
+  <w:abstractNum w:abstractNumId="42" w15:restartNumberingAfterBreak="0">
     <w:nsid w:val="1CBB589A"/>
     <w:multiLevelType w:val="multilevel"/>
     <w:tmpl w:val="A6BC2D8E"/>
@@ -20834,7 +21288,7 @@
       </w:rPr>
     </w:lvl>
   </w:abstractNum>
-  <w:abstractNum w:abstractNumId="42" w15:restartNumberingAfterBreak="0">
+  <w:abstractNum w:abstractNumId="43" w15:restartNumberingAfterBreak="0">
     <w:nsid w:val="1D573DE1"/>
     <w:multiLevelType w:val="multilevel"/>
     <w:tmpl w:val="5094B166"/>
@@ -20979,7 +21433,7 @@
       </w:rPr>
     </w:lvl>
   </w:abstractNum>
-  <w:abstractNum w:abstractNumId="43" w15:restartNumberingAfterBreak="0">
+  <w:abstractNum w:abstractNumId="44" w15:restartNumberingAfterBreak="0">
     <w:nsid w:val="1D5924CF"/>
     <w:multiLevelType w:val="multilevel"/>
     <w:tmpl w:val="C1B2651E"/>
@@ -21092,7 +21546,7 @@
       </w:pPr>
     </w:lvl>
   </w:abstractNum>
-  <w:abstractNum w:abstractNumId="44" w15:restartNumberingAfterBreak="0">
+  <w:abstractNum w:abstractNumId="45" w15:restartNumberingAfterBreak="0">
     <w:nsid w:val="1DCF5674"/>
     <w:multiLevelType w:val="multilevel"/>
     <w:tmpl w:val="B87A9C18"/>
@@ -21241,7 +21695,7 @@
       </w:rPr>
     </w:lvl>
   </w:abstractNum>
-  <w:abstractNum w:abstractNumId="45" w15:restartNumberingAfterBreak="0">
+  <w:abstractNum w:abstractNumId="46" w15:restartNumberingAfterBreak="0">
     <w:nsid w:val="1E1A7ADE"/>
     <w:multiLevelType w:val="multilevel"/>
     <w:tmpl w:val="D28601E8"/>
@@ -21390,7 +21844,7 @@
       </w:rPr>
     </w:lvl>
   </w:abstractNum>
-  <w:abstractNum w:abstractNumId="46" w15:restartNumberingAfterBreak="0">
+  <w:abstractNum w:abstractNumId="47" w15:restartNumberingAfterBreak="0">
     <w:nsid w:val="1E956CA4"/>
     <w:multiLevelType w:val="multilevel"/>
     <w:tmpl w:val="19961226"/>
@@ -21539,7 +21993,7 @@
       </w:rPr>
     </w:lvl>
   </w:abstractNum>
-  <w:abstractNum w:abstractNumId="47" w15:restartNumberingAfterBreak="0">
+  <w:abstractNum w:abstractNumId="48" w15:restartNumberingAfterBreak="0">
     <w:nsid w:val="1E9741D8"/>
     <w:multiLevelType w:val="multilevel"/>
     <w:tmpl w:val="986630C0"/>
@@ -21688,7 +22142,7 @@
       </w:rPr>
     </w:lvl>
   </w:abstractNum>
-  <w:abstractNum w:abstractNumId="48" w15:restartNumberingAfterBreak="0">
+  <w:abstractNum w:abstractNumId="49" w15:restartNumberingAfterBreak="0">
     <w:nsid w:val="1ECA5392"/>
     <w:multiLevelType w:val="multilevel"/>
     <w:tmpl w:val="BE88079E"/>
@@ -21837,7 +22291,7 @@
       </w:rPr>
     </w:lvl>
   </w:abstractNum>
-  <w:abstractNum w:abstractNumId="49" w15:restartNumberingAfterBreak="0">
+  <w:abstractNum w:abstractNumId="50" w15:restartNumberingAfterBreak="0">
     <w:nsid w:val="1FD57833"/>
     <w:multiLevelType w:val="multilevel"/>
     <w:tmpl w:val="035083E8"/>
@@ -21954,7 +22408,7 @@
       </w:pPr>
     </w:lvl>
   </w:abstractNum>
-  <w:abstractNum w:abstractNumId="50" w15:restartNumberingAfterBreak="0">
+  <w:abstractNum w:abstractNumId="51" w15:restartNumberingAfterBreak="0">
     <w:nsid w:val="200A58FE"/>
     <w:multiLevelType w:val="multilevel"/>
     <w:tmpl w:val="A9F4A8E0"/>
@@ -22067,7 +22521,7 @@
       </w:pPr>
     </w:lvl>
   </w:abstractNum>
-  <w:abstractNum w:abstractNumId="51" w15:restartNumberingAfterBreak="0">
+  <w:abstractNum w:abstractNumId="52" w15:restartNumberingAfterBreak="0">
     <w:nsid w:val="208A0A40"/>
     <w:multiLevelType w:val="multilevel"/>
     <w:tmpl w:val="F968B38C"/>
@@ -22184,7 +22638,7 @@
       </w:pPr>
     </w:lvl>
   </w:abstractNum>
-  <w:abstractNum w:abstractNumId="52" w15:restartNumberingAfterBreak="0">
+  <w:abstractNum w:abstractNumId="53" w15:restartNumberingAfterBreak="0">
     <w:nsid w:val="20DB1858"/>
     <w:multiLevelType w:val="multilevel"/>
     <w:tmpl w:val="2F343DF2"/>
@@ -22333,7 +22787,7 @@
       </w:rPr>
     </w:lvl>
   </w:abstractNum>
-  <w:abstractNum w:abstractNumId="53" w15:restartNumberingAfterBreak="0">
+  <w:abstractNum w:abstractNumId="54" w15:restartNumberingAfterBreak="0">
     <w:nsid w:val="21E74E0B"/>
     <w:multiLevelType w:val="multilevel"/>
     <w:tmpl w:val="5DAAD77C"/>
@@ -22482,7 +22936,7 @@
       </w:rPr>
     </w:lvl>
   </w:abstractNum>
-  <w:abstractNum w:abstractNumId="54" w15:restartNumberingAfterBreak="0">
+  <w:abstractNum w:abstractNumId="55" w15:restartNumberingAfterBreak="0">
     <w:nsid w:val="23967A70"/>
     <w:multiLevelType w:val="multilevel"/>
     <w:tmpl w:val="EAC2A33A"/>
@@ -22631,7 +23085,7 @@
       </w:rPr>
     </w:lvl>
   </w:abstractNum>
-  <w:abstractNum w:abstractNumId="55" w15:restartNumberingAfterBreak="0">
+  <w:abstractNum w:abstractNumId="56" w15:restartNumberingAfterBreak="0">
     <w:nsid w:val="24836839"/>
     <w:multiLevelType w:val="multilevel"/>
     <w:tmpl w:val="2562694C"/>
@@ -22780,7 +23234,7 @@
       </w:rPr>
     </w:lvl>
   </w:abstractNum>
-  <w:abstractNum w:abstractNumId="56" w15:restartNumberingAfterBreak="0">
+  <w:abstractNum w:abstractNumId="57" w15:restartNumberingAfterBreak="0">
     <w:nsid w:val="26553B60"/>
     <w:multiLevelType w:val="multilevel"/>
     <w:tmpl w:val="1C9014F0"/>
@@ -22925,7 +23379,7 @@
       </w:rPr>
     </w:lvl>
   </w:abstractNum>
-  <w:abstractNum w:abstractNumId="57" w15:restartNumberingAfterBreak="0">
+  <w:abstractNum w:abstractNumId="58" w15:restartNumberingAfterBreak="0">
     <w:nsid w:val="26F71876"/>
     <w:multiLevelType w:val="multilevel"/>
     <w:tmpl w:val="360482FC"/>
@@ -23074,7 +23528,7 @@
       </w:rPr>
     </w:lvl>
   </w:abstractNum>
-  <w:abstractNum w:abstractNumId="58" w15:restartNumberingAfterBreak="0">
+  <w:abstractNum w:abstractNumId="59" w15:restartNumberingAfterBreak="0">
     <w:nsid w:val="293A4C52"/>
     <w:multiLevelType w:val="multilevel"/>
     <w:tmpl w:val="6E66A9D6"/>
@@ -23219,7 +23673,7 @@
       </w:rPr>
     </w:lvl>
   </w:abstractNum>
-  <w:abstractNum w:abstractNumId="59" w15:restartNumberingAfterBreak="0">
+  <w:abstractNum w:abstractNumId="60" w15:restartNumberingAfterBreak="0">
     <w:nsid w:val="2958508C"/>
     <w:multiLevelType w:val="multilevel"/>
     <w:tmpl w:val="98D4945A"/>
@@ -23368,7 +23822,120 @@
       </w:rPr>
     </w:lvl>
   </w:abstractNum>
-  <w:abstractNum w:abstractNumId="60" w15:restartNumberingAfterBreak="0">
+  <w:abstractNum w:abstractNumId="61" w15:restartNumberingAfterBreak="0">
+    <w:nsid w:val="2E6646D9"/>
+    <w:multiLevelType w:val="multilevel"/>
+    <w:tmpl w:val="71E870D6"/>
+    <w:lvl w:ilvl="0">
+      <w:start w:val="1"/>
+      <w:numFmt w:val="decimal"/>
+      <w:lvlText w:val="%1."/>
+      <w:lvlJc w:val="left"/>
+      <w:pPr>
+        <w:tabs>
+          <w:tab w:val="num" w:pos="720"/>
+        </w:tabs>
+        <w:ind w:left="720" w:hanging="360"/>
+      </w:pPr>
+    </w:lvl>
+    <w:lvl w:ilvl="1" w:tentative="1">
+      <w:start w:val="1"/>
+      <w:numFmt w:val="decimal"/>
+      <w:lvlText w:val="%2."/>
+      <w:lvlJc w:val="left"/>
+      <w:pPr>
+        <w:tabs>
+          <w:tab w:val="num" w:pos="1440"/>
+        </w:tabs>
+        <w:ind w:left="1440" w:hanging="360"/>
+      </w:pPr>
+    </w:lvl>
+    <w:lvl w:ilvl="2" w:tentative="1">
+      <w:start w:val="1"/>
+      <w:numFmt w:val="decimal"/>
+      <w:lvlText w:val="%3."/>
+      <w:lvlJc w:val="left"/>
+      <w:pPr>
+        <w:tabs>
+          <w:tab w:val="num" w:pos="2160"/>
+        </w:tabs>
+        <w:ind w:left="2160" w:hanging="360"/>
+      </w:pPr>
+    </w:lvl>
+    <w:lvl w:ilvl="3" w:tentative="1">
+      <w:start w:val="1"/>
+      <w:numFmt w:val="decimal"/>
+      <w:lvlText w:val="%4."/>
+      <w:lvlJc w:val="left"/>
+      <w:pPr>
+        <w:tabs>
+          <w:tab w:val="num" w:pos="2880"/>
+        </w:tabs>
+        <w:ind w:left="2880" w:hanging="360"/>
+      </w:pPr>
+    </w:lvl>
+    <w:lvl w:ilvl="4" w:tentative="1">
+      <w:start w:val="1"/>
+      <w:numFmt w:val="decimal"/>
+      <w:lvlText w:val="%5."/>
+      <w:lvlJc w:val="left"/>
+      <w:pPr>
+        <w:tabs>
+          <w:tab w:val="num" w:pos="3600"/>
+        </w:tabs>
+        <w:ind w:left="3600" w:hanging="360"/>
+      </w:pPr>
+    </w:lvl>
+    <w:lvl w:ilvl="5" w:tentative="1">
+      <w:start w:val="1"/>
+      <w:numFmt w:val="decimal"/>
+      <w:lvlText w:val="%6."/>
+      <w:lvlJc w:val="left"/>
+      <w:pPr>
+        <w:tabs>
+          <w:tab w:val="num" w:pos="4320"/>
+        </w:tabs>
+        <w:ind w:left="4320" w:hanging="360"/>
+      </w:pPr>
+    </w:lvl>
+    <w:lvl w:ilvl="6" w:tentative="1">
+      <w:start w:val="1"/>
+      <w:numFmt w:val="decimal"/>
+      <w:lvlText w:val="%7."/>
+      <w:lvlJc w:val="left"/>
+      <w:pPr>
+        <w:tabs>
+          <w:tab w:val="num" w:pos="5040"/>
+        </w:tabs>
+        <w:ind w:left="5040" w:hanging="360"/>
+      </w:pPr>
+    </w:lvl>
+    <w:lvl w:ilvl="7" w:tentative="1">
+      <w:start w:val="1"/>
+      <w:numFmt w:val="decimal"/>
+      <w:lvlText w:val="%8."/>
+      <w:lvlJc w:val="left"/>
+      <w:pPr>
+        <w:tabs>
+          <w:tab w:val="num" w:pos="5760"/>
+        </w:tabs>
+        <w:ind w:left="5760" w:hanging="360"/>
+      </w:pPr>
+    </w:lvl>
+    <w:lvl w:ilvl="8" w:tentative="1">
+      <w:start w:val="1"/>
+      <w:numFmt w:val="decimal"/>
+      <w:lvlText w:val="%9."/>
+      <w:lvlJc w:val="left"/>
+      <w:pPr>
+        <w:tabs>
+          <w:tab w:val="num" w:pos="6480"/>
+        </w:tabs>
+        <w:ind w:left="6480" w:hanging="360"/>
+      </w:pPr>
+    </w:lvl>
+  </w:abstractNum>
+  <w:abstractNum w:abstractNumId="62" w15:restartNumberingAfterBreak="0">
     <w:nsid w:val="2E8C6F75"/>
     <w:multiLevelType w:val="multilevel"/>
     <w:tmpl w:val="3C3C1508"/>
@@ -23517,7 +24084,7 @@
       </w:rPr>
     </w:lvl>
   </w:abstractNum>
-  <w:abstractNum w:abstractNumId="61" w15:restartNumberingAfterBreak="0">
+  <w:abstractNum w:abstractNumId="63" w15:restartNumberingAfterBreak="0">
     <w:nsid w:val="308A6AEC"/>
     <w:multiLevelType w:val="multilevel"/>
     <w:tmpl w:val="5824B38E"/>
@@ -23666,7 +24233,7 @@
       </w:rPr>
     </w:lvl>
   </w:abstractNum>
-  <w:abstractNum w:abstractNumId="62" w15:restartNumberingAfterBreak="0">
+  <w:abstractNum w:abstractNumId="64" w15:restartNumberingAfterBreak="0">
     <w:nsid w:val="3275706C"/>
     <w:multiLevelType w:val="multilevel"/>
     <w:tmpl w:val="62B6781A"/>
@@ -23779,7 +24346,7 @@
       </w:pPr>
     </w:lvl>
   </w:abstractNum>
-  <w:abstractNum w:abstractNumId="63" w15:restartNumberingAfterBreak="0">
+  <w:abstractNum w:abstractNumId="65" w15:restartNumberingAfterBreak="0">
     <w:nsid w:val="32DA2157"/>
     <w:multiLevelType w:val="multilevel"/>
     <w:tmpl w:val="90522214"/>
@@ -23928,7 +24495,7 @@
       </w:rPr>
     </w:lvl>
   </w:abstractNum>
-  <w:abstractNum w:abstractNumId="64" w15:restartNumberingAfterBreak="0">
+  <w:abstractNum w:abstractNumId="66" w15:restartNumberingAfterBreak="0">
     <w:nsid w:val="33144A87"/>
     <w:multiLevelType w:val="multilevel"/>
     <w:tmpl w:val="9DA2CFF8"/>
@@ -24077,7 +24644,7 @@
       </w:rPr>
     </w:lvl>
   </w:abstractNum>
-  <w:abstractNum w:abstractNumId="65" w15:restartNumberingAfterBreak="0">
+  <w:abstractNum w:abstractNumId="67" w15:restartNumberingAfterBreak="0">
     <w:nsid w:val="352B0180"/>
     <w:multiLevelType w:val="multilevel"/>
     <w:tmpl w:val="731422EE"/>
@@ -24226,7 +24793,7 @@
       </w:rPr>
     </w:lvl>
   </w:abstractNum>
-  <w:abstractNum w:abstractNumId="66" w15:restartNumberingAfterBreak="0">
+  <w:abstractNum w:abstractNumId="68" w15:restartNumberingAfterBreak="0">
     <w:nsid w:val="35B80EED"/>
     <w:multiLevelType w:val="multilevel"/>
     <w:tmpl w:val="893A1FAA"/>
@@ -24375,7 +24942,7 @@
       </w:rPr>
     </w:lvl>
   </w:abstractNum>
-  <w:abstractNum w:abstractNumId="67" w15:restartNumberingAfterBreak="0">
+  <w:abstractNum w:abstractNumId="69" w15:restartNumberingAfterBreak="0">
     <w:nsid w:val="35EB25BA"/>
     <w:multiLevelType w:val="multilevel"/>
     <w:tmpl w:val="F73EA568"/>
@@ -24524,7 +25091,7 @@
       </w:rPr>
     </w:lvl>
   </w:abstractNum>
-  <w:abstractNum w:abstractNumId="68" w15:restartNumberingAfterBreak="0">
+  <w:abstractNum w:abstractNumId="70" w15:restartNumberingAfterBreak="0">
     <w:nsid w:val="367C7A9A"/>
     <w:multiLevelType w:val="multilevel"/>
     <w:tmpl w:val="633ED0A6"/>
@@ -24673,7 +25240,7 @@
       </w:rPr>
     </w:lvl>
   </w:abstractNum>
-  <w:abstractNum w:abstractNumId="69" w15:restartNumberingAfterBreak="0">
+  <w:abstractNum w:abstractNumId="71" w15:restartNumberingAfterBreak="0">
     <w:nsid w:val="36DF3D76"/>
     <w:multiLevelType w:val="multilevel"/>
     <w:tmpl w:val="22FC9238"/>
@@ -24818,7 +25385,7 @@
       </w:rPr>
     </w:lvl>
   </w:abstractNum>
-  <w:abstractNum w:abstractNumId="70" w15:restartNumberingAfterBreak="0">
+  <w:abstractNum w:abstractNumId="72" w15:restartNumberingAfterBreak="0">
     <w:nsid w:val="377F4E25"/>
     <w:multiLevelType w:val="hybridMultilevel"/>
     <w:tmpl w:val="0EB0C74E"/>
@@ -24908,7 +25475,7 @@
       </w:pPr>
     </w:lvl>
   </w:abstractNum>
-  <w:abstractNum w:abstractNumId="71" w15:restartNumberingAfterBreak="0">
+  <w:abstractNum w:abstractNumId="73" w15:restartNumberingAfterBreak="0">
     <w:nsid w:val="38833AC2"/>
     <w:multiLevelType w:val="multilevel"/>
     <w:tmpl w:val="DCD69308"/>
@@ -25057,7 +25624,7 @@
       </w:rPr>
     </w:lvl>
   </w:abstractNum>
-  <w:abstractNum w:abstractNumId="72" w15:restartNumberingAfterBreak="0">
+  <w:abstractNum w:abstractNumId="74" w15:restartNumberingAfterBreak="0">
     <w:nsid w:val="38F558C1"/>
     <w:multiLevelType w:val="multilevel"/>
     <w:tmpl w:val="40C8C2AC"/>
@@ -25206,7 +25773,7 @@
       </w:rPr>
     </w:lvl>
   </w:abstractNum>
-  <w:abstractNum w:abstractNumId="73" w15:restartNumberingAfterBreak="0">
+  <w:abstractNum w:abstractNumId="75" w15:restartNumberingAfterBreak="0">
     <w:nsid w:val="39134D5E"/>
     <w:multiLevelType w:val="multilevel"/>
     <w:tmpl w:val="913058F8"/>
@@ -25355,7 +25922,7 @@
       </w:rPr>
     </w:lvl>
   </w:abstractNum>
-  <w:abstractNum w:abstractNumId="74" w15:restartNumberingAfterBreak="0">
+  <w:abstractNum w:abstractNumId="76" w15:restartNumberingAfterBreak="0">
     <w:nsid w:val="391E7F50"/>
     <w:multiLevelType w:val="multilevel"/>
     <w:tmpl w:val="C674CA22"/>
@@ -25504,7 +26071,7 @@
       </w:rPr>
     </w:lvl>
   </w:abstractNum>
-  <w:abstractNum w:abstractNumId="75" w15:restartNumberingAfterBreak="0">
+  <w:abstractNum w:abstractNumId="77" w15:restartNumberingAfterBreak="0">
     <w:nsid w:val="3A0A53F1"/>
     <w:multiLevelType w:val="multilevel"/>
     <w:tmpl w:val="2020DF72"/>
@@ -25617,7 +26184,7 @@
       </w:pPr>
     </w:lvl>
   </w:abstractNum>
-  <w:abstractNum w:abstractNumId="76" w15:restartNumberingAfterBreak="0">
+  <w:abstractNum w:abstractNumId="78" w15:restartNumberingAfterBreak="0">
     <w:nsid w:val="3A131D66"/>
     <w:multiLevelType w:val="multilevel"/>
     <w:tmpl w:val="24F4F816"/>
@@ -25766,7 +26333,7 @@
       </w:rPr>
     </w:lvl>
   </w:abstractNum>
-  <w:abstractNum w:abstractNumId="77" w15:restartNumberingAfterBreak="0">
+  <w:abstractNum w:abstractNumId="79" w15:restartNumberingAfterBreak="0">
     <w:nsid w:val="3A4474F2"/>
     <w:multiLevelType w:val="multilevel"/>
     <w:tmpl w:val="5DA624DC"/>
@@ -25915,7 +26482,7 @@
       </w:rPr>
     </w:lvl>
   </w:abstractNum>
-  <w:abstractNum w:abstractNumId="78" w15:restartNumberingAfterBreak="0">
+  <w:abstractNum w:abstractNumId="80" w15:restartNumberingAfterBreak="0">
     <w:nsid w:val="3A7F5F69"/>
     <w:multiLevelType w:val="multilevel"/>
     <w:tmpl w:val="1B1EA230"/>
@@ -26064,7 +26631,7 @@
       </w:rPr>
     </w:lvl>
   </w:abstractNum>
-  <w:abstractNum w:abstractNumId="79" w15:restartNumberingAfterBreak="0">
+  <w:abstractNum w:abstractNumId="81" w15:restartNumberingAfterBreak="0">
     <w:nsid w:val="3A9B0EB3"/>
     <w:multiLevelType w:val="multilevel"/>
     <w:tmpl w:val="12DAAE4C"/>
@@ -26213,7 +26780,7 @@
       </w:rPr>
     </w:lvl>
   </w:abstractNum>
-  <w:abstractNum w:abstractNumId="80" w15:restartNumberingAfterBreak="0">
+  <w:abstractNum w:abstractNumId="82" w15:restartNumberingAfterBreak="0">
     <w:nsid w:val="3B572AEC"/>
     <w:multiLevelType w:val="multilevel"/>
     <w:tmpl w:val="CE6CA1D2"/>
@@ -26362,7 +26929,7 @@
       </w:rPr>
     </w:lvl>
   </w:abstractNum>
-  <w:abstractNum w:abstractNumId="81" w15:restartNumberingAfterBreak="0">
+  <w:abstractNum w:abstractNumId="83" w15:restartNumberingAfterBreak="0">
     <w:nsid w:val="3CD04225"/>
     <w:multiLevelType w:val="multilevel"/>
     <w:tmpl w:val="81C2684C"/>
@@ -26511,7 +27078,7 @@
       </w:rPr>
     </w:lvl>
   </w:abstractNum>
-  <w:abstractNum w:abstractNumId="82" w15:restartNumberingAfterBreak="0">
+  <w:abstractNum w:abstractNumId="84" w15:restartNumberingAfterBreak="0">
     <w:nsid w:val="3EC434D1"/>
     <w:multiLevelType w:val="multilevel"/>
     <w:tmpl w:val="CEF41810"/>
@@ -26660,7 +27227,7 @@
       </w:rPr>
     </w:lvl>
   </w:abstractNum>
-  <w:abstractNum w:abstractNumId="83" w15:restartNumberingAfterBreak="0">
+  <w:abstractNum w:abstractNumId="85" w15:restartNumberingAfterBreak="0">
     <w:nsid w:val="3F93309C"/>
     <w:multiLevelType w:val="multilevel"/>
     <w:tmpl w:val="D1100FB2"/>
@@ -26773,7 +27340,7 @@
       </w:rPr>
     </w:lvl>
   </w:abstractNum>
-  <w:abstractNum w:abstractNumId="84" w15:restartNumberingAfterBreak="0">
+  <w:abstractNum w:abstractNumId="86" w15:restartNumberingAfterBreak="0">
     <w:nsid w:val="408A2BD2"/>
     <w:multiLevelType w:val="multilevel"/>
     <w:tmpl w:val="AF142B3A"/>
@@ -26922,7 +27489,7 @@
       </w:rPr>
     </w:lvl>
   </w:abstractNum>
-  <w:abstractNum w:abstractNumId="85" w15:restartNumberingAfterBreak="0">
+  <w:abstractNum w:abstractNumId="87" w15:restartNumberingAfterBreak="0">
     <w:nsid w:val="41230EC5"/>
     <w:multiLevelType w:val="multilevel"/>
     <w:tmpl w:val="A0B6DC8C"/>
@@ -27071,7 +27638,7 @@
       </w:rPr>
     </w:lvl>
   </w:abstractNum>
-  <w:abstractNum w:abstractNumId="86" w15:restartNumberingAfterBreak="0">
+  <w:abstractNum w:abstractNumId="88" w15:restartNumberingAfterBreak="0">
     <w:nsid w:val="419E7FFB"/>
     <w:multiLevelType w:val="multilevel"/>
     <w:tmpl w:val="2A8C9C7E"/>
@@ -27188,7 +27755,7 @@
       </w:pPr>
     </w:lvl>
   </w:abstractNum>
-  <w:abstractNum w:abstractNumId="87" w15:restartNumberingAfterBreak="0">
+  <w:abstractNum w:abstractNumId="89" w15:restartNumberingAfterBreak="0">
     <w:nsid w:val="420C094F"/>
     <w:multiLevelType w:val="multilevel"/>
     <w:tmpl w:val="8528C9DE"/>
@@ -27337,7 +27904,7 @@
       </w:rPr>
     </w:lvl>
   </w:abstractNum>
-  <w:abstractNum w:abstractNumId="88" w15:restartNumberingAfterBreak="0">
+  <w:abstractNum w:abstractNumId="90" w15:restartNumberingAfterBreak="0">
     <w:nsid w:val="433C1063"/>
     <w:multiLevelType w:val="multilevel"/>
     <w:tmpl w:val="CB5C2BA2"/>
@@ -27486,7 +28053,7 @@
       </w:rPr>
     </w:lvl>
   </w:abstractNum>
-  <w:abstractNum w:abstractNumId="89" w15:restartNumberingAfterBreak="0">
+  <w:abstractNum w:abstractNumId="91" w15:restartNumberingAfterBreak="0">
     <w:nsid w:val="45510277"/>
     <w:multiLevelType w:val="multilevel"/>
     <w:tmpl w:val="56B26F3E"/>
@@ -27635,7 +28202,7 @@
       </w:rPr>
     </w:lvl>
   </w:abstractNum>
-  <w:abstractNum w:abstractNumId="90" w15:restartNumberingAfterBreak="0">
+  <w:abstractNum w:abstractNumId="92" w15:restartNumberingAfterBreak="0">
     <w:nsid w:val="45F17ACC"/>
     <w:multiLevelType w:val="multilevel"/>
     <w:tmpl w:val="78469CCC"/>
@@ -27784,7 +28351,7 @@
       </w:rPr>
     </w:lvl>
   </w:abstractNum>
-  <w:abstractNum w:abstractNumId="91" w15:restartNumberingAfterBreak="0">
+  <w:abstractNum w:abstractNumId="93" w15:restartNumberingAfterBreak="0">
     <w:nsid w:val="46A155D5"/>
     <w:multiLevelType w:val="multilevel"/>
     <w:tmpl w:val="44ACD8FC"/>
@@ -27933,7 +28500,7 @@
       </w:rPr>
     </w:lvl>
   </w:abstractNum>
-  <w:abstractNum w:abstractNumId="92" w15:restartNumberingAfterBreak="0">
+  <w:abstractNum w:abstractNumId="94" w15:restartNumberingAfterBreak="0">
     <w:nsid w:val="46DA672B"/>
     <w:multiLevelType w:val="multilevel"/>
     <w:tmpl w:val="3246065E"/>
@@ -28082,7 +28649,7 @@
       </w:rPr>
     </w:lvl>
   </w:abstractNum>
-  <w:abstractNum w:abstractNumId="93" w15:restartNumberingAfterBreak="0">
+  <w:abstractNum w:abstractNumId="95" w15:restartNumberingAfterBreak="0">
     <w:nsid w:val="47B23F33"/>
     <w:multiLevelType w:val="multilevel"/>
     <w:tmpl w:val="87040A3E"/>
@@ -28231,7 +28798,7 @@
       </w:rPr>
     </w:lvl>
   </w:abstractNum>
-  <w:abstractNum w:abstractNumId="94" w15:restartNumberingAfterBreak="0">
+  <w:abstractNum w:abstractNumId="96" w15:restartNumberingAfterBreak="0">
     <w:nsid w:val="486500D3"/>
     <w:multiLevelType w:val="multilevel"/>
     <w:tmpl w:val="2000001F"/>
@@ -28317,7 +28884,7 @@
       </w:pPr>
     </w:lvl>
   </w:abstractNum>
-  <w:abstractNum w:abstractNumId="95" w15:restartNumberingAfterBreak="0">
+  <w:abstractNum w:abstractNumId="97" w15:restartNumberingAfterBreak="0">
     <w:nsid w:val="48BB6270"/>
     <w:multiLevelType w:val="multilevel"/>
     <w:tmpl w:val="2000001F"/>
@@ -28403,7 +28970,7 @@
       </w:pPr>
     </w:lvl>
   </w:abstractNum>
-  <w:abstractNum w:abstractNumId="96" w15:restartNumberingAfterBreak="0">
+  <w:abstractNum w:abstractNumId="98" w15:restartNumberingAfterBreak="0">
     <w:nsid w:val="48C57C32"/>
     <w:multiLevelType w:val="multilevel"/>
     <w:tmpl w:val="B7B07996"/>
@@ -28552,7 +29119,7 @@
       </w:rPr>
     </w:lvl>
   </w:abstractNum>
-  <w:abstractNum w:abstractNumId="97" w15:restartNumberingAfterBreak="0">
+  <w:abstractNum w:abstractNumId="99" w15:restartNumberingAfterBreak="0">
     <w:nsid w:val="48D712CB"/>
     <w:multiLevelType w:val="multilevel"/>
     <w:tmpl w:val="57F4AFC8"/>
@@ -28701,7 +29268,7 @@
       </w:rPr>
     </w:lvl>
   </w:abstractNum>
-  <w:abstractNum w:abstractNumId="98" w15:restartNumberingAfterBreak="0">
+  <w:abstractNum w:abstractNumId="100" w15:restartNumberingAfterBreak="0">
     <w:nsid w:val="48E24BEB"/>
     <w:multiLevelType w:val="multilevel"/>
     <w:tmpl w:val="6EF88C2C"/>
@@ -28850,7 +29417,7 @@
       </w:rPr>
     </w:lvl>
   </w:abstractNum>
-  <w:abstractNum w:abstractNumId="99" w15:restartNumberingAfterBreak="0">
+  <w:abstractNum w:abstractNumId="101" w15:restartNumberingAfterBreak="0">
     <w:nsid w:val="48FA7538"/>
     <w:multiLevelType w:val="multilevel"/>
     <w:tmpl w:val="740C545A"/>
@@ -28999,7 +29566,7 @@
       </w:rPr>
     </w:lvl>
   </w:abstractNum>
-  <w:abstractNum w:abstractNumId="100" w15:restartNumberingAfterBreak="0">
+  <w:abstractNum w:abstractNumId="102" w15:restartNumberingAfterBreak="0">
     <w:nsid w:val="4A8A55BC"/>
     <w:multiLevelType w:val="multilevel"/>
     <w:tmpl w:val="A510C274"/>
@@ -29148,7 +29715,7 @@
       </w:rPr>
     </w:lvl>
   </w:abstractNum>
-  <w:abstractNum w:abstractNumId="101" w15:restartNumberingAfterBreak="0">
+  <w:abstractNum w:abstractNumId="103" w15:restartNumberingAfterBreak="0">
     <w:nsid w:val="4AA0202E"/>
     <w:multiLevelType w:val="multilevel"/>
     <w:tmpl w:val="5D10C8AC"/>
@@ -29297,7 +29864,7 @@
       </w:rPr>
     </w:lvl>
   </w:abstractNum>
-  <w:abstractNum w:abstractNumId="102" w15:restartNumberingAfterBreak="0">
+  <w:abstractNum w:abstractNumId="104" w15:restartNumberingAfterBreak="0">
     <w:nsid w:val="4C1B5CC0"/>
     <w:multiLevelType w:val="multilevel"/>
     <w:tmpl w:val="0F1AD73E"/>
@@ -29446,7 +30013,7 @@
       </w:rPr>
     </w:lvl>
   </w:abstractNum>
-  <w:abstractNum w:abstractNumId="103" w15:restartNumberingAfterBreak="0">
+  <w:abstractNum w:abstractNumId="105" w15:restartNumberingAfterBreak="0">
     <w:nsid w:val="4C4C31B6"/>
     <w:multiLevelType w:val="multilevel"/>
     <w:tmpl w:val="ABAEB844"/>
@@ -29595,7 +30162,7 @@
       </w:rPr>
     </w:lvl>
   </w:abstractNum>
-  <w:abstractNum w:abstractNumId="104" w15:restartNumberingAfterBreak="0">
+  <w:abstractNum w:abstractNumId="106" w15:restartNumberingAfterBreak="0">
     <w:nsid w:val="4C5D4EB3"/>
     <w:multiLevelType w:val="multilevel"/>
     <w:tmpl w:val="FE5A577E"/>
@@ -29744,7 +30311,7 @@
       </w:rPr>
     </w:lvl>
   </w:abstractNum>
-  <w:abstractNum w:abstractNumId="105" w15:restartNumberingAfterBreak="0">
+  <w:abstractNum w:abstractNumId="107" w15:restartNumberingAfterBreak="0">
     <w:nsid w:val="4CCC657A"/>
     <w:multiLevelType w:val="multilevel"/>
     <w:tmpl w:val="2000001F"/>
@@ -29830,7 +30397,7 @@
       </w:pPr>
     </w:lvl>
   </w:abstractNum>
-  <w:abstractNum w:abstractNumId="106" w15:restartNumberingAfterBreak="0">
+  <w:abstractNum w:abstractNumId="108" w15:restartNumberingAfterBreak="0">
     <w:nsid w:val="4D8D64B2"/>
     <w:multiLevelType w:val="multilevel"/>
     <w:tmpl w:val="A544C5CC"/>
@@ -29947,7 +30514,7 @@
       </w:pPr>
     </w:lvl>
   </w:abstractNum>
-  <w:abstractNum w:abstractNumId="107" w15:restartNumberingAfterBreak="0">
+  <w:abstractNum w:abstractNumId="109" w15:restartNumberingAfterBreak="0">
     <w:nsid w:val="4E9736E7"/>
     <w:multiLevelType w:val="multilevel"/>
     <w:tmpl w:val="EE54AD12"/>
@@ -30092,7 +30659,7 @@
       </w:rPr>
     </w:lvl>
   </w:abstractNum>
-  <w:abstractNum w:abstractNumId="108" w15:restartNumberingAfterBreak="0">
+  <w:abstractNum w:abstractNumId="110" w15:restartNumberingAfterBreak="0">
     <w:nsid w:val="4F5418EC"/>
     <w:multiLevelType w:val="multilevel"/>
     <w:tmpl w:val="A96E6252"/>
@@ -30241,7 +30808,7 @@
       </w:rPr>
     </w:lvl>
   </w:abstractNum>
-  <w:abstractNum w:abstractNumId="109" w15:restartNumberingAfterBreak="0">
+  <w:abstractNum w:abstractNumId="111" w15:restartNumberingAfterBreak="0">
     <w:nsid w:val="4F634EED"/>
     <w:multiLevelType w:val="multilevel"/>
     <w:tmpl w:val="416C2FEE"/>
@@ -30390,7 +30957,7 @@
       </w:rPr>
     </w:lvl>
   </w:abstractNum>
-  <w:abstractNum w:abstractNumId="110" w15:restartNumberingAfterBreak="0">
+  <w:abstractNum w:abstractNumId="112" w15:restartNumberingAfterBreak="0">
     <w:nsid w:val="4F982EC8"/>
     <w:multiLevelType w:val="multilevel"/>
     <w:tmpl w:val="BE8470D2"/>
@@ -30539,7 +31106,7 @@
       </w:rPr>
     </w:lvl>
   </w:abstractNum>
-  <w:abstractNum w:abstractNumId="111" w15:restartNumberingAfterBreak="0">
+  <w:abstractNum w:abstractNumId="113" w15:restartNumberingAfterBreak="0">
     <w:nsid w:val="4FDD175D"/>
     <w:multiLevelType w:val="multilevel"/>
     <w:tmpl w:val="13AAA2BE"/>
@@ -30688,7 +31255,7 @@
       </w:rPr>
     </w:lvl>
   </w:abstractNum>
-  <w:abstractNum w:abstractNumId="112" w15:restartNumberingAfterBreak="0">
+  <w:abstractNum w:abstractNumId="114" w15:restartNumberingAfterBreak="0">
     <w:nsid w:val="50087C09"/>
     <w:multiLevelType w:val="multilevel"/>
     <w:tmpl w:val="8E9676FA"/>
@@ -30837,7 +31404,7 @@
       </w:rPr>
     </w:lvl>
   </w:abstractNum>
-  <w:abstractNum w:abstractNumId="113" w15:restartNumberingAfterBreak="0">
+  <w:abstractNum w:abstractNumId="115" w15:restartNumberingAfterBreak="0">
     <w:nsid w:val="53646623"/>
     <w:multiLevelType w:val="multilevel"/>
     <w:tmpl w:val="347A9EC4"/>
@@ -30950,7 +31517,7 @@
       </w:pPr>
     </w:lvl>
   </w:abstractNum>
-  <w:abstractNum w:abstractNumId="114" w15:restartNumberingAfterBreak="0">
+  <w:abstractNum w:abstractNumId="116" w15:restartNumberingAfterBreak="0">
     <w:nsid w:val="544477C9"/>
     <w:multiLevelType w:val="multilevel"/>
     <w:tmpl w:val="747ADC06"/>
@@ -31099,7 +31666,7 @@
       </w:rPr>
     </w:lvl>
   </w:abstractNum>
-  <w:abstractNum w:abstractNumId="115" w15:restartNumberingAfterBreak="0">
+  <w:abstractNum w:abstractNumId="117" w15:restartNumberingAfterBreak="0">
     <w:nsid w:val="545339C5"/>
     <w:multiLevelType w:val="multilevel"/>
     <w:tmpl w:val="B7C2311A"/>
@@ -31214,7 +31781,7 @@
       </w:rPr>
     </w:lvl>
   </w:abstractNum>
-  <w:abstractNum w:abstractNumId="116" w15:restartNumberingAfterBreak="0">
+  <w:abstractNum w:abstractNumId="118" w15:restartNumberingAfterBreak="0">
     <w:nsid w:val="556138C4"/>
     <w:multiLevelType w:val="multilevel"/>
     <w:tmpl w:val="097AEDA0"/>
@@ -31363,7 +31930,7 @@
       </w:rPr>
     </w:lvl>
   </w:abstractNum>
-  <w:abstractNum w:abstractNumId="117" w15:restartNumberingAfterBreak="0">
+  <w:abstractNum w:abstractNumId="119" w15:restartNumberingAfterBreak="0">
     <w:nsid w:val="56D14B31"/>
     <w:multiLevelType w:val="multilevel"/>
     <w:tmpl w:val="D9A66268"/>
@@ -31512,7 +32079,7 @@
       </w:rPr>
     </w:lvl>
   </w:abstractNum>
-  <w:abstractNum w:abstractNumId="118" w15:restartNumberingAfterBreak="0">
+  <w:abstractNum w:abstractNumId="120" w15:restartNumberingAfterBreak="0">
     <w:nsid w:val="56F5351E"/>
     <w:multiLevelType w:val="multilevel"/>
     <w:tmpl w:val="013A77EE"/>
@@ -31661,7 +32228,7 @@
       </w:rPr>
     </w:lvl>
   </w:abstractNum>
-  <w:abstractNum w:abstractNumId="119" w15:restartNumberingAfterBreak="0">
+  <w:abstractNum w:abstractNumId="121" w15:restartNumberingAfterBreak="0">
     <w:nsid w:val="57250009"/>
     <w:multiLevelType w:val="multilevel"/>
     <w:tmpl w:val="1D104D00"/>
@@ -31810,7 +32377,7 @@
       </w:rPr>
     </w:lvl>
   </w:abstractNum>
-  <w:abstractNum w:abstractNumId="120" w15:restartNumberingAfterBreak="0">
+  <w:abstractNum w:abstractNumId="122" w15:restartNumberingAfterBreak="0">
     <w:nsid w:val="57EE020A"/>
     <w:multiLevelType w:val="multilevel"/>
     <w:tmpl w:val="F4AC2314"/>
@@ -31959,7 +32526,7 @@
       </w:rPr>
     </w:lvl>
   </w:abstractNum>
-  <w:abstractNum w:abstractNumId="121" w15:restartNumberingAfterBreak="0">
+  <w:abstractNum w:abstractNumId="123" w15:restartNumberingAfterBreak="0">
     <w:nsid w:val="582E2BE7"/>
     <w:multiLevelType w:val="multilevel"/>
     <w:tmpl w:val="15106376"/>
@@ -32108,7 +32675,7 @@
       </w:rPr>
     </w:lvl>
   </w:abstractNum>
-  <w:abstractNum w:abstractNumId="122" w15:restartNumberingAfterBreak="0">
+  <w:abstractNum w:abstractNumId="124" w15:restartNumberingAfterBreak="0">
     <w:nsid w:val="58864CBA"/>
     <w:multiLevelType w:val="multilevel"/>
     <w:tmpl w:val="9D1CC354"/>
@@ -32221,7 +32788,7 @@
       </w:pPr>
     </w:lvl>
   </w:abstractNum>
-  <w:abstractNum w:abstractNumId="123" w15:restartNumberingAfterBreak="0">
+  <w:abstractNum w:abstractNumId="125" w15:restartNumberingAfterBreak="0">
     <w:nsid w:val="599B6786"/>
     <w:multiLevelType w:val="multilevel"/>
     <w:tmpl w:val="A0AC6E64"/>
@@ -32370,7 +32937,7 @@
       </w:rPr>
     </w:lvl>
   </w:abstractNum>
-  <w:abstractNum w:abstractNumId="124" w15:restartNumberingAfterBreak="0">
+  <w:abstractNum w:abstractNumId="126" w15:restartNumberingAfterBreak="0">
     <w:nsid w:val="5AA10CA1"/>
     <w:multiLevelType w:val="multilevel"/>
     <w:tmpl w:val="6D56D9E4"/>
@@ -32519,7 +33086,7 @@
       </w:rPr>
     </w:lvl>
   </w:abstractNum>
-  <w:abstractNum w:abstractNumId="125" w15:restartNumberingAfterBreak="0">
+  <w:abstractNum w:abstractNumId="127" w15:restartNumberingAfterBreak="0">
     <w:nsid w:val="5B977A5E"/>
     <w:multiLevelType w:val="multilevel"/>
     <w:tmpl w:val="5FC20F70"/>
@@ -32664,7 +33231,7 @@
       </w:rPr>
     </w:lvl>
   </w:abstractNum>
-  <w:abstractNum w:abstractNumId="126" w15:restartNumberingAfterBreak="0">
+  <w:abstractNum w:abstractNumId="128" w15:restartNumberingAfterBreak="0">
     <w:nsid w:val="5BB448A3"/>
     <w:multiLevelType w:val="multilevel"/>
     <w:tmpl w:val="B2C47F66"/>
@@ -32809,7 +33376,7 @@
       </w:rPr>
     </w:lvl>
   </w:abstractNum>
-  <w:abstractNum w:abstractNumId="127" w15:restartNumberingAfterBreak="0">
+  <w:abstractNum w:abstractNumId="129" w15:restartNumberingAfterBreak="0">
     <w:nsid w:val="5C334A80"/>
     <w:multiLevelType w:val="multilevel"/>
     <w:tmpl w:val="A0E4F200"/>
@@ -32954,7 +33521,7 @@
       </w:rPr>
     </w:lvl>
   </w:abstractNum>
-  <w:abstractNum w:abstractNumId="128" w15:restartNumberingAfterBreak="0">
+  <w:abstractNum w:abstractNumId="130" w15:restartNumberingAfterBreak="0">
     <w:nsid w:val="5D4F705A"/>
     <w:multiLevelType w:val="multilevel"/>
     <w:tmpl w:val="17D6F462"/>
@@ -33103,7 +33670,7 @@
       </w:rPr>
     </w:lvl>
   </w:abstractNum>
-  <w:abstractNum w:abstractNumId="129" w15:restartNumberingAfterBreak="0">
+  <w:abstractNum w:abstractNumId="131" w15:restartNumberingAfterBreak="0">
     <w:nsid w:val="5DCE672B"/>
     <w:multiLevelType w:val="multilevel"/>
     <w:tmpl w:val="33662F62"/>
@@ -33252,7 +33819,7 @@
       </w:rPr>
     </w:lvl>
   </w:abstractNum>
-  <w:abstractNum w:abstractNumId="130" w15:restartNumberingAfterBreak="0">
+  <w:abstractNum w:abstractNumId="132" w15:restartNumberingAfterBreak="0">
     <w:nsid w:val="5F201F90"/>
     <w:multiLevelType w:val="multilevel"/>
     <w:tmpl w:val="30B0567C"/>
@@ -33401,7 +33968,7 @@
       </w:rPr>
     </w:lvl>
   </w:abstractNum>
-  <w:abstractNum w:abstractNumId="131" w15:restartNumberingAfterBreak="0">
+  <w:abstractNum w:abstractNumId="133" w15:restartNumberingAfterBreak="0">
     <w:nsid w:val="5F2E2F15"/>
     <w:multiLevelType w:val="multilevel"/>
     <w:tmpl w:val="040A4746"/>
@@ -33550,7 +34117,7 @@
       </w:rPr>
     </w:lvl>
   </w:abstractNum>
-  <w:abstractNum w:abstractNumId="132" w15:restartNumberingAfterBreak="0">
+  <w:abstractNum w:abstractNumId="134" w15:restartNumberingAfterBreak="0">
     <w:nsid w:val="5F3A027F"/>
     <w:multiLevelType w:val="multilevel"/>
     <w:tmpl w:val="FCD05388"/>
@@ -33699,7 +34266,7 @@
       </w:rPr>
     </w:lvl>
   </w:abstractNum>
-  <w:abstractNum w:abstractNumId="133" w15:restartNumberingAfterBreak="0">
+  <w:abstractNum w:abstractNumId="135" w15:restartNumberingAfterBreak="0">
     <w:nsid w:val="5FCC71CC"/>
     <w:multiLevelType w:val="multilevel"/>
     <w:tmpl w:val="F0D6D104"/>
@@ -33848,7 +34415,7 @@
       </w:rPr>
     </w:lvl>
   </w:abstractNum>
-  <w:abstractNum w:abstractNumId="134" w15:restartNumberingAfterBreak="0">
+  <w:abstractNum w:abstractNumId="136" w15:restartNumberingAfterBreak="0">
     <w:nsid w:val="60C235F9"/>
     <w:multiLevelType w:val="multilevel"/>
     <w:tmpl w:val="CDE4506A"/>
@@ -33934,7 +34501,7 @@
       </w:pPr>
     </w:lvl>
   </w:abstractNum>
-  <w:abstractNum w:abstractNumId="135" w15:restartNumberingAfterBreak="0">
+  <w:abstractNum w:abstractNumId="137" w15:restartNumberingAfterBreak="0">
     <w:nsid w:val="61607C2D"/>
     <w:multiLevelType w:val="multilevel"/>
     <w:tmpl w:val="60DC4B7C"/>
@@ -34051,7 +34618,7 @@
       </w:pPr>
     </w:lvl>
   </w:abstractNum>
-  <w:abstractNum w:abstractNumId="136" w15:restartNumberingAfterBreak="0">
+  <w:abstractNum w:abstractNumId="138" w15:restartNumberingAfterBreak="0">
     <w:nsid w:val="61CB718A"/>
     <w:multiLevelType w:val="multilevel"/>
     <w:tmpl w:val="20000021"/>
@@ -34164,7 +34731,7 @@
       </w:rPr>
     </w:lvl>
   </w:abstractNum>
-  <w:abstractNum w:abstractNumId="137" w15:restartNumberingAfterBreak="0">
+  <w:abstractNum w:abstractNumId="139" w15:restartNumberingAfterBreak="0">
     <w:nsid w:val="626A40D3"/>
     <w:multiLevelType w:val="multilevel"/>
     <w:tmpl w:val="3BE894E8"/>
@@ -34313,7 +34880,7 @@
       </w:rPr>
     </w:lvl>
   </w:abstractNum>
-  <w:abstractNum w:abstractNumId="138" w15:restartNumberingAfterBreak="0">
+  <w:abstractNum w:abstractNumId="140" w15:restartNumberingAfterBreak="0">
     <w:nsid w:val="62812AB3"/>
     <w:multiLevelType w:val="multilevel"/>
     <w:tmpl w:val="BCC2F48A"/>
@@ -34458,7 +35025,7 @@
       </w:rPr>
     </w:lvl>
   </w:abstractNum>
-  <w:abstractNum w:abstractNumId="139" w15:restartNumberingAfterBreak="0">
+  <w:abstractNum w:abstractNumId="141" w15:restartNumberingAfterBreak="0">
     <w:nsid w:val="62E949E2"/>
     <w:multiLevelType w:val="multilevel"/>
     <w:tmpl w:val="680CF5C6"/>
@@ -34607,7 +35174,7 @@
       </w:rPr>
     </w:lvl>
   </w:abstractNum>
-  <w:abstractNum w:abstractNumId="140" w15:restartNumberingAfterBreak="0">
+  <w:abstractNum w:abstractNumId="142" w15:restartNumberingAfterBreak="0">
     <w:nsid w:val="63127A02"/>
     <w:multiLevelType w:val="multilevel"/>
     <w:tmpl w:val="F8323E06"/>
@@ -34756,7 +35323,7 @@
       </w:rPr>
     </w:lvl>
   </w:abstractNum>
-  <w:abstractNum w:abstractNumId="141" w15:restartNumberingAfterBreak="0">
+  <w:abstractNum w:abstractNumId="143" w15:restartNumberingAfterBreak="0">
     <w:nsid w:val="63CA08DC"/>
     <w:multiLevelType w:val="multilevel"/>
     <w:tmpl w:val="FC4CB1CE"/>
@@ -34905,7 +35472,7 @@
       </w:rPr>
     </w:lvl>
   </w:abstractNum>
-  <w:abstractNum w:abstractNumId="142" w15:restartNumberingAfterBreak="0">
+  <w:abstractNum w:abstractNumId="144" w15:restartNumberingAfterBreak="0">
     <w:nsid w:val="65675DE4"/>
     <w:multiLevelType w:val="multilevel"/>
     <w:tmpl w:val="8C063E36"/>
@@ -35054,7 +35621,7 @@
       </w:rPr>
     </w:lvl>
   </w:abstractNum>
-  <w:abstractNum w:abstractNumId="143" w15:restartNumberingAfterBreak="0">
+  <w:abstractNum w:abstractNumId="145" w15:restartNumberingAfterBreak="0">
     <w:nsid w:val="67504652"/>
     <w:multiLevelType w:val="hybridMultilevel"/>
     <w:tmpl w:val="1BD07068"/>
@@ -35140,7 +35707,7 @@
       </w:pPr>
     </w:lvl>
   </w:abstractNum>
-  <w:abstractNum w:abstractNumId="144" w15:restartNumberingAfterBreak="0">
+  <w:abstractNum w:abstractNumId="146" w15:restartNumberingAfterBreak="0">
     <w:nsid w:val="678F3836"/>
     <w:multiLevelType w:val="multilevel"/>
     <w:tmpl w:val="6B7CE15A"/>
@@ -35253,7 +35820,7 @@
       </w:pPr>
     </w:lvl>
   </w:abstractNum>
-  <w:abstractNum w:abstractNumId="145" w15:restartNumberingAfterBreak="0">
+  <w:abstractNum w:abstractNumId="147" w15:restartNumberingAfterBreak="0">
     <w:nsid w:val="68D16F39"/>
     <w:multiLevelType w:val="multilevel"/>
     <w:tmpl w:val="5726B3A6"/>
@@ -35398,7 +35965,7 @@
       </w:rPr>
     </w:lvl>
   </w:abstractNum>
-  <w:abstractNum w:abstractNumId="146" w15:restartNumberingAfterBreak="0">
+  <w:abstractNum w:abstractNumId="148" w15:restartNumberingAfterBreak="0">
     <w:nsid w:val="690404D4"/>
     <w:multiLevelType w:val="multilevel"/>
     <w:tmpl w:val="B7C8FFCE"/>
@@ -35547,7 +36114,7 @@
       </w:rPr>
     </w:lvl>
   </w:abstractNum>
-  <w:abstractNum w:abstractNumId="147" w15:restartNumberingAfterBreak="0">
+  <w:abstractNum w:abstractNumId="149" w15:restartNumberingAfterBreak="0">
     <w:nsid w:val="69471A58"/>
     <w:multiLevelType w:val="multilevel"/>
     <w:tmpl w:val="D62E6514"/>
@@ -35696,7 +36263,7 @@
       </w:rPr>
     </w:lvl>
   </w:abstractNum>
-  <w:abstractNum w:abstractNumId="148" w15:restartNumberingAfterBreak="0">
+  <w:abstractNum w:abstractNumId="150" w15:restartNumberingAfterBreak="0">
     <w:nsid w:val="6A14456F"/>
     <w:multiLevelType w:val="multilevel"/>
     <w:tmpl w:val="F26CB794"/>
@@ -35845,7 +36412,7 @@
       </w:rPr>
     </w:lvl>
   </w:abstractNum>
-  <w:abstractNum w:abstractNumId="149" w15:restartNumberingAfterBreak="0">
+  <w:abstractNum w:abstractNumId="151" w15:restartNumberingAfterBreak="0">
     <w:nsid w:val="6AAE7596"/>
     <w:multiLevelType w:val="multilevel"/>
     <w:tmpl w:val="C022603C"/>
@@ -35990,7 +36557,7 @@
       </w:rPr>
     </w:lvl>
   </w:abstractNum>
-  <w:abstractNum w:abstractNumId="150" w15:restartNumberingAfterBreak="0">
+  <w:abstractNum w:abstractNumId="152" w15:restartNumberingAfterBreak="0">
     <w:nsid w:val="6BFE5105"/>
     <w:multiLevelType w:val="multilevel"/>
     <w:tmpl w:val="C7BE79D4"/>
@@ -36135,7 +36702,7 @@
       </w:rPr>
     </w:lvl>
   </w:abstractNum>
-  <w:abstractNum w:abstractNumId="151" w15:restartNumberingAfterBreak="0">
+  <w:abstractNum w:abstractNumId="153" w15:restartNumberingAfterBreak="0">
     <w:nsid w:val="6C1700F2"/>
     <w:multiLevelType w:val="multilevel"/>
     <w:tmpl w:val="CA34BA1A"/>
@@ -36284,7 +36851,7 @@
       </w:rPr>
     </w:lvl>
   </w:abstractNum>
-  <w:abstractNum w:abstractNumId="152" w15:restartNumberingAfterBreak="0">
+  <w:abstractNum w:abstractNumId="154" w15:restartNumberingAfterBreak="0">
     <w:nsid w:val="6C653EBA"/>
     <w:multiLevelType w:val="multilevel"/>
     <w:tmpl w:val="50068D36"/>
@@ -36433,7 +37000,7 @@
       </w:rPr>
     </w:lvl>
   </w:abstractNum>
-  <w:abstractNum w:abstractNumId="153" w15:restartNumberingAfterBreak="0">
+  <w:abstractNum w:abstractNumId="155" w15:restartNumberingAfterBreak="0">
     <w:nsid w:val="6CEB46A5"/>
     <w:multiLevelType w:val="multilevel"/>
     <w:tmpl w:val="DAA8FB58"/>
@@ -36582,7 +37149,7 @@
       </w:rPr>
     </w:lvl>
   </w:abstractNum>
-  <w:abstractNum w:abstractNumId="154" w15:restartNumberingAfterBreak="0">
+  <w:abstractNum w:abstractNumId="156" w15:restartNumberingAfterBreak="0">
     <w:nsid w:val="6E157ACE"/>
     <w:multiLevelType w:val="multilevel"/>
     <w:tmpl w:val="FF54C034"/>
@@ -36731,7 +37298,7 @@
       </w:rPr>
     </w:lvl>
   </w:abstractNum>
-  <w:abstractNum w:abstractNumId="155" w15:restartNumberingAfterBreak="0">
+  <w:abstractNum w:abstractNumId="157" w15:restartNumberingAfterBreak="0">
     <w:nsid w:val="6E7E18FC"/>
     <w:multiLevelType w:val="multilevel"/>
     <w:tmpl w:val="4D9240FA"/>
@@ -36880,7 +37447,7 @@
       </w:rPr>
     </w:lvl>
   </w:abstractNum>
-  <w:abstractNum w:abstractNumId="156" w15:restartNumberingAfterBreak="0">
+  <w:abstractNum w:abstractNumId="158" w15:restartNumberingAfterBreak="0">
     <w:nsid w:val="6EA626EB"/>
     <w:multiLevelType w:val="multilevel"/>
     <w:tmpl w:val="902C5626"/>
@@ -36993,7 +37560,7 @@
       </w:pPr>
     </w:lvl>
   </w:abstractNum>
-  <w:abstractNum w:abstractNumId="157" w15:restartNumberingAfterBreak="0">
+  <w:abstractNum w:abstractNumId="159" w15:restartNumberingAfterBreak="0">
     <w:nsid w:val="6ECF3DF1"/>
     <w:multiLevelType w:val="multilevel"/>
     <w:tmpl w:val="FACE6F04"/>
@@ -37106,7 +37673,7 @@
       </w:pPr>
     </w:lvl>
   </w:abstractNum>
-  <w:abstractNum w:abstractNumId="158" w15:restartNumberingAfterBreak="0">
+  <w:abstractNum w:abstractNumId="160" w15:restartNumberingAfterBreak="0">
     <w:nsid w:val="6F0F67EA"/>
     <w:multiLevelType w:val="multilevel"/>
     <w:tmpl w:val="A4AA76AC"/>
@@ -37255,7 +37822,7 @@
       </w:rPr>
     </w:lvl>
   </w:abstractNum>
-  <w:abstractNum w:abstractNumId="159" w15:restartNumberingAfterBreak="0">
+  <w:abstractNum w:abstractNumId="161" w15:restartNumberingAfterBreak="0">
     <w:nsid w:val="6F2B043F"/>
     <w:multiLevelType w:val="multilevel"/>
     <w:tmpl w:val="3F6453FC"/>
@@ -37404,7 +37971,7 @@
       </w:rPr>
     </w:lvl>
   </w:abstractNum>
-  <w:abstractNum w:abstractNumId="160" w15:restartNumberingAfterBreak="0">
+  <w:abstractNum w:abstractNumId="162" w15:restartNumberingAfterBreak="0">
     <w:nsid w:val="6F6F338C"/>
     <w:multiLevelType w:val="multilevel"/>
     <w:tmpl w:val="804419F2"/>
@@ -37553,7 +38120,7 @@
       </w:rPr>
     </w:lvl>
   </w:abstractNum>
-  <w:abstractNum w:abstractNumId="161" w15:restartNumberingAfterBreak="0">
+  <w:abstractNum w:abstractNumId="163" w15:restartNumberingAfterBreak="0">
     <w:nsid w:val="701A6929"/>
     <w:multiLevelType w:val="multilevel"/>
     <w:tmpl w:val="4322C9B0"/>
@@ -37702,7 +38269,7 @@
       </w:rPr>
     </w:lvl>
   </w:abstractNum>
-  <w:abstractNum w:abstractNumId="162" w15:restartNumberingAfterBreak="0">
+  <w:abstractNum w:abstractNumId="164" w15:restartNumberingAfterBreak="0">
     <w:nsid w:val="70745341"/>
     <w:multiLevelType w:val="multilevel"/>
     <w:tmpl w:val="6BC4A072"/>
@@ -37851,7 +38418,7 @@
       </w:rPr>
     </w:lvl>
   </w:abstractNum>
-  <w:abstractNum w:abstractNumId="163" w15:restartNumberingAfterBreak="0">
+  <w:abstractNum w:abstractNumId="165" w15:restartNumberingAfterBreak="0">
     <w:nsid w:val="708D3043"/>
     <w:multiLevelType w:val="multilevel"/>
     <w:tmpl w:val="4A18F0DE"/>
@@ -37996,7 +38563,7 @@
       </w:rPr>
     </w:lvl>
   </w:abstractNum>
-  <w:abstractNum w:abstractNumId="164" w15:restartNumberingAfterBreak="0">
+  <w:abstractNum w:abstractNumId="166" w15:restartNumberingAfterBreak="0">
     <w:nsid w:val="721B4B89"/>
     <w:multiLevelType w:val="hybridMultilevel"/>
     <w:tmpl w:val="132E3A0E"/>
@@ -38109,7 +38676,7 @@
       </w:rPr>
     </w:lvl>
   </w:abstractNum>
-  <w:abstractNum w:abstractNumId="165" w15:restartNumberingAfterBreak="0">
+  <w:abstractNum w:abstractNumId="167" w15:restartNumberingAfterBreak="0">
     <w:nsid w:val="72BC60E0"/>
     <w:multiLevelType w:val="multilevel"/>
     <w:tmpl w:val="75E41862"/>
@@ -38258,7 +38825,7 @@
       </w:rPr>
     </w:lvl>
   </w:abstractNum>
-  <w:abstractNum w:abstractNumId="166" w15:restartNumberingAfterBreak="0">
+  <w:abstractNum w:abstractNumId="168" w15:restartNumberingAfterBreak="0">
     <w:nsid w:val="748A33F3"/>
     <w:multiLevelType w:val="multilevel"/>
     <w:tmpl w:val="7E7CEC88"/>
@@ -38407,7 +38974,7 @@
       </w:rPr>
     </w:lvl>
   </w:abstractNum>
-  <w:abstractNum w:abstractNumId="167" w15:restartNumberingAfterBreak="0">
+  <w:abstractNum w:abstractNumId="169" w15:restartNumberingAfterBreak="0">
     <w:nsid w:val="74EB3C0F"/>
     <w:multiLevelType w:val="multilevel"/>
     <w:tmpl w:val="B4C68614"/>
@@ -38556,7 +39123,7 @@
       </w:rPr>
     </w:lvl>
   </w:abstractNum>
-  <w:abstractNum w:abstractNumId="168" w15:restartNumberingAfterBreak="0">
+  <w:abstractNum w:abstractNumId="170" w15:restartNumberingAfterBreak="0">
     <w:nsid w:val="76492B49"/>
     <w:multiLevelType w:val="multilevel"/>
     <w:tmpl w:val="82F8E03A"/>
@@ -38705,7 +39272,7 @@
       </w:rPr>
     </w:lvl>
   </w:abstractNum>
-  <w:abstractNum w:abstractNumId="169" w15:restartNumberingAfterBreak="0">
+  <w:abstractNum w:abstractNumId="171" w15:restartNumberingAfterBreak="0">
     <w:nsid w:val="76E91FB3"/>
     <w:multiLevelType w:val="multilevel"/>
     <w:tmpl w:val="AA4CA698"/>
@@ -38854,7 +39421,7 @@
       </w:rPr>
     </w:lvl>
   </w:abstractNum>
-  <w:abstractNum w:abstractNumId="170" w15:restartNumberingAfterBreak="0">
+  <w:abstractNum w:abstractNumId="172" w15:restartNumberingAfterBreak="0">
     <w:nsid w:val="78371F46"/>
     <w:multiLevelType w:val="multilevel"/>
     <w:tmpl w:val="CDE4506A"/>
@@ -38940,7 +39507,7 @@
       </w:pPr>
     </w:lvl>
   </w:abstractNum>
-  <w:abstractNum w:abstractNumId="171" w15:restartNumberingAfterBreak="0">
+  <w:abstractNum w:abstractNumId="173" w15:restartNumberingAfterBreak="0">
     <w:nsid w:val="79F171F1"/>
     <w:multiLevelType w:val="multilevel"/>
     <w:tmpl w:val="FA3C621C"/>
@@ -39089,7 +39656,7 @@
       </w:rPr>
     </w:lvl>
   </w:abstractNum>
-  <w:abstractNum w:abstractNumId="172" w15:restartNumberingAfterBreak="0">
+  <w:abstractNum w:abstractNumId="174" w15:restartNumberingAfterBreak="0">
     <w:nsid w:val="7A030F64"/>
     <w:multiLevelType w:val="multilevel"/>
     <w:tmpl w:val="58E82760"/>
@@ -39238,7 +39805,7 @@
       </w:rPr>
     </w:lvl>
   </w:abstractNum>
-  <w:abstractNum w:abstractNumId="173" w15:restartNumberingAfterBreak="0">
+  <w:abstractNum w:abstractNumId="175" w15:restartNumberingAfterBreak="0">
     <w:nsid w:val="7AAD195B"/>
     <w:multiLevelType w:val="multilevel"/>
     <w:tmpl w:val="E8E8A792"/>
@@ -39387,7 +39954,7 @@
       </w:rPr>
     </w:lvl>
   </w:abstractNum>
-  <w:abstractNum w:abstractNumId="174" w15:restartNumberingAfterBreak="0">
+  <w:abstractNum w:abstractNumId="176" w15:restartNumberingAfterBreak="0">
     <w:nsid w:val="7BBF3328"/>
     <w:multiLevelType w:val="multilevel"/>
     <w:tmpl w:val="8CCAA84E"/>
@@ -39536,7 +40103,7 @@
       </w:rPr>
     </w:lvl>
   </w:abstractNum>
-  <w:abstractNum w:abstractNumId="175" w15:restartNumberingAfterBreak="0">
+  <w:abstractNum w:abstractNumId="177" w15:restartNumberingAfterBreak="0">
     <w:nsid w:val="7D101317"/>
     <w:multiLevelType w:val="multilevel"/>
     <w:tmpl w:val="0712A5B4"/>
@@ -39681,7 +40248,7 @@
       </w:rPr>
     </w:lvl>
   </w:abstractNum>
-  <w:abstractNum w:abstractNumId="176" w15:restartNumberingAfterBreak="0">
+  <w:abstractNum w:abstractNumId="178" w15:restartNumberingAfterBreak="0">
     <w:nsid w:val="7D237867"/>
     <w:multiLevelType w:val="multilevel"/>
     <w:tmpl w:val="9CF84E9E"/>
@@ -39830,7 +40397,7 @@
       </w:rPr>
     </w:lvl>
   </w:abstractNum>
-  <w:abstractNum w:abstractNumId="177" w15:restartNumberingAfterBreak="0">
+  <w:abstractNum w:abstractNumId="179" w15:restartNumberingAfterBreak="0">
     <w:nsid w:val="7E3E6FD7"/>
     <w:multiLevelType w:val="multilevel"/>
     <w:tmpl w:val="9B102BEC"/>
@@ -39975,7 +40542,7 @@
       </w:rPr>
     </w:lvl>
   </w:abstractNum>
-  <w:abstractNum w:abstractNumId="178" w15:restartNumberingAfterBreak="0">
+  <w:abstractNum w:abstractNumId="180" w15:restartNumberingAfterBreak="0">
     <w:nsid w:val="7F3555B7"/>
     <w:multiLevelType w:val="hybridMultilevel"/>
     <w:tmpl w:val="3962D4B0"/>
@@ -40090,34 +40657,34 @@
     </w:lvl>
   </w:abstractNum>
   <w:num w:numId="1" w16cid:durableId="1091049933">
-    <w:abstractNumId w:val="46"/>
+    <w:abstractNumId w:val="47"/>
   </w:num>
   <w:num w:numId="2" w16cid:durableId="1891376967">
     <w:abstractNumId w:val="6"/>
   </w:num>
   <w:num w:numId="3" w16cid:durableId="551844226">
-    <w:abstractNumId w:val="40"/>
+    <w:abstractNumId w:val="41"/>
   </w:num>
   <w:num w:numId="4" w16cid:durableId="2091463282">
-    <w:abstractNumId w:val="96"/>
+    <w:abstractNumId w:val="98"/>
   </w:num>
   <w:num w:numId="5" w16cid:durableId="1636180735">
     <w:abstractNumId w:val="14"/>
   </w:num>
   <w:num w:numId="6" w16cid:durableId="282421069">
-    <w:abstractNumId w:val="101"/>
+    <w:abstractNumId w:val="103"/>
   </w:num>
   <w:num w:numId="7" w16cid:durableId="2076463795">
-    <w:abstractNumId w:val="112"/>
+    <w:abstractNumId w:val="114"/>
   </w:num>
   <w:num w:numId="8" w16cid:durableId="259408934">
-    <w:abstractNumId w:val="167"/>
+    <w:abstractNumId w:val="169"/>
   </w:num>
   <w:num w:numId="9" w16cid:durableId="1226378873">
-    <w:abstractNumId w:val="47"/>
+    <w:abstractNumId w:val="48"/>
   </w:num>
   <w:num w:numId="10" w16cid:durableId="1369642100">
-    <w:abstractNumId w:val="47"/>
+    <w:abstractNumId w:val="48"/>
     <w:lvlOverride w:ilvl="1">
       <w:lvl w:ilvl="1">
         <w:numFmt w:val="decimal"/>
@@ -40127,31 +40694,31 @@
     </w:lvlOverride>
   </w:num>
   <w:num w:numId="11" w16cid:durableId="1229724436">
-    <w:abstractNumId w:val="33"/>
+    <w:abstractNumId w:val="34"/>
   </w:num>
   <w:num w:numId="12" w16cid:durableId="1840152305">
-    <w:abstractNumId w:val="84"/>
+    <w:abstractNumId w:val="86"/>
   </w:num>
   <w:num w:numId="13" w16cid:durableId="963852690">
-    <w:abstractNumId w:val="100"/>
+    <w:abstractNumId w:val="102"/>
   </w:num>
   <w:num w:numId="14" w16cid:durableId="366876967">
-    <w:abstractNumId w:val="129"/>
+    <w:abstractNumId w:val="131"/>
   </w:num>
   <w:num w:numId="15" w16cid:durableId="1976878">
-    <w:abstractNumId w:val="66"/>
+    <w:abstractNumId w:val="68"/>
   </w:num>
   <w:num w:numId="16" w16cid:durableId="347341951">
-    <w:abstractNumId w:val="151"/>
+    <w:abstractNumId w:val="153"/>
   </w:num>
   <w:num w:numId="17" w16cid:durableId="174730376">
-    <w:abstractNumId w:val="69"/>
+    <w:abstractNumId w:val="71"/>
   </w:num>
   <w:num w:numId="18" w16cid:durableId="572204590">
-    <w:abstractNumId w:val="42"/>
+    <w:abstractNumId w:val="43"/>
   </w:num>
   <w:num w:numId="19" w16cid:durableId="842665824">
-    <w:abstractNumId w:val="139"/>
+    <w:abstractNumId w:val="141"/>
   </w:num>
   <w:num w:numId="20" w16cid:durableId="529881770">
     <w:abstractNumId w:val="13"/>
@@ -40160,67 +40727,67 @@
     <w:abstractNumId w:val="3"/>
   </w:num>
   <w:num w:numId="22" w16cid:durableId="1993213557">
-    <w:abstractNumId w:val="161"/>
+    <w:abstractNumId w:val="163"/>
   </w:num>
   <w:num w:numId="23" w16cid:durableId="1304316451">
-    <w:abstractNumId w:val="160"/>
+    <w:abstractNumId w:val="162"/>
   </w:num>
   <w:num w:numId="24" w16cid:durableId="53241634">
-    <w:abstractNumId w:val="20"/>
+    <w:abstractNumId w:val="21"/>
   </w:num>
   <w:num w:numId="25" w16cid:durableId="1938901936">
-    <w:abstractNumId w:val="90"/>
+    <w:abstractNumId w:val="92"/>
   </w:num>
   <w:num w:numId="26" w16cid:durableId="874347523">
-    <w:abstractNumId w:val="113"/>
+    <w:abstractNumId w:val="115"/>
   </w:num>
   <w:num w:numId="27" w16cid:durableId="155075910">
-    <w:abstractNumId w:val="155"/>
+    <w:abstractNumId w:val="157"/>
   </w:num>
   <w:num w:numId="28" w16cid:durableId="411590594">
-    <w:abstractNumId w:val="142"/>
+    <w:abstractNumId w:val="144"/>
   </w:num>
   <w:num w:numId="29" w16cid:durableId="1347831502">
-    <w:abstractNumId w:val="124"/>
+    <w:abstractNumId w:val="126"/>
   </w:num>
   <w:num w:numId="30" w16cid:durableId="1653410153">
-    <w:abstractNumId w:val="169"/>
+    <w:abstractNumId w:val="171"/>
   </w:num>
   <w:num w:numId="31" w16cid:durableId="1410038242">
-    <w:abstractNumId w:val="70"/>
+    <w:abstractNumId w:val="72"/>
   </w:num>
   <w:num w:numId="32" w16cid:durableId="139612234">
-    <w:abstractNumId w:val="143"/>
+    <w:abstractNumId w:val="145"/>
   </w:num>
   <w:num w:numId="33" w16cid:durableId="1684935223">
-    <w:abstractNumId w:val="28"/>
+    <w:abstractNumId w:val="29"/>
   </w:num>
   <w:num w:numId="34" w16cid:durableId="1177040639">
     <w:abstractNumId w:val="15"/>
   </w:num>
   <w:num w:numId="35" w16cid:durableId="588121372">
-    <w:abstractNumId w:val="50"/>
+    <w:abstractNumId w:val="51"/>
   </w:num>
   <w:num w:numId="36" w16cid:durableId="2050915618">
-    <w:abstractNumId w:val="136"/>
+    <w:abstractNumId w:val="138"/>
   </w:num>
   <w:num w:numId="37" w16cid:durableId="1122849457">
     <w:abstractNumId w:val="7"/>
   </w:num>
   <w:num w:numId="38" w16cid:durableId="1578513027">
-    <w:abstractNumId w:val="26"/>
+    <w:abstractNumId w:val="27"/>
   </w:num>
   <w:num w:numId="39" w16cid:durableId="1787656889">
-    <w:abstractNumId w:val="144"/>
+    <w:abstractNumId w:val="146"/>
   </w:num>
   <w:num w:numId="40" w16cid:durableId="218322439">
     <w:abstractNumId w:val="10"/>
   </w:num>
   <w:num w:numId="41" w16cid:durableId="1894349623">
-    <w:abstractNumId w:val="95"/>
+    <w:abstractNumId w:val="97"/>
   </w:num>
   <w:num w:numId="42" w16cid:durableId="166092097">
-    <w:abstractNumId w:val="94"/>
+    <w:abstractNumId w:val="96"/>
   </w:num>
   <w:num w:numId="43" w16cid:durableId="1476726297">
     <w:abstractNumId w:val="15"/>
@@ -40354,196 +40921,196 @@
     </w:lvlOverride>
   </w:num>
   <w:num w:numId="44" w16cid:durableId="1833568962">
-    <w:abstractNumId w:val="115"/>
+    <w:abstractNumId w:val="117"/>
   </w:num>
   <w:num w:numId="45" w16cid:durableId="448090535">
-    <w:abstractNumId w:val="148"/>
+    <w:abstractNumId w:val="150"/>
   </w:num>
   <w:num w:numId="46" w16cid:durableId="1379167433">
-    <w:abstractNumId w:val="134"/>
+    <w:abstractNumId w:val="136"/>
   </w:num>
   <w:num w:numId="47" w16cid:durableId="2053459618">
-    <w:abstractNumId w:val="170"/>
+    <w:abstractNumId w:val="172"/>
   </w:num>
   <w:num w:numId="48" w16cid:durableId="828594387">
-    <w:abstractNumId w:val="27"/>
+    <w:abstractNumId w:val="28"/>
   </w:num>
   <w:num w:numId="49" w16cid:durableId="504907251">
-    <w:abstractNumId w:val="83"/>
+    <w:abstractNumId w:val="85"/>
   </w:num>
   <w:num w:numId="50" w16cid:durableId="1387073572">
     <w:abstractNumId w:val="8"/>
   </w:num>
   <w:num w:numId="51" w16cid:durableId="1278366311">
-    <w:abstractNumId w:val="17"/>
+    <w:abstractNumId w:val="18"/>
   </w:num>
   <w:num w:numId="52" w16cid:durableId="1972594896">
-    <w:abstractNumId w:val="165"/>
+    <w:abstractNumId w:val="167"/>
   </w:num>
   <w:num w:numId="53" w16cid:durableId="106043802">
-    <w:abstractNumId w:val="64"/>
+    <w:abstractNumId w:val="66"/>
   </w:num>
   <w:num w:numId="54" w16cid:durableId="1954089898">
-    <w:abstractNumId w:val="102"/>
+    <w:abstractNumId w:val="104"/>
   </w:num>
   <w:num w:numId="55" w16cid:durableId="797990552">
-    <w:abstractNumId w:val="45"/>
+    <w:abstractNumId w:val="46"/>
   </w:num>
   <w:num w:numId="56" w16cid:durableId="1724207344">
-    <w:abstractNumId w:val="87"/>
+    <w:abstractNumId w:val="89"/>
   </w:num>
   <w:num w:numId="57" w16cid:durableId="1515150619">
-    <w:abstractNumId w:val="116"/>
+    <w:abstractNumId w:val="118"/>
   </w:num>
   <w:num w:numId="58" w16cid:durableId="2092502926">
-    <w:abstractNumId w:val="152"/>
+    <w:abstractNumId w:val="154"/>
   </w:num>
   <w:num w:numId="59" w16cid:durableId="599219652">
-    <w:abstractNumId w:val="174"/>
+    <w:abstractNumId w:val="176"/>
   </w:num>
   <w:num w:numId="60" w16cid:durableId="829711654">
-    <w:abstractNumId w:val="159"/>
+    <w:abstractNumId w:val="161"/>
   </w:num>
   <w:num w:numId="61" w16cid:durableId="866525934">
-    <w:abstractNumId w:val="54"/>
+    <w:abstractNumId w:val="55"/>
   </w:num>
   <w:num w:numId="62" w16cid:durableId="924192007">
-    <w:abstractNumId w:val="99"/>
+    <w:abstractNumId w:val="101"/>
   </w:num>
   <w:num w:numId="63" w16cid:durableId="858347787">
-    <w:abstractNumId w:val="105"/>
+    <w:abstractNumId w:val="107"/>
   </w:num>
   <w:num w:numId="64" w16cid:durableId="226497001">
     <w:abstractNumId w:val="11"/>
   </w:num>
   <w:num w:numId="65" w16cid:durableId="1820999170">
-    <w:abstractNumId w:val="72"/>
+    <w:abstractNumId w:val="74"/>
   </w:num>
   <w:num w:numId="66" w16cid:durableId="1536387868">
-    <w:abstractNumId w:val="29"/>
+    <w:abstractNumId w:val="30"/>
   </w:num>
   <w:num w:numId="67" w16cid:durableId="190149636">
-    <w:abstractNumId w:val="138"/>
+    <w:abstractNumId w:val="140"/>
   </w:num>
   <w:num w:numId="68" w16cid:durableId="1938097720">
     <w:abstractNumId w:val="0"/>
   </w:num>
   <w:num w:numId="69" w16cid:durableId="967394691">
-    <w:abstractNumId w:val="80"/>
+    <w:abstractNumId w:val="82"/>
   </w:num>
   <w:num w:numId="70" w16cid:durableId="1170564633">
-    <w:abstractNumId w:val="178"/>
+    <w:abstractNumId w:val="180"/>
   </w:num>
   <w:num w:numId="71" w16cid:durableId="787043302">
-    <w:abstractNumId w:val="171"/>
+    <w:abstractNumId w:val="173"/>
   </w:num>
   <w:num w:numId="72" w16cid:durableId="1027483225">
-    <w:abstractNumId w:val="31"/>
+    <w:abstractNumId w:val="32"/>
   </w:num>
   <w:num w:numId="73" w16cid:durableId="1687321085">
-    <w:abstractNumId w:val="63"/>
+    <w:abstractNumId w:val="65"/>
   </w:num>
   <w:num w:numId="74" w16cid:durableId="586304370">
-    <w:abstractNumId w:val="154"/>
+    <w:abstractNumId w:val="156"/>
   </w:num>
   <w:num w:numId="75" w16cid:durableId="182983013">
-    <w:abstractNumId w:val="21"/>
+    <w:abstractNumId w:val="22"/>
   </w:num>
   <w:num w:numId="76" w16cid:durableId="1021273563">
-    <w:abstractNumId w:val="127"/>
+    <w:abstractNumId w:val="129"/>
   </w:num>
   <w:num w:numId="77" w16cid:durableId="236596679">
-    <w:abstractNumId w:val="121"/>
+    <w:abstractNumId w:val="123"/>
   </w:num>
   <w:num w:numId="78" w16cid:durableId="1984001274">
-    <w:abstractNumId w:val="126"/>
+    <w:abstractNumId w:val="128"/>
   </w:num>
   <w:num w:numId="79" w16cid:durableId="1145855946">
-    <w:abstractNumId w:val="177"/>
+    <w:abstractNumId w:val="179"/>
   </w:num>
   <w:num w:numId="80" w16cid:durableId="1648046349">
-    <w:abstractNumId w:val="36"/>
+    <w:abstractNumId w:val="37"/>
   </w:num>
   <w:num w:numId="81" w16cid:durableId="1142237683">
     <w:abstractNumId w:val="2"/>
   </w:num>
   <w:num w:numId="82" w16cid:durableId="1128670715">
-    <w:abstractNumId w:val="56"/>
+    <w:abstractNumId w:val="57"/>
   </w:num>
   <w:num w:numId="83" w16cid:durableId="1230844203">
-    <w:abstractNumId w:val="117"/>
+    <w:abstractNumId w:val="119"/>
   </w:num>
   <w:num w:numId="84" w16cid:durableId="366295924">
-    <w:abstractNumId w:val="146"/>
+    <w:abstractNumId w:val="148"/>
   </w:num>
   <w:num w:numId="85" w16cid:durableId="1512992960">
-    <w:abstractNumId w:val="44"/>
+    <w:abstractNumId w:val="45"/>
   </w:num>
   <w:num w:numId="86" w16cid:durableId="1174108618">
-    <w:abstractNumId w:val="82"/>
+    <w:abstractNumId w:val="84"/>
   </w:num>
   <w:num w:numId="87" w16cid:durableId="940256432">
-    <w:abstractNumId w:val="18"/>
+    <w:abstractNumId w:val="19"/>
   </w:num>
   <w:num w:numId="88" w16cid:durableId="763720883">
-    <w:abstractNumId w:val="53"/>
+    <w:abstractNumId w:val="54"/>
   </w:num>
   <w:num w:numId="89" w16cid:durableId="114295844">
-    <w:abstractNumId w:val="120"/>
+    <w:abstractNumId w:val="122"/>
   </w:num>
   <w:num w:numId="90" w16cid:durableId="2126655385">
     <w:abstractNumId w:val="1"/>
   </w:num>
   <w:num w:numId="91" w16cid:durableId="1206086">
-    <w:abstractNumId w:val="107"/>
+    <w:abstractNumId w:val="109"/>
   </w:num>
   <w:num w:numId="92" w16cid:durableId="1228148012">
-    <w:abstractNumId w:val="81"/>
+    <w:abstractNumId w:val="83"/>
   </w:num>
   <w:num w:numId="93" w16cid:durableId="727416149">
+    <w:abstractNumId w:val="177"/>
+  </w:num>
+  <w:num w:numId="94" w16cid:durableId="2105105030">
     <w:abstractNumId w:val="175"/>
   </w:num>
-  <w:num w:numId="94" w16cid:durableId="2105105030">
-    <w:abstractNumId w:val="173"/>
-  </w:num>
   <w:num w:numId="95" w16cid:durableId="2101172144">
-    <w:abstractNumId w:val="41"/>
+    <w:abstractNumId w:val="42"/>
   </w:num>
   <w:num w:numId="96" w16cid:durableId="1918635734">
-    <w:abstractNumId w:val="61"/>
+    <w:abstractNumId w:val="63"/>
   </w:num>
   <w:num w:numId="97" w16cid:durableId="206265660">
-    <w:abstractNumId w:val="97"/>
+    <w:abstractNumId w:val="99"/>
   </w:num>
   <w:num w:numId="98" w16cid:durableId="2022127006">
-    <w:abstractNumId w:val="98"/>
+    <w:abstractNumId w:val="100"/>
   </w:num>
   <w:num w:numId="99" w16cid:durableId="92017578">
-    <w:abstractNumId w:val="58"/>
+    <w:abstractNumId w:val="59"/>
   </w:num>
   <w:num w:numId="100" w16cid:durableId="1289507547">
-    <w:abstractNumId w:val="141"/>
+    <w:abstractNumId w:val="143"/>
   </w:num>
   <w:num w:numId="101" w16cid:durableId="239797761">
-    <w:abstractNumId w:val="150"/>
+    <w:abstractNumId w:val="152"/>
   </w:num>
   <w:num w:numId="102" w16cid:durableId="137461560">
     <w:abstractNumId w:val="16"/>
   </w:num>
   <w:num w:numId="103" w16cid:durableId="1079446645">
-    <w:abstractNumId w:val="108"/>
+    <w:abstractNumId w:val="110"/>
   </w:num>
   <w:num w:numId="104" w16cid:durableId="1511600928">
-    <w:abstractNumId w:val="43"/>
+    <w:abstractNumId w:val="44"/>
   </w:num>
   <w:num w:numId="105" w16cid:durableId="117144454">
-    <w:abstractNumId w:val="86"/>
+    <w:abstractNumId w:val="88"/>
   </w:num>
   <w:num w:numId="106" w16cid:durableId="892809531">
-    <w:abstractNumId w:val="37"/>
+    <w:abstractNumId w:val="38"/>
   </w:num>
   <w:num w:numId="107" w16cid:durableId="1850750358">
-    <w:abstractNumId w:val="37"/>
+    <w:abstractNumId w:val="38"/>
     <w:lvlOverride w:ilvl="1">
       <w:lvl w:ilvl="1">
         <w:numFmt w:val="bullet"/>
@@ -40563,46 +41130,46 @@
     </w:lvlOverride>
   </w:num>
   <w:num w:numId="108" w16cid:durableId="1798790559">
-    <w:abstractNumId w:val="32"/>
+    <w:abstractNumId w:val="33"/>
   </w:num>
   <w:num w:numId="109" w16cid:durableId="1988626139">
     <w:abstractNumId w:val="9"/>
   </w:num>
   <w:num w:numId="110" w16cid:durableId="62683161">
-    <w:abstractNumId w:val="34"/>
+    <w:abstractNumId w:val="35"/>
   </w:num>
   <w:num w:numId="111" w16cid:durableId="1501581943">
-    <w:abstractNumId w:val="48"/>
+    <w:abstractNumId w:val="49"/>
   </w:num>
   <w:num w:numId="112" w16cid:durableId="1174347126">
-    <w:abstractNumId w:val="19"/>
+    <w:abstractNumId w:val="20"/>
   </w:num>
   <w:num w:numId="113" w16cid:durableId="1979873629">
-    <w:abstractNumId w:val="38"/>
+    <w:abstractNumId w:val="39"/>
   </w:num>
   <w:num w:numId="114" w16cid:durableId="979112944">
-    <w:abstractNumId w:val="119"/>
+    <w:abstractNumId w:val="121"/>
   </w:num>
   <w:num w:numId="115" w16cid:durableId="503862738">
     <w:abstractNumId w:val="5"/>
   </w:num>
   <w:num w:numId="116" w16cid:durableId="1419061729">
-    <w:abstractNumId w:val="23"/>
+    <w:abstractNumId w:val="24"/>
   </w:num>
   <w:num w:numId="117" w16cid:durableId="708456529">
-    <w:abstractNumId w:val="93"/>
+    <w:abstractNumId w:val="95"/>
   </w:num>
   <w:num w:numId="118" w16cid:durableId="1100488600">
-    <w:abstractNumId w:val="85"/>
+    <w:abstractNumId w:val="87"/>
   </w:num>
   <w:num w:numId="119" w16cid:durableId="849760959">
-    <w:abstractNumId w:val="65"/>
+    <w:abstractNumId w:val="67"/>
   </w:num>
   <w:num w:numId="120" w16cid:durableId="626937524">
-    <w:abstractNumId w:val="149"/>
+    <w:abstractNumId w:val="151"/>
   </w:num>
   <w:num w:numId="121" w16cid:durableId="119425117">
-    <w:abstractNumId w:val="149"/>
+    <w:abstractNumId w:val="151"/>
     <w:lvlOverride w:ilvl="1">
       <w:lvl w:ilvl="1">
         <w:numFmt w:val="bullet"/>
@@ -40622,7 +41189,7 @@
     </w:lvlOverride>
   </w:num>
   <w:num w:numId="122" w16cid:durableId="670303007">
-    <w:abstractNumId w:val="149"/>
+    <w:abstractNumId w:val="151"/>
     <w:lvlOverride w:ilvl="1">
       <w:lvl w:ilvl="1">
         <w:numFmt w:val="bullet"/>
@@ -40642,190 +41209,196 @@
     </w:lvlOverride>
   </w:num>
   <w:num w:numId="123" w16cid:durableId="1419863283">
-    <w:abstractNumId w:val="162"/>
+    <w:abstractNumId w:val="164"/>
   </w:num>
   <w:num w:numId="124" w16cid:durableId="651833826">
-    <w:abstractNumId w:val="60"/>
+    <w:abstractNumId w:val="62"/>
   </w:num>
   <w:num w:numId="125" w16cid:durableId="2093769883">
-    <w:abstractNumId w:val="128"/>
+    <w:abstractNumId w:val="130"/>
   </w:num>
   <w:num w:numId="126" w16cid:durableId="910846652">
     <w:abstractNumId w:val="4"/>
   </w:num>
   <w:num w:numId="127" w16cid:durableId="2039769940">
-    <w:abstractNumId w:val="62"/>
+    <w:abstractNumId w:val="64"/>
   </w:num>
   <w:num w:numId="128" w16cid:durableId="1480076784">
-    <w:abstractNumId w:val="75"/>
+    <w:abstractNumId w:val="77"/>
   </w:num>
   <w:num w:numId="129" w16cid:durableId="443160715">
-    <w:abstractNumId w:val="25"/>
+    <w:abstractNumId w:val="26"/>
   </w:num>
   <w:num w:numId="130" w16cid:durableId="107428733">
-    <w:abstractNumId w:val="137"/>
+    <w:abstractNumId w:val="139"/>
   </w:num>
   <w:num w:numId="131" w16cid:durableId="1625960149">
+    <w:abstractNumId w:val="170"/>
+  </w:num>
+  <w:num w:numId="132" w16cid:durableId="443616072">
+    <w:abstractNumId w:val="135"/>
+  </w:num>
+  <w:num w:numId="133" w16cid:durableId="870875033">
+    <w:abstractNumId w:val="178"/>
+  </w:num>
+  <w:num w:numId="134" w16cid:durableId="1623418263">
     <w:abstractNumId w:val="168"/>
   </w:num>
-  <w:num w:numId="132" w16cid:durableId="443616072">
-    <w:abstractNumId w:val="133"/>
-  </w:num>
-  <w:num w:numId="133" w16cid:durableId="870875033">
-    <w:abstractNumId w:val="176"/>
-  </w:num>
-  <w:num w:numId="134" w16cid:durableId="1623418263">
-    <w:abstractNumId w:val="166"/>
-  </w:num>
   <w:num w:numId="135" w16cid:durableId="708719909">
-    <w:abstractNumId w:val="35"/>
+    <w:abstractNumId w:val="36"/>
   </w:num>
   <w:num w:numId="136" w16cid:durableId="2099404917">
-    <w:abstractNumId w:val="39"/>
+    <w:abstractNumId w:val="40"/>
   </w:num>
   <w:num w:numId="137" w16cid:durableId="1400056911">
-    <w:abstractNumId w:val="78"/>
+    <w:abstractNumId w:val="80"/>
   </w:num>
   <w:num w:numId="138" w16cid:durableId="16782682">
     <w:abstractNumId w:val="12"/>
   </w:num>
   <w:num w:numId="139" w16cid:durableId="1998877743">
-    <w:abstractNumId w:val="104"/>
+    <w:abstractNumId w:val="106"/>
   </w:num>
   <w:num w:numId="140" w16cid:durableId="1004673594">
-    <w:abstractNumId w:val="77"/>
+    <w:abstractNumId w:val="79"/>
   </w:num>
   <w:num w:numId="141" w16cid:durableId="1972636377">
+    <w:abstractNumId w:val="134"/>
+  </w:num>
+  <w:num w:numId="142" w16cid:durableId="1883012483">
+    <w:abstractNumId w:val="93"/>
+  </w:num>
+  <w:num w:numId="143" w16cid:durableId="1763378456">
+    <w:abstractNumId w:val="133"/>
+  </w:num>
+  <w:num w:numId="144" w16cid:durableId="243420690">
+    <w:abstractNumId w:val="25"/>
+  </w:num>
+  <w:num w:numId="145" w16cid:durableId="891888230">
+    <w:abstractNumId w:val="120"/>
+  </w:num>
+  <w:num w:numId="146" w16cid:durableId="1213343404">
+    <w:abstractNumId w:val="127"/>
+  </w:num>
+  <w:num w:numId="147" w16cid:durableId="861868013">
+    <w:abstractNumId w:val="158"/>
+  </w:num>
+  <w:num w:numId="148" w16cid:durableId="2115707322">
+    <w:abstractNumId w:val="50"/>
+  </w:num>
+  <w:num w:numId="149" w16cid:durableId="1845776805">
+    <w:abstractNumId w:val="174"/>
+  </w:num>
+  <w:num w:numId="150" w16cid:durableId="757366736">
+    <w:abstractNumId w:val="147"/>
+  </w:num>
+  <w:num w:numId="151" w16cid:durableId="1023749942">
+    <w:abstractNumId w:val="125"/>
+  </w:num>
+  <w:num w:numId="152" w16cid:durableId="23026108">
+    <w:abstractNumId w:val="124"/>
+  </w:num>
+  <w:num w:numId="153" w16cid:durableId="708458928">
+    <w:abstractNumId w:val="116"/>
+  </w:num>
+  <w:num w:numId="154" w16cid:durableId="1258291845">
+    <w:abstractNumId w:val="112"/>
+  </w:num>
+  <w:num w:numId="155" w16cid:durableId="768889089">
+    <w:abstractNumId w:val="137"/>
+  </w:num>
+  <w:num w:numId="156" w16cid:durableId="17506394">
+    <w:abstractNumId w:val="78"/>
+  </w:num>
+  <w:num w:numId="157" w16cid:durableId="997149117">
+    <w:abstractNumId w:val="105"/>
+  </w:num>
+  <w:num w:numId="158" w16cid:durableId="1424259324">
+    <w:abstractNumId w:val="60"/>
+  </w:num>
+  <w:num w:numId="159" w16cid:durableId="137459831">
+    <w:abstractNumId w:val="81"/>
+  </w:num>
+  <w:num w:numId="160" w16cid:durableId="1744644774">
+    <w:abstractNumId w:val="113"/>
+  </w:num>
+  <w:num w:numId="161" w16cid:durableId="308363107">
+    <w:abstractNumId w:val="160"/>
+  </w:num>
+  <w:num w:numId="162" w16cid:durableId="174803804">
+    <w:abstractNumId w:val="165"/>
+  </w:num>
+  <w:num w:numId="163" w16cid:durableId="614991350">
+    <w:abstractNumId w:val="90"/>
+  </w:num>
+  <w:num w:numId="164" w16cid:durableId="1186289341">
+    <w:abstractNumId w:val="159"/>
+  </w:num>
+  <w:num w:numId="165" w16cid:durableId="1630167067">
+    <w:abstractNumId w:val="108"/>
+  </w:num>
+  <w:num w:numId="166" w16cid:durableId="1117215797">
+    <w:abstractNumId w:val="58"/>
+  </w:num>
+  <w:num w:numId="167" w16cid:durableId="198054051">
+    <w:abstractNumId w:val="56"/>
+  </w:num>
+  <w:num w:numId="168" w16cid:durableId="151021859">
+    <w:abstractNumId w:val="149"/>
+  </w:num>
+  <w:num w:numId="169" w16cid:durableId="1128470360">
+    <w:abstractNumId w:val="75"/>
+  </w:num>
+  <w:num w:numId="170" w16cid:durableId="355926645">
+    <w:abstractNumId w:val="76"/>
+  </w:num>
+  <w:num w:numId="171" w16cid:durableId="2072799944">
+    <w:abstractNumId w:val="142"/>
+  </w:num>
+  <w:num w:numId="172" w16cid:durableId="482818837">
+    <w:abstractNumId w:val="111"/>
+  </w:num>
+  <w:num w:numId="173" w16cid:durableId="1308245119">
+    <w:abstractNumId w:val="166"/>
+  </w:num>
+  <w:num w:numId="174" w16cid:durableId="2088990418">
+    <w:abstractNumId w:val="23"/>
+  </w:num>
+  <w:num w:numId="175" w16cid:durableId="2069067579">
+    <w:abstractNumId w:val="70"/>
+  </w:num>
+  <w:num w:numId="176" w16cid:durableId="608122750">
     <w:abstractNumId w:val="132"/>
   </w:num>
-  <w:num w:numId="142" w16cid:durableId="1883012483">
+  <w:num w:numId="177" w16cid:durableId="1440762964">
+    <w:abstractNumId w:val="31"/>
+  </w:num>
+  <w:num w:numId="178" w16cid:durableId="1165391401">
+    <w:abstractNumId w:val="94"/>
+  </w:num>
+  <w:num w:numId="179" w16cid:durableId="2022931474">
+    <w:abstractNumId w:val="69"/>
+  </w:num>
+  <w:num w:numId="180" w16cid:durableId="1866016271">
+    <w:abstractNumId w:val="53"/>
+  </w:num>
+  <w:num w:numId="181" w16cid:durableId="401026585">
+    <w:abstractNumId w:val="73"/>
+  </w:num>
+  <w:num w:numId="182" w16cid:durableId="374815453">
+    <w:abstractNumId w:val="155"/>
+  </w:num>
+  <w:num w:numId="183" w16cid:durableId="1073619914">
+    <w:abstractNumId w:val="52"/>
+  </w:num>
+  <w:num w:numId="184" w16cid:durableId="46536523">
     <w:abstractNumId w:val="91"/>
   </w:num>
-  <w:num w:numId="143" w16cid:durableId="1763378456">
-    <w:abstractNumId w:val="131"/>
+  <w:num w:numId="185" w16cid:durableId="762532439">
+    <w:abstractNumId w:val="61"/>
   </w:num>
-  <w:num w:numId="144" w16cid:durableId="243420690">
-    <w:abstractNumId w:val="24"/>
-  </w:num>
-  <w:num w:numId="145" w16cid:durableId="891888230">
-    <w:abstractNumId w:val="118"/>
-  </w:num>
-  <w:num w:numId="146" w16cid:durableId="1213343404">
-    <w:abstractNumId w:val="125"/>
-  </w:num>
-  <w:num w:numId="147" w16cid:durableId="861868013">
-    <w:abstractNumId w:val="156"/>
-  </w:num>
-  <w:num w:numId="148" w16cid:durableId="2115707322">
-    <w:abstractNumId w:val="49"/>
-  </w:num>
-  <w:num w:numId="149" w16cid:durableId="1845776805">
-    <w:abstractNumId w:val="172"/>
-  </w:num>
-  <w:num w:numId="150" w16cid:durableId="757366736">
-    <w:abstractNumId w:val="145"/>
-  </w:num>
-  <w:num w:numId="151" w16cid:durableId="1023749942">
-    <w:abstractNumId w:val="123"/>
-  </w:num>
-  <w:num w:numId="152" w16cid:durableId="23026108">
-    <w:abstractNumId w:val="122"/>
-  </w:num>
-  <w:num w:numId="153" w16cid:durableId="708458928">
-    <w:abstractNumId w:val="114"/>
-  </w:num>
-  <w:num w:numId="154" w16cid:durableId="1258291845">
-    <w:abstractNumId w:val="110"/>
-  </w:num>
-  <w:num w:numId="155" w16cid:durableId="768889089">
-    <w:abstractNumId w:val="135"/>
-  </w:num>
-  <w:num w:numId="156" w16cid:durableId="17506394">
-    <w:abstractNumId w:val="76"/>
-  </w:num>
-  <w:num w:numId="157" w16cid:durableId="997149117">
-    <w:abstractNumId w:val="103"/>
-  </w:num>
-  <w:num w:numId="158" w16cid:durableId="1424259324">
-    <w:abstractNumId w:val="59"/>
-  </w:num>
-  <w:num w:numId="159" w16cid:durableId="137459831">
-    <w:abstractNumId w:val="79"/>
-  </w:num>
-  <w:num w:numId="160" w16cid:durableId="1744644774">
-    <w:abstractNumId w:val="111"/>
-  </w:num>
-  <w:num w:numId="161" w16cid:durableId="308363107">
-    <w:abstractNumId w:val="158"/>
-  </w:num>
-  <w:num w:numId="162" w16cid:durableId="174803804">
-    <w:abstractNumId w:val="163"/>
-  </w:num>
-  <w:num w:numId="163" w16cid:durableId="614991350">
-    <w:abstractNumId w:val="88"/>
-  </w:num>
-  <w:num w:numId="164" w16cid:durableId="1186289341">
-    <w:abstractNumId w:val="157"/>
-  </w:num>
-  <w:num w:numId="165" w16cid:durableId="1630167067">
-    <w:abstractNumId w:val="106"/>
-  </w:num>
-  <w:num w:numId="166" w16cid:durableId="1117215797">
-    <w:abstractNumId w:val="57"/>
-  </w:num>
-  <w:num w:numId="167" w16cid:durableId="198054051">
-    <w:abstractNumId w:val="55"/>
-  </w:num>
-  <w:num w:numId="168" w16cid:durableId="151021859">
-    <w:abstractNumId w:val="147"/>
-  </w:num>
-  <w:num w:numId="169" w16cid:durableId="1128470360">
-    <w:abstractNumId w:val="73"/>
-  </w:num>
-  <w:num w:numId="170" w16cid:durableId="355926645">
-    <w:abstractNumId w:val="74"/>
-  </w:num>
-  <w:num w:numId="171" w16cid:durableId="2072799944">
-    <w:abstractNumId w:val="140"/>
-  </w:num>
-  <w:num w:numId="172" w16cid:durableId="482818837">
-    <w:abstractNumId w:val="109"/>
-  </w:num>
-  <w:num w:numId="173" w16cid:durableId="1308245119">
-    <w:abstractNumId w:val="164"/>
-  </w:num>
-  <w:num w:numId="174" w16cid:durableId="2088990418">
-    <w:abstractNumId w:val="22"/>
-  </w:num>
-  <w:num w:numId="175" w16cid:durableId="2069067579">
-    <w:abstractNumId w:val="68"/>
-  </w:num>
-  <w:num w:numId="176" w16cid:durableId="608122750">
-    <w:abstractNumId w:val="130"/>
-  </w:num>
-  <w:num w:numId="177" w16cid:durableId="1440762964">
-    <w:abstractNumId w:val="30"/>
-  </w:num>
-  <w:num w:numId="178" w16cid:durableId="1165391401">
-    <w:abstractNumId w:val="92"/>
-  </w:num>
-  <w:num w:numId="179" w16cid:durableId="2022931474">
-    <w:abstractNumId w:val="67"/>
-  </w:num>
-  <w:num w:numId="180" w16cid:durableId="1866016271">
-    <w:abstractNumId w:val="52"/>
-  </w:num>
-  <w:num w:numId="181" w16cid:durableId="401026585">
-    <w:abstractNumId w:val="71"/>
-  </w:num>
-  <w:num w:numId="182" w16cid:durableId="374815453">
-    <w:abstractNumId w:val="153"/>
-  </w:num>
-  <w:num w:numId="183" w16cid:durableId="1073619914">
-    <w:abstractNumId w:val="51"/>
-  </w:num>
-  <w:num w:numId="184" w16cid:durableId="46536523">
-    <w:abstractNumId w:val="89"/>
+  <w:num w:numId="186" w16cid:durableId="1866282010">
+    <w:abstractNumId w:val="17"/>
   </w:num>
 </w:numbering>
 </file>
@@ -41937,6 +42510,18 @@
       <w:u w:val="single"/>
     </w:rPr>
   </w:style>
+  <w:style w:type="character" w:styleId="UnresolvedMention">
+    <w:name w:val="Unresolved Mention"/>
+    <w:basedOn w:val="DefaultParagraphFont"/>
+    <w:uiPriority w:val="99"/>
+    <w:semiHidden/>
+    <w:unhideWhenUsed/>
+    <w:rsid w:val="000D30F9"/>
+    <w:rPr>
+      <w:color w:val="605E5C"/>
+      <w:shd w:val="clear" w:color="auto" w:fill="E1DFDD"/>
+    </w:rPr>
+  </w:style>
 </w:styles>
 </file>
 

</xml_diff>

<commit_message>
Changed Ritardo Games to Gini.gg, $RTD to $GINI
</commit_message>
<xml_diff>
--- a/content/Whitepaper.docx
+++ b/content/Whitepaper.docx
@@ -257,9 +257,8 @@
             <w:rFonts w:cstheme="minorHAnsi"/>
             <w:b/>
             <w:bCs/>
-            <w:color w:val="auto"/>
           </w:rPr>
-          <w:t>www.ritardo.games</w:t>
+          <w:t>www.gini.gg</w:t>
         </w:r>
       </w:hyperlink>
     </w:p>
@@ -413,21 +412,12 @@
       <w:r>
         <w:t>The inception of decentralized finance was predicated on the vision of establishing an equitable and transparent economic system, a direct response to the moral hazard observed in centralized markets. A decade later, this foundational promise has been challenged by the emergence of informational asymmetries and structural power laws that mirror the flaws of traditional finance. This paper introduces </w:t>
       </w:r>
-      <w:proofErr w:type="spellStart"/>
-      <w:r>
-        <w:rPr>
-          <w:b/>
-          <w:bCs/>
-        </w:rPr>
-        <w:t>Ritardo</w:t>
-      </w:r>
-      <w:proofErr w:type="spellEnd"/>
-      <w:r>
-        <w:rPr>
-          <w:b/>
-          <w:bCs/>
-        </w:rPr>
-        <w:t xml:space="preserve"> Games</w:t>
+      <w:r>
+        <w:rPr>
+          <w:b/>
+          <w:bCs/>
+        </w:rPr>
+        <w:t>Gini.gg</w:t>
       </w:r>
       <w:r>
         <w:t>, a Decentralized Autonomous Organization (DAO) designed to function as both a critique of and a pedagogical antidote to this reality.</w:t>
@@ -437,13 +427,11 @@
       <w:pPr>
         <w:spacing w:after="120"/>
       </w:pPr>
-      <w:proofErr w:type="spellStart"/>
-      <w:r>
-        <w:t>Ritardo</w:t>
-      </w:r>
-      <w:proofErr w:type="spellEnd"/>
-      <w:r>
-        <w:t xml:space="preserve"> Games is architected as a </w:t>
+      <w:r>
+        <w:t>Gini.gg</w:t>
+      </w:r>
+      <w:r>
+        <w:t xml:space="preserve"> is architected as a </w:t>
       </w:r>
       <w:r>
         <w:rPr>
@@ -483,13 +471,11 @@
       <w:r>
         <w:t xml:space="preserve">This paper posits that </w:t>
       </w:r>
-      <w:proofErr w:type="spellStart"/>
-      <w:r>
-        <w:t>Ritardo</w:t>
-      </w:r>
-      <w:proofErr w:type="spellEnd"/>
-      <w:r>
-        <w:t xml:space="preserve"> Games is a deliberately engineered </w:t>
+      <w:r>
+        <w:t>Gini.gg</w:t>
+      </w:r>
+      <w:r>
+        <w:t xml:space="preserve"> is a deliberately engineered </w:t>
       </w:r>
       <w:r>
         <w:rPr>
@@ -626,7 +612,7 @@
           <w:i/>
           <w:iCs/>
         </w:rPr>
-        <w:t>$RTD</w:t>
+        <w:t>$GINI</w:t>
       </w:r>
       <w:r>
         <w:rPr>
@@ -649,21 +635,19 @@
         </w:rPr>
         <w:t xml:space="preserve"> are tokens with utility within the </w:t>
       </w:r>
-      <w:proofErr w:type="spellStart"/>
       <w:r>
         <w:rPr>
           <w:i/>
           <w:iCs/>
         </w:rPr>
-        <w:t>Ritardo</w:t>
-      </w:r>
-      <w:proofErr w:type="spellEnd"/>
+        <w:t>Gini.gg</w:t>
+      </w:r>
       <w:r>
         <w:rPr>
           <w:i/>
           <w:iCs/>
         </w:rPr>
-        <w:t xml:space="preserve"> Games ecosystem and are not intended to be investment products. Please conduct your own research and consult with professional advisors before participating. All forward-looking statements are subject to risks and uncertainties.</w:t>
+        <w:t xml:space="preserve"> ecosystem and are not intended to be investment products. Please conduct your own research and consult with professional advisors before participating. All forward-looking statements are subject to risks and uncertainties.</w:t>
       </w:r>
     </w:p>
     <w:sdt>
@@ -1073,7 +1057,21 @@
                 <w:rStyle w:val="Hyperlink"/>
                 <w:noProof/>
               </w:rPr>
-              <w:t>Operationalizing the Paradox: The Ritardo Games Framework</w:t>
+              <w:t xml:space="preserve">Operationalizing the Paradox: The </w:t>
+            </w:r>
+            <w:r>
+              <w:rPr>
+                <w:rStyle w:val="Hyperlink"/>
+                <w:noProof/>
+              </w:rPr>
+              <w:t>Gini.gg</w:t>
+            </w:r>
+            <w:r>
+              <w:rPr>
+                <w:rStyle w:val="Hyperlink"/>
+                <w:noProof/>
+              </w:rPr>
+              <w:t xml:space="preserve"> Framework</w:t>
             </w:r>
             <w:r>
               <w:rPr>
@@ -3534,13 +3532,11 @@
       <w:r>
         <w:t xml:space="preserve">Operationalizing the Paradox: The </w:t>
       </w:r>
-      <w:proofErr w:type="spellStart"/>
-      <w:r>
-        <w:t>Ritardo</w:t>
-      </w:r>
-      <w:proofErr w:type="spellEnd"/>
-      <w:r>
-        <w:t xml:space="preserve"> Games Framework</w:t>
+      <w:r>
+        <w:t>Gini.gg</w:t>
+      </w:r>
+      <w:r>
+        <w:t xml:space="preserve"> Framework</w:t>
       </w:r>
       <w:bookmarkEnd w:id="4"/>
     </w:p>
@@ -3551,21 +3547,12 @@
       <w:r>
         <w:t>To confront the structural dissonance outlined above—the conflict between the egalitarian ethos of the original cypherpunk vision and the hyper-concentrative reality of the current market—we introduce the </w:t>
       </w:r>
-      <w:proofErr w:type="spellStart"/>
-      <w:r>
-        <w:rPr>
-          <w:b/>
-          <w:bCs/>
-        </w:rPr>
-        <w:t>Ritardo</w:t>
-      </w:r>
-      <w:proofErr w:type="spellEnd"/>
-      <w:r>
-        <w:rPr>
-          <w:b/>
-          <w:bCs/>
-        </w:rPr>
-        <w:t xml:space="preserve"> Games</w:t>
+      <w:r>
+        <w:rPr>
+          <w:b/>
+          <w:bCs/>
+        </w:rPr>
+        <w:t>Gini.gg</w:t>
       </w:r>
       <w:r>
         <w:t> protocol.</w:t>
@@ -3578,21 +3565,12 @@
       <w:r>
         <w:t>This intervention is designed not merely as a recreational application, but as a live, on-chain economic laboratory. It proceeds from the premise that the cryptocurrency ecosystem is currently trapped in a state of ideological suspension: fundamentally "socialist" in its architectural promise of open access and peer-to-peer solidarity, yet ruthlessly "capitalist" in its execution, governed by power laws and capital efficiency. </w:t>
       </w:r>
-      <w:proofErr w:type="spellStart"/>
-      <w:r>
-        <w:rPr>
-          <w:b/>
-          <w:bCs/>
-        </w:rPr>
-        <w:t>Ritardo</w:t>
-      </w:r>
-      <w:proofErr w:type="spellEnd"/>
-      <w:r>
-        <w:rPr>
-          <w:b/>
-          <w:bCs/>
-        </w:rPr>
-        <w:t xml:space="preserve"> Games</w:t>
+      <w:r>
+        <w:rPr>
+          <w:b/>
+          <w:bCs/>
+        </w:rPr>
+        <w:t>Gini.gg</w:t>
       </w:r>
       <w:r>
         <w:t> externalizes this internal conflict, transforming the implicit tension of the market into an explicit, gamified mechanism.</w:t>
@@ -3925,29 +3903,38 @@
       <w:r>
         <w:t xml:space="preserve">The architecture of </w:t>
       </w:r>
+      <w:r>
+        <w:t>Gini.gg</w:t>
+      </w:r>
+      <w:r>
+        <w:t xml:space="preserve"> serves a dual function: it is simultaneously a competitive economic simulation and a mechanism for </w:t>
+      </w:r>
       <w:proofErr w:type="spellStart"/>
       <w:r>
-        <w:t>Ritardo</w:t>
+        <w:t>behavioral</w:t>
       </w:r>
       <w:proofErr w:type="spellEnd"/>
       <w:r>
-        <w:t xml:space="preserve"> Games serves a dual function: it is simultaneously a competitive economic simulation and a mechanism for </w:t>
+        <w:t xml:space="preserve"> reconditioning. To effectively intervene in the prevailing market culture, the protocol adopts the aesthetic and linguistic conventions of the high-velocity speculative environment it seeks to critique.</w:t>
+      </w:r>
+    </w:p>
+    <w:p>
+      <w:pPr>
+        <w:spacing w:after="120"/>
+      </w:pPr>
+      <w:r>
+        <w:t xml:space="preserve">This approach is codified in the project's </w:t>
+      </w:r>
+      <w:r>
+        <w:t xml:space="preserve">main </w:t>
       </w:r>
       <w:proofErr w:type="spellStart"/>
       <w:r>
-        <w:t>behavioral</w:t>
+        <w:t>CHaracters</w:t>
       </w:r>
       <w:proofErr w:type="spellEnd"/>
       <w:r>
-        <w:t xml:space="preserve"> reconditioning. To effectively intervene in the prevailing market culture, the protocol adopts the aesthetic and linguistic conventions of the high-velocity speculative environment it seeks to critique.</w:t>
-      </w:r>
-    </w:p>
-    <w:p>
-      <w:pPr>
-        <w:spacing w:after="120"/>
-      </w:pPr>
-      <w:r>
-        <w:t>This approach is codified in the project's title. While "</w:t>
+        <w:t>. While "</w:t>
       </w:r>
       <w:proofErr w:type="spellStart"/>
       <w:r>
@@ -4122,11 +4109,9 @@
       <w:r>
         <w:t xml:space="preserve">The operational requirements of the </w:t>
       </w:r>
-      <w:proofErr w:type="spellStart"/>
-      <w:r>
-        <w:t>Ritardo</w:t>
-      </w:r>
-      <w:proofErr w:type="spellEnd"/>
+      <w:r>
+        <w:t>Gini.gg</w:t>
+      </w:r>
       <w:r>
         <w:t xml:space="preserve"> protocol are incompatible with traditional corporate structures. A centralized entity, bound by fiduciary obligations to maximize shareholder equity, introduces a fundamental conflict of interest. Such an entity would be structurally incentivized to manipulate the simulation’s parameters—such as issuance rates or fee structures—to optimize for revenue extraction rather than the integrity of the game. Under a centralized administrator, the simulation would cease to be a neutral laboratory and effectively become a rent-seeking platform.</w:t>
       </w:r>
@@ -4154,13 +4139,11 @@
       <w:r>
         <w:t xml:space="preserve">Ultimately, </w:t>
       </w:r>
-      <w:proofErr w:type="spellStart"/>
-      <w:r>
-        <w:t>Ritardo</w:t>
-      </w:r>
-      <w:proofErr w:type="spellEnd"/>
-      <w:r>
-        <w:t xml:space="preserve"> Games functions as a direct intervention in the prevailing economic paradigm of the cryptocurrency sector. The dominant narrative, rooted in the legacy of first-generation blockchain protocols, frames crypto-assets primarily as Sovereign Capital—tools for the decentralized accumulation and storage of value. While revolutionary, this view limits the technology's potential to simple asset ownership.</w:t>
+      <w:r>
+        <w:t>Gini.gg</w:t>
+      </w:r>
+      <w:r>
+        <w:t xml:space="preserve"> functions as a direct intervention in the prevailing economic paradigm of the cryptocurrency sector. The dominant narrative, rooted in the legacy of first-generation blockchain protocols, frames crypto-assets primarily as Sovereign Capital—tools for the decentralized accumulation and storage of value. While revolutionary, this view limits the technology's potential to simple asset ownership.</w:t>
       </w:r>
     </w:p>
     <w:p>
@@ -4183,13 +4166,11 @@
           <w:bCs/>
         </w:rPr>
       </w:pPr>
-      <w:proofErr w:type="spellStart"/>
-      <w:r>
-        <w:t>Ritardo</w:t>
-      </w:r>
-      <w:proofErr w:type="spellEnd"/>
-      <w:r>
-        <w:t xml:space="preserve"> Games represents the practical application of this shift. It is a proof-of-concept designed to demonstrate that the highest utility of distributed ledger technology lies not in speculative accumulation, but in the capacity to engineer more equitable, self-governing systems of human organization.</w:t>
+      <w:r>
+        <w:t>Gini.gg</w:t>
+      </w:r>
+      <w:r>
+        <w:t xml:space="preserve"> represents the practical application of this shift. It is a proof-of-concept designed to demonstrate that the highest utility of distributed ledger technology lies not in speculative accumulation, but in the capacity to engineer more equitable, self-governing systems of human organization.</w:t>
       </w:r>
     </w:p>
     <w:p>
@@ -4264,19 +4245,17 @@
         </w:rPr>
         <w:t xml:space="preserve">he structural integrity of the </w:t>
       </w:r>
-      <w:proofErr w:type="spellStart"/>
       <w:r>
         <w:rPr>
           <w:rFonts w:eastAsiaTheme="majorEastAsia" w:cstheme="minorHAnsi"/>
         </w:rPr>
-        <w:t>Ritardo</w:t>
-      </w:r>
-      <w:proofErr w:type="spellEnd"/>
+        <w:t>Gini.gg protocol</w:t>
+      </w:r>
       <w:r>
         <w:rPr>
           <w:rFonts w:eastAsiaTheme="majorEastAsia" w:cstheme="minorHAnsi"/>
         </w:rPr>
-        <w:t xml:space="preserve"> protocol necessitates a departure from traditional corporate governance. A centralized entity, subject to external regulatory pressure and internal profit motives, poses an existential risk to the game’s immutability. Such an entity retains the capacity to arbitrarily alter payout structures or intervene in market dynamics, thereby undermining the simulation's validity.</w:t>
+        <w:t xml:space="preserve"> necessitates a departure from traditional corporate governance. A centralized entity, subject to external regulatory pressure and internal profit motives, poses an existential risk to the game’s immutability. Such an entity retains the capacity to arbitrarily alter payout structures or intervene in market dynamics, thereby undermining the simulation's validity.</w:t>
       </w:r>
     </w:p>
     <w:p>
@@ -4414,14 +4393,12 @@
         </w:rPr>
         <w:t xml:space="preserve">The operational logic of the </w:t>
       </w:r>
-      <w:proofErr w:type="spellStart"/>
       <w:r>
         <w:rPr>
           <w:rFonts w:eastAsiaTheme="majorEastAsia" w:cstheme="minorHAnsi"/>
         </w:rPr>
-        <w:t>Ritardo</w:t>
-      </w:r>
-      <w:proofErr w:type="spellEnd"/>
+        <w:t>Gini.gg</w:t>
+      </w:r>
       <w:r>
         <w:rPr>
           <w:rFonts w:eastAsiaTheme="majorEastAsia" w:cstheme="minorHAnsi"/>
@@ -4588,7 +4565,19 @@
         <w:rPr>
           <w:rFonts w:eastAsiaTheme="majorEastAsia" w:cstheme="minorHAnsi"/>
         </w:rPr>
-        <w:t>Policy. $RTD holders actively vote on how to deploy this capital—optimizing between token buybacks, liquidity provision, or treasury expansion—thereby creating value through collective asset management</w:t>
+        <w:t xml:space="preserve">Policy. </w:t>
+      </w:r>
+      <w:r>
+        <w:rPr>
+          <w:rFonts w:eastAsiaTheme="majorEastAsia" w:cstheme="minorHAnsi"/>
+        </w:rPr>
+        <w:t>$GINI</w:t>
+      </w:r>
+      <w:r>
+        <w:rPr>
+          <w:rFonts w:eastAsiaTheme="majorEastAsia" w:cstheme="minorHAnsi"/>
+        </w:rPr>
+        <w:t xml:space="preserve"> holders actively vote on how to deploy this capital—optimizing between token buybacks, liquidity provision, or treasury expansion—thereby creating value through collective asset management</w:t>
       </w:r>
     </w:p>
     <w:p>
@@ -4641,19 +4630,17 @@
         </w:rPr>
         <w:t xml:space="preserve">To balance the competing needs of broad participation (inclusivity) and cryptographic security (safety), </w:t>
       </w:r>
-      <w:proofErr w:type="spellStart"/>
       <w:r>
         <w:rPr>
           <w:rFonts w:eastAsiaTheme="majorEastAsia" w:cstheme="minorHAnsi"/>
         </w:rPr>
-        <w:t>Ritardo</w:t>
-      </w:r>
-      <w:proofErr w:type="spellEnd"/>
+        <w:t>Gini.gg</w:t>
+      </w:r>
       <w:r>
         <w:rPr>
           <w:rFonts w:eastAsiaTheme="majorEastAsia" w:cstheme="minorHAnsi"/>
         </w:rPr>
-        <w:t xml:space="preserve"> Games employs a </w:t>
+        <w:t xml:space="preserve"> employs a </w:t>
       </w:r>
       <w:r>
         <w:rPr>
@@ -4784,7 +4771,19 @@
         <w:rPr>
           <w:rFonts w:eastAsiaTheme="majorEastAsia" w:cstheme="minorHAnsi"/>
         </w:rPr>
-        <w:t> Voting is conducted via cryptographic signatures rather than on-chain transactions. This incurs zero gas costs, removing economic barriers to entry and ensuring that governance remains accessible to all $RTD holders, regardless of portfolio size.</w:t>
+        <w:t xml:space="preserve"> Voting is conducted via cryptographic signatures rather than on-chain transactions. This incurs zero gas costs, removing economic barriers to entry and ensuring that governance remains accessible to all </w:t>
+      </w:r>
+      <w:r>
+        <w:rPr>
+          <w:rFonts w:eastAsiaTheme="majorEastAsia" w:cstheme="minorHAnsi"/>
+        </w:rPr>
+        <w:t>$GINI</w:t>
+      </w:r>
+      <w:r>
+        <w:rPr>
+          <w:rFonts w:eastAsiaTheme="majorEastAsia" w:cstheme="minorHAnsi"/>
+        </w:rPr>
+        <w:t xml:space="preserve"> holders, regardless of portfolio size.</w:t>
       </w:r>
     </w:p>
     <w:p>
@@ -4810,7 +4809,19 @@
         <w:rPr>
           <w:rFonts w:eastAsiaTheme="majorEastAsia" w:cstheme="minorHAnsi"/>
         </w:rPr>
-        <w:t> To prevent "governance attacks" (where an actor borrows tokens just to swing a vote), voting power is calculated based on a historical block checkpoint. A user’s influence is determined by their staked $RTD balance </w:t>
+        <w:t xml:space="preserve"> To prevent "governance attacks" (where an actor borrows tokens just to swing a vote), voting power is calculated based on a historical block checkpoint. A user’s influence is determined by their staked </w:t>
+      </w:r>
+      <w:r>
+        <w:rPr>
+          <w:rFonts w:eastAsiaTheme="majorEastAsia" w:cstheme="minorHAnsi"/>
+        </w:rPr>
+        <w:t>$GINI</w:t>
+      </w:r>
+      <w:r>
+        <w:rPr>
+          <w:rFonts w:eastAsiaTheme="majorEastAsia" w:cstheme="minorHAnsi"/>
+        </w:rPr>
+        <w:t xml:space="preserve"> balance </w:t>
       </w:r>
       <w:r>
         <w:rPr>
@@ -4965,23 +4976,21 @@
         </w:rPr>
         <w:t> As managers of the </w:t>
       </w:r>
-      <w:proofErr w:type="spellStart"/>
       <w:r>
         <w:rPr>
           <w:rFonts w:eastAsiaTheme="majorEastAsia" w:cstheme="minorHAnsi"/>
           <w:b/>
           <w:bCs/>
         </w:rPr>
-        <w:t>Ritardo</w:t>
-      </w:r>
-      <w:proofErr w:type="spellEnd"/>
+        <w:t>Gini.gg</w:t>
+      </w:r>
       <w:r>
         <w:rPr>
           <w:rFonts w:eastAsiaTheme="majorEastAsia" w:cstheme="minorHAnsi"/>
           <w:b/>
           <w:bCs/>
         </w:rPr>
-        <w:t xml:space="preserve"> Games DAO LLC</w:t>
+        <w:t xml:space="preserve"> DAO LLC</w:t>
       </w:r>
       <w:r>
         <w:rPr>
@@ -5174,7 +5183,19 @@
         <w:rPr>
           <w:rFonts w:eastAsiaTheme="majorEastAsia" w:cstheme="minorHAnsi"/>
         </w:rPr>
-        <w:t> $RTD holders sign messages to cast votes. If the defined quorum and majority thresholds are met, the proposal is considered "Passed."</w:t>
+        <w:t> </w:t>
+      </w:r>
+      <w:r>
+        <w:rPr>
+          <w:rFonts w:eastAsiaTheme="majorEastAsia" w:cstheme="minorHAnsi"/>
+        </w:rPr>
+        <w:t>$GINI</w:t>
+      </w:r>
+      <w:r>
+        <w:rPr>
+          <w:rFonts w:eastAsiaTheme="majorEastAsia" w:cstheme="minorHAnsi"/>
+        </w:rPr>
+        <w:t xml:space="preserve"> holders sign messages to cast votes. If the defined quorum and majority thresholds are met, the proposal is considered "Passed."</w:t>
       </w:r>
     </w:p>
     <w:p>
@@ -5339,13 +5360,11 @@
       <w:r>
         <w:t xml:space="preserve">To ensure the protocol operates with the necessary throughput, security, and economic efficiency, the </w:t>
       </w:r>
-      <w:proofErr w:type="spellStart"/>
-      <w:r>
-        <w:t>Ritardo</w:t>
-      </w:r>
-      <w:proofErr w:type="spellEnd"/>
-      <w:r>
-        <w:t xml:space="preserve"> Games simulation will be deployed on </w:t>
+      <w:r>
+        <w:t>Gini.gg</w:t>
+      </w:r>
+      <w:r>
+        <w:t xml:space="preserve"> simulation will be deployed on </w:t>
       </w:r>
       <w:r>
         <w:rPr>
@@ -5503,13 +5522,11 @@
       <w:r>
         <w:t xml:space="preserve">The mechanics of </w:t>
       </w:r>
-      <w:proofErr w:type="spellStart"/>
-      <w:r>
-        <w:t>Ritardo</w:t>
-      </w:r>
-      <w:proofErr w:type="spellEnd"/>
-      <w:r>
-        <w:t xml:space="preserve"> Games are not arbitrary gamification elements; they are the rigorous codification of the philosophical conflict outlined in Part I. Every rule is designed to ensure fairness, enforce accountability, and isolate the variables of economic ideology.</w:t>
+      <w:r>
+        <w:t>Gini.gg</w:t>
+      </w:r>
+      <w:r>
+        <w:t xml:space="preserve"> are not arbitrary gamification elements; they are the rigorous codification of the philosophical conflict outlined in Part I. Every rule is designed to ensure fairness, enforce accountability, and isolate the variables of economic ideology.</w:t>
       </w:r>
     </w:p>
     <w:p>
@@ -5708,14 +5725,7 @@
         <w:t>(</w:t>
       </w:r>
       <w:r>
-        <w:t>$</w:t>
-      </w:r>
-      <w:r>
-        <w:rPr>
-          <w:i/>
-          <w:iCs/>
-        </w:rPr>
-        <w:t>RTD</w:t>
+        <w:t>$GINI</w:t>
       </w:r>
       <w:r>
         <w:t>),</w:t>
@@ -5753,23 +5763,43 @@
         <w:t>The Mechanism:</w:t>
       </w:r>
       <w:r>
-        <w:t> This check is atomic. Before any transaction (mint or trade) is processed, the smart contract queries the </w:t>
-      </w:r>
-      <w:proofErr w:type="spellStart"/>
-      <w:r>
-        <w:t>RTD.sol</w:t>
-      </w:r>
-      <w:proofErr w:type="spellEnd"/>
-      <w:r>
-        <w:t> contract. If the user’s governance collateral falls below the required threshold relative to the transaction value, the interaction reverts.</w:t>
-      </w:r>
-    </w:p>
-    <w:p>
-      <w:pPr>
-        <w:spacing w:after="120"/>
-      </w:pPr>
+        <w:t> </w:t>
+      </w:r>
+      <w:r>
+        <w:t>This check is atomic. Before any transaction (mint or trade) is processed, the smart contract verifies the user's staked balance against a </w:t>
+      </w:r>
+      <w:r>
+        <w:rPr>
+          <w:b/>
+          <w:bCs/>
+        </w:rPr>
+        <w:t>Static Collateral Ratio</w:t>
+      </w:r>
+      <w:r>
+        <w:t xml:space="preserve"> defined for the season (e.g., 10 </w:t>
+      </w:r>
+      <w:r>
+        <w:t>$GINI</w:t>
+      </w:r>
+      <w:r>
+        <w:t xml:space="preserve"> required per 100 $FIM held). This ensures deterministic access </w:t>
+      </w:r>
       <w:r>
         <w:lastRenderedPageBreak/>
+        <w:t xml:space="preserve">requirements while maintaining the high-water mark logic: a single pool of staked </w:t>
+      </w:r>
+      <w:r>
+        <w:t>$GINI</w:t>
+      </w:r>
+      <w:r>
+        <w:t xml:space="preserve"> can collateralize multiple concurrent seasons, provided the user meets the maximum requirement of any single active game.</w:t>
+      </w:r>
+    </w:p>
+    <w:p>
+      <w:pPr>
+        <w:spacing w:after="120"/>
+      </w:pPr>
+      <w:r>
         <w:t>This mechanism ensures </w:t>
       </w:r>
       <w:r>
@@ -6096,11 +6126,9 @@
         <w:br/>
         <w:t xml:space="preserve">Unlike standard Decentralized Exchanges (AMMs) which obscure individual actors behind liquidity pools, the </w:t>
       </w:r>
-      <w:proofErr w:type="spellStart"/>
-      <w:r>
-        <w:t>Ritardo</w:t>
-      </w:r>
-      <w:proofErr w:type="spellEnd"/>
+      <w:r>
+        <w:t>Gini.gg</w:t>
+      </w:r>
       <w:r>
         <w:t xml:space="preserve"> Exchange utilizes a </w:t>
       </w:r>
@@ -6167,6 +6195,7 @@
           <w:b/>
           <w:bCs/>
         </w:rPr>
+        <w:lastRenderedPageBreak/>
         <w:t>Strategic Rationale:</w:t>
       </w:r>
       <w:r>
@@ -6180,11 +6209,7 @@
         <w:t>distributional impact</w:t>
       </w:r>
       <w:r>
-        <w:t xml:space="preserve">. Selling to a "whale" increases the Gini (aiding Capitalism); selling to </w:t>
-      </w:r>
-      <w:r>
-        <w:lastRenderedPageBreak/>
-        <w:t>a low-net-worth player decreases the Gini (aiding Socialism). By exposing the counterparty's identity, the contract transforms every trade into a political act.</w:t>
+        <w:t>. Selling to a "whale" increases the Gini (aiding Capitalism); selling to a low-net-worth player decreases the Gini (aiding Socialism). By exposing the counterparty's identity, the contract transforms every trade into a political act.</w:t>
       </w:r>
     </w:p>
     <w:p>
@@ -6581,36 +6606,25 @@
     <w:p>
       <w:pPr>
         <w:spacing w:after="120"/>
-        <w:rPr>
-          <w:lang w:val="en-DE"/>
-        </w:rPr>
-      </w:pPr>
-      <w:r>
-        <w:rPr>
-          <w:b/>
-          <w:bCs/>
-          <w:lang w:val="en-DE"/>
+      </w:pPr>
+      <w:r>
+        <w:rPr>
+          <w:b/>
+          <w:bCs/>
         </w:rPr>
         <w:t>The Existential Threshold (Dust Filter):</w:t>
       </w:r>
       <w:r>
-        <w:rPr>
-          <w:lang w:val="en-DE"/>
-        </w:rPr>
         <w:t> To prevent "Population Inflation" attacks—where an actor creates thousands of distinct wallets with negligible balances to artificially skew the inequality metric—the Gini calculation enforces a </w:t>
       </w:r>
       <w:r>
         <w:rPr>
           <w:b/>
           <w:bCs/>
-          <w:lang w:val="en-DE"/>
         </w:rPr>
         <w:t>Minimum Balance Threshold</w:t>
       </w:r>
       <w:r>
-        <w:rPr>
-          <w:lang w:val="en-DE"/>
-        </w:rPr>
         <w:t>. Only wallets holding </w:t>
       </w:r>
     </w:p>
@@ -6619,247 +6633,129 @@
         <w:spacing w:after="120"/>
       </w:pPr>
       <w:r>
-        <w:rPr>
-          <w:lang w:val="en-DE"/>
-        </w:rPr>
         <w:t>FIM</w:t>
       </w:r>
       <w:r>
-        <w:rPr>
-          <w:lang w:val="en-DE"/>
-        </w:rPr>
         <w:t xml:space="preserve"> </w:t>
       </w:r>
       <w:r>
-        <w:rPr>
-          <w:lang w:val="en-DE"/>
-        </w:rPr>
         <w:t>above</w:t>
       </w:r>
       <w:r>
-        <w:rPr>
-          <w:lang w:val="en-DE"/>
-        </w:rPr>
         <w:t xml:space="preserve"> </w:t>
       </w:r>
       <w:r>
-        <w:rPr>
-          <w:lang w:val="en-DE"/>
-        </w:rPr>
         <w:t>this</w:t>
       </w:r>
       <w:r>
-        <w:rPr>
-          <w:lang w:val="en-DE"/>
-        </w:rPr>
         <w:t xml:space="preserve"> </w:t>
       </w:r>
       <w:r>
-        <w:rPr>
-          <w:lang w:val="en-DE"/>
-        </w:rPr>
         <w:t>threshold</w:t>
       </w:r>
       <w:r>
-        <w:rPr>
-          <w:lang w:val="en-DE"/>
-        </w:rPr>
         <w:t xml:space="preserve"> </w:t>
       </w:r>
       <w:r>
-        <w:rPr>
-          <w:lang w:val="en-DE"/>
-        </w:rPr>
         <w:t>(defined</w:t>
       </w:r>
       <w:r>
-        <w:rPr>
-          <w:lang w:val="en-DE"/>
-        </w:rPr>
         <w:t xml:space="preserve"> </w:t>
       </w:r>
       <w:r>
-        <w:rPr>
-          <w:lang w:val="en-DE"/>
-        </w:rPr>
         <w:t>in</w:t>
       </w:r>
       <w:r>
-        <w:rPr>
-          <w:lang w:val="en-DE"/>
-        </w:rPr>
         <w:t xml:space="preserve"> </w:t>
       </w:r>
       <w:r>
-        <w:rPr>
-          <w:lang w:val="en-DE"/>
-        </w:rPr>
         <w:t>the</w:t>
       </w:r>
       <w:r>
-        <w:rPr>
-          <w:lang w:val="en-DE"/>
-        </w:rPr>
         <w:t xml:space="preserve"> </w:t>
       </w:r>
       <w:r>
-        <w:rPr>
-          <w:lang w:val="en-DE"/>
-        </w:rPr>
         <w:t>‘</w:t>
       </w:r>
       <w:proofErr w:type="spellStart"/>
       <w:proofErr w:type="gramStart"/>
       <w:r>
-        <w:rPr>
-          <w:lang w:val="en-DE"/>
-        </w:rPr>
         <w:t>SeasonManifest</w:t>
       </w:r>
       <w:proofErr w:type="spellEnd"/>
       <w:r>
-        <w:rPr>
-          <w:lang w:val="en-DE"/>
-        </w:rPr>
         <w:t>‘</w:t>
       </w:r>
       <w:proofErr w:type="gramEnd"/>
       <w:r>
-        <w:rPr>
-          <w:lang w:val="en-DE"/>
-        </w:rPr>
         <w:t>,</w:t>
       </w:r>
       <w:r>
-        <w:rPr>
-          <w:lang w:val="en-DE"/>
-        </w:rPr>
         <w:t xml:space="preserve"> </w:t>
       </w:r>
       <w:r>
-        <w:rPr>
-          <w:lang w:val="en-DE"/>
-        </w:rPr>
         <w:t>e.g.,</w:t>
       </w:r>
       <w:r>
-        <w:rPr>
-          <w:lang w:val="en-DE"/>
-        </w:rPr>
         <w:t xml:space="preserve"> </w:t>
       </w:r>
       <w:r>
-        <w:rPr>
-          <w:lang w:val="en-DE"/>
-        </w:rPr>
         <w:t>5</w:t>
       </w:r>
       <w:r>
-        <w:rPr>
-          <w:lang w:val="en-DE"/>
-        </w:rPr>
         <w:t xml:space="preserve"> </w:t>
       </w:r>
-      <w:r>
-        <w:rPr>
-          <w:lang w:val="en-DE"/>
-        </w:rPr>
+      <w:proofErr w:type="gramStart"/>
+      <w:r>
         <w:t>units</w:t>
       </w:r>
       <w:r>
-        <w:rPr>
-          <w:lang w:val="en-DE"/>
-        </w:rPr>
         <w:t xml:space="preserve"> </w:t>
       </w:r>
       <w:r>
-        <w:rPr>
-          <w:lang w:val="en-DE"/>
-        </w:rPr>
         <w:t>)</w:t>
       </w:r>
-      <w:r>
-        <w:rPr>
-          <w:lang w:val="en-DE"/>
-        </w:rPr>
+      <w:proofErr w:type="gramEnd"/>
+      <w:r>
         <w:t xml:space="preserve"> </w:t>
       </w:r>
       <w:r>
-        <w:rPr>
-          <w:lang w:val="en-DE"/>
-        </w:rPr>
         <w:t>are</w:t>
       </w:r>
       <w:r>
-        <w:rPr>
-          <w:lang w:val="en-DE"/>
-        </w:rPr>
         <w:t xml:space="preserve"> </w:t>
       </w:r>
       <w:r>
-        <w:rPr>
-          <w:lang w:val="en-DE"/>
-        </w:rPr>
         <w:t>included</w:t>
       </w:r>
       <w:r>
-        <w:rPr>
-          <w:lang w:val="en-DE"/>
-        </w:rPr>
         <w:t xml:space="preserve"> </w:t>
       </w:r>
       <w:r>
-        <w:rPr>
-          <w:lang w:val="en-DE"/>
-        </w:rPr>
         <w:t>in</w:t>
       </w:r>
       <w:r>
-        <w:rPr>
-          <w:lang w:val="en-DE"/>
-        </w:rPr>
         <w:t xml:space="preserve"> </w:t>
       </w:r>
       <w:r>
-        <w:rPr>
-          <w:lang w:val="en-DE"/>
-        </w:rPr>
         <w:t>the</w:t>
       </w:r>
       <w:r>
-        <w:rPr>
-          <w:lang w:val="en-DE"/>
-        </w:rPr>
         <w:t xml:space="preserve"> </w:t>
       </w:r>
       <w:r>
-        <w:rPr>
-          <w:lang w:val="en-DE"/>
-        </w:rPr>
         <w:t>population</w:t>
       </w:r>
       <w:r>
-        <w:rPr>
-          <w:lang w:val="en-DE"/>
-        </w:rPr>
         <w:t xml:space="preserve"> </w:t>
       </w:r>
       <w:r>
-        <w:rPr>
-          <w:lang w:val="en-DE"/>
-        </w:rPr>
         <w:t>count</w:t>
       </w:r>
       <w:r>
-        <w:rPr>
-          <w:lang w:val="en-DE"/>
-        </w:rPr>
         <w:t xml:space="preserve">. </w:t>
       </w:r>
       <w:r>
-        <w:rPr>
-          <w:lang w:val="en-DE"/>
-        </w:rPr>
         <w:t>Wallets below this amount are mathematically excluded from the state calculation.</w:t>
       </w:r>
     </w:p>
@@ -6877,6 +6773,7 @@
         <w:pStyle w:val="Heading3"/>
       </w:pPr>
       <w:r>
+        <w:lastRenderedPageBreak/>
         <w:t>Phase III: Settlement and Payout Logic</w:t>
       </w:r>
     </w:p>
@@ -6906,7 +6803,6 @@
         <w:spacing w:after="120"/>
       </w:pPr>
       <w:r>
-        <w:lastRenderedPageBreak/>
         <w:t>Upon the triggering of a victory condition, the </w:t>
       </w:r>
       <w:proofErr w:type="spellStart"/>
@@ -7331,6 +7227,7 @@
         </w:numPr>
       </w:pPr>
       <w:r>
+        <w:lastRenderedPageBreak/>
         <w:t>Winning Payout Logic (The Progress Share): This portion of the Prize Pool is paid out entirely according to the rules of the </w:t>
       </w:r>
       <w:proofErr w:type="spellStart"/>
@@ -7354,7 +7251,6 @@
         </w:numPr>
       </w:pPr>
       <w:r>
-        <w:lastRenderedPageBreak/>
         <w:t>Draw Payout Logic (The Residual Share): This remaining portion is paid out according to the original Draw condition: returned to all players proportionally based on their final </w:t>
       </w:r>
       <w:r>
@@ -7412,21 +7308,19 @@
         </w:rPr>
         <w:t xml:space="preserve">The </w:t>
       </w:r>
-      <w:proofErr w:type="spellStart"/>
-      <w:r>
-        <w:rPr>
-          <w:rFonts w:cstheme="minorHAnsi"/>
-          <w:color w:val="000000" w:themeColor="text1"/>
-        </w:rPr>
-        <w:t>Ritardo</w:t>
-      </w:r>
-      <w:proofErr w:type="spellEnd"/>
-      <w:r>
-        <w:rPr>
-          <w:rFonts w:cstheme="minorHAnsi"/>
-          <w:color w:val="000000" w:themeColor="text1"/>
-        </w:rPr>
-        <w:t xml:space="preserve"> Games protocol utilizes a modular architecture anchored in the </w:t>
+      <w:r>
+        <w:rPr>
+          <w:rFonts w:cstheme="minorHAnsi"/>
+          <w:color w:val="000000" w:themeColor="text1"/>
+        </w:rPr>
+        <w:t>Gini.gg</w:t>
+      </w:r>
+      <w:r>
+        <w:rPr>
+          <w:rFonts w:cstheme="minorHAnsi"/>
+          <w:color w:val="000000" w:themeColor="text1"/>
+        </w:rPr>
+        <w:t xml:space="preserve"> protocol utilizes a modular architecture anchored in the </w:t>
       </w:r>
       <w:r>
         <w:rPr>
@@ -7601,7 +7495,21 @@
           <w:rFonts w:cstheme="minorHAnsi"/>
           <w:color w:val="000000" w:themeColor="text1"/>
         </w:rPr>
-        <w:t> $RTD serves a critical security function as the collateral anchor for the game. The contract provides view functions used by seasonal contracts to verify that a participant holds the required 10% collateral ratio relative to their seasonal game exposure.</w:t>
+        <w:t> </w:t>
+      </w:r>
+      <w:r>
+        <w:rPr>
+          <w:rFonts w:cstheme="minorHAnsi"/>
+          <w:color w:val="000000" w:themeColor="text1"/>
+        </w:rPr>
+        <w:t>$GINI</w:t>
+      </w:r>
+      <w:r>
+        <w:rPr>
+          <w:rFonts w:cstheme="minorHAnsi"/>
+          <w:color w:val="000000" w:themeColor="text1"/>
+        </w:rPr>
+        <w:t xml:space="preserve"> serves a critical security function as the collateral anchor for the game. The contract provides view functions used by seasonal contracts to verify that a participant holds the required 10% collateral ratio relative to their seasonal game exposure.</w:t>
       </w:r>
       <w:r>
         <w:rPr>
@@ -7637,7 +7545,21 @@
           <w:rFonts w:cstheme="minorHAnsi"/>
           <w:color w:val="000000" w:themeColor="text1"/>
         </w:rPr>
-        <w:t> The token utilizes a rigid supply model (1,000,000,000 $RTD), minted once at the Token Generation Event (TGE) to prevent arbitrary dilution.</w:t>
+        <w:t xml:space="preserve"> The token utilizes a rigid supply model (1,000,000,000 </w:t>
+      </w:r>
+      <w:r>
+        <w:rPr>
+          <w:rFonts w:cstheme="minorHAnsi"/>
+          <w:color w:val="000000" w:themeColor="text1"/>
+        </w:rPr>
+        <w:t>$GINI</w:t>
+      </w:r>
+      <w:r>
+        <w:rPr>
+          <w:rFonts w:cstheme="minorHAnsi"/>
+          <w:color w:val="000000" w:themeColor="text1"/>
+        </w:rPr>
+        <w:t>), minted once at the Token Generation Event (TGE) to prevent arbitrary dilution.</w:t>
       </w:r>
     </w:p>
     <w:p>
@@ -7679,6 +7601,7 @@
         <w:rPr>
           <w:rFonts w:cstheme="minorHAnsi"/>
           <w:color w:val="000000" w:themeColor="text1"/>
+          <w:lang w:val="en-DE"/>
         </w:rPr>
       </w:pPr>
       <w:r>
@@ -7695,19 +7618,41 @@
           <w:rFonts w:cstheme="minorHAnsi"/>
           <w:color w:val="000000" w:themeColor="text1"/>
         </w:rPr>
-        <w:t> This contract is the cornerstone of protocol security. It manages the staking of $RTD to enforce the "Skin in the Game" rule and track voting power.</w:t>
-      </w:r>
-      <w:r>
-        <w:rPr>
-          <w:rFonts w:cstheme="minorHAnsi"/>
-          <w:color w:val="000000" w:themeColor="text1"/>
-        </w:rPr>
-        <w:t xml:space="preserve"> It </w:t>
-      </w:r>
-      <w:r>
-        <w:rPr>
-          <w:rFonts w:cstheme="minorHAnsi"/>
-          <w:color w:val="000000" w:themeColor="text1"/>
+        <w:t xml:space="preserve"> This contract is the cornerstone of protocol security. It manages the staking of </w:t>
+      </w:r>
+      <w:r>
+        <w:rPr>
+          <w:rFonts w:cstheme="minorHAnsi"/>
+          <w:color w:val="000000" w:themeColor="text1"/>
+        </w:rPr>
+        <w:t>$GINI</w:t>
+      </w:r>
+      <w:r>
+        <w:rPr>
+          <w:rFonts w:cstheme="minorHAnsi"/>
+          <w:color w:val="000000" w:themeColor="text1"/>
+        </w:rPr>
+        <w:t xml:space="preserve"> to enforce the "Skin in the Game" rule and track voting power.</w:t>
+      </w:r>
+      <w:r>
+        <w:rPr>
+          <w:rFonts w:cstheme="minorHAnsi"/>
+          <w:color w:val="000000" w:themeColor="text1"/>
+        </w:rPr>
+        <w:t xml:space="preserve"> </w:t>
+      </w:r>
+      <w:r>
+        <w:rPr>
+          <w:rFonts w:cstheme="minorHAnsi"/>
+          <w:color w:val="000000" w:themeColor="text1"/>
+        </w:rPr>
+        <w:t xml:space="preserve">It </w:t>
+      </w:r>
+      <w:r>
+        <w:rPr>
+          <w:rFonts w:cstheme="minorHAnsi"/>
+          <w:color w:val="000000" w:themeColor="text1"/>
+          <w:lang w:val="en-DE"/>
         </w:rPr>
         <w:t>enforces the </w:t>
       </w:r>
@@ -7717,6 +7662,7 @@
           <w:b/>
           <w:bCs/>
           <w:color w:val="000000" w:themeColor="text1"/>
+          <w:lang w:val="en-DE"/>
         </w:rPr>
         <w:t>High-Water Mark (MAX)</w:t>
       </w:r>
@@ -7724,15 +7670,33 @@
         <w:rPr>
           <w:rFonts w:cstheme="minorHAnsi"/>
           <w:color w:val="000000" w:themeColor="text1"/>
-        </w:rPr>
-        <w:t> rule. It uses a price oracle (Uniswap V3) to calculate the RTD</w:t>
-      </w:r>
-      <w:r>
-        <w:rPr>
-          <w:rFonts w:cstheme="minorHAnsi"/>
-          <w:i/>
-          <w:iCs/>
-          <w:color w:val="000000" w:themeColor="text1"/>
+          <w:lang w:val="en-DE"/>
+        </w:rPr>
+        <w:t> rule using a </w:t>
+      </w:r>
+      <w:r>
+        <w:rPr>
+          <w:rFonts w:cstheme="minorHAnsi"/>
+          <w:b/>
+          <w:bCs/>
+          <w:color w:val="000000" w:themeColor="text1"/>
+          <w:lang w:val="en-DE"/>
+        </w:rPr>
+        <w:t>Static Ratio</w:t>
+      </w:r>
+      <w:r>
+        <w:rPr>
+          <w:rFonts w:cstheme="minorHAnsi"/>
+          <w:color w:val="000000" w:themeColor="text1"/>
+          <w:lang w:val="en-DE"/>
+        </w:rPr>
+        <w:t> model. The collateral requirement is fixed per season, ensuring deterministic access without reliance on external price feeds. A single RTD</w:t>
+      </w:r>
+      <w:r>
+        <w:rPr>
+          <w:rFonts w:cstheme="minorHAnsi"/>
+          <w:color w:val="000000" w:themeColor="text1"/>
+          <w:lang w:val="en-DE"/>
         </w:rPr>
         <w:t xml:space="preserve"> </w:t>
       </w:r>
@@ -7740,37 +7704,40 @@
         <w:rPr>
           <w:rFonts w:cstheme="minorHAnsi"/>
           <w:color w:val="000000" w:themeColor="text1"/>
-        </w:rPr>
-        <w:t>collateral requirement. A single RTD stake can collateralize multiple active seasons up to the highest required amount.</w:t>
-      </w:r>
-    </w:p>
-    <w:p>
-      <w:pPr>
+          <w:lang w:val="en-DE"/>
+        </w:rPr>
+        <w:t>stake can collateralize multiple active seasons simultaneously, provided the user meets the maximum requirement of any single season they are participating in.</w:t>
+      </w:r>
+    </w:p>
+    <w:p>
+      <w:pPr>
+        <w:pStyle w:val="ListParagraph"/>
         <w:numPr>
           <w:ilvl w:val="0"/>
           <w:numId w:val="26"/>
         </w:numPr>
-        <w:spacing w:after="120"/>
-        <w:rPr>
-          <w:rFonts w:cstheme="minorHAnsi"/>
-          <w:color w:val="000000" w:themeColor="text1"/>
-        </w:rPr>
-      </w:pPr>
-      <w:r>
-        <w:rPr>
-          <w:rFonts w:cstheme="minorHAnsi"/>
-          <w:b/>
-          <w:bCs/>
-          <w:color w:val="000000" w:themeColor="text1"/>
-        </w:rPr>
-        <w:t>Checkpointing Logic:</w:t>
-      </w:r>
-      <w:r>
-        <w:rPr>
-          <w:rFonts w:cstheme="minorHAnsi"/>
-          <w:color w:val="000000" w:themeColor="text1"/>
-        </w:rPr>
-        <w:t> The contract utilizes </w:t>
+        <w:rPr>
+          <w:rFonts w:cstheme="minorHAnsi"/>
+          <w:b/>
+          <w:bCs/>
+          <w:color w:val="000000" w:themeColor="text1"/>
+        </w:rPr>
+      </w:pPr>
+      <w:r>
+        <w:rPr>
+          <w:rFonts w:cstheme="minorHAnsi"/>
+          <w:b/>
+          <w:bCs/>
+          <w:color w:val="000000" w:themeColor="text1"/>
+        </w:rPr>
+        <w:t xml:space="preserve">Policy Snapshotting: </w:t>
+      </w:r>
+      <w:r>
+        <w:rPr>
+          <w:rFonts w:cstheme="minorHAnsi"/>
+          <w:color w:val="000000" w:themeColor="text1"/>
+        </w:rPr>
+        <w:t xml:space="preserve">The contract utilizes </w:t>
       </w:r>
       <w:r>
         <w:rPr>
@@ -7786,7 +7753,7 @@
           <w:rFonts w:cstheme="minorHAnsi"/>
           <w:color w:val="000000" w:themeColor="text1"/>
         </w:rPr>
-        <w:t>. It records balances at specific block heights, allowing off-chain governance interfaces (Snapshot) to accurately query voting power based on a user's staked balance at the time a proposal was created.</w:t>
+        <w:t xml:space="preserve"> to record balances at specific block heights, allowing off-chain governance interfaces to accurately query voting power based on a user's staked balance.</w:t>
       </w:r>
     </w:p>
     <w:p>
@@ -7831,7 +7798,21 @@
           <w:rFonts w:cstheme="minorHAnsi"/>
           <w:color w:val="000000" w:themeColor="text1"/>
         </w:rPr>
-        <w:t xml:space="preserve"> $RTD if doing so would drop their balance below the requirement for an active game season in which they are participating.</w:t>
+        <w:t xml:space="preserve"> </w:t>
+      </w:r>
+      <w:r>
+        <w:rPr>
+          <w:rFonts w:cstheme="minorHAnsi"/>
+          <w:color w:val="000000" w:themeColor="text1"/>
+        </w:rPr>
+        <w:t>$GINI</w:t>
+      </w:r>
+      <w:r>
+        <w:rPr>
+          <w:rFonts w:cstheme="minorHAnsi"/>
+          <w:color w:val="000000" w:themeColor="text1"/>
+        </w:rPr>
+        <w:t xml:space="preserve"> if doing so would drop their balance below the requirement for an active game season in which they are participating.</w:t>
       </w:r>
     </w:p>
     <w:p>
@@ -8165,14 +8146,46 @@
           <w:color w:val="000000" w:themeColor="text1"/>
         </w:rPr>
         <w:lastRenderedPageBreak/>
-        <w:t>Credible Policy:</w:t>
-      </w:r>
-      <w:r>
-        <w:rPr>
-          <w:rFonts w:cstheme="minorHAnsi"/>
-          <w:color w:val="000000" w:themeColor="text1"/>
-        </w:rPr>
-        <w:t xml:space="preserve"> The Treasury manages yield generation via external DeFi protocols. Multi-Ledger Accounting tracks individual season principals separately.</w:t>
+        <w:t>JIT Asset Management:</w:t>
+      </w:r>
+      <w:r>
+        <w:rPr>
+          <w:rFonts w:cstheme="minorHAnsi"/>
+          <w:color w:val="000000" w:themeColor="text1"/>
+        </w:rPr>
+        <w:t xml:space="preserve"> The Treasury utilizes </w:t>
+      </w:r>
+      <w:r>
+        <w:rPr>
+          <w:rFonts w:cstheme="minorHAnsi"/>
+          <w:b/>
+          <w:bCs/>
+          <w:color w:val="000000" w:themeColor="text1"/>
+        </w:rPr>
+        <w:t>Just-In-Time (JIT) Liquidity</w:t>
+      </w:r>
+      <w:r>
+        <w:rPr>
+          <w:rFonts w:cstheme="minorHAnsi"/>
+          <w:color w:val="000000" w:themeColor="text1"/>
+        </w:rPr>
+        <w:t xml:space="preserve">, automatically supplying idle USDC to </w:t>
+      </w:r>
+      <w:proofErr w:type="spellStart"/>
+      <w:r>
+        <w:rPr>
+          <w:rFonts w:cstheme="minorHAnsi"/>
+          <w:color w:val="000000" w:themeColor="text1"/>
+        </w:rPr>
+        <w:t>Aave</w:t>
+      </w:r>
+      <w:proofErr w:type="spellEnd"/>
+      <w:r>
+        <w:rPr>
+          <w:rFonts w:cstheme="minorHAnsi"/>
+          <w:color w:val="000000" w:themeColor="text1"/>
+        </w:rPr>
+        <w:t xml:space="preserve"> V3 to generate yield and withdrawing only when required for payouts.</w:t>
       </w:r>
     </w:p>
     <w:p>
@@ -8194,14 +8207,77 @@
           <w:bCs/>
           <w:color w:val="000000" w:themeColor="text1"/>
         </w:rPr>
-        <w:t>Policy Snapshotting:</w:t>
-      </w:r>
-      <w:r>
-        <w:rPr>
-          <w:rFonts w:cstheme="minorHAnsi"/>
-          <w:color w:val="000000" w:themeColor="text1"/>
-        </w:rPr>
-        <w:t xml:space="preserve"> Economic rules (e.g., Buyback %, Reinvest %) are snapshotted at the start of each season, ensuring the payout policy cannot be retroactively changed by the DAO during the game.</w:t>
+        <w:t>Multi-Ledger Accounting:</w:t>
+      </w:r>
+      <w:r>
+        <w:rPr>
+          <w:rFonts w:cstheme="minorHAnsi"/>
+          <w:color w:val="000000" w:themeColor="text1"/>
+        </w:rPr>
+        <w:t xml:space="preserve"> It tracks </w:t>
+      </w:r>
+      <w:proofErr w:type="spellStart"/>
+      <w:r>
+        <w:rPr>
+          <w:rFonts w:cstheme="minorHAnsi"/>
+          <w:i/>
+          <w:iCs/>
+          <w:color w:val="000000" w:themeColor="text1"/>
+        </w:rPr>
+        <w:t>seasonPrincipals</w:t>
+      </w:r>
+      <w:proofErr w:type="spellEnd"/>
+      <w:r>
+        <w:rPr>
+          <w:rFonts w:cstheme="minorHAnsi"/>
+          <w:color w:val="000000" w:themeColor="text1"/>
+        </w:rPr>
+        <w:t xml:space="preserve"> individually, ensuring that the liabilities of one game season are cryptographically segregated from others.</w:t>
+      </w:r>
+    </w:p>
+    <w:p>
+      <w:pPr>
+        <w:numPr>
+          <w:ilvl w:val="0"/>
+          <w:numId w:val="28"/>
+        </w:numPr>
+        <w:spacing w:after="120"/>
+        <w:rPr>
+          <w:rFonts w:cstheme="minorHAnsi"/>
+          <w:color w:val="000000" w:themeColor="text1"/>
+        </w:rPr>
+      </w:pPr>
+      <w:r>
+        <w:rPr>
+          <w:rFonts w:cstheme="minorHAnsi"/>
+          <w:b/>
+          <w:bCs/>
+          <w:color w:val="000000" w:themeColor="text1"/>
+        </w:rPr>
+        <w:t>Season-Locked Policies</w:t>
+      </w:r>
+      <w:r>
+        <w:rPr>
+          <w:rFonts w:cstheme="minorHAnsi"/>
+          <w:color w:val="000000" w:themeColor="text1"/>
+        </w:rPr>
+        <w:t xml:space="preserve">: To ensure credible neutrality, economic parameters (Buyback %, Reinvest %, Liquidity Provider %) are </w:t>
+      </w:r>
+      <w:r>
+        <w:rPr>
+          <w:rFonts w:cstheme="minorHAnsi"/>
+          <w:b/>
+          <w:bCs/>
+          <w:color w:val="000000" w:themeColor="text1"/>
+        </w:rPr>
+        <w:t>snapshotted</w:t>
+      </w:r>
+      <w:r>
+        <w:rPr>
+          <w:rFonts w:cstheme="minorHAnsi"/>
+          <w:color w:val="000000" w:themeColor="text1"/>
+        </w:rPr>
+        <w:t xml:space="preserve"> at the moment a season is deployed. This creates an immutable record of the financial rules for that specific game, binding the Treasury to a fixed revenue strategy for the duration of the season.</w:t>
       </w:r>
     </w:p>
     <w:p>
@@ -8356,7 +8432,7 @@
           <w:rFonts w:cstheme="minorHAnsi"/>
           <w:color w:val="000000" w:themeColor="text1"/>
         </w:rPr>
-        <w:t> function includes an atomic check. Before accepting USDC, it queries the Staking contract to ensure the buyer holds sufficient governance tokens (ValueRTD≥10%×</w:t>
+        <w:t> function includes an atomic check. Before accepting USDC, it queries the Staking contract to ensure the buyer holds sufficient governance tokens (</w:t>
       </w:r>
       <w:proofErr w:type="spellStart"/>
       <w:r>
@@ -8364,42 +8440,73 @@
           <w:rFonts w:cstheme="minorHAnsi"/>
           <w:color w:val="000000" w:themeColor="text1"/>
         </w:rPr>
+        <w:t>ValueRTD</w:t>
+      </w:r>
+      <w:proofErr w:type="spellEnd"/>
+      <w:r>
+        <w:rPr>
+          <w:rFonts w:cstheme="minorHAnsi"/>
+          <w:color w:val="000000" w:themeColor="text1"/>
+        </w:rPr>
+        <w:t xml:space="preserve"> </w:t>
+      </w:r>
+      <w:r>
+        <w:rPr>
+          <w:rFonts w:cstheme="minorHAnsi"/>
+          <w:color w:val="000000" w:themeColor="text1"/>
+        </w:rPr>
+        <w:t>≥</w:t>
+      </w:r>
+      <w:r>
+        <w:rPr>
+          <w:rFonts w:cstheme="minorHAnsi"/>
+          <w:color w:val="000000" w:themeColor="text1"/>
+        </w:rPr>
+        <w:t xml:space="preserve"> </w:t>
+      </w:r>
+      <w:r>
+        <w:rPr>
+          <w:rFonts w:cstheme="minorHAnsi"/>
+          <w:color w:val="000000" w:themeColor="text1"/>
+        </w:rPr>
+        <w:t>10%</w:t>
+      </w:r>
+      <w:r>
+        <w:rPr>
+          <w:rFonts w:cstheme="minorHAnsi"/>
+          <w:color w:val="000000" w:themeColor="text1"/>
+        </w:rPr>
+        <w:t xml:space="preserve"> </w:t>
+      </w:r>
+      <w:r>
+        <w:rPr>
+          <w:rFonts w:cstheme="minorHAnsi"/>
+          <w:color w:val="000000" w:themeColor="text1"/>
+        </w:rPr>
+        <w:t>×</w:t>
+      </w:r>
+      <w:r>
+        <w:rPr>
+          <w:rFonts w:cstheme="minorHAnsi"/>
+          <w:color w:val="000000" w:themeColor="text1"/>
+        </w:rPr>
+        <w:t xml:space="preserve"> </w:t>
+      </w:r>
+      <w:proofErr w:type="spellStart"/>
+      <w:r>
+        <w:rPr>
+          <w:rFonts w:cstheme="minorHAnsi"/>
+          <w:color w:val="000000" w:themeColor="text1"/>
+        </w:rPr>
         <w:t>ValueFIM</w:t>
       </w:r>
-      <w:r>
-        <w:rPr>
-          <w:rFonts w:cstheme="minorHAnsi"/>
-          <w:i/>
-          <w:iCs/>
-          <w:color w:val="000000" w:themeColor="text1"/>
-        </w:rPr>
-        <w:t>ValueRTD</w:t>
-      </w:r>
       <w:proofErr w:type="spellEnd"/>
       <w:r>
         <w:rPr>
           <w:rFonts w:cstheme="minorHAnsi"/>
           <w:color w:val="000000" w:themeColor="text1"/>
         </w:rPr>
-        <w:t>​≥10%×</w:t>
-      </w:r>
-      <w:proofErr w:type="spellStart"/>
-      <w:r>
-        <w:rPr>
-          <w:rFonts w:cstheme="minorHAnsi"/>
-          <w:i/>
-          <w:iCs/>
-          <w:color w:val="000000" w:themeColor="text1"/>
-        </w:rPr>
-        <w:t>ValueFIM</w:t>
-      </w:r>
-      <w:proofErr w:type="spellEnd"/>
-      <w:r>
-        <w:rPr>
-          <w:rFonts w:cstheme="minorHAnsi"/>
-          <w:color w:val="000000" w:themeColor="text1"/>
-        </w:rPr>
-        <w:t>​). If this condition is not met, the transaction reverts.</w:t>
+        <w:t>). If this condition is not met, the transaction reverts.</w:t>
       </w:r>
       <w:r>
         <w:rPr>
@@ -8806,19 +8913,206 @@
       <w:pPr>
         <w:numPr>
           <w:ilvl w:val="0"/>
-          <w:numId w:val="31"/>
+          <w:numId w:val="54"/>
         </w:numPr>
         <w:spacing w:after="120"/>
         <w:rPr>
           <w:rFonts w:cstheme="minorHAnsi"/>
           <w:color w:val="000000" w:themeColor="text1"/>
-        </w:rPr>
-      </w:pPr>
+          <w:lang w:val="en-DE"/>
+        </w:rPr>
+      </w:pPr>
+      <w:r>
+        <w:rPr>
+          <w:rFonts w:cstheme="minorHAnsi"/>
+          <w:b/>
+          <w:bCs/>
+          <w:color w:val="000000" w:themeColor="text1"/>
+          <w:lang w:val="en-DE"/>
+        </w:rPr>
+        <w:lastRenderedPageBreak/>
+        <w:t>Function:</w:t>
+      </w:r>
+      <w:r>
+        <w:rPr>
+          <w:rFonts w:cstheme="minorHAnsi"/>
+          <w:color w:val="000000" w:themeColor="text1"/>
+          <w:lang w:val="en-DE"/>
+        </w:rPr>
+        <w:t> The autonomous referee and state machine managing the rigid lifecycle of the season, enforcing the rules of engagement, and acting as the final arbiter of victory.</w:t>
+      </w:r>
+    </w:p>
+    <w:p>
+      <w:pPr>
+        <w:numPr>
+          <w:ilvl w:val="0"/>
+          <w:numId w:val="54"/>
+        </w:numPr>
+        <w:spacing w:after="120"/>
+        <w:rPr>
+          <w:rFonts w:cstheme="minorHAnsi"/>
+          <w:color w:val="000000" w:themeColor="text1"/>
+          <w:lang w:val="en-DE"/>
+        </w:rPr>
+      </w:pPr>
+      <w:r>
+        <w:rPr>
+          <w:rFonts w:cstheme="minorHAnsi"/>
+          <w:b/>
+          <w:bCs/>
+          <w:color w:val="000000" w:themeColor="text1"/>
+          <w:lang w:val="en-DE"/>
+        </w:rPr>
+        <w:t>The Phase Engine:</w:t>
+      </w:r>
+      <w:r>
+        <w:rPr>
+          <w:rFonts w:cstheme="minorHAnsi"/>
+          <w:color w:val="000000" w:themeColor="text1"/>
+          <w:lang w:val="en-DE"/>
+        </w:rPr>
+        <w:t> To ensure deterministic execution, the contract enforces a strict linear state transition: AUCTION →→BOOTSTRAP →→TRADING →→</w:t>
+      </w:r>
+      <w:proofErr w:type="gramStart"/>
+      <w:r>
+        <w:rPr>
+          <w:rFonts w:cstheme="minorHAnsi"/>
+          <w:color w:val="000000" w:themeColor="text1"/>
+          <w:lang w:val="en-DE"/>
+        </w:rPr>
+        <w:t>SETTLING </w:t>
+      </w:r>
+      <w:r>
+        <w:rPr>
+          <w:rFonts w:cstheme="minorHAnsi"/>
+          <w:color w:val="000000" w:themeColor="text1"/>
+          <w:lang w:val="en-DE"/>
+        </w:rPr>
+        <w:t xml:space="preserve"> </w:t>
+      </w:r>
+      <w:r>
+        <w:rPr>
+          <w:rFonts w:cstheme="minorHAnsi"/>
+          <w:color w:val="000000" w:themeColor="text1"/>
+          <w:lang w:val="en-DE"/>
+        </w:rPr>
+        <w:t>→</w:t>
+      </w:r>
+      <w:proofErr w:type="gramEnd"/>
+      <w:r>
+        <w:rPr>
+          <w:rFonts w:cstheme="minorHAnsi"/>
+          <w:color w:val="000000" w:themeColor="text1"/>
+          <w:lang w:val="en-DE"/>
+        </w:rPr>
+        <w:t>→</w:t>
+      </w:r>
+      <w:r>
+        <w:rPr>
+          <w:rFonts w:cstheme="minorHAnsi"/>
+          <w:color w:val="000000" w:themeColor="text1"/>
+          <w:lang w:val="en-DE"/>
+        </w:rPr>
+        <w:t xml:space="preserve"> </w:t>
+      </w:r>
+      <w:r>
+        <w:rPr>
+          <w:rFonts w:cstheme="minorHAnsi"/>
+          <w:color w:val="000000" w:themeColor="text1"/>
+          <w:lang w:val="en-DE"/>
+        </w:rPr>
+        <w:t>PAYOUT.</w:t>
+      </w:r>
+    </w:p>
+    <w:p>
+      <w:pPr>
+        <w:numPr>
+          <w:ilvl w:val="0"/>
+          <w:numId w:val="54"/>
+        </w:numPr>
+        <w:spacing w:after="120"/>
+        <w:rPr>
+          <w:rFonts w:cstheme="minorHAnsi"/>
+          <w:color w:val="000000" w:themeColor="text1"/>
+          <w:lang w:val="en-DE"/>
+        </w:rPr>
+      </w:pPr>
+      <w:r>
+        <w:rPr>
+          <w:rFonts w:cstheme="minorHAnsi"/>
+          <w:b/>
+          <w:bCs/>
+          <w:color w:val="000000" w:themeColor="text1"/>
+          <w:lang w:val="en-DE"/>
+        </w:rPr>
+        <w:t>The Bootstrap Phase:</w:t>
+      </w:r>
+      <w:r>
+        <w:rPr>
+          <w:rFonts w:cstheme="minorHAnsi"/>
+          <w:color w:val="000000" w:themeColor="text1"/>
+          <w:lang w:val="en-DE"/>
+        </w:rPr>
+        <w:t> Immediately following the auction, the game enters a BOOTSTRAP state. Trading is paused until the </w:t>
+      </w:r>
+      <w:r>
+        <w:rPr>
+          <w:rFonts w:cstheme="minorHAnsi"/>
+          <w:b/>
+          <w:bCs/>
+          <w:color w:val="000000" w:themeColor="text1"/>
+          <w:lang w:val="en-DE"/>
+        </w:rPr>
+        <w:t>Gini Solver Bot</w:t>
+      </w:r>
+      <w:r>
+        <w:rPr>
+          <w:rFonts w:cstheme="minorHAnsi"/>
+          <w:color w:val="000000" w:themeColor="text1"/>
+          <w:lang w:val="en-DE"/>
+        </w:rPr>
+        <w:t> submits the initial distribution data to establish the baseline </w:t>
+      </w:r>
       <w:proofErr w:type="spellStart"/>
       <w:r>
         <w:rPr>
           <w:rFonts w:cstheme="minorHAnsi"/>
           <w:color w:val="000000" w:themeColor="text1"/>
+          <w:lang w:val="en-DE"/>
+        </w:rPr>
+        <w:t>Ginitial</w:t>
+      </w:r>
+      <w:proofErr w:type="spellEnd"/>
+      <w:r>
+        <w:rPr>
+          <w:rFonts w:cstheme="minorHAnsi"/>
+          <w:color w:val="000000" w:themeColor="text1"/>
+          <w:lang w:val="en-DE"/>
+        </w:rPr>
+        <w:t>. This ensures the game cannot begin until the starting conditions are cryptographically verified.</w:t>
+      </w:r>
+    </w:p>
+    <w:p>
+      <w:pPr>
+        <w:numPr>
+          <w:ilvl w:val="0"/>
+          <w:numId w:val="54"/>
+        </w:numPr>
+        <w:spacing w:after="120"/>
+        <w:rPr>
+          <w:rFonts w:cstheme="minorHAnsi"/>
+          <w:color w:val="000000" w:themeColor="text1"/>
+          <w:lang w:val="en-DE"/>
+        </w:rPr>
+      </w:pPr>
+      <w:proofErr w:type="spellStart"/>
+      <w:r>
+        <w:rPr>
+          <w:rFonts w:cstheme="minorHAnsi"/>
+          <w:b/>
+          <w:bCs/>
+          <w:color w:val="000000" w:themeColor="text1"/>
+          <w:lang w:val="en-DE"/>
         </w:rPr>
         <w:t>Trustless</w:t>
       </w:r>
@@ -8826,201 +9120,376 @@
       <w:r>
         <w:rPr>
           <w:rFonts w:cstheme="minorHAnsi"/>
-          <w:color w:val="000000" w:themeColor="text1"/>
-        </w:rPr>
-        <w:t xml:space="preserve"> Verification (The Arbitrator): The contract does not calculate the Gini Coefficient on every trade. Instead, any external actor (a Keeper bot) can trigger the complex calculation by submitting a sorted batch of all player balances.</w:t>
+          <w:b/>
+          <w:bCs/>
+          <w:color w:val="000000" w:themeColor="text1"/>
+          <w:lang w:val="en-DE"/>
+        </w:rPr>
+        <w:t xml:space="preserve"> Verification (The Arbitrator):</w:t>
+      </w:r>
+      <w:r>
+        <w:rPr>
+          <w:rFonts w:cstheme="minorHAnsi"/>
+          <w:color w:val="000000" w:themeColor="text1"/>
+          <w:lang w:val="en-DE"/>
+        </w:rPr>
+        <w:t> To minimize gas costs while maintaining credible neutrality, the contract utilizes a </w:t>
+      </w:r>
+      <w:r>
+        <w:rPr>
+          <w:rFonts w:cstheme="minorHAnsi"/>
+          <w:b/>
+          <w:bCs/>
+          <w:color w:val="000000" w:themeColor="text1"/>
+          <w:lang w:val="en-DE"/>
+        </w:rPr>
+        <w:t>Batch/Sort-Verification</w:t>
+      </w:r>
+      <w:r>
+        <w:rPr>
+          <w:rFonts w:cstheme="minorHAnsi"/>
+          <w:color w:val="000000" w:themeColor="text1"/>
+          <w:lang w:val="en-DE"/>
+        </w:rPr>
+        <w:t> model. It does not calculate the Gini Coefficient on every trade. Instead, any external actor (a Keeper or Bot) can trigger a state update by posting a </w:t>
+      </w:r>
+      <w:r>
+        <w:rPr>
+          <w:rFonts w:cstheme="minorHAnsi"/>
+          <w:b/>
+          <w:bCs/>
+          <w:color w:val="000000" w:themeColor="text1"/>
+          <w:lang w:val="en-DE"/>
+        </w:rPr>
+        <w:t>USDC Bond</w:t>
+      </w:r>
+      <w:r>
+        <w:rPr>
+          <w:rFonts w:cstheme="minorHAnsi"/>
+          <w:color w:val="000000" w:themeColor="text1"/>
+          <w:lang w:val="en-DE"/>
+        </w:rPr>
+        <w:t> and submitting a sorted batch of player balances.</w:t>
       </w:r>
     </w:p>
     <w:p>
       <w:pPr>
         <w:numPr>
           <w:ilvl w:val="1"/>
-          <w:numId w:val="31"/>
+          <w:numId w:val="54"/>
         </w:numPr>
         <w:spacing w:after="120"/>
         <w:rPr>
           <w:rFonts w:cstheme="minorHAnsi"/>
           <w:color w:val="000000" w:themeColor="text1"/>
-        </w:rPr>
-      </w:pPr>
-      <w:r>
-        <w:rPr>
-          <w:rFonts w:cstheme="minorHAnsi"/>
-          <w:color w:val="000000" w:themeColor="text1"/>
-        </w:rPr>
-        <w:lastRenderedPageBreak/>
-        <w:t xml:space="preserve">The contract performs a </w:t>
+          <w:lang w:val="en-DE"/>
+        </w:rPr>
+      </w:pPr>
+      <w:r>
+        <w:rPr>
+          <w:rFonts w:cstheme="minorHAnsi"/>
+          <w:b/>
+          <w:bCs/>
+          <w:color w:val="000000" w:themeColor="text1"/>
+          <w:lang w:val="en-DE"/>
+        </w:rPr>
+        <w:t>The Validation Logic:</w:t>
+      </w:r>
+      <w:r>
+        <w:rPr>
+          <w:rFonts w:cstheme="minorHAnsi"/>
+          <w:color w:val="000000" w:themeColor="text1"/>
+          <w:lang w:val="en-DE"/>
+        </w:rPr>
+        <w:t> The contract performs a low-cost verification of the submitted data:</w:t>
+      </w:r>
+    </w:p>
+    <w:p>
+      <w:pPr>
+        <w:numPr>
+          <w:ilvl w:val="2"/>
+          <w:numId w:val="54"/>
+        </w:numPr>
+        <w:spacing w:after="120"/>
+        <w:rPr>
+          <w:rFonts w:cstheme="minorHAnsi"/>
+          <w:color w:val="000000" w:themeColor="text1"/>
+          <w:lang w:val="en-DE"/>
+        </w:rPr>
+      </w:pPr>
+      <w:r>
+        <w:rPr>
+          <w:rFonts w:cstheme="minorHAnsi"/>
+          <w:b/>
+          <w:bCs/>
+          <w:color w:val="000000" w:themeColor="text1"/>
+          <w:lang w:val="en-DE"/>
+        </w:rPr>
+        <w:t>Sort Check:</w:t>
+      </w:r>
+      <w:r>
+        <w:rPr>
+          <w:rFonts w:cstheme="minorHAnsi"/>
+          <w:color w:val="000000" w:themeColor="text1"/>
+          <w:lang w:val="en-DE"/>
+        </w:rPr>
+        <w:t> Verifies that every address in the batch has a balance greater than or equal to the previous address (balance[</w:t>
       </w:r>
       <w:proofErr w:type="spellStart"/>
       <w:r>
         <w:rPr>
           <w:rFonts w:cstheme="minorHAnsi"/>
           <w:color w:val="000000" w:themeColor="text1"/>
-        </w:rPr>
-        <w:t>Trustless</w:t>
+          <w:lang w:val="en-DE"/>
+        </w:rPr>
+        <w:t>i</w:t>
       </w:r>
       <w:proofErr w:type="spellEnd"/>
       <w:r>
         <w:rPr>
           <w:rFonts w:cstheme="minorHAnsi"/>
           <w:color w:val="000000" w:themeColor="text1"/>
-        </w:rPr>
-        <w:t xml:space="preserve"> Verification Check: It verifies that the submitted data is correctly sorted, complete, and mathematically consistent with the known total supply.</w:t>
+          <w:lang w:val="en-DE"/>
+        </w:rPr>
+        <w:t>] &gt;= balance[i-1]).</w:t>
+      </w:r>
+    </w:p>
+    <w:p>
+      <w:pPr>
+        <w:numPr>
+          <w:ilvl w:val="2"/>
+          <w:numId w:val="54"/>
+        </w:numPr>
+        <w:spacing w:after="120"/>
+        <w:rPr>
+          <w:rFonts w:cstheme="minorHAnsi"/>
+          <w:color w:val="000000" w:themeColor="text1"/>
+          <w:lang w:val="en-DE"/>
+        </w:rPr>
+      </w:pPr>
+      <w:r>
+        <w:rPr>
+          <w:rFonts w:cstheme="minorHAnsi"/>
+          <w:b/>
+          <w:bCs/>
+          <w:color w:val="000000" w:themeColor="text1"/>
+          <w:lang w:val="en-DE"/>
+        </w:rPr>
+        <w:t>Integrity Check:</w:t>
+      </w:r>
+      <w:r>
+        <w:rPr>
+          <w:rFonts w:cstheme="minorHAnsi"/>
+          <w:color w:val="000000" w:themeColor="text1"/>
+          <w:lang w:val="en-DE"/>
+        </w:rPr>
+        <w:t> Verifies that the sum of the processed balances matches the total known on-chain supply.</w:t>
+      </w:r>
+    </w:p>
+    <w:p>
+      <w:pPr>
+        <w:numPr>
+          <w:ilvl w:val="2"/>
+          <w:numId w:val="54"/>
+        </w:numPr>
+        <w:spacing w:after="120"/>
+        <w:rPr>
+          <w:rFonts w:cstheme="minorHAnsi"/>
+          <w:color w:val="000000" w:themeColor="text1"/>
+          <w:lang w:val="en-DE"/>
+        </w:rPr>
+      </w:pPr>
+      <w:r>
+        <w:rPr>
+          <w:rFonts w:cstheme="minorHAnsi"/>
+          <w:b/>
+          <w:bCs/>
+          <w:color w:val="000000" w:themeColor="text1"/>
+          <w:lang w:val="en-DE"/>
+        </w:rPr>
+        <w:t>Dust Filter:</w:t>
+      </w:r>
+      <w:r>
+        <w:rPr>
+          <w:rFonts w:cstheme="minorHAnsi"/>
+          <w:color w:val="000000" w:themeColor="text1"/>
+          <w:lang w:val="en-DE"/>
+        </w:rPr>
+        <w:t> Automatically excludes any account with a balance below the </w:t>
+      </w:r>
+      <w:r>
+        <w:rPr>
+          <w:rFonts w:cstheme="minorHAnsi"/>
+          <w:b/>
+          <w:bCs/>
+          <w:color w:val="000000" w:themeColor="text1"/>
+          <w:lang w:val="en-DE"/>
+        </w:rPr>
+        <w:t>Existential Threshold</w:t>
+      </w:r>
+      <w:r>
+        <w:rPr>
+          <w:rFonts w:cstheme="minorHAnsi"/>
+          <w:color w:val="000000" w:themeColor="text1"/>
+          <w:lang w:val="en-DE"/>
+        </w:rPr>
+        <w:t> (e.g., 5 $FIM). These "dust" accounts are mathematically removed from the Gini calculation to prevent population inflation attacks.</w:t>
       </w:r>
     </w:p>
     <w:p>
       <w:pPr>
         <w:numPr>
           <w:ilvl w:val="1"/>
-          <w:numId w:val="31"/>
+          <w:numId w:val="54"/>
         </w:numPr>
         <w:spacing w:after="120"/>
         <w:rPr>
           <w:rFonts w:cstheme="minorHAnsi"/>
           <w:color w:val="000000" w:themeColor="text1"/>
-        </w:rPr>
-      </w:pPr>
-      <w:r>
-        <w:rPr>
-          <w:rFonts w:cstheme="minorHAnsi"/>
-          <w:color w:val="000000" w:themeColor="text1"/>
-        </w:rPr>
-        <w:t>If the check passes and the victory threshold is met, the game is finalized.</w:t>
+          <w:lang w:val="en-DE"/>
+        </w:rPr>
+      </w:pPr>
+      <w:r>
+        <w:rPr>
+          <w:rFonts w:cstheme="minorHAnsi"/>
+          <w:b/>
+          <w:bCs/>
+          <w:color w:val="000000" w:themeColor="text1"/>
+          <w:lang w:val="en-DE"/>
+        </w:rPr>
+        <w:t>Incentive Mechanism:</w:t>
+      </w:r>
+      <w:r>
+        <w:rPr>
+          <w:rFonts w:cstheme="minorHAnsi"/>
+          <w:color w:val="000000" w:themeColor="text1"/>
+          <w:lang w:val="en-DE"/>
+        </w:rPr>
+        <w:t> If the batch is valid and processed successfully, the </w:t>
+      </w:r>
+      <w:r>
+        <w:rPr>
+          <w:rFonts w:cstheme="minorHAnsi"/>
+          <w:b/>
+          <w:bCs/>
+          <w:color w:val="000000" w:themeColor="text1"/>
+          <w:lang w:val="en-DE"/>
+        </w:rPr>
+        <w:t>Bond</w:t>
+      </w:r>
+      <w:r>
+        <w:rPr>
+          <w:rFonts w:cstheme="minorHAnsi"/>
+          <w:color w:val="000000" w:themeColor="text1"/>
+          <w:lang w:val="en-DE"/>
+        </w:rPr>
+        <w:t xml:space="preserve"> is returned to the submitter. If the batch is invalid or fraudulent, the Bond is slashed, creating a robust </w:t>
+      </w:r>
+      <w:proofErr w:type="spellStart"/>
+      <w:r>
+        <w:rPr>
+          <w:rFonts w:cstheme="minorHAnsi"/>
+          <w:color w:val="000000" w:themeColor="text1"/>
+          <w:lang w:val="en-DE"/>
+        </w:rPr>
+        <w:t>cryptoeconomic</w:t>
+      </w:r>
+      <w:proofErr w:type="spellEnd"/>
+      <w:r>
+        <w:rPr>
+          <w:rFonts w:cstheme="minorHAnsi"/>
+          <w:color w:val="000000" w:themeColor="text1"/>
+          <w:lang w:val="en-DE"/>
+        </w:rPr>
+        <w:t xml:space="preserve"> </w:t>
+      </w:r>
+      <w:proofErr w:type="spellStart"/>
+      <w:r>
+        <w:rPr>
+          <w:rFonts w:cstheme="minorHAnsi"/>
+          <w:color w:val="000000" w:themeColor="text1"/>
+          <w:lang w:val="en-DE"/>
+        </w:rPr>
+        <w:t>defense</w:t>
+      </w:r>
+      <w:proofErr w:type="spellEnd"/>
+      <w:r>
+        <w:rPr>
+          <w:rFonts w:cstheme="minorHAnsi"/>
+          <w:color w:val="000000" w:themeColor="text1"/>
+          <w:lang w:val="en-DE"/>
+        </w:rPr>
+        <w:t xml:space="preserve"> against spam.</w:t>
       </w:r>
     </w:p>
     <w:p>
       <w:pPr>
         <w:numPr>
           <w:ilvl w:val="0"/>
-          <w:numId w:val="31"/>
+          <w:numId w:val="54"/>
         </w:numPr>
         <w:spacing w:after="120"/>
         <w:rPr>
           <w:rFonts w:cstheme="minorHAnsi"/>
           <w:color w:val="000000" w:themeColor="text1"/>
-        </w:rPr>
-      </w:pPr>
-      <w:r>
-        <w:rPr>
-          <w:rFonts w:cstheme="minorHAnsi"/>
-          <w:color w:val="000000" w:themeColor="text1"/>
-        </w:rPr>
-        <w:t>Rationale: This Batch/Sort-Verification model externalizes the gas-intensive computation while maintaining the cryptographic guarantee of an immutable arbiter.</w:t>
+          <w:lang w:val="en-DE"/>
+        </w:rPr>
+      </w:pPr>
+      <w:r>
+        <w:rPr>
+          <w:rFonts w:cstheme="minorHAnsi"/>
+          <w:b/>
+          <w:bCs/>
+          <w:color w:val="000000" w:themeColor="text1"/>
+          <w:lang w:val="en-DE"/>
+        </w:rPr>
+        <w:t>The Multiplier Logic:</w:t>
+      </w:r>
+      <w:r>
+        <w:rPr>
+          <w:rFonts w:cstheme="minorHAnsi"/>
+          <w:color w:val="000000" w:themeColor="text1"/>
+          <w:lang w:val="en-DE"/>
+        </w:rPr>
+        <w:t> It calculates the win condition dynamically. For the Socialist faction, it applies the compensation formula M=β+(1−Ginitial)2</w:t>
+      </w:r>
+      <w:r>
+        <w:rPr>
+          <w:rFonts w:cstheme="minorHAnsi"/>
+          <w:color w:val="000000" w:themeColor="text1"/>
+          <w:lang w:val="en-DE"/>
+        </w:rPr>
+        <w:t xml:space="preserve"> </w:t>
+      </w:r>
+      <w:r>
+        <w:rPr>
+          <w:rFonts w:cstheme="minorHAnsi"/>
+          <w:color w:val="000000" w:themeColor="text1"/>
+          <w:lang w:val="en-DE"/>
+        </w:rPr>
+        <w:t>to the progress metric.</w:t>
       </w:r>
     </w:p>
     <w:p>
       <w:pPr>
         <w:numPr>
           <w:ilvl w:val="0"/>
-          <w:numId w:val="31"/>
+          <w:numId w:val="54"/>
         </w:numPr>
         <w:spacing w:after="120"/>
         <w:rPr>
           <w:rFonts w:cstheme="minorHAnsi"/>
           <w:color w:val="000000" w:themeColor="text1"/>
-        </w:rPr>
-      </w:pPr>
-      <w:r>
-        <w:rPr>
-          <w:rFonts w:cstheme="minorHAnsi"/>
-          <w:b/>
-          <w:bCs/>
-          <w:color w:val="000000" w:themeColor="text1"/>
-        </w:rPr>
-        <w:t>The Multiplier Logic:</w:t>
-      </w:r>
-      <w:r>
-        <w:rPr>
-          <w:rFonts w:cstheme="minorHAnsi"/>
-          <w:color w:val="000000" w:themeColor="text1"/>
-        </w:rPr>
-        <w:t> It calculates the win condition dynamically. For the Socialist faction, it applies the compensation formula M=1.4+(1−Ginitial)2</w:t>
-      </w:r>
-      <w:r>
-        <w:rPr>
-          <w:rFonts w:cstheme="minorHAnsi"/>
-          <w:i/>
-          <w:iCs/>
-          <w:color w:val="000000" w:themeColor="text1"/>
-        </w:rPr>
-        <w:t>M</w:t>
-      </w:r>
-      <w:r>
-        <w:rPr>
-          <w:rFonts w:cstheme="minorHAnsi"/>
-          <w:color w:val="000000" w:themeColor="text1"/>
-        </w:rPr>
-        <w:t>=1.4+(1−</w:t>
-      </w:r>
-      <w:r>
-        <w:rPr>
-          <w:rFonts w:cstheme="minorHAnsi"/>
-          <w:i/>
-          <w:iCs/>
-          <w:color w:val="000000" w:themeColor="text1"/>
-        </w:rPr>
-        <w:t>Ginitial</w:t>
-      </w:r>
-      <w:r>
-        <w:rPr>
-          <w:rFonts w:cstheme="minorHAnsi"/>
-          <w:color w:val="000000" w:themeColor="text1"/>
-        </w:rPr>
-        <w:t>​)2</w:t>
-      </w:r>
-      <w:r>
-        <w:rPr>
-          <w:rFonts w:cstheme="minorHAnsi"/>
-          <w:color w:val="000000" w:themeColor="text1"/>
-        </w:rPr>
-        <w:t xml:space="preserve"> </w:t>
-      </w:r>
-      <w:r>
-        <w:rPr>
-          <w:rFonts w:cstheme="minorHAnsi"/>
-          <w:color w:val="000000" w:themeColor="text1"/>
-        </w:rPr>
-        <w:t>to the progress metric.</w:t>
-      </w:r>
-    </w:p>
-    <w:p>
-      <w:pPr>
-        <w:pStyle w:val="ListParagraph"/>
-        <w:numPr>
-          <w:ilvl w:val="0"/>
-          <w:numId w:val="31"/>
-        </w:numPr>
-        <w:rPr>
-          <w:rFonts w:cstheme="minorHAnsi"/>
-          <w:color w:val="000000" w:themeColor="text1"/>
-        </w:rPr>
-      </w:pPr>
-      <w:r>
-        <w:rPr>
-          <w:rFonts w:cstheme="minorHAnsi"/>
-          <w:color w:val="000000" w:themeColor="text1"/>
-        </w:rPr>
-        <w:t>The Filter: The verification logic enforces the Existential Threshold. Any account in the submitted batch with a balance below the defined minimum is rejected, ensuring the Gini score reflects only economically significant participants.</w:t>
-      </w:r>
-    </w:p>
-    <w:p>
-      <w:pPr>
-        <w:numPr>
-          <w:ilvl w:val="0"/>
-          <w:numId w:val="31"/>
-        </w:numPr>
-        <w:spacing w:after="120"/>
-        <w:rPr>
-          <w:rFonts w:cstheme="minorHAnsi"/>
-          <w:color w:val="000000" w:themeColor="text1"/>
-        </w:rPr>
-      </w:pPr>
-      <w:r>
-        <w:rPr>
-          <w:rFonts w:cstheme="minorHAnsi"/>
-          <w:b/>
-          <w:bCs/>
-          <w:color w:val="000000" w:themeColor="text1"/>
+          <w:lang w:val="en-DE"/>
+        </w:rPr>
+      </w:pPr>
+      <w:r>
+        <w:rPr>
+          <w:rFonts w:cstheme="minorHAnsi"/>
+          <w:b/>
+          <w:bCs/>
+          <w:color w:val="000000" w:themeColor="text1"/>
+          <w:lang w:val="en-DE"/>
         </w:rPr>
         <w:t>Settlement Engine:</w:t>
       </w:r>
@@ -9028,28 +9497,49 @@
         <w:rPr>
           <w:rFonts w:cstheme="minorHAnsi"/>
           <w:color w:val="000000" w:themeColor="text1"/>
-        </w:rPr>
-        <w:t> Upon game conclusion, this contract executes the "Finalization Cascade":</w:t>
+          <w:lang w:val="en-DE"/>
+        </w:rPr>
+        <w:t> Upon the successful verification of a victory condition or time expiry during the SETTLING phase, the contract executes the </w:t>
+      </w:r>
+      <w:r>
+        <w:rPr>
+          <w:rFonts w:cstheme="minorHAnsi"/>
+          <w:b/>
+          <w:bCs/>
+          <w:color w:val="000000" w:themeColor="text1"/>
+          <w:lang w:val="en-DE"/>
+        </w:rPr>
+        <w:t>"Finalization Cascade"</w:t>
+      </w:r>
+      <w:r>
+        <w:rPr>
+          <w:rFonts w:cstheme="minorHAnsi"/>
+          <w:color w:val="000000" w:themeColor="text1"/>
+          <w:lang w:val="en-DE"/>
+        </w:rPr>
+        <w:t>:</w:t>
       </w:r>
     </w:p>
     <w:p>
       <w:pPr>
         <w:numPr>
           <w:ilvl w:val="1"/>
-          <w:numId w:val="31"/>
+          <w:numId w:val="54"/>
         </w:numPr>
         <w:spacing w:after="120"/>
         <w:rPr>
           <w:rFonts w:cstheme="minorHAnsi"/>
           <w:color w:val="000000" w:themeColor="text1"/>
-        </w:rPr>
-      </w:pPr>
-      <w:r>
-        <w:rPr>
-          <w:rFonts w:cstheme="minorHAnsi"/>
-          <w:b/>
-          <w:bCs/>
-          <w:color w:val="000000" w:themeColor="text1"/>
+          <w:lang w:val="en-DE"/>
+        </w:rPr>
+      </w:pPr>
+      <w:r>
+        <w:rPr>
+          <w:rFonts w:cstheme="minorHAnsi"/>
+          <w:b/>
+          <w:bCs/>
+          <w:color w:val="000000" w:themeColor="text1"/>
+          <w:lang w:val="en-DE"/>
         </w:rPr>
         <w:t>Oligarchy Calculation (Capitalist Win):</w:t>
       </w:r>
@@ -9057,22 +9547,15 @@
         <w:rPr>
           <w:rFonts w:cstheme="minorHAnsi"/>
           <w:color w:val="000000" w:themeColor="text1"/>
-        </w:rPr>
-        <w:t> Identifies the top </w:t>
-      </w:r>
-      <w:r>
-        <w:rPr>
-          <w:rFonts w:cstheme="minorHAnsi"/>
-          <w:i/>
-          <w:iCs/>
-          <w:color w:val="000000" w:themeColor="text1"/>
-        </w:rPr>
-        <w:t>N</w:t>
-      </w:r>
-      <w:r>
-        <w:rPr>
-          <w:rFonts w:cstheme="minorHAnsi"/>
-          <w:color w:val="000000" w:themeColor="text1"/>
+          <w:lang w:val="en-DE"/>
+        </w:rPr>
+        <w:t> Identifies the top N</w:t>
+      </w:r>
+      <w:r>
+        <w:rPr>
+          <w:rFonts w:cstheme="minorHAnsi"/>
+          <w:color w:val="000000" w:themeColor="text1"/>
+          <w:lang w:val="en-DE"/>
         </w:rPr>
         <w:t xml:space="preserve"> </w:t>
       </w:r>
@@ -9080,6 +9563,7 @@
         <w:rPr>
           <w:rFonts w:cstheme="minorHAnsi"/>
           <w:color w:val="000000" w:themeColor="text1"/>
+          <w:lang w:val="en-DE"/>
         </w:rPr>
         <w:t>holders holding &gt;50%</w:t>
       </w:r>
@@ -9087,6 +9571,7 @@
         <w:rPr>
           <w:rFonts w:cstheme="minorHAnsi"/>
           <w:color w:val="000000" w:themeColor="text1"/>
+          <w:lang w:val="en-DE"/>
         </w:rPr>
         <w:t xml:space="preserve"> </w:t>
       </w:r>
@@ -9094,6 +9579,7 @@
         <w:rPr>
           <w:rFonts w:cstheme="minorHAnsi"/>
           <w:color w:val="000000" w:themeColor="text1"/>
+          <w:lang w:val="en-DE"/>
         </w:rPr>
         <w:t>of supply and calculates their proportional payout.</w:t>
       </w:r>
@@ -9102,20 +9588,22 @@
       <w:pPr>
         <w:numPr>
           <w:ilvl w:val="1"/>
-          <w:numId w:val="31"/>
+          <w:numId w:val="54"/>
         </w:numPr>
         <w:spacing w:after="120"/>
         <w:rPr>
           <w:rFonts w:cstheme="minorHAnsi"/>
           <w:color w:val="000000" w:themeColor="text1"/>
-        </w:rPr>
-      </w:pPr>
-      <w:r>
-        <w:rPr>
-          <w:rFonts w:cstheme="minorHAnsi"/>
-          <w:b/>
-          <w:bCs/>
-          <w:color w:val="000000" w:themeColor="text1"/>
+          <w:lang w:val="en-DE"/>
+        </w:rPr>
+      </w:pPr>
+      <w:r>
+        <w:rPr>
+          <w:rFonts w:cstheme="minorHAnsi"/>
+          <w:b/>
+          <w:bCs/>
+          <w:color w:val="000000" w:themeColor="text1"/>
+          <w:lang w:val="en-DE"/>
         </w:rPr>
         <w:t>Solidarity Calculation (Socialist Win):</w:t>
       </w:r>
@@ -9124,18 +9612,20 @@
       <w:pPr>
         <w:numPr>
           <w:ilvl w:val="2"/>
-          <w:numId w:val="31"/>
+          <w:numId w:val="54"/>
         </w:numPr>
         <w:spacing w:after="120"/>
         <w:rPr>
           <w:rFonts w:cstheme="minorHAnsi"/>
           <w:color w:val="000000" w:themeColor="text1"/>
-        </w:rPr>
-      </w:pPr>
-      <w:r>
-        <w:rPr>
-          <w:rFonts w:cstheme="minorHAnsi"/>
-          <w:color w:val="000000" w:themeColor="text1"/>
+          <w:lang w:val="en-DE"/>
+        </w:rPr>
+      </w:pPr>
+      <w:r>
+        <w:rPr>
+          <w:rFonts w:cstheme="minorHAnsi"/>
+          <w:color w:val="000000" w:themeColor="text1"/>
+          <w:lang w:val="en-DE"/>
         </w:rPr>
         <w:t>Calculates the </w:t>
       </w:r>
@@ -9144,6 +9634,7 @@
         <w:rPr>
           <w:rFonts w:cstheme="minorHAnsi"/>
           <w:color w:val="000000" w:themeColor="text1"/>
+          <w:lang w:val="en-DE"/>
         </w:rPr>
         <w:t>Cap_Value</w:t>
       </w:r>
@@ -9152,6 +9643,7 @@
         <w:rPr>
           <w:rFonts w:cstheme="minorHAnsi"/>
           <w:color w:val="000000" w:themeColor="text1"/>
+          <w:lang w:val="en-DE"/>
         </w:rPr>
         <w:t> based on the median holdings.</w:t>
       </w:r>
@@ -9160,18 +9652,20 @@
       <w:pPr>
         <w:numPr>
           <w:ilvl w:val="2"/>
-          <w:numId w:val="31"/>
+          <w:numId w:val="54"/>
         </w:numPr>
         <w:spacing w:after="120"/>
         <w:rPr>
           <w:rFonts w:cstheme="minorHAnsi"/>
           <w:color w:val="000000" w:themeColor="text1"/>
-        </w:rPr>
-      </w:pPr>
-      <w:r>
-        <w:rPr>
-          <w:rFonts w:cstheme="minorHAnsi"/>
-          <w:color w:val="000000" w:themeColor="text1"/>
+          <w:lang w:val="en-DE"/>
+        </w:rPr>
+      </w:pPr>
+      <w:r>
+        <w:rPr>
+          <w:rFonts w:cstheme="minorHAnsi"/>
+          <w:color w:val="000000" w:themeColor="text1"/>
+          <w:lang w:val="en-DE"/>
         </w:rPr>
         <w:t>Skims excess value from the "Elite" (Top 50%) to the Solidarity Fund.</w:t>
       </w:r>
@@ -9180,18 +9674,20 @@
       <w:pPr>
         <w:numPr>
           <w:ilvl w:val="2"/>
-          <w:numId w:val="31"/>
+          <w:numId w:val="54"/>
         </w:numPr>
         <w:spacing w:after="120"/>
         <w:rPr>
           <w:rFonts w:cstheme="minorHAnsi"/>
           <w:color w:val="000000" w:themeColor="text1"/>
-        </w:rPr>
-      </w:pPr>
-      <w:r>
-        <w:rPr>
-          <w:rFonts w:cstheme="minorHAnsi"/>
-          <w:color w:val="000000" w:themeColor="text1"/>
+          <w:lang w:val="en-DE"/>
+        </w:rPr>
+      </w:pPr>
+      <w:r>
+        <w:rPr>
+          <w:rFonts w:cstheme="minorHAnsi"/>
+          <w:color w:val="000000" w:themeColor="text1"/>
+          <w:lang w:val="en-DE"/>
         </w:rPr>
         <w:t>Calculates the </w:t>
       </w:r>
@@ -9200,6 +9696,7 @@
         <w:rPr>
           <w:rFonts w:cstheme="minorHAnsi"/>
           <w:color w:val="000000" w:themeColor="text1"/>
+          <w:lang w:val="en-DE"/>
         </w:rPr>
         <w:t>Net_Contribution</w:t>
       </w:r>
@@ -9208,6 +9705,7 @@
         <w:rPr>
           <w:rFonts w:cstheme="minorHAnsi"/>
           <w:color w:val="000000" w:themeColor="text1"/>
+          <w:lang w:val="en-DE"/>
         </w:rPr>
         <w:t> (</w:t>
       </w:r>
@@ -9216,6 +9714,7 @@
         <w:rPr>
           <w:rFonts w:cstheme="minorHAnsi"/>
           <w:color w:val="000000" w:themeColor="text1"/>
+          <w:lang w:val="en-DE"/>
         </w:rPr>
         <w:t>Money_In</w:t>
       </w:r>
@@ -9224,6 +9723,7 @@
         <w:rPr>
           <w:rFonts w:cstheme="minorHAnsi"/>
           <w:color w:val="000000" w:themeColor="text1"/>
+          <w:lang w:val="en-DE"/>
         </w:rPr>
         <w:t> - </w:t>
       </w:r>
@@ -9232,6 +9732,7 @@
         <w:rPr>
           <w:rFonts w:cstheme="minorHAnsi"/>
           <w:color w:val="000000" w:themeColor="text1"/>
+          <w:lang w:val="en-DE"/>
         </w:rPr>
         <w:t>Money_Out</w:t>
       </w:r>
@@ -9240,6 +9741,7 @@
         <w:rPr>
           <w:rFonts w:cstheme="minorHAnsi"/>
           <w:color w:val="000000" w:themeColor="text1"/>
+          <w:lang w:val="en-DE"/>
         </w:rPr>
         <w:t>) for all players.</w:t>
       </w:r>
@@ -9248,18 +9750,20 @@
       <w:pPr>
         <w:numPr>
           <w:ilvl w:val="2"/>
-          <w:numId w:val="31"/>
+          <w:numId w:val="54"/>
         </w:numPr>
         <w:spacing w:after="120"/>
         <w:rPr>
           <w:rFonts w:cstheme="minorHAnsi"/>
           <w:color w:val="000000" w:themeColor="text1"/>
-        </w:rPr>
-      </w:pPr>
-      <w:r>
-        <w:rPr>
-          <w:rFonts w:cstheme="minorHAnsi"/>
-          <w:color w:val="000000" w:themeColor="text1"/>
+          <w:lang w:val="en-DE"/>
+        </w:rPr>
+      </w:pPr>
+      <w:r>
+        <w:rPr>
+          <w:rFonts w:cstheme="minorHAnsi"/>
+          <w:color w:val="000000" w:themeColor="text1"/>
+          <w:lang w:val="en-DE"/>
         </w:rPr>
         <w:t>Distributes the fund proportionally to </w:t>
       </w:r>
@@ -9268,6 +9772,7 @@
         <w:rPr>
           <w:rFonts w:cstheme="minorHAnsi"/>
           <w:color w:val="000000" w:themeColor="text1"/>
+          <w:lang w:val="en-DE"/>
         </w:rPr>
         <w:t>Net_Contribution</w:t>
       </w:r>
@@ -9276,6 +9781,7 @@
         <w:rPr>
           <w:rFonts w:cstheme="minorHAnsi"/>
           <w:color w:val="000000" w:themeColor="text1"/>
+          <w:lang w:val="en-DE"/>
         </w:rPr>
         <w:t>.</w:t>
       </w:r>
@@ -9284,20 +9790,25 @@
       <w:pPr>
         <w:numPr>
           <w:ilvl w:val="1"/>
-          <w:numId w:val="31"/>
+          <w:numId w:val="54"/>
         </w:numPr>
-        <w:spacing w:after="120"/>
-        <w:rPr>
-          <w:rFonts w:cstheme="minorHAnsi"/>
-          <w:color w:val="000000" w:themeColor="text1"/>
-        </w:rPr>
-      </w:pPr>
-      <w:r>
-        <w:rPr>
-          <w:rFonts w:cstheme="minorHAnsi"/>
-          <w:b/>
-          <w:bCs/>
-          <w:color w:val="000000" w:themeColor="text1"/>
+        <w:tabs>
+          <w:tab w:val="clear" w:pos="1440"/>
+        </w:tabs>
+        <w:spacing w:after="120"/>
+        <w:rPr>
+          <w:rFonts w:cstheme="minorHAnsi"/>
+          <w:color w:val="000000" w:themeColor="text1"/>
+          <w:lang w:val="en-DE"/>
+        </w:rPr>
+      </w:pPr>
+      <w:r>
+        <w:rPr>
+          <w:rFonts w:cstheme="minorHAnsi"/>
+          <w:b/>
+          <w:bCs/>
+          <w:color w:val="000000" w:themeColor="text1"/>
+          <w:lang w:val="en-DE"/>
         </w:rPr>
         <w:t>Instruction:</w:t>
       </w:r>
@@ -9305,6 +9816,7 @@
         <w:rPr>
           <w:rFonts w:cstheme="minorHAnsi"/>
           <w:color w:val="000000" w:themeColor="text1"/>
+          <w:lang w:val="en-DE"/>
         </w:rPr>
         <w:t> Sends the final array of {</w:t>
       </w:r>
@@ -9313,6 +9825,7 @@
         <w:rPr>
           <w:rFonts w:cstheme="minorHAnsi"/>
           <w:color w:val="000000" w:themeColor="text1"/>
+          <w:lang w:val="en-DE"/>
         </w:rPr>
         <w:t>WinnerAddress</w:t>
       </w:r>
@@ -9321,9 +9834,19 @@
         <w:rPr>
           <w:rFonts w:cstheme="minorHAnsi"/>
           <w:color w:val="000000" w:themeColor="text1"/>
-        </w:rPr>
-        <w:t>, Amount} to the Treasury for execution.</w:t>
-      </w:r>
+          <w:lang w:val="en-DE"/>
+        </w:rPr>
+        <w:t>, Amount} to the Treasury for execution.</w:t>
+      </w:r>
+    </w:p>
+    <w:p>
+      <w:pPr>
+        <w:spacing w:after="120"/>
+        <w:rPr>
+          <w:rFonts w:cstheme="minorHAnsi"/>
+          <w:color w:val="000000" w:themeColor="text1"/>
+        </w:rPr>
+      </w:pPr>
     </w:p>
     <w:p>
       <w:pPr>
@@ -9373,6 +9896,7 @@
           <w:bCs/>
           <w:color w:val="000000" w:themeColor="text1"/>
         </w:rPr>
+        <w:lastRenderedPageBreak/>
         <w:t>Function:</w:t>
       </w:r>
       <w:r>
@@ -9599,7 +10123,6 @@
           <w:bCs/>
           <w:color w:val="000000" w:themeColor="text1"/>
         </w:rPr>
-        <w:lastRenderedPageBreak/>
         <w:t>Institutional Phase (Network Integration):</w:t>
       </w:r>
       <w:r>
@@ -10041,6 +10564,7 @@
           <w:bCs/>
           <w:color w:val="000000" w:themeColor="text1"/>
         </w:rPr>
+        <w:lastRenderedPageBreak/>
         <w:t>Settlement Calculation:</w:t>
       </w:r>
       <w:r>
@@ -10209,6 +10733,290 @@
       <w:pPr>
         <w:spacing w:after="120"/>
         <w:rPr>
+          <w:rFonts w:cstheme="minorHAnsi"/>
+          <w:color w:val="000000" w:themeColor="text1"/>
+          <w:lang w:val="en-DE"/>
+        </w:rPr>
+      </w:pPr>
+      <w:r>
+        <w:rPr>
+          <w:rFonts w:cstheme="minorHAnsi"/>
+          <w:b/>
+          <w:bCs/>
+          <w:color w:val="000000" w:themeColor="text1"/>
+          <w:lang w:val="en-DE"/>
+        </w:rPr>
+        <w:t>The Operational Lifecycle</w:t>
+      </w:r>
+    </w:p>
+    <w:p>
+      <w:pPr>
+        <w:numPr>
+          <w:ilvl w:val="0"/>
+          <w:numId w:val="53"/>
+        </w:numPr>
+        <w:spacing w:after="120"/>
+        <w:rPr>
+          <w:rFonts w:cstheme="minorHAnsi"/>
+          <w:color w:val="000000" w:themeColor="text1"/>
+          <w:lang w:val="en-DE"/>
+        </w:rPr>
+      </w:pPr>
+      <w:r>
+        <w:rPr>
+          <w:rFonts w:cstheme="minorHAnsi"/>
+          <w:b/>
+          <w:bCs/>
+          <w:color w:val="000000" w:themeColor="text1"/>
+          <w:lang w:val="en-DE"/>
+        </w:rPr>
+        <w:t>Auction:</w:t>
+      </w:r>
+      <w:r>
+        <w:rPr>
+          <w:rFonts w:cstheme="minorHAnsi"/>
+          <w:color w:val="000000" w:themeColor="text1"/>
+          <w:lang w:val="en-DE"/>
+        </w:rPr>
+        <w:t> Users mint FIM</w:t>
+      </w:r>
+      <w:r>
+        <w:rPr>
+          <w:rFonts w:cstheme="minorHAnsi"/>
+          <w:color w:val="000000" w:themeColor="text1"/>
+          <w:lang w:val="en-DE"/>
+        </w:rPr>
+        <w:t xml:space="preserve"> </w:t>
+      </w:r>
+      <w:r>
+        <w:rPr>
+          <w:rFonts w:cstheme="minorHAnsi"/>
+          <w:color w:val="000000" w:themeColor="text1"/>
+          <w:lang w:val="en-DE"/>
+        </w:rPr>
+        <w:t>via the Auction contract.</w:t>
+      </w:r>
+    </w:p>
+    <w:p>
+      <w:pPr>
+        <w:numPr>
+          <w:ilvl w:val="0"/>
+          <w:numId w:val="53"/>
+        </w:numPr>
+        <w:spacing w:after="120"/>
+        <w:rPr>
+          <w:rFonts w:cstheme="minorHAnsi"/>
+          <w:color w:val="000000" w:themeColor="text1"/>
+          <w:lang w:val="en-DE"/>
+        </w:rPr>
+      </w:pPr>
+      <w:r>
+        <w:rPr>
+          <w:rFonts w:cstheme="minorHAnsi"/>
+          <w:b/>
+          <w:bCs/>
+          <w:color w:val="000000" w:themeColor="text1"/>
+          <w:lang w:val="en-DE"/>
+        </w:rPr>
+        <w:t>Bootstrap:</w:t>
+      </w:r>
+      <w:r>
+        <w:rPr>
+          <w:rFonts w:cstheme="minorHAnsi"/>
+          <w:color w:val="000000" w:themeColor="text1"/>
+          <w:lang w:val="en-DE"/>
+        </w:rPr>
+        <w:t> The Game enters a waiting state. The Bot calculates and submits </w:t>
+      </w:r>
+      <w:proofErr w:type="spellStart"/>
+      <w:proofErr w:type="gramStart"/>
+      <w:r>
+        <w:rPr>
+          <w:rFonts w:cstheme="minorHAnsi"/>
+          <w:color w:val="000000" w:themeColor="text1"/>
+          <w:lang w:val="en-DE"/>
+        </w:rPr>
+        <w:t>Ginitial</w:t>
+      </w:r>
+      <w:proofErr w:type="spellEnd"/>
+      <w:r>
+        <w:rPr>
+          <w:rFonts w:cstheme="minorHAnsi"/>
+          <w:color w:val="000000" w:themeColor="text1"/>
+          <w:lang w:val="en-DE"/>
+        </w:rPr>
+        <w:t xml:space="preserve"> </w:t>
+      </w:r>
+      <w:r>
+        <w:rPr>
+          <w:rFonts w:cstheme="minorHAnsi"/>
+          <w:color w:val="000000" w:themeColor="text1"/>
+          <w:lang w:val="en-DE"/>
+        </w:rPr>
+        <w:t>.</w:t>
+      </w:r>
+      <w:proofErr w:type="gramEnd"/>
+      <w:r>
+        <w:rPr>
+          <w:rFonts w:cstheme="minorHAnsi"/>
+          <w:color w:val="000000" w:themeColor="text1"/>
+          <w:lang w:val="en-DE"/>
+        </w:rPr>
+        <w:t xml:space="preserve"> Trading opens only after this verification is complete.</w:t>
+      </w:r>
+    </w:p>
+    <w:p>
+      <w:pPr>
+        <w:numPr>
+          <w:ilvl w:val="0"/>
+          <w:numId w:val="53"/>
+        </w:numPr>
+        <w:spacing w:after="120"/>
+        <w:rPr>
+          <w:rFonts w:cstheme="minorHAnsi"/>
+          <w:color w:val="000000" w:themeColor="text1"/>
+          <w:lang w:val="en-DE"/>
+        </w:rPr>
+      </w:pPr>
+      <w:r>
+        <w:rPr>
+          <w:rFonts w:cstheme="minorHAnsi"/>
+          <w:b/>
+          <w:bCs/>
+          <w:color w:val="000000" w:themeColor="text1"/>
+          <w:lang w:val="en-DE"/>
+        </w:rPr>
+        <w:t>Trading:</w:t>
+      </w:r>
+      <w:r>
+        <w:rPr>
+          <w:rFonts w:cstheme="minorHAnsi"/>
+          <w:color w:val="000000" w:themeColor="text1"/>
+          <w:lang w:val="en-DE"/>
+        </w:rPr>
+        <w:t> The active market phase where </w:t>
+      </w:r>
+      <w:proofErr w:type="spellStart"/>
+      <w:r>
+        <w:rPr>
+          <w:rFonts w:cstheme="minorHAnsi"/>
+          <w:color w:val="000000" w:themeColor="text1"/>
+          <w:lang w:val="en-DE"/>
+        </w:rPr>
+        <w:t>FIMis</w:t>
+      </w:r>
+      <w:proofErr w:type="spellEnd"/>
+      <w:r>
+        <w:rPr>
+          <w:rFonts w:cstheme="minorHAnsi"/>
+          <w:color w:val="000000" w:themeColor="text1"/>
+          <w:lang w:val="en-DE"/>
+        </w:rPr>
+        <w:t xml:space="preserve"> exchanged.</w:t>
+      </w:r>
+    </w:p>
+    <w:p>
+      <w:pPr>
+        <w:numPr>
+          <w:ilvl w:val="0"/>
+          <w:numId w:val="53"/>
+        </w:numPr>
+        <w:spacing w:after="120"/>
+        <w:rPr>
+          <w:rFonts w:cstheme="minorHAnsi"/>
+          <w:color w:val="000000" w:themeColor="text1"/>
+          <w:lang w:val="en-DE"/>
+        </w:rPr>
+      </w:pPr>
+      <w:r>
+        <w:rPr>
+          <w:rFonts w:cstheme="minorHAnsi"/>
+          <w:b/>
+          <w:bCs/>
+          <w:color w:val="000000" w:themeColor="text1"/>
+          <w:lang w:val="en-DE"/>
+        </w:rPr>
+        <w:t>Settling:</w:t>
+      </w:r>
+      <w:r>
+        <w:rPr>
+          <w:rFonts w:cstheme="minorHAnsi"/>
+          <w:color w:val="000000" w:themeColor="text1"/>
+          <w:lang w:val="en-DE"/>
+        </w:rPr>
+        <w:t> Upon a victory trigger or time expiry, the Bot submits the final sorted state to verify the outcome.</w:t>
+      </w:r>
+    </w:p>
+    <w:p>
+      <w:pPr>
+        <w:numPr>
+          <w:ilvl w:val="0"/>
+          <w:numId w:val="53"/>
+        </w:numPr>
+        <w:spacing w:after="120"/>
+        <w:rPr>
+          <w:rFonts w:cstheme="minorHAnsi"/>
+          <w:color w:val="000000" w:themeColor="text1"/>
+          <w:lang w:val="en-DE"/>
+        </w:rPr>
+      </w:pPr>
+      <w:r>
+        <w:rPr>
+          <w:rFonts w:cstheme="minorHAnsi"/>
+          <w:b/>
+          <w:bCs/>
+          <w:color w:val="000000" w:themeColor="text1"/>
+          <w:lang w:val="en-DE"/>
+        </w:rPr>
+        <w:t>Payout:</w:t>
+      </w:r>
+      <w:r>
+        <w:rPr>
+          <w:rFonts w:cstheme="minorHAnsi"/>
+          <w:color w:val="000000" w:themeColor="text1"/>
+          <w:lang w:val="en-DE"/>
+        </w:rPr>
+        <w:t> Users claim prizes and unlock their RTD</w:t>
+      </w:r>
+      <w:r>
+        <w:rPr>
+          <w:rFonts w:cstheme="minorHAnsi"/>
+          <w:color w:val="000000" w:themeColor="text1"/>
+          <w:lang w:val="en-DE"/>
+        </w:rPr>
+        <w:t xml:space="preserve"> </w:t>
+      </w:r>
+      <w:r>
+        <w:rPr>
+          <w:rFonts w:cstheme="minorHAnsi"/>
+          <w:color w:val="000000" w:themeColor="text1"/>
+          <w:lang w:val="en-DE"/>
+        </w:rPr>
+        <w:t>collateral.</w:t>
+      </w:r>
+    </w:p>
+    <w:p>
+      <w:pPr>
+        <w:spacing w:after="120"/>
+        <w:rPr>
+          <w:rFonts w:cstheme="minorHAnsi"/>
+          <w:color w:val="000000" w:themeColor="text1"/>
+        </w:rPr>
+      </w:pPr>
+    </w:p>
+    <w:p>
+      <w:pPr>
+        <w:spacing w:after="120"/>
+        <w:rPr>
+          <w:rFonts w:cstheme="minorHAnsi"/>
+          <w:color w:val="000000" w:themeColor="text1"/>
+        </w:rPr>
+      </w:pPr>
+    </w:p>
+    <w:p>
+      <w:pPr>
+        <w:spacing w:after="120"/>
+        <w:rPr>
           <w:rFonts w:eastAsiaTheme="majorEastAsia" w:cstheme="majorBidi"/>
           <w:b/>
           <w:color w:val="000000" w:themeColor="text1"/>
@@ -10261,13 +11069,11 @@
       <w:r>
         <w:t xml:space="preserve">The economic architecture of </w:t>
       </w:r>
-      <w:proofErr w:type="spellStart"/>
-      <w:r>
-        <w:t>Ritardo</w:t>
-      </w:r>
-      <w:proofErr w:type="spellEnd"/>
-      <w:r>
-        <w:t xml:space="preserve"> Games uses a </w:t>
+      <w:r>
+        <w:t>Gini.gg</w:t>
+      </w:r>
+      <w:r>
+        <w:t xml:space="preserve"> uses a </w:t>
       </w:r>
       <w:r>
         <w:rPr>
@@ -10338,13 +11144,17 @@
         <w:pStyle w:val="Heading3"/>
       </w:pPr>
       <w:r>
-        <w:t xml:space="preserve">The Sovereign Asset: $RTD (The </w:t>
-      </w:r>
-      <w:proofErr w:type="spellStart"/>
-      <w:r>
-        <w:t>Ritardo</w:t>
-      </w:r>
-      <w:proofErr w:type="spellEnd"/>
+        <w:t xml:space="preserve">The Sovereign Asset: </w:t>
+      </w:r>
+      <w:r>
+        <w:t>$GINI</w:t>
+      </w:r>
+      <w:r>
+        <w:t xml:space="preserve"> (The </w:t>
+      </w:r>
+      <w:r>
+        <w:t>Gini</w:t>
+      </w:r>
       <w:r>
         <w:t>)</w:t>
       </w:r>
@@ -10390,21 +11200,31 @@
         <w:rPr>
           <w:rFonts w:eastAsiaTheme="majorEastAsia" w:cstheme="minorHAnsi"/>
         </w:rPr>
-        <w:t xml:space="preserve"> $RTD represents ownership over the </w:t>
-      </w:r>
-      <w:proofErr w:type="spellStart"/>
+        <w:t> </w:t>
+      </w:r>
       <w:r>
         <w:rPr>
           <w:rFonts w:eastAsiaTheme="majorEastAsia" w:cstheme="minorHAnsi"/>
         </w:rPr>
-        <w:t>Ritardo</w:t>
-      </w:r>
-      <w:proofErr w:type="spellEnd"/>
+        <w:t>$GINI</w:t>
+      </w:r>
       <w:r>
         <w:rPr>
           <w:rFonts w:eastAsiaTheme="majorEastAsia" w:cstheme="minorHAnsi"/>
         </w:rPr>
-        <w:t xml:space="preserve"> Games protocol.</w:t>
+        <w:t xml:space="preserve"> represents ownership over the </w:t>
+      </w:r>
+      <w:r>
+        <w:rPr>
+          <w:rFonts w:eastAsiaTheme="majorEastAsia" w:cstheme="minorHAnsi"/>
+        </w:rPr>
+        <w:t>Gini.gg</w:t>
+      </w:r>
+      <w:r>
+        <w:rPr>
+          <w:rFonts w:eastAsiaTheme="majorEastAsia" w:cstheme="minorHAnsi"/>
+        </w:rPr>
+        <w:t xml:space="preserve"> protocol.</w:t>
       </w:r>
     </w:p>
     <w:p>
@@ -10440,7 +11260,19 @@
         <w:rPr>
           <w:rFonts w:eastAsiaTheme="majorEastAsia" w:cstheme="minorHAnsi"/>
         </w:rPr>
-        <w:t>, holding $RTD is required to play the game. The </w:t>
+        <w:t xml:space="preserve">, holding </w:t>
+      </w:r>
+      <w:r>
+        <w:rPr>
+          <w:rFonts w:eastAsiaTheme="majorEastAsia" w:cstheme="minorHAnsi"/>
+        </w:rPr>
+        <w:t>$GINI</w:t>
+      </w:r>
+      <w:r>
+        <w:rPr>
+          <w:rFonts w:eastAsiaTheme="majorEastAsia" w:cstheme="minorHAnsi"/>
+        </w:rPr>
+        <w:t xml:space="preserve"> is required to play the game. The </w:t>
       </w:r>
       <w:proofErr w:type="spellStart"/>
       <w:r>
@@ -10498,7 +11330,19 @@
         <w:rPr>
           <w:rFonts w:eastAsiaTheme="majorEastAsia" w:cstheme="minorHAnsi"/>
         </w:rPr>
-        <w:t>, the $RTD ecosystem uses a Dynamic Allocation model. The USDC profits generated by the Treasury are used according to the active </w:t>
+        <w:t xml:space="preserve">, the </w:t>
+      </w:r>
+      <w:r>
+        <w:rPr>
+          <w:rFonts w:eastAsiaTheme="majorEastAsia" w:cstheme="minorHAnsi"/>
+        </w:rPr>
+        <w:t>$GINI</w:t>
+      </w:r>
+      <w:r>
+        <w:rPr>
+          <w:rFonts w:eastAsiaTheme="majorEastAsia" w:cstheme="minorHAnsi"/>
+        </w:rPr>
+        <w:t xml:space="preserve"> ecosystem uses a Dynamic Allocation model. The USDC profits generated by the Treasury are used according to the active </w:t>
       </w:r>
       <w:proofErr w:type="spellStart"/>
       <w:r>
@@ -10538,7 +11382,19 @@
         <w:rPr>
           <w:rFonts w:eastAsiaTheme="majorEastAsia" w:cstheme="minorHAnsi"/>
         </w:rPr>
-        <w:t> Purchasing and burning $RTD to reduce total supply.</w:t>
+        <w:t xml:space="preserve"> Purchasing and burning </w:t>
+      </w:r>
+      <w:r>
+        <w:rPr>
+          <w:rFonts w:eastAsiaTheme="majorEastAsia" w:cstheme="minorHAnsi"/>
+        </w:rPr>
+        <w:t>$GINI</w:t>
+      </w:r>
+      <w:r>
+        <w:rPr>
+          <w:rFonts w:eastAsiaTheme="majorEastAsia" w:cstheme="minorHAnsi"/>
+        </w:rPr>
+        <w:t xml:space="preserve"> to reduce total supply.</w:t>
       </w:r>
     </w:p>
     <w:p>
@@ -10613,7 +11469,13 @@
     </w:p>
     <w:p>
       <w:r>
-        <w:t>The total supply of $RTD is fixed at </w:t>
+        <w:t xml:space="preserve">The total supply of </w:t>
+      </w:r>
+      <w:r>
+        <w:t>$GINI</w:t>
+      </w:r>
+      <w:r>
+        <w:t xml:space="preserve"> is fixed at </w:t>
       </w:r>
       <w:r>
         <w:rPr>
@@ -10637,10 +11499,10 @@
         <w:tblLook w:val="04A0" w:firstRow="1" w:lastRow="0" w:firstColumn="1" w:lastColumn="0" w:noHBand="0" w:noVBand="1"/>
       </w:tblPr>
       <w:tblGrid>
-        <w:gridCol w:w="1526"/>
+        <w:gridCol w:w="1534"/>
         <w:gridCol w:w="1109"/>
         <w:gridCol w:w="1496"/>
-        <w:gridCol w:w="4885"/>
+        <w:gridCol w:w="4877"/>
       </w:tblGrid>
       <w:tr>
         <w:tc>
@@ -10988,21 +11850,19 @@
             <w:r>
               <w:t> Allocated to the </w:t>
             </w:r>
-            <w:proofErr w:type="spellStart"/>
             <w:r>
               <w:rPr>
                 <w:b/>
                 <w:bCs/>
               </w:rPr>
-              <w:t>Ritardo</w:t>
-            </w:r>
-            <w:proofErr w:type="spellEnd"/>
+              <w:t>Gini.gg</w:t>
+            </w:r>
             <w:r>
               <w:rPr>
                 <w:b/>
                 <w:bCs/>
               </w:rPr>
-              <w:t xml:space="preserve"> Games DAO LLC</w:t>
+              <w:t xml:space="preserve"> DAO LLC</w:t>
             </w:r>
             <w:r>
               <w:t> to cover real-world costs (legal compliance, audits, hosting). Managed via multi-sig with strict spending rules.</w:t>
@@ -11159,13 +12019,11 @@
       <w:r>
         <w:t xml:space="preserve">The emission schedule of the </w:t>
       </w:r>
-      <w:proofErr w:type="spellStart"/>
-      <w:r>
-        <w:t>Ritardo</w:t>
-      </w:r>
-      <w:proofErr w:type="spellEnd"/>
-      <w:r>
-        <w:t xml:space="preserve"> Games ecosystem is architected to prioritize long-term protocol stability over short-term speculative velocity. While the initial circulating supply is set at 5%, this figure represents only the starting state of a </w:t>
+      <w:r>
+        <w:t>Gini.gg</w:t>
+      </w:r>
+      <w:r>
+        <w:t xml:space="preserve"> ecosystem is architected to prioritize long-term protocol stability over short-term speculative velocity. While the initial circulating supply is set at 5%, this figure represents only the starting state of a </w:t>
       </w:r>
       <w:r>
         <w:rPr>
@@ -11227,7 +12085,21 @@
           <w:b/>
           <w:bCs/>
         </w:rPr>
-        <w:t>75% of the total $RTD supply is dedicated to the community</w:t>
+        <w:t xml:space="preserve">75% of the total </w:t>
+      </w:r>
+      <w:r>
+        <w:rPr>
+          <w:b/>
+          <w:bCs/>
+        </w:rPr>
+        <w:t>$GINI</w:t>
+      </w:r>
+      <w:r>
+        <w:rPr>
+          <w:b/>
+          <w:bCs/>
+        </w:rPr>
+        <w:t xml:space="preserve"> supply is dedicated to the community</w:t>
       </w:r>
       <w:r>
         <w:t>:</w:t>
@@ -11339,7 +12211,19 @@
       </w:r>
       <w:r>
         <w:br/>
-        <w:t>The $RTD economy is instantiated through a singular, atomic Token Generation Event (TGE). During this event, the immutable supply cap of 1,000,000,000 $RTD is minted. Distribution to the specific vesting contracts (for Team) and holding vaults (for Treasury and Ecosystem) is executed programmatically in the same block to ensure strict adherence to the allocation table defined in Section 10.3.</w:t>
+        <w:t xml:space="preserve">The </w:t>
+      </w:r>
+      <w:r>
+        <w:t>$GINI</w:t>
+      </w:r>
+      <w:r>
+        <w:t xml:space="preserve"> economy is instantiated through a singular, atomic Token Generation Event (TGE). During this event, the immutable supply cap of 1,000,000,000 </w:t>
+      </w:r>
+      <w:r>
+        <w:t>$GINI</w:t>
+      </w:r>
+      <w:r>
+        <w:t xml:space="preserve"> is minted. Distribution to the specific vesting contracts (for Team) and holding vaults (for Treasury and Ecosystem) is executed programmatically in the same block to ensure strict adherence to the allocation table defined in Section 10.3.</w:t>
       </w:r>
     </w:p>
     <w:p>
@@ -11362,7 +12246,13 @@
         <w:t>10%</w:t>
       </w:r>
       <w:r>
-        <w:t> of supply allocated to "Genesis Liquidity" is operationally divided into two distinct tranches of 50,000,000 $RTD (5%) each, serving complementary functions:</w:t>
+        <w:t xml:space="preserve"> of supply allocated to "Genesis Liquidity" is operationally divided into two distinct tranches of 50,000,000 </w:t>
+      </w:r>
+      <w:r>
+        <w:t>$GINI</w:t>
+      </w:r>
+      <w:r>
+        <w:t xml:space="preserve"> (5%) each, serving complementary functions:</w:t>
       </w:r>
     </w:p>
     <w:p>
@@ -11410,13 +12300,11 @@
         <w:br/>
         <w:t xml:space="preserve">The second tranche (5%) is paired with USDC capital provided by the </w:t>
       </w:r>
-      <w:proofErr w:type="spellStart"/>
-      <w:r>
-        <w:t>Ritardo</w:t>
-      </w:r>
-      <w:proofErr w:type="spellEnd"/>
-      <w:r>
-        <w:t xml:space="preserve"> Games DAO LLC to establish the initial market.</w:t>
+      <w:r>
+        <w:t>Gini.gg</w:t>
+      </w:r>
+      <w:r>
+        <w:t xml:space="preserve"> DAO LLC to establish the initial market.</w:t>
       </w:r>
     </w:p>
     <w:p>
@@ -11546,13 +12434,11 @@
       <w:r>
         <w:t xml:space="preserve">The growth strategy of the </w:t>
       </w:r>
-      <w:proofErr w:type="spellStart"/>
-      <w:r>
-        <w:t>Ritardo</w:t>
-      </w:r>
-      <w:proofErr w:type="spellEnd"/>
-      <w:r>
-        <w:t xml:space="preserve"> Games ecosystem operates on the premise that a robust decentralized network requires a dedicated, intellectually engaged core constituency. The go-to-market strategy is bifurcated into a </w:t>
+      <w:r>
+        <w:t>Gini.gg</w:t>
+      </w:r>
+      <w:r>
+        <w:t xml:space="preserve"> ecosystem operates on the premise that a robust decentralized network requires a dedicated, intellectually engaged core constituency. The go-to-market strategy is bifurcated into a </w:t>
       </w:r>
       <w:r>
         <w:rPr>
@@ -12617,13 +13503,11 @@
       <w:r>
         <w:t xml:space="preserve">By formalizing the social layer, </w:t>
       </w:r>
-      <w:proofErr w:type="spellStart"/>
-      <w:r>
-        <w:t>Ritardo</w:t>
-      </w:r>
-      <w:proofErr w:type="spellEnd"/>
-      <w:r>
-        <w:t xml:space="preserve"> Games ensures that the "meta-game" of coordination is as robust as the on-chain execution.</w:t>
+      <w:r>
+        <w:t>Gini.gg</w:t>
+      </w:r>
+      <w:r>
+        <w:t xml:space="preserve"> ensures that the "meta-game" of coordination is as robust as the on-chain execution.</w:t>
       </w:r>
     </w:p>
     <w:p/>
@@ -13136,13 +14020,11 @@
       <w:r>
         <w:t xml:space="preserve">At its core, </w:t>
       </w:r>
-      <w:proofErr w:type="spellStart"/>
-      <w:r>
-        <w:t>Ritardo</w:t>
-      </w:r>
-      <w:proofErr w:type="spellEnd"/>
-      <w:r>
-        <w:t xml:space="preserve"> Games is a perfect-information, real-money economic simulation built on a foundation of pure strategy. It is a competitive arena where victory is not determined by luck or informational asymmetry, but by a participant's ability to </w:t>
+      <w:r>
+        <w:t>Gini.gg</w:t>
+      </w:r>
+      <w:r>
+        <w:t xml:space="preserve"> is a perfect-information, real-money economic simulation built on a foundation of pure strategy. It is a competitive arena where victory is not determined by luck or informational asymmetry, but by a participant's ability to </w:t>
       </w:r>
       <w:proofErr w:type="spellStart"/>
       <w:r>
@@ -13538,7 +14420,13 @@
               <w:t>Game Season 1 Launch</w:t>
             </w:r>
             <w:r>
-              <w:t>, $RTD Token Generation Event (TGE), </w:t>
+              <w:t xml:space="preserve">, </w:t>
+            </w:r>
+            <w:r>
+              <w:t>$GINI</w:t>
+            </w:r>
+            <w:r>
+              <w:t xml:space="preserve"> Token Generation Event (TGE), </w:t>
             </w:r>
             <w:r>
               <w:rPr>
@@ -13682,7 +14570,6 @@
         <w:pStyle w:val="Heading3"/>
       </w:pPr>
       <w:r>
-        <w:lastRenderedPageBreak/>
         <w:t>Future Vision: The Evolution of the Game</w:t>
       </w:r>
     </w:p>
@@ -13690,11 +14577,9 @@
       <w:r>
         <w:t xml:space="preserve">The initial game mode establishes the baseline mechanism. The </w:t>
       </w:r>
-      <w:proofErr w:type="spellStart"/>
-      <w:r>
-        <w:t>Ritardo</w:t>
-      </w:r>
-      <w:proofErr w:type="spellEnd"/>
+      <w:r>
+        <w:t>Gini.gg</w:t>
+      </w:r>
       <w:r>
         <w:t xml:space="preserve"> DAO is empowered to continuously introduce new modes to challenge players and expand the ecosystem’s strategic depth. Future possibilities include:</w:t>
       </w:r>
@@ -13711,6 +14596,7 @@
           <w:b/>
           <w:bCs/>
         </w:rPr>
+        <w:lastRenderedPageBreak/>
         <w:t>The "Volatile Asset" Game Mode:</w:t>
       </w:r>
       <w:r>
@@ -14204,7 +15090,6 @@
         <w:spacing w:after="120"/>
       </w:pPr>
       <w:r>
-        <w:lastRenderedPageBreak/>
         <w:t>Payout Logic Formalization:</w:t>
       </w:r>
     </w:p>
@@ -14372,6 +15257,7 @@
         <w:spacing w:after="120"/>
       </w:pPr>
       <w:r>
+        <w:lastRenderedPageBreak/>
         <w:t>For a player </w:t>
       </w:r>
       <w:proofErr w:type="spellStart"/>
@@ -14752,13 +15638,64 @@
       <w:r>
         <w:t xml:space="preserve">The design of </w:t>
       </w:r>
+      <w:r>
+        <w:t>Gini.gg</w:t>
+      </w:r>
+      <w:r>
+        <w:t xml:space="preserve"> is an exercise in applied game theory. The rules are not just a framework for play, but a system designed to guide participants toward specific strategic realizations and to counter common exploits through robust mechanism design.</w:t>
+      </w:r>
+    </w:p>
+    <w:p>
+      <w:pPr>
+        <w:pStyle w:val="Heading3"/>
+        <w:spacing w:after="120"/>
+      </w:pPr>
+      <w:r>
+        <w:rPr>
+          <w:rStyle w:val="Heading3Char"/>
+          <w:b/>
+          <w:bCs/>
+        </w:rPr>
+        <w:t>The Core Dilemma: The Individual vs. The Collective</w:t>
+      </w:r>
+    </w:p>
+    <w:p>
+      <w:pPr>
+        <w:spacing w:after="120"/>
+      </w:pPr>
+      <w:r>
+        <w:t>The game presents a classic multi-player dilemma. The most intuitive, low-coordination strategy for any individual player is to act in their own immediate self-interest (buy low, sell high to maximize personal</w:t>
+      </w:r>
+      <w:r>
+        <w:t xml:space="preserve"> $USDC</w:t>
+      </w:r>
+      <w:r>
+        <w:t xml:space="preserve"> profit). However, every such trade, if made without considering the counterparty, is statistically likely to push the Gini Coefficient up, benefiting the Capitalist faction. If all non-whale players adopt this simple strategy, they collectively guarantee a Capitalist victory where they are almost certain to win nothing. The globally optimal strategy for the majority is to overcome this coordination problem and act as a collective for the Socialist victory.</w:t>
+      </w:r>
+    </w:p>
+    <w:p>
+      <w:pPr>
+        <w:pStyle w:val="Heading3"/>
+        <w:spacing w:after="120"/>
+      </w:pPr>
+      <w:r>
+        <w:t>Nash Equilibrium &amp; The Learning Effect</w:t>
+      </w:r>
+    </w:p>
+    <w:p>
+      <w:pPr>
+        <w:spacing w:after="120"/>
+      </w:pPr>
+      <w:r>
+        <w:t xml:space="preserve">The "obvious" Nash Equilibrium, from a single-player perspective, appears to be defection from the collective good in </w:t>
+      </w:r>
       <w:proofErr w:type="spellStart"/>
       <w:r>
-        <w:t>Ritardo</w:t>
+        <w:t>favor</w:t>
       </w:r>
       <w:proofErr w:type="spellEnd"/>
       <w:r>
-        <w:t xml:space="preserve"> Games is an exercise in applied game theory. The rules are not just a framework for play, but a system designed to guide participants toward specific strategic realizations and to counter common exploits through robust mechanism design.</w:t>
+        <w:t xml:space="preserve"> of personal profit. The game is designed to reveal that this is a suboptimal equilibrium for most participants. The true, more stable equilibrium is cooperation within a faction. The game's "learning effect" is the process of players discovering, through real financial stakes, that their own best outcome is tied to the success of their chosen collective.</w:t>
       </w:r>
     </w:p>
     <w:p>
@@ -14767,59 +15704,6 @@
         <w:spacing w:after="120"/>
       </w:pPr>
       <w:r>
-        <w:rPr>
-          <w:rStyle w:val="Heading3Char"/>
-          <w:b/>
-          <w:bCs/>
-        </w:rPr>
-        <w:t>The Core Dilemma: The Individual vs. The Collective</w:t>
-      </w:r>
-    </w:p>
-    <w:p>
-      <w:pPr>
-        <w:spacing w:after="120"/>
-      </w:pPr>
-      <w:r>
-        <w:t>The game presents a classic multi-player dilemma. The most intuitive, low-coordination strategy for any individual player is to act in their own immediate self-interest (buy low, sell high to maximize personal</w:t>
-      </w:r>
-      <w:r>
-        <w:t xml:space="preserve"> $USDC</w:t>
-      </w:r>
-      <w:r>
-        <w:t xml:space="preserve"> profit). However, every such trade, if made without considering the counterparty, is statistically likely to push the Gini Coefficient up, benefiting the Capitalist faction. If all non-whale players adopt this simple strategy, they collectively guarantee a Capitalist victory where they are almost certain to win nothing. The globally optimal strategy for the majority is to overcome this coordination problem and act as a collective for the Socialist victory.</w:t>
-      </w:r>
-    </w:p>
-    <w:p>
-      <w:pPr>
-        <w:pStyle w:val="Heading3"/>
-        <w:spacing w:after="120"/>
-      </w:pPr>
-      <w:r>
-        <w:t>Nash Equilibrium &amp; The Learning Effect</w:t>
-      </w:r>
-    </w:p>
-    <w:p>
-      <w:pPr>
-        <w:spacing w:after="120"/>
-      </w:pPr>
-      <w:r>
-        <w:t xml:space="preserve">The "obvious" Nash Equilibrium, from a single-player perspective, appears to be defection from the collective good in </w:t>
-      </w:r>
-      <w:proofErr w:type="spellStart"/>
-      <w:r>
-        <w:t>favor</w:t>
-      </w:r>
-      <w:proofErr w:type="spellEnd"/>
-      <w:r>
-        <w:t xml:space="preserve"> of personal profit. The game is designed to reveal that this is a suboptimal equilibrium for most participants. The true, more stable equilibrium is cooperation within a faction. The game's "learning effect" is the process of players discovering, through real financial stakes, that their own best outcome is tied to the success of their chosen collective.</w:t>
-      </w:r>
-    </w:p>
-    <w:p>
-      <w:pPr>
-        <w:pStyle w:val="Heading3"/>
-        <w:spacing w:after="120"/>
-      </w:pPr>
-      <w:r>
         <w:t>Emergent Strategies: Gini-Aware Trading</w:t>
       </w:r>
     </w:p>
@@ -14827,13 +15711,11 @@
       <w:r>
         <w:t xml:space="preserve">The platform's design, which provides perfect information about counterparty balances on the Peer-to-Peer Order Book, gives rise to a set of sophisticated strategies we term "Gini-Aware Trading." Unlike traditional markets focused solely on price, players in </w:t>
       </w:r>
-      <w:proofErr w:type="spellStart"/>
-      <w:r>
-        <w:t>Ritardo</w:t>
-      </w:r>
-      <w:proofErr w:type="spellEnd"/>
-      <w:r>
-        <w:t xml:space="preserve"> Games must price in the externality of their trade's impact on the Gini Coefficient.</w:t>
+      <w:r>
+        <w:t>Gini.gg</w:t>
+      </w:r>
+      <w:r>
+        <w:t xml:space="preserve"> must price in the externality of their trade's impact on the Gini Coefficient.</w:t>
       </w:r>
     </w:p>
     <w:p>
@@ -14848,7 +15730,6 @@
           <w:b/>
           <w:bCs/>
         </w:rPr>
-        <w:lastRenderedPageBreak/>
         <w:t>The Socialist Premium:</w:t>
       </w:r>
       <w:r>
@@ -14885,6 +15766,7 @@
           <w:b/>
           <w:bCs/>
         </w:rPr>
+        <w:lastRenderedPageBreak/>
         <w:t>Strategic Matching:</w:t>
       </w:r>
       <w:r>
@@ -15242,7 +16124,6 @@
         <w:spacing w:after="120"/>
       </w:pPr>
       <w:r>
-        <w:lastRenderedPageBreak/>
         <w:t>DAO (Decentralized Autonomous Organization): An organization represented by rules encoded as a computer program that is transparent, controlled by the organization members, and not influenced by a central government.</w:t>
       </w:r>
     </w:p>
@@ -15257,13 +16138,11 @@
       <w:r>
         <w:t xml:space="preserve">$FIM (Fake Internet Money): The non-investment, seasonal utility token used exclusively for gameplay within a single </w:t>
       </w:r>
-      <w:proofErr w:type="spellStart"/>
-      <w:r>
-        <w:t>Ritardo</w:t>
-      </w:r>
-      <w:proofErr w:type="spellEnd"/>
-      <w:r>
-        <w:t xml:space="preserve"> Games season.</w:t>
+      <w:r>
+        <w:t>Gini.gg</w:t>
+      </w:r>
+      <w:r>
+        <w:t xml:space="preserve"> season.</w:t>
       </w:r>
     </w:p>
     <w:p>
@@ -15287,6 +16166,7 @@
         <w:spacing w:after="120"/>
       </w:pPr>
       <w:r>
+        <w:lastRenderedPageBreak/>
         <w:t xml:space="preserve">Net Contribution: A core metric calculated as a player's total </w:t>
       </w:r>
       <w:proofErr w:type="spellStart"/>
@@ -15335,23 +16215,22 @@
         <w:spacing w:after="120"/>
       </w:pPr>
       <w:r>
-        <w:t>$RTD (</w:t>
-      </w:r>
-      <w:proofErr w:type="spellStart"/>
-      <w:r>
-        <w:t>Ritardo</w:t>
-      </w:r>
-      <w:proofErr w:type="spellEnd"/>
+        <w:t>$GINI</w:t>
+      </w:r>
+      <w:r>
+        <w:t xml:space="preserve"> (</w:t>
+      </w:r>
+      <w:r>
+        <w:t>Gini</w:t>
+      </w:r>
       <w:r>
         <w:t xml:space="preserve">): The governance token of the </w:t>
       </w:r>
-      <w:proofErr w:type="spellStart"/>
-      <w:r>
-        <w:t>Ritardo</w:t>
-      </w:r>
-      <w:proofErr w:type="spellEnd"/>
-      <w:r>
-        <w:t xml:space="preserve"> Games ecosystem. Holders govern the DAO and their stake is required as collateral to participate in the game.</w:t>
+      <w:r>
+        <w:t>Gini.gg</w:t>
+      </w:r>
+      <w:r>
+        <w:t xml:space="preserve"> ecosystem. Holders govern the DAO and their stake is required as collateral to participate in the game.</w:t>
       </w:r>
     </w:p>
     <w:p>
@@ -16254,6 +17133,119 @@
     </w:lvl>
   </w:abstractNum>
   <w:abstractNum w:abstractNumId="5" w15:restartNumberingAfterBreak="0">
+    <w:nsid w:val="143202CA"/>
+    <w:multiLevelType w:val="multilevel"/>
+    <w:tmpl w:val="37040172"/>
+    <w:lvl w:ilvl="0">
+      <w:start w:val="1"/>
+      <w:numFmt w:val="decimal"/>
+      <w:lvlText w:val="%1."/>
+      <w:lvlJc w:val="left"/>
+      <w:pPr>
+        <w:tabs>
+          <w:tab w:val="num" w:pos="720"/>
+        </w:tabs>
+        <w:ind w:left="720" w:hanging="360"/>
+      </w:pPr>
+    </w:lvl>
+    <w:lvl w:ilvl="1" w:tentative="1">
+      <w:start w:val="1"/>
+      <w:numFmt w:val="decimal"/>
+      <w:lvlText w:val="%2."/>
+      <w:lvlJc w:val="left"/>
+      <w:pPr>
+        <w:tabs>
+          <w:tab w:val="num" w:pos="1440"/>
+        </w:tabs>
+        <w:ind w:left="1440" w:hanging="360"/>
+      </w:pPr>
+    </w:lvl>
+    <w:lvl w:ilvl="2" w:tentative="1">
+      <w:start w:val="1"/>
+      <w:numFmt w:val="decimal"/>
+      <w:lvlText w:val="%3."/>
+      <w:lvlJc w:val="left"/>
+      <w:pPr>
+        <w:tabs>
+          <w:tab w:val="num" w:pos="2160"/>
+        </w:tabs>
+        <w:ind w:left="2160" w:hanging="360"/>
+      </w:pPr>
+    </w:lvl>
+    <w:lvl w:ilvl="3" w:tentative="1">
+      <w:start w:val="1"/>
+      <w:numFmt w:val="decimal"/>
+      <w:lvlText w:val="%4."/>
+      <w:lvlJc w:val="left"/>
+      <w:pPr>
+        <w:tabs>
+          <w:tab w:val="num" w:pos="2880"/>
+        </w:tabs>
+        <w:ind w:left="2880" w:hanging="360"/>
+      </w:pPr>
+    </w:lvl>
+    <w:lvl w:ilvl="4" w:tentative="1">
+      <w:start w:val="1"/>
+      <w:numFmt w:val="decimal"/>
+      <w:lvlText w:val="%5."/>
+      <w:lvlJc w:val="left"/>
+      <w:pPr>
+        <w:tabs>
+          <w:tab w:val="num" w:pos="3600"/>
+        </w:tabs>
+        <w:ind w:left="3600" w:hanging="360"/>
+      </w:pPr>
+    </w:lvl>
+    <w:lvl w:ilvl="5" w:tentative="1">
+      <w:start w:val="1"/>
+      <w:numFmt w:val="decimal"/>
+      <w:lvlText w:val="%6."/>
+      <w:lvlJc w:val="left"/>
+      <w:pPr>
+        <w:tabs>
+          <w:tab w:val="num" w:pos="4320"/>
+        </w:tabs>
+        <w:ind w:left="4320" w:hanging="360"/>
+      </w:pPr>
+    </w:lvl>
+    <w:lvl w:ilvl="6" w:tentative="1">
+      <w:start w:val="1"/>
+      <w:numFmt w:val="decimal"/>
+      <w:lvlText w:val="%7."/>
+      <w:lvlJc w:val="left"/>
+      <w:pPr>
+        <w:tabs>
+          <w:tab w:val="num" w:pos="5040"/>
+        </w:tabs>
+        <w:ind w:left="5040" w:hanging="360"/>
+      </w:pPr>
+    </w:lvl>
+    <w:lvl w:ilvl="7" w:tentative="1">
+      <w:start w:val="1"/>
+      <w:numFmt w:val="decimal"/>
+      <w:lvlText w:val="%8."/>
+      <w:lvlJc w:val="left"/>
+      <w:pPr>
+        <w:tabs>
+          <w:tab w:val="num" w:pos="5760"/>
+        </w:tabs>
+        <w:ind w:left="5760" w:hanging="360"/>
+      </w:pPr>
+    </w:lvl>
+    <w:lvl w:ilvl="8" w:tentative="1">
+      <w:start w:val="1"/>
+      <w:numFmt w:val="decimal"/>
+      <w:lvlText w:val="%9."/>
+      <w:lvlJc w:val="left"/>
+      <w:pPr>
+        <w:tabs>
+          <w:tab w:val="num" w:pos="6480"/>
+        </w:tabs>
+        <w:ind w:left="6480" w:hanging="360"/>
+      </w:pPr>
+    </w:lvl>
+  </w:abstractNum>
+  <w:abstractNum w:abstractNumId="6" w15:restartNumberingAfterBreak="0">
     <w:nsid w:val="16D219A5"/>
     <w:multiLevelType w:val="multilevel"/>
     <w:tmpl w:val="1488EA72"/>
@@ -16402,7 +17394,7 @@
       </w:rPr>
     </w:lvl>
   </w:abstractNum>
-  <w:abstractNum w:abstractNumId="6" w15:restartNumberingAfterBreak="0">
+  <w:abstractNum w:abstractNumId="7" w15:restartNumberingAfterBreak="0">
     <w:nsid w:val="208A0A40"/>
     <w:multiLevelType w:val="multilevel"/>
     <w:tmpl w:val="F968B38C"/>
@@ -16519,7 +17511,7 @@
       </w:pPr>
     </w:lvl>
   </w:abstractNum>
-  <w:abstractNum w:abstractNumId="7" w15:restartNumberingAfterBreak="0">
+  <w:abstractNum w:abstractNumId="8" w15:restartNumberingAfterBreak="0">
     <w:nsid w:val="20DB1858"/>
     <w:multiLevelType w:val="multilevel"/>
     <w:tmpl w:val="2F343DF2"/>
@@ -16668,7 +17660,7 @@
       </w:rPr>
     </w:lvl>
   </w:abstractNum>
-  <w:abstractNum w:abstractNumId="8" w15:restartNumberingAfterBreak="0">
+  <w:abstractNum w:abstractNumId="9" w15:restartNumberingAfterBreak="0">
     <w:nsid w:val="24836839"/>
     <w:multiLevelType w:val="multilevel"/>
     <w:tmpl w:val="2562694C"/>
@@ -16817,7 +17809,7 @@
       </w:rPr>
     </w:lvl>
   </w:abstractNum>
-  <w:abstractNum w:abstractNumId="9" w15:restartNumberingAfterBreak="0">
+  <w:abstractNum w:abstractNumId="10" w15:restartNumberingAfterBreak="0">
     <w:nsid w:val="26F71876"/>
     <w:multiLevelType w:val="multilevel"/>
     <w:tmpl w:val="360482FC"/>
@@ -16966,7 +17958,7 @@
       </w:rPr>
     </w:lvl>
   </w:abstractNum>
-  <w:abstractNum w:abstractNumId="10" w15:restartNumberingAfterBreak="0">
+  <w:abstractNum w:abstractNumId="11" w15:restartNumberingAfterBreak="0">
     <w:nsid w:val="2958508C"/>
     <w:multiLevelType w:val="multilevel"/>
     <w:tmpl w:val="98D4945A"/>
@@ -17115,7 +18107,7 @@
       </w:rPr>
     </w:lvl>
   </w:abstractNum>
-  <w:abstractNum w:abstractNumId="11" w15:restartNumberingAfterBreak="0">
+  <w:abstractNum w:abstractNumId="12" w15:restartNumberingAfterBreak="0">
     <w:nsid w:val="2E6646D9"/>
     <w:multiLevelType w:val="multilevel"/>
     <w:tmpl w:val="71E870D6"/>
@@ -17228,7 +18220,7 @@
       </w:pPr>
     </w:lvl>
   </w:abstractNum>
-  <w:abstractNum w:abstractNumId="12" w15:restartNumberingAfterBreak="0">
+  <w:abstractNum w:abstractNumId="13" w15:restartNumberingAfterBreak="0">
     <w:nsid w:val="3275706C"/>
     <w:multiLevelType w:val="multilevel"/>
     <w:tmpl w:val="62B6781A"/>
@@ -17341,7 +18333,7 @@
       </w:pPr>
     </w:lvl>
   </w:abstractNum>
-  <w:abstractNum w:abstractNumId="13" w15:restartNumberingAfterBreak="0">
+  <w:abstractNum w:abstractNumId="14" w15:restartNumberingAfterBreak="0">
     <w:nsid w:val="35EB25BA"/>
     <w:multiLevelType w:val="multilevel"/>
     <w:tmpl w:val="F73EA568"/>
@@ -17490,7 +18482,7 @@
       </w:rPr>
     </w:lvl>
   </w:abstractNum>
-  <w:abstractNum w:abstractNumId="14" w15:restartNumberingAfterBreak="0">
+  <w:abstractNum w:abstractNumId="15" w15:restartNumberingAfterBreak="0">
     <w:nsid w:val="367C7A9A"/>
     <w:multiLevelType w:val="multilevel"/>
     <w:tmpl w:val="633ED0A6"/>
@@ -17639,7 +18631,7 @@
       </w:rPr>
     </w:lvl>
   </w:abstractNum>
-  <w:abstractNum w:abstractNumId="15" w15:restartNumberingAfterBreak="0">
+  <w:abstractNum w:abstractNumId="16" w15:restartNumberingAfterBreak="0">
     <w:nsid w:val="39134D5E"/>
     <w:multiLevelType w:val="multilevel"/>
     <w:tmpl w:val="913058F8"/>
@@ -17788,7 +18780,7 @@
       </w:rPr>
     </w:lvl>
   </w:abstractNum>
-  <w:abstractNum w:abstractNumId="16" w15:restartNumberingAfterBreak="0">
+  <w:abstractNum w:abstractNumId="17" w15:restartNumberingAfterBreak="0">
     <w:nsid w:val="391E7F50"/>
     <w:multiLevelType w:val="multilevel"/>
     <w:tmpl w:val="C674CA22"/>
@@ -17937,7 +18929,7 @@
       </w:rPr>
     </w:lvl>
   </w:abstractNum>
-  <w:abstractNum w:abstractNumId="17" w15:restartNumberingAfterBreak="0">
+  <w:abstractNum w:abstractNumId="18" w15:restartNumberingAfterBreak="0">
     <w:nsid w:val="3A0A53F1"/>
     <w:multiLevelType w:val="multilevel"/>
     <w:tmpl w:val="2020DF72"/>
@@ -18050,7 +19042,7 @@
       </w:pPr>
     </w:lvl>
   </w:abstractNum>
-  <w:abstractNum w:abstractNumId="18" w15:restartNumberingAfterBreak="0">
+  <w:abstractNum w:abstractNumId="19" w15:restartNumberingAfterBreak="0">
     <w:nsid w:val="3A131D66"/>
     <w:multiLevelType w:val="multilevel"/>
     <w:tmpl w:val="24F4F816"/>
@@ -18199,7 +19191,7 @@
       </w:rPr>
     </w:lvl>
   </w:abstractNum>
-  <w:abstractNum w:abstractNumId="19" w15:restartNumberingAfterBreak="0">
+  <w:abstractNum w:abstractNumId="20" w15:restartNumberingAfterBreak="0">
     <w:nsid w:val="3A4474F2"/>
     <w:multiLevelType w:val="multilevel"/>
     <w:tmpl w:val="5DA624DC"/>
@@ -18348,7 +19340,7 @@
       </w:rPr>
     </w:lvl>
   </w:abstractNum>
-  <w:abstractNum w:abstractNumId="20" w15:restartNumberingAfterBreak="0">
+  <w:abstractNum w:abstractNumId="21" w15:restartNumberingAfterBreak="0">
     <w:nsid w:val="3A9B0EB3"/>
     <w:multiLevelType w:val="multilevel"/>
     <w:tmpl w:val="12DAAE4C"/>
@@ -18497,7 +19489,7 @@
       </w:rPr>
     </w:lvl>
   </w:abstractNum>
-  <w:abstractNum w:abstractNumId="21" w15:restartNumberingAfterBreak="0">
+  <w:abstractNum w:abstractNumId="22" w15:restartNumberingAfterBreak="0">
     <w:nsid w:val="433C1063"/>
     <w:multiLevelType w:val="multilevel"/>
     <w:tmpl w:val="CB5C2BA2"/>
@@ -18646,7 +19638,7 @@
       </w:rPr>
     </w:lvl>
   </w:abstractNum>
-  <w:abstractNum w:abstractNumId="22" w15:restartNumberingAfterBreak="0">
+  <w:abstractNum w:abstractNumId="23" w15:restartNumberingAfterBreak="0">
     <w:nsid w:val="45510277"/>
     <w:multiLevelType w:val="multilevel"/>
     <w:tmpl w:val="56B26F3E"/>
@@ -18795,7 +19787,7 @@
       </w:rPr>
     </w:lvl>
   </w:abstractNum>
-  <w:abstractNum w:abstractNumId="23" w15:restartNumberingAfterBreak="0">
+  <w:abstractNum w:abstractNumId="24" w15:restartNumberingAfterBreak="0">
     <w:nsid w:val="46A155D5"/>
     <w:multiLevelType w:val="multilevel"/>
     <w:tmpl w:val="44ACD8FC"/>
@@ -18944,7 +19936,7 @@
       </w:rPr>
     </w:lvl>
   </w:abstractNum>
-  <w:abstractNum w:abstractNumId="24" w15:restartNumberingAfterBreak="0">
+  <w:abstractNum w:abstractNumId="25" w15:restartNumberingAfterBreak="0">
     <w:nsid w:val="46DA672B"/>
     <w:multiLevelType w:val="multilevel"/>
     <w:tmpl w:val="3246065E"/>
@@ -19093,7 +20085,7 @@
       </w:rPr>
     </w:lvl>
   </w:abstractNum>
-  <w:abstractNum w:abstractNumId="25" w15:restartNumberingAfterBreak="0">
+  <w:abstractNum w:abstractNumId="26" w15:restartNumberingAfterBreak="0">
     <w:nsid w:val="48FA7538"/>
     <w:multiLevelType w:val="multilevel"/>
     <w:tmpl w:val="740C545A"/>
@@ -19242,7 +20234,7 @@
       </w:rPr>
     </w:lvl>
   </w:abstractNum>
-  <w:abstractNum w:abstractNumId="26" w15:restartNumberingAfterBreak="0">
+  <w:abstractNum w:abstractNumId="27" w15:restartNumberingAfterBreak="0">
     <w:nsid w:val="4C4C31B6"/>
     <w:multiLevelType w:val="multilevel"/>
     <w:tmpl w:val="ABAEB844"/>
@@ -19391,7 +20383,7 @@
       </w:rPr>
     </w:lvl>
   </w:abstractNum>
-  <w:abstractNum w:abstractNumId="27" w15:restartNumberingAfterBreak="0">
+  <w:abstractNum w:abstractNumId="28" w15:restartNumberingAfterBreak="0">
     <w:nsid w:val="4D8D64B2"/>
     <w:multiLevelType w:val="multilevel"/>
     <w:tmpl w:val="A544C5CC"/>
@@ -19508,7 +20500,7 @@
       </w:pPr>
     </w:lvl>
   </w:abstractNum>
-  <w:abstractNum w:abstractNumId="28" w15:restartNumberingAfterBreak="0">
+  <w:abstractNum w:abstractNumId="29" w15:restartNumberingAfterBreak="0">
     <w:nsid w:val="4F634EED"/>
     <w:multiLevelType w:val="multilevel"/>
     <w:tmpl w:val="416C2FEE"/>
@@ -19657,7 +20649,7 @@
       </w:rPr>
     </w:lvl>
   </w:abstractNum>
-  <w:abstractNum w:abstractNumId="29" w15:restartNumberingAfterBreak="0">
+  <w:abstractNum w:abstractNumId="30" w15:restartNumberingAfterBreak="0">
     <w:nsid w:val="4F982EC8"/>
     <w:multiLevelType w:val="multilevel"/>
     <w:tmpl w:val="BE8470D2"/>
@@ -19806,7 +20798,7 @@
       </w:rPr>
     </w:lvl>
   </w:abstractNum>
-  <w:abstractNum w:abstractNumId="30" w15:restartNumberingAfterBreak="0">
+  <w:abstractNum w:abstractNumId="31" w15:restartNumberingAfterBreak="0">
     <w:nsid w:val="4FDD175D"/>
     <w:multiLevelType w:val="multilevel"/>
     <w:tmpl w:val="13AAA2BE"/>
@@ -19955,7 +20947,7 @@
       </w:rPr>
     </w:lvl>
   </w:abstractNum>
-  <w:abstractNum w:abstractNumId="31" w15:restartNumberingAfterBreak="0">
+  <w:abstractNum w:abstractNumId="32" w15:restartNumberingAfterBreak="0">
     <w:nsid w:val="544477C9"/>
     <w:multiLevelType w:val="multilevel"/>
     <w:tmpl w:val="747ADC06"/>
@@ -20104,7 +21096,7 @@
       </w:rPr>
     </w:lvl>
   </w:abstractNum>
-  <w:abstractNum w:abstractNumId="32" w15:restartNumberingAfterBreak="0">
+  <w:abstractNum w:abstractNumId="33" w15:restartNumberingAfterBreak="0">
     <w:nsid w:val="545339C5"/>
     <w:multiLevelType w:val="multilevel"/>
     <w:tmpl w:val="B7C2311A"/>
@@ -20219,7 +21211,7 @@
       </w:rPr>
     </w:lvl>
   </w:abstractNum>
-  <w:abstractNum w:abstractNumId="33" w15:restartNumberingAfterBreak="0">
+  <w:abstractNum w:abstractNumId="34" w15:restartNumberingAfterBreak="0">
     <w:nsid w:val="56F5351E"/>
     <w:multiLevelType w:val="multilevel"/>
     <w:tmpl w:val="013A77EE"/>
@@ -20368,7 +21360,7 @@
       </w:rPr>
     </w:lvl>
   </w:abstractNum>
-  <w:abstractNum w:abstractNumId="34" w15:restartNumberingAfterBreak="0">
+  <w:abstractNum w:abstractNumId="35" w15:restartNumberingAfterBreak="0">
     <w:nsid w:val="58864CBA"/>
     <w:multiLevelType w:val="multilevel"/>
     <w:tmpl w:val="9D1CC354"/>
@@ -20481,7 +21473,7 @@
       </w:pPr>
     </w:lvl>
   </w:abstractNum>
-  <w:abstractNum w:abstractNumId="35" w15:restartNumberingAfterBreak="0">
+  <w:abstractNum w:abstractNumId="36" w15:restartNumberingAfterBreak="0">
     <w:nsid w:val="599B6786"/>
     <w:multiLevelType w:val="multilevel"/>
     <w:tmpl w:val="A0AC6E64"/>
@@ -20630,7 +21622,7 @@
       </w:rPr>
     </w:lvl>
   </w:abstractNum>
-  <w:abstractNum w:abstractNumId="36" w15:restartNumberingAfterBreak="0">
+  <w:abstractNum w:abstractNumId="37" w15:restartNumberingAfterBreak="0">
     <w:nsid w:val="5B977A5E"/>
     <w:multiLevelType w:val="multilevel"/>
     <w:tmpl w:val="5FC20F70"/>
@@ -20775,7 +21767,7 @@
       </w:rPr>
     </w:lvl>
   </w:abstractNum>
-  <w:abstractNum w:abstractNumId="37" w15:restartNumberingAfterBreak="0">
+  <w:abstractNum w:abstractNumId="38" w15:restartNumberingAfterBreak="0">
     <w:nsid w:val="5D4F705A"/>
     <w:multiLevelType w:val="multilevel"/>
     <w:tmpl w:val="17D6F462"/>
@@ -20924,7 +21916,7 @@
       </w:rPr>
     </w:lvl>
   </w:abstractNum>
-  <w:abstractNum w:abstractNumId="38" w15:restartNumberingAfterBreak="0">
+  <w:abstractNum w:abstractNumId="39" w15:restartNumberingAfterBreak="0">
     <w:nsid w:val="5F201F90"/>
     <w:multiLevelType w:val="multilevel"/>
     <w:tmpl w:val="30B0567C"/>
@@ -21073,7 +22065,7 @@
       </w:rPr>
     </w:lvl>
   </w:abstractNum>
-  <w:abstractNum w:abstractNumId="39" w15:restartNumberingAfterBreak="0">
+  <w:abstractNum w:abstractNumId="40" w15:restartNumberingAfterBreak="0">
     <w:nsid w:val="5F2E2F15"/>
     <w:multiLevelType w:val="multilevel"/>
     <w:tmpl w:val="040A4746"/>
@@ -21222,7 +22214,7 @@
       </w:rPr>
     </w:lvl>
   </w:abstractNum>
-  <w:abstractNum w:abstractNumId="40" w15:restartNumberingAfterBreak="0">
+  <w:abstractNum w:abstractNumId="41" w15:restartNumberingAfterBreak="0">
     <w:nsid w:val="5F3A027F"/>
     <w:multiLevelType w:val="multilevel"/>
     <w:tmpl w:val="FCD05388"/>
@@ -21371,7 +22363,152 @@
       </w:rPr>
     </w:lvl>
   </w:abstractNum>
-  <w:abstractNum w:abstractNumId="41" w15:restartNumberingAfterBreak="0">
+  <w:abstractNum w:abstractNumId="42" w15:restartNumberingAfterBreak="0">
+    <w:nsid w:val="5F882B10"/>
+    <w:multiLevelType w:val="multilevel"/>
+    <w:tmpl w:val="932C6132"/>
+    <w:lvl w:ilvl="0">
+      <w:start w:val="1"/>
+      <w:numFmt w:val="bullet"/>
+      <w:lvlText w:val=""/>
+      <w:lvlJc w:val="left"/>
+      <w:pPr>
+        <w:tabs>
+          <w:tab w:val="num" w:pos="720"/>
+        </w:tabs>
+        <w:ind w:left="720" w:hanging="360"/>
+      </w:pPr>
+      <w:rPr>
+        <w:rFonts w:ascii="Symbol" w:hAnsi="Symbol" w:hint="default"/>
+        <w:sz w:val="20"/>
+      </w:rPr>
+    </w:lvl>
+    <w:lvl w:ilvl="1">
+      <w:start w:val="1"/>
+      <w:numFmt w:val="bullet"/>
+      <w:lvlText w:val="o"/>
+      <w:lvlJc w:val="left"/>
+      <w:pPr>
+        <w:tabs>
+          <w:tab w:val="num" w:pos="1440"/>
+        </w:tabs>
+        <w:ind w:left="1440" w:hanging="360"/>
+      </w:pPr>
+      <w:rPr>
+        <w:rFonts w:ascii="Courier New" w:hAnsi="Courier New" w:hint="default"/>
+        <w:sz w:val="20"/>
+      </w:rPr>
+    </w:lvl>
+    <w:lvl w:ilvl="2">
+      <w:start w:val="1"/>
+      <w:numFmt w:val="decimal"/>
+      <w:lvlText w:val="%3."/>
+      <w:lvlJc w:val="left"/>
+      <w:pPr>
+        <w:tabs>
+          <w:tab w:val="num" w:pos="2160"/>
+        </w:tabs>
+        <w:ind w:left="2160" w:hanging="360"/>
+      </w:pPr>
+    </w:lvl>
+    <w:lvl w:ilvl="3" w:tentative="1">
+      <w:start w:val="1"/>
+      <w:numFmt w:val="bullet"/>
+      <w:lvlText w:val=""/>
+      <w:lvlJc w:val="left"/>
+      <w:pPr>
+        <w:tabs>
+          <w:tab w:val="num" w:pos="2880"/>
+        </w:tabs>
+        <w:ind w:left="2880" w:hanging="360"/>
+      </w:pPr>
+      <w:rPr>
+        <w:rFonts w:ascii="Wingdings" w:hAnsi="Wingdings" w:hint="default"/>
+        <w:sz w:val="20"/>
+      </w:rPr>
+    </w:lvl>
+    <w:lvl w:ilvl="4" w:tentative="1">
+      <w:start w:val="1"/>
+      <w:numFmt w:val="bullet"/>
+      <w:lvlText w:val=""/>
+      <w:lvlJc w:val="left"/>
+      <w:pPr>
+        <w:tabs>
+          <w:tab w:val="num" w:pos="3600"/>
+        </w:tabs>
+        <w:ind w:left="3600" w:hanging="360"/>
+      </w:pPr>
+      <w:rPr>
+        <w:rFonts w:ascii="Wingdings" w:hAnsi="Wingdings" w:hint="default"/>
+        <w:sz w:val="20"/>
+      </w:rPr>
+    </w:lvl>
+    <w:lvl w:ilvl="5" w:tentative="1">
+      <w:start w:val="1"/>
+      <w:numFmt w:val="bullet"/>
+      <w:lvlText w:val=""/>
+      <w:lvlJc w:val="left"/>
+      <w:pPr>
+        <w:tabs>
+          <w:tab w:val="num" w:pos="4320"/>
+        </w:tabs>
+        <w:ind w:left="4320" w:hanging="360"/>
+      </w:pPr>
+      <w:rPr>
+        <w:rFonts w:ascii="Wingdings" w:hAnsi="Wingdings" w:hint="default"/>
+        <w:sz w:val="20"/>
+      </w:rPr>
+    </w:lvl>
+    <w:lvl w:ilvl="6" w:tentative="1">
+      <w:start w:val="1"/>
+      <w:numFmt w:val="bullet"/>
+      <w:lvlText w:val=""/>
+      <w:lvlJc w:val="left"/>
+      <w:pPr>
+        <w:tabs>
+          <w:tab w:val="num" w:pos="5040"/>
+        </w:tabs>
+        <w:ind w:left="5040" w:hanging="360"/>
+      </w:pPr>
+      <w:rPr>
+        <w:rFonts w:ascii="Wingdings" w:hAnsi="Wingdings" w:hint="default"/>
+        <w:sz w:val="20"/>
+      </w:rPr>
+    </w:lvl>
+    <w:lvl w:ilvl="7" w:tentative="1">
+      <w:start w:val="1"/>
+      <w:numFmt w:val="bullet"/>
+      <w:lvlText w:val=""/>
+      <w:lvlJc w:val="left"/>
+      <w:pPr>
+        <w:tabs>
+          <w:tab w:val="num" w:pos="5760"/>
+        </w:tabs>
+        <w:ind w:left="5760" w:hanging="360"/>
+      </w:pPr>
+      <w:rPr>
+        <w:rFonts w:ascii="Wingdings" w:hAnsi="Wingdings" w:hint="default"/>
+        <w:sz w:val="20"/>
+      </w:rPr>
+    </w:lvl>
+    <w:lvl w:ilvl="8" w:tentative="1">
+      <w:start w:val="1"/>
+      <w:numFmt w:val="bullet"/>
+      <w:lvlText w:val=""/>
+      <w:lvlJc w:val="left"/>
+      <w:pPr>
+        <w:tabs>
+          <w:tab w:val="num" w:pos="6480"/>
+        </w:tabs>
+        <w:ind w:left="6480" w:hanging="360"/>
+      </w:pPr>
+      <w:rPr>
+        <w:rFonts w:ascii="Wingdings" w:hAnsi="Wingdings" w:hint="default"/>
+        <w:sz w:val="20"/>
+      </w:rPr>
+    </w:lvl>
+  </w:abstractNum>
+  <w:abstractNum w:abstractNumId="43" w15:restartNumberingAfterBreak="0">
     <w:nsid w:val="61607C2D"/>
     <w:multiLevelType w:val="multilevel"/>
     <w:tmpl w:val="60DC4B7C"/>
@@ -21488,7 +22625,7 @@
       </w:pPr>
     </w:lvl>
   </w:abstractNum>
-  <w:abstractNum w:abstractNumId="42" w15:restartNumberingAfterBreak="0">
+  <w:abstractNum w:abstractNumId="44" w15:restartNumberingAfterBreak="0">
     <w:nsid w:val="626A40D3"/>
     <w:multiLevelType w:val="multilevel"/>
     <w:tmpl w:val="3BE894E8"/>
@@ -21637,7 +22774,7 @@
       </w:rPr>
     </w:lvl>
   </w:abstractNum>
-  <w:abstractNum w:abstractNumId="43" w15:restartNumberingAfterBreak="0">
+  <w:abstractNum w:abstractNumId="45" w15:restartNumberingAfterBreak="0">
     <w:nsid w:val="63127A02"/>
     <w:multiLevelType w:val="multilevel"/>
     <w:tmpl w:val="F8323E06"/>
@@ -21786,7 +22923,7 @@
       </w:rPr>
     </w:lvl>
   </w:abstractNum>
-  <w:abstractNum w:abstractNumId="44" w15:restartNumberingAfterBreak="0">
+  <w:abstractNum w:abstractNumId="46" w15:restartNumberingAfterBreak="0">
     <w:nsid w:val="68D16F39"/>
     <w:multiLevelType w:val="multilevel"/>
     <w:tmpl w:val="5726B3A6"/>
@@ -21931,7 +23068,7 @@
       </w:rPr>
     </w:lvl>
   </w:abstractNum>
-  <w:abstractNum w:abstractNumId="45" w15:restartNumberingAfterBreak="0">
+  <w:abstractNum w:abstractNumId="47" w15:restartNumberingAfterBreak="0">
     <w:nsid w:val="69471A58"/>
     <w:multiLevelType w:val="multilevel"/>
     <w:tmpl w:val="D62E6514"/>
@@ -22080,7 +23217,7 @@
       </w:rPr>
     </w:lvl>
   </w:abstractNum>
-  <w:abstractNum w:abstractNumId="46" w15:restartNumberingAfterBreak="0">
+  <w:abstractNum w:abstractNumId="48" w15:restartNumberingAfterBreak="0">
     <w:nsid w:val="6C653EBA"/>
     <w:multiLevelType w:val="multilevel"/>
     <w:tmpl w:val="50068D36"/>
@@ -22229,7 +23366,7 @@
       </w:rPr>
     </w:lvl>
   </w:abstractNum>
-  <w:abstractNum w:abstractNumId="47" w15:restartNumberingAfterBreak="0">
+  <w:abstractNum w:abstractNumId="49" w15:restartNumberingAfterBreak="0">
     <w:nsid w:val="6F0F67EA"/>
     <w:multiLevelType w:val="multilevel"/>
     <w:tmpl w:val="A4AA76AC"/>
@@ -22378,7 +23515,7 @@
       </w:rPr>
     </w:lvl>
   </w:abstractNum>
-  <w:abstractNum w:abstractNumId="48" w15:restartNumberingAfterBreak="0">
+  <w:abstractNum w:abstractNumId="50" w15:restartNumberingAfterBreak="0">
     <w:nsid w:val="6F2B043F"/>
     <w:multiLevelType w:val="multilevel"/>
     <w:tmpl w:val="3F6453FC"/>
@@ -22527,7 +23664,7 @@
       </w:rPr>
     </w:lvl>
   </w:abstractNum>
-  <w:abstractNum w:abstractNumId="49" w15:restartNumberingAfterBreak="0">
+  <w:abstractNum w:abstractNumId="51" w15:restartNumberingAfterBreak="0">
     <w:nsid w:val="708D3043"/>
     <w:multiLevelType w:val="multilevel"/>
     <w:tmpl w:val="4A18F0DE"/>
@@ -22672,7 +23809,7 @@
       </w:rPr>
     </w:lvl>
   </w:abstractNum>
-  <w:abstractNum w:abstractNumId="50" w15:restartNumberingAfterBreak="0">
+  <w:abstractNum w:abstractNumId="52" w15:restartNumberingAfterBreak="0">
     <w:nsid w:val="721B4B89"/>
     <w:multiLevelType w:val="hybridMultilevel"/>
     <w:tmpl w:val="132E3A0E"/>
@@ -22785,7 +23922,7 @@
       </w:rPr>
     </w:lvl>
   </w:abstractNum>
-  <w:abstractNum w:abstractNumId="51" w15:restartNumberingAfterBreak="0">
+  <w:abstractNum w:abstractNumId="53" w15:restartNumberingAfterBreak="0">
     <w:nsid w:val="7BBF3328"/>
     <w:multiLevelType w:val="multilevel"/>
     <w:tmpl w:val="8CCAA84E"/>
@@ -22935,160 +24072,203 @@
     </w:lvl>
   </w:abstractNum>
   <w:num w:numId="1" w16cid:durableId="1833568962">
-    <w:abstractNumId w:val="32"/>
+    <w:abstractNumId w:val="33"/>
   </w:num>
   <w:num w:numId="2" w16cid:durableId="2092502926">
-    <w:abstractNumId w:val="46"/>
+    <w:abstractNumId w:val="48"/>
   </w:num>
   <w:num w:numId="3" w16cid:durableId="599219652">
-    <w:abstractNumId w:val="51"/>
+    <w:abstractNumId w:val="53"/>
   </w:num>
   <w:num w:numId="4" w16cid:durableId="829711654">
-    <w:abstractNumId w:val="48"/>
+    <w:abstractNumId w:val="50"/>
   </w:num>
   <w:num w:numId="5" w16cid:durableId="924192007">
-    <w:abstractNumId w:val="25"/>
+    <w:abstractNumId w:val="26"/>
   </w:num>
   <w:num w:numId="6" w16cid:durableId="2093769883">
-    <w:abstractNumId w:val="37"/>
+    <w:abstractNumId w:val="38"/>
   </w:num>
   <w:num w:numId="7" w16cid:durableId="910846652">
     <w:abstractNumId w:val="0"/>
   </w:num>
   <w:num w:numId="8" w16cid:durableId="2039769940">
-    <w:abstractNumId w:val="12"/>
+    <w:abstractNumId w:val="13"/>
   </w:num>
   <w:num w:numId="9" w16cid:durableId="1480076784">
-    <w:abstractNumId w:val="17"/>
+    <w:abstractNumId w:val="18"/>
   </w:num>
   <w:num w:numId="10" w16cid:durableId="443160715">
     <w:abstractNumId w:val="4"/>
   </w:num>
   <w:num w:numId="11" w16cid:durableId="107428733">
-    <w:abstractNumId w:val="42"/>
+    <w:abstractNumId w:val="44"/>
   </w:num>
   <w:num w:numId="12" w16cid:durableId="1004673594">
-    <w:abstractNumId w:val="19"/>
+    <w:abstractNumId w:val="20"/>
   </w:num>
   <w:num w:numId="13" w16cid:durableId="1972636377">
-    <w:abstractNumId w:val="40"/>
+    <w:abstractNumId w:val="41"/>
   </w:num>
   <w:num w:numId="14" w16cid:durableId="1883012483">
-    <w:abstractNumId w:val="23"/>
+    <w:abstractNumId w:val="24"/>
   </w:num>
   <w:num w:numId="15" w16cid:durableId="1763378456">
-    <w:abstractNumId w:val="39"/>
+    <w:abstractNumId w:val="40"/>
   </w:num>
   <w:num w:numId="16" w16cid:durableId="243420690">
     <w:abstractNumId w:val="3"/>
   </w:num>
   <w:num w:numId="17" w16cid:durableId="891888230">
-    <w:abstractNumId w:val="33"/>
+    <w:abstractNumId w:val="34"/>
   </w:num>
   <w:num w:numId="18" w16cid:durableId="1213343404">
+    <w:abstractNumId w:val="37"/>
+  </w:num>
+  <w:num w:numId="19" w16cid:durableId="757366736">
+    <w:abstractNumId w:val="46"/>
+  </w:num>
+  <w:num w:numId="20" w16cid:durableId="1023749942">
     <w:abstractNumId w:val="36"/>
   </w:num>
-  <w:num w:numId="19" w16cid:durableId="757366736">
-    <w:abstractNumId w:val="44"/>
-  </w:num>
-  <w:num w:numId="20" w16cid:durableId="1023749942">
+  <w:num w:numId="21" w16cid:durableId="23026108">
     <w:abstractNumId w:val="35"/>
   </w:num>
-  <w:num w:numId="21" w16cid:durableId="23026108">
-    <w:abstractNumId w:val="34"/>
+  <w:num w:numId="22" w16cid:durableId="708458928">
+    <w:abstractNumId w:val="32"/>
   </w:num>
-  <w:num w:numId="22" w16cid:durableId="708458928">
+  <w:num w:numId="23" w16cid:durableId="1258291845">
+    <w:abstractNumId w:val="30"/>
+  </w:num>
+  <w:num w:numId="24" w16cid:durableId="768889089">
+    <w:abstractNumId w:val="43"/>
+  </w:num>
+  <w:num w:numId="25" w16cid:durableId="17506394">
+    <w:abstractNumId w:val="19"/>
+  </w:num>
+  <w:num w:numId="26" w16cid:durableId="997149117">
+    <w:abstractNumId w:val="27"/>
+  </w:num>
+  <w:num w:numId="27" w16cid:durableId="1424259324">
+    <w:abstractNumId w:val="11"/>
+  </w:num>
+  <w:num w:numId="28" w16cid:durableId="137459831">
+    <w:abstractNumId w:val="21"/>
+  </w:num>
+  <w:num w:numId="29" w16cid:durableId="1744644774">
     <w:abstractNumId w:val="31"/>
   </w:num>
-  <w:num w:numId="23" w16cid:durableId="1258291845">
+  <w:num w:numId="30" w16cid:durableId="308363107">
+    <w:abstractNumId w:val="49"/>
+  </w:num>
+  <w:num w:numId="31" w16cid:durableId="174803804">
+    <w:abstractNumId w:val="51"/>
+  </w:num>
+  <w:num w:numId="32" w16cid:durableId="614991350">
+    <w:abstractNumId w:val="22"/>
+  </w:num>
+  <w:num w:numId="33" w16cid:durableId="1630167067">
+    <w:abstractNumId w:val="28"/>
+  </w:num>
+  <w:num w:numId="34" w16cid:durableId="1117215797">
+    <w:abstractNumId w:val="10"/>
+  </w:num>
+  <w:num w:numId="35" w16cid:durableId="198054051">
+    <w:abstractNumId w:val="9"/>
+  </w:num>
+  <w:num w:numId="36" w16cid:durableId="151021859">
+    <w:abstractNumId w:val="47"/>
+  </w:num>
+  <w:num w:numId="37" w16cid:durableId="1128470360">
+    <w:abstractNumId w:val="16"/>
+  </w:num>
+  <w:num w:numId="38" w16cid:durableId="355926645">
+    <w:abstractNumId w:val="17"/>
+  </w:num>
+  <w:num w:numId="39" w16cid:durableId="2072799944">
+    <w:abstractNumId w:val="45"/>
+  </w:num>
+  <w:num w:numId="40" w16cid:durableId="482818837">
     <w:abstractNumId w:val="29"/>
   </w:num>
-  <w:num w:numId="24" w16cid:durableId="768889089">
-    <w:abstractNumId w:val="41"/>
-  </w:num>
-  <w:num w:numId="25" w16cid:durableId="17506394">
-    <w:abstractNumId w:val="18"/>
-  </w:num>
-  <w:num w:numId="26" w16cid:durableId="997149117">
-    <w:abstractNumId w:val="26"/>
-  </w:num>
-  <w:num w:numId="27" w16cid:durableId="1424259324">
-    <w:abstractNumId w:val="10"/>
-  </w:num>
-  <w:num w:numId="28" w16cid:durableId="137459831">
-    <w:abstractNumId w:val="20"/>
-  </w:num>
-  <w:num w:numId="29" w16cid:durableId="1744644774">
-    <w:abstractNumId w:val="30"/>
-  </w:num>
-  <w:num w:numId="30" w16cid:durableId="308363107">
-    <w:abstractNumId w:val="47"/>
-  </w:num>
-  <w:num w:numId="31" w16cid:durableId="174803804">
-    <w:abstractNumId w:val="49"/>
-  </w:num>
-  <w:num w:numId="32" w16cid:durableId="614991350">
-    <w:abstractNumId w:val="21"/>
-  </w:num>
-  <w:num w:numId="33" w16cid:durableId="1630167067">
-    <w:abstractNumId w:val="27"/>
-  </w:num>
-  <w:num w:numId="34" w16cid:durableId="1117215797">
-    <w:abstractNumId w:val="9"/>
-  </w:num>
-  <w:num w:numId="35" w16cid:durableId="198054051">
-    <w:abstractNumId w:val="8"/>
-  </w:num>
-  <w:num w:numId="36" w16cid:durableId="151021859">
-    <w:abstractNumId w:val="45"/>
-  </w:num>
-  <w:num w:numId="37" w16cid:durableId="1128470360">
-    <w:abstractNumId w:val="15"/>
-  </w:num>
-  <w:num w:numId="38" w16cid:durableId="355926645">
-    <w:abstractNumId w:val="16"/>
-  </w:num>
-  <w:num w:numId="39" w16cid:durableId="2072799944">
-    <w:abstractNumId w:val="43"/>
-  </w:num>
-  <w:num w:numId="40" w16cid:durableId="482818837">
-    <w:abstractNumId w:val="28"/>
-  </w:num>
   <w:num w:numId="41" w16cid:durableId="1308245119">
-    <w:abstractNumId w:val="50"/>
+    <w:abstractNumId w:val="52"/>
   </w:num>
   <w:num w:numId="42" w16cid:durableId="2088990418">
     <w:abstractNumId w:val="2"/>
   </w:num>
   <w:num w:numId="43" w16cid:durableId="2069067579">
+    <w:abstractNumId w:val="15"/>
+  </w:num>
+  <w:num w:numId="44" w16cid:durableId="608122750">
+    <w:abstractNumId w:val="39"/>
+  </w:num>
+  <w:num w:numId="45" w16cid:durableId="1440762964">
+    <w:abstractNumId w:val="6"/>
+  </w:num>
+  <w:num w:numId="46" w16cid:durableId="1165391401">
+    <w:abstractNumId w:val="25"/>
+  </w:num>
+  <w:num w:numId="47" w16cid:durableId="2022931474">
     <w:abstractNumId w:val="14"/>
   </w:num>
-  <w:num w:numId="44" w16cid:durableId="608122750">
-    <w:abstractNumId w:val="38"/>
+  <w:num w:numId="48" w16cid:durableId="1866016271">
+    <w:abstractNumId w:val="8"/>
   </w:num>
-  <w:num w:numId="45" w16cid:durableId="1440762964">
-    <w:abstractNumId w:val="5"/>
-  </w:num>
-  <w:num w:numId="46" w16cid:durableId="1165391401">
-    <w:abstractNumId w:val="24"/>
-  </w:num>
-  <w:num w:numId="47" w16cid:durableId="2022931474">
-    <w:abstractNumId w:val="13"/>
-  </w:num>
-  <w:num w:numId="48" w16cid:durableId="1866016271">
+  <w:num w:numId="49" w16cid:durableId="1073619914">
     <w:abstractNumId w:val="7"/>
   </w:num>
-  <w:num w:numId="49" w16cid:durableId="1073619914">
-    <w:abstractNumId w:val="6"/>
-  </w:num>
   <w:num w:numId="50" w16cid:durableId="46536523">
-    <w:abstractNumId w:val="22"/>
+    <w:abstractNumId w:val="23"/>
   </w:num>
   <w:num w:numId="51" w16cid:durableId="762532439">
-    <w:abstractNumId w:val="11"/>
+    <w:abstractNumId w:val="12"/>
   </w:num>
   <w:num w:numId="52" w16cid:durableId="1866282010">
     <w:abstractNumId w:val="1"/>
+  </w:num>
+  <w:num w:numId="53" w16cid:durableId="1963344118">
+    <w:abstractNumId w:val="5"/>
+  </w:num>
+  <w:num w:numId="54" w16cid:durableId="207571900">
+    <w:abstractNumId w:val="42"/>
+  </w:num>
+  <w:num w:numId="55" w16cid:durableId="598413422">
+    <w:abstractNumId w:val="42"/>
+    <w:lvlOverride w:ilvl="1">
+      <w:lvl w:ilvl="1">
+        <w:numFmt w:val="decimal"/>
+        <w:lvlText w:val="%2."/>
+        <w:lvlJc w:val="left"/>
+      </w:lvl>
+    </w:lvlOverride>
+  </w:num>
+  <w:num w:numId="56" w16cid:durableId="386489143">
+    <w:abstractNumId w:val="42"/>
+    <w:lvlOverride w:ilvl="1">
+      <w:lvl w:ilvl="1">
+        <w:numFmt w:val="decimal"/>
+        <w:lvlText w:val="%2."/>
+        <w:lvlJc w:val="left"/>
+      </w:lvl>
+    </w:lvlOverride>
+    <w:lvlOverride w:ilvl="2">
+      <w:lvl w:ilvl="2">
+        <w:numFmt w:val="bullet"/>
+        <w:lvlText w:val=""/>
+        <w:lvlJc w:val="left"/>
+        <w:pPr>
+          <w:tabs>
+            <w:tab w:val="num" w:pos="2160"/>
+          </w:tabs>
+          <w:ind w:left="2160" w:hanging="360"/>
+        </w:pPr>
+        <w:rPr>
+          <w:rFonts w:ascii="Wingdings" w:hAnsi="Wingdings" w:hint="default"/>
+          <w:sz w:val="20"/>
+        </w:rPr>
+      </w:lvl>
+    </w:lvlOverride>
   </w:num>
   <w:numIdMacAtCleanup w:val="52"/>
 </w:numbering>

</xml_diff>

<commit_message>
AuctionMask fix max button and implement additional elegible fim dispaly
</commit_message>
<xml_diff>
--- a/content/Whitepaper.docx
+++ b/content/Whitepaper.docx
@@ -3926,19 +3926,23 @@
         <w:t xml:space="preserve">This approach is codified in the project's </w:t>
       </w:r>
       <w:r>
-        <w:t xml:space="preserve">main </w:t>
+        <w:t>main C</w:t>
+      </w:r>
+      <w:r>
+        <w:t>h</w:t>
+      </w:r>
+      <w:r>
+        <w:t>aracters</w:t>
+      </w:r>
+      <w:r>
+        <w:t xml:space="preserve">. While </w:t>
+      </w:r>
+      <w:r>
+        <w:t>“</w:t>
       </w:r>
       <w:proofErr w:type="spellStart"/>
       <w:r>
-        <w:t>CHaracters</w:t>
-      </w:r>
-      <w:proofErr w:type="spellEnd"/>
-      <w:r>
-        <w:t>. While "</w:t>
-      </w:r>
-      <w:proofErr w:type="spellStart"/>
-      <w:r>
-        <w:t>Ritardo</w:t>
+        <w:t>Regardo</w:t>
       </w:r>
       <w:proofErr w:type="spellEnd"/>
       <w:r>
@@ -5728,23 +5732,10 @@
         <w:t>$GINI</w:t>
       </w:r>
       <w:r>
-        <w:t>),</w:t>
-      </w:r>
-      <w:r>
-        <w:t xml:space="preserve"> </w:t>
-      </w:r>
-      <w:r>
-        <w:t>equivalent to at least </w:t>
-      </w:r>
-      <w:r>
-        <w:rPr>
-          <w:b/>
-          <w:bCs/>
-        </w:rPr>
-        <w:t>10%</w:t>
-      </w:r>
-      <w:r>
-        <w:t> of the value of their $FIM position.</w:t>
+        <w:t>)</w:t>
+      </w:r>
+      <w:r>
+        <w:t>.</w:t>
       </w:r>
     </w:p>
     <w:p>
@@ -5782,17 +5773,29 @@
         <w:t>$GINI</w:t>
       </w:r>
       <w:r>
-        <w:t xml:space="preserve"> required per 100 $FIM held). This ensures deterministic access </w:t>
+        <w:t xml:space="preserve"> required per 100 $FIM held). This ensures deterministic access requirements while maintaining the high-water mark logic: a single pool of staked </w:t>
+      </w:r>
+      <w:r>
+        <w:t>$GINI</w:t>
+      </w:r>
+      <w:r>
+        <w:t xml:space="preserve"> can </w:t>
       </w:r>
       <w:r>
         <w:lastRenderedPageBreak/>
-        <w:t xml:space="preserve">requirements while maintaining the high-water mark logic: a single pool of staked </w:t>
-      </w:r>
-      <w:r>
-        <w:t>$GINI</w:t>
-      </w:r>
-      <w:r>
-        <w:t xml:space="preserve"> can collateralize multiple concurrent seasons, provided the user meets the maximum requirement of any single active game.</w:t>
+        <w:t>collateralize multiple concurrent seasons, provided the user meets the maximum requirement of any single active game.</w:t>
+      </w:r>
+    </w:p>
+    <w:p>
+      <w:pPr>
+        <w:pStyle w:val="ListParagraph"/>
+        <w:numPr>
+          <w:ilvl w:val="0"/>
+          <w:numId w:val="12"/>
+        </w:numPr>
+      </w:pPr>
+      <w:r>
+        <w:t>High-Water Mark Efficiency: This commitment operates on a High-Water Mark (MAX) basis. A single pool of staked $RTD can collateralize multiple concurrent seasons, provided the user meets the maximum requirement of any single active game.</w:t>
       </w:r>
     </w:p>
     <w:p>
@@ -6090,20 +6093,86 @@
     <w:p>
       <w:pPr>
         <w:spacing w:after="120"/>
-      </w:pPr>
-      <w:r>
-        <w:t>Following the auction, the economy transitions to a free-market state for a quarterly duration.</w:t>
-      </w:r>
-    </w:p>
-    <w:p>
-      <w:pPr>
-        <w:spacing w:after="120"/>
-      </w:pPr>
-      <w:r>
-        <w:rPr>
-          <w:b/>
-          <w:bCs/>
-        </w:rPr>
+        <w:rPr>
+          <w:lang w:val="en-DE"/>
+        </w:rPr>
+      </w:pPr>
+      <w:r>
+        <w:rPr>
+          <w:lang w:val="en-DE"/>
+        </w:rPr>
+        <w:t>Following the auction, the economy does not immediately transition to a free market. Instead, it enters a </w:t>
+      </w:r>
+      <w:r>
+        <w:rPr>
+          <w:b/>
+          <w:bCs/>
+          <w:lang w:val="en-DE"/>
+        </w:rPr>
+        <w:t>Bootstrap Phase</w:t>
+      </w:r>
+      <w:r>
+        <w:rPr>
+          <w:lang w:val="en-DE"/>
+        </w:rPr>
+        <w:t>. During this window, trading is temporarily paused while the </w:t>
+      </w:r>
+      <w:r>
+        <w:rPr>
+          <w:b/>
+          <w:bCs/>
+          <w:lang w:val="en-DE"/>
+        </w:rPr>
+        <w:t>Gini Solver Bot</w:t>
+      </w:r>
+      <w:r>
+        <w:rPr>
+          <w:lang w:val="en-DE"/>
+        </w:rPr>
+        <w:t> calculates and submits the initial distribution data (</w:t>
+      </w:r>
+      <w:proofErr w:type="spellStart"/>
+      <w:r>
+        <w:rPr>
+          <w:lang w:val="en-DE"/>
+        </w:rPr>
+        <w:t>Ginitial</w:t>
+      </w:r>
+      <w:proofErr w:type="spellEnd"/>
+      <w:r>
+        <w:rPr>
+          <w:lang w:val="en-DE"/>
+        </w:rPr>
+        <w:t>). Only after this baseline is cryptographically verified does the state transition to the active </w:t>
+      </w:r>
+      <w:r>
+        <w:rPr>
+          <w:b/>
+          <w:bCs/>
+          <w:lang w:val="en-DE"/>
+        </w:rPr>
+        <w:t>Trading Phase</w:t>
+      </w:r>
+      <w:r>
+        <w:rPr>
+          <w:lang w:val="en-DE"/>
+        </w:rPr>
+        <w:t>.</w:t>
+      </w:r>
+    </w:p>
+    <w:p>
+      <w:pPr>
+        <w:spacing w:after="120"/>
+        <w:rPr>
+          <w:lang w:val="en-DE"/>
+        </w:rPr>
+      </w:pPr>
+      <w:r>
+        <w:rPr>
+          <w:b/>
+          <w:bCs/>
+        </w:rPr>
+        <w:lastRenderedPageBreak/>
         <w:t>The Transparent Order Book (</w:t>
       </w:r>
       <w:proofErr w:type="spellStart"/>
@@ -6195,7 +6264,6 @@
           <w:b/>
           <w:bCs/>
         </w:rPr>
-        <w:lastRenderedPageBreak/>
         <w:t>Strategic Rationale:</w:t>
       </w:r>
       <w:r>
@@ -6612,6 +6680,7 @@
           <w:b/>
           <w:bCs/>
         </w:rPr>
+        <w:lastRenderedPageBreak/>
         <w:t>The Existential Threshold (Dust Filter):</w:t>
       </w:r>
       <w:r>
@@ -6773,7 +6842,6 @@
         <w:pStyle w:val="Heading3"/>
       </w:pPr>
       <w:r>
-        <w:lastRenderedPageBreak/>
         <w:t>Phase III: Settlement and Payout Logic</w:t>
       </w:r>
     </w:p>
@@ -7157,6 +7225,7 @@
         </w:numPr>
       </w:pPr>
       <w:r>
+        <w:lastRenderedPageBreak/>
         <w:t>The overall progress is determined by the greater of the two.</w:t>
       </w:r>
     </w:p>
@@ -7227,7 +7296,6 @@
         </w:numPr>
       </w:pPr>
       <w:r>
-        <w:lastRenderedPageBreak/>
         <w:t>Winning Payout Logic (The Progress Share): This portion of the Prize Pool is paid out entirely according to the rules of the </w:t>
       </w:r>
       <w:proofErr w:type="spellStart"/>
@@ -7601,7 +7669,6 @@
         <w:rPr>
           <w:rFonts w:cstheme="minorHAnsi"/>
           <w:color w:val="000000" w:themeColor="text1"/>
-          <w:lang w:val="en-DE"/>
         </w:rPr>
       </w:pPr>
       <w:r>
@@ -7652,7 +7719,6 @@
         <w:rPr>
           <w:rFonts w:cstheme="minorHAnsi"/>
           <w:color w:val="000000" w:themeColor="text1"/>
-          <w:lang w:val="en-DE"/>
         </w:rPr>
         <w:t>enforces the </w:t>
       </w:r>
@@ -7662,7 +7728,6 @@
           <w:b/>
           <w:bCs/>
           <w:color w:val="000000" w:themeColor="text1"/>
-          <w:lang w:val="en-DE"/>
         </w:rPr>
         <w:t>High-Water Mark (MAX)</w:t>
       </w:r>
@@ -7670,7 +7735,6 @@
         <w:rPr>
           <w:rFonts w:cstheme="minorHAnsi"/>
           <w:color w:val="000000" w:themeColor="text1"/>
-          <w:lang w:val="en-DE"/>
         </w:rPr>
         <w:t> rule using a </w:t>
       </w:r>
@@ -7680,7 +7744,6 @@
           <w:b/>
           <w:bCs/>
           <w:color w:val="000000" w:themeColor="text1"/>
-          <w:lang w:val="en-DE"/>
         </w:rPr>
         <w:t>Static Ratio</w:t>
       </w:r>
@@ -7688,7 +7751,6 @@
         <w:rPr>
           <w:rFonts w:cstheme="minorHAnsi"/>
           <w:color w:val="000000" w:themeColor="text1"/>
-          <w:lang w:val="en-DE"/>
         </w:rPr>
         <w:t> model. The collateral requirement is fixed per season, ensuring deterministic access without reliance on external price feeds. A single RTD</w:t>
       </w:r>
@@ -7696,7 +7758,6 @@
         <w:rPr>
           <w:rFonts w:cstheme="minorHAnsi"/>
           <w:color w:val="000000" w:themeColor="text1"/>
-          <w:lang w:val="en-DE"/>
         </w:rPr>
         <w:t xml:space="preserve"> </w:t>
       </w:r>
@@ -7704,7 +7765,6 @@
         <w:rPr>
           <w:rFonts w:cstheme="minorHAnsi"/>
           <w:color w:val="000000" w:themeColor="text1"/>
-          <w:lang w:val="en-DE"/>
         </w:rPr>
         <w:t>stake can collateralize multiple active seasons simultaneously, provided the user meets the maximum requirement of any single season they are participating in.</w:t>
       </w:r>
@@ -8919,16 +8979,14 @@
         <w:rPr>
           <w:rFonts w:cstheme="minorHAnsi"/>
           <w:color w:val="000000" w:themeColor="text1"/>
-          <w:lang w:val="en-DE"/>
-        </w:rPr>
-      </w:pPr>
-      <w:r>
-        <w:rPr>
-          <w:rFonts w:cstheme="minorHAnsi"/>
-          <w:b/>
-          <w:bCs/>
-          <w:color w:val="000000" w:themeColor="text1"/>
-          <w:lang w:val="en-DE"/>
+        </w:rPr>
+      </w:pPr>
+      <w:r>
+        <w:rPr>
+          <w:rFonts w:cstheme="minorHAnsi"/>
+          <w:b/>
+          <w:bCs/>
+          <w:color w:val="000000" w:themeColor="text1"/>
         </w:rPr>
         <w:lastRenderedPageBreak/>
         <w:t>Function:</w:t>
@@ -8937,7 +8995,6 @@
         <w:rPr>
           <w:rFonts w:cstheme="minorHAnsi"/>
           <w:color w:val="000000" w:themeColor="text1"/>
-          <w:lang w:val="en-DE"/>
         </w:rPr>
         <w:t> The autonomous referee and state machine managing the rigid lifecycle of the season, enforcing the rules of engagement, and acting as the final arbiter of victory.</w:t>
       </w:r>
@@ -8952,16 +9009,14 @@
         <w:rPr>
           <w:rFonts w:cstheme="minorHAnsi"/>
           <w:color w:val="000000" w:themeColor="text1"/>
-          <w:lang w:val="en-DE"/>
-        </w:rPr>
-      </w:pPr>
-      <w:r>
-        <w:rPr>
-          <w:rFonts w:cstheme="minorHAnsi"/>
-          <w:b/>
-          <w:bCs/>
-          <w:color w:val="000000" w:themeColor="text1"/>
-          <w:lang w:val="en-DE"/>
+        </w:rPr>
+      </w:pPr>
+      <w:r>
+        <w:rPr>
+          <w:rFonts w:cstheme="minorHAnsi"/>
+          <w:b/>
+          <w:bCs/>
+          <w:color w:val="000000" w:themeColor="text1"/>
         </w:rPr>
         <w:t>The Phase Engine:</w:t>
       </w:r>
@@ -8969,7 +9024,6 @@
         <w:rPr>
           <w:rFonts w:cstheme="minorHAnsi"/>
           <w:color w:val="000000" w:themeColor="text1"/>
-          <w:lang w:val="en-DE"/>
         </w:rPr>
         <w:t> To ensure deterministic execution, the contract enforces a strict linear state transition: AUCTION →→BOOTSTRAP →→TRADING →→</w:t>
       </w:r>
@@ -8978,7 +9032,6 @@
         <w:rPr>
           <w:rFonts w:cstheme="minorHAnsi"/>
           <w:color w:val="000000" w:themeColor="text1"/>
-          <w:lang w:val="en-DE"/>
         </w:rPr>
         <w:t>SETTLING </w:t>
       </w:r>
@@ -8986,7 +9039,6 @@
         <w:rPr>
           <w:rFonts w:cstheme="minorHAnsi"/>
           <w:color w:val="000000" w:themeColor="text1"/>
-          <w:lang w:val="en-DE"/>
         </w:rPr>
         <w:t xml:space="preserve"> </w:t>
       </w:r>
@@ -8994,7 +9046,6 @@
         <w:rPr>
           <w:rFonts w:cstheme="minorHAnsi"/>
           <w:color w:val="000000" w:themeColor="text1"/>
-          <w:lang w:val="en-DE"/>
         </w:rPr>
         <w:t>→</w:t>
       </w:r>
@@ -9003,7 +9054,6 @@
         <w:rPr>
           <w:rFonts w:cstheme="minorHAnsi"/>
           <w:color w:val="000000" w:themeColor="text1"/>
-          <w:lang w:val="en-DE"/>
         </w:rPr>
         <w:t>→</w:t>
       </w:r>
@@ -9011,7 +9061,6 @@
         <w:rPr>
           <w:rFonts w:cstheme="minorHAnsi"/>
           <w:color w:val="000000" w:themeColor="text1"/>
-          <w:lang w:val="en-DE"/>
         </w:rPr>
         <w:t xml:space="preserve"> </w:t>
       </w:r>
@@ -9019,7 +9068,6 @@
         <w:rPr>
           <w:rFonts w:cstheme="minorHAnsi"/>
           <w:color w:val="000000" w:themeColor="text1"/>
-          <w:lang w:val="en-DE"/>
         </w:rPr>
         <w:t>PAYOUT.</w:t>
       </w:r>
@@ -9034,16 +9082,14 @@
         <w:rPr>
           <w:rFonts w:cstheme="minorHAnsi"/>
           <w:color w:val="000000" w:themeColor="text1"/>
-          <w:lang w:val="en-DE"/>
-        </w:rPr>
-      </w:pPr>
-      <w:r>
-        <w:rPr>
-          <w:rFonts w:cstheme="minorHAnsi"/>
-          <w:b/>
-          <w:bCs/>
-          <w:color w:val="000000" w:themeColor="text1"/>
-          <w:lang w:val="en-DE"/>
+        </w:rPr>
+      </w:pPr>
+      <w:r>
+        <w:rPr>
+          <w:rFonts w:cstheme="minorHAnsi"/>
+          <w:b/>
+          <w:bCs/>
+          <w:color w:val="000000" w:themeColor="text1"/>
         </w:rPr>
         <w:t>The Bootstrap Phase:</w:t>
       </w:r>
@@ -9051,7 +9097,6 @@
         <w:rPr>
           <w:rFonts w:cstheme="minorHAnsi"/>
           <w:color w:val="000000" w:themeColor="text1"/>
-          <w:lang w:val="en-DE"/>
         </w:rPr>
         <w:t> Immediately following the auction, the game enters a BOOTSTRAP state. Trading is paused until the </w:t>
       </w:r>
@@ -9061,7 +9106,6 @@
           <w:b/>
           <w:bCs/>
           <w:color w:val="000000" w:themeColor="text1"/>
-          <w:lang w:val="en-DE"/>
         </w:rPr>
         <w:t>Gini Solver Bot</w:t>
       </w:r>
@@ -9069,7 +9113,6 @@
         <w:rPr>
           <w:rFonts w:cstheme="minorHAnsi"/>
           <w:color w:val="000000" w:themeColor="text1"/>
-          <w:lang w:val="en-DE"/>
         </w:rPr>
         <w:t> submits the initial distribution data to establish the baseline </w:t>
       </w:r>
@@ -9078,7 +9121,6 @@
         <w:rPr>
           <w:rFonts w:cstheme="minorHAnsi"/>
           <w:color w:val="000000" w:themeColor="text1"/>
-          <w:lang w:val="en-DE"/>
         </w:rPr>
         <w:t>Ginitial</w:t>
       </w:r>
@@ -9087,7 +9129,6 @@
         <w:rPr>
           <w:rFonts w:cstheme="minorHAnsi"/>
           <w:color w:val="000000" w:themeColor="text1"/>
-          <w:lang w:val="en-DE"/>
         </w:rPr>
         <w:t>. This ensures the game cannot begin until the starting conditions are cryptographically verified.</w:t>
       </w:r>
@@ -9102,7 +9143,6 @@
         <w:rPr>
           <w:rFonts w:cstheme="minorHAnsi"/>
           <w:color w:val="000000" w:themeColor="text1"/>
-          <w:lang w:val="en-DE"/>
         </w:rPr>
       </w:pPr>
       <w:proofErr w:type="spellStart"/>
@@ -9112,7 +9152,6 @@
           <w:b/>
           <w:bCs/>
           <w:color w:val="000000" w:themeColor="text1"/>
-          <w:lang w:val="en-DE"/>
         </w:rPr>
         <w:t>Trustless</w:t>
       </w:r>
@@ -9123,7 +9162,6 @@
           <w:b/>
           <w:bCs/>
           <w:color w:val="000000" w:themeColor="text1"/>
-          <w:lang w:val="en-DE"/>
         </w:rPr>
         <w:t xml:space="preserve"> Verification (The Arbitrator):</w:t>
       </w:r>
@@ -9131,7 +9169,6 @@
         <w:rPr>
           <w:rFonts w:cstheme="minorHAnsi"/>
           <w:color w:val="000000" w:themeColor="text1"/>
-          <w:lang w:val="en-DE"/>
         </w:rPr>
         <w:t> To minimize gas costs while maintaining credible neutrality, the contract utilizes a </w:t>
       </w:r>
@@ -9141,7 +9178,6 @@
           <w:b/>
           <w:bCs/>
           <w:color w:val="000000" w:themeColor="text1"/>
-          <w:lang w:val="en-DE"/>
         </w:rPr>
         <w:t>Batch/Sort-Verification</w:t>
       </w:r>
@@ -9149,7 +9185,6 @@
         <w:rPr>
           <w:rFonts w:cstheme="minorHAnsi"/>
           <w:color w:val="000000" w:themeColor="text1"/>
-          <w:lang w:val="en-DE"/>
         </w:rPr>
         <w:t> model. It does not calculate the Gini Coefficient on every trade. Instead, any external actor (a Keeper or Bot) can trigger a state update by posting a </w:t>
       </w:r>
@@ -9159,7 +9194,6 @@
           <w:b/>
           <w:bCs/>
           <w:color w:val="000000" w:themeColor="text1"/>
-          <w:lang w:val="en-DE"/>
         </w:rPr>
         <w:t>USDC Bond</w:t>
       </w:r>
@@ -9167,7 +9201,6 @@
         <w:rPr>
           <w:rFonts w:cstheme="minorHAnsi"/>
           <w:color w:val="000000" w:themeColor="text1"/>
-          <w:lang w:val="en-DE"/>
         </w:rPr>
         <w:t> and submitting a sorted batch of player balances.</w:t>
       </w:r>
@@ -9182,16 +9215,14 @@
         <w:rPr>
           <w:rFonts w:cstheme="minorHAnsi"/>
           <w:color w:val="000000" w:themeColor="text1"/>
-          <w:lang w:val="en-DE"/>
-        </w:rPr>
-      </w:pPr>
-      <w:r>
-        <w:rPr>
-          <w:rFonts w:cstheme="minorHAnsi"/>
-          <w:b/>
-          <w:bCs/>
-          <w:color w:val="000000" w:themeColor="text1"/>
-          <w:lang w:val="en-DE"/>
+        </w:rPr>
+      </w:pPr>
+      <w:r>
+        <w:rPr>
+          <w:rFonts w:cstheme="minorHAnsi"/>
+          <w:b/>
+          <w:bCs/>
+          <w:color w:val="000000" w:themeColor="text1"/>
         </w:rPr>
         <w:t>The Validation Logic:</w:t>
       </w:r>
@@ -9199,7 +9230,6 @@
         <w:rPr>
           <w:rFonts w:cstheme="minorHAnsi"/>
           <w:color w:val="000000" w:themeColor="text1"/>
-          <w:lang w:val="en-DE"/>
         </w:rPr>
         <w:t> The contract performs a low-cost verification of the submitted data:</w:t>
       </w:r>
@@ -9214,16 +9244,14 @@
         <w:rPr>
           <w:rFonts w:cstheme="minorHAnsi"/>
           <w:color w:val="000000" w:themeColor="text1"/>
-          <w:lang w:val="en-DE"/>
-        </w:rPr>
-      </w:pPr>
-      <w:r>
-        <w:rPr>
-          <w:rFonts w:cstheme="minorHAnsi"/>
-          <w:b/>
-          <w:bCs/>
-          <w:color w:val="000000" w:themeColor="text1"/>
-          <w:lang w:val="en-DE"/>
+        </w:rPr>
+      </w:pPr>
+      <w:r>
+        <w:rPr>
+          <w:rFonts w:cstheme="minorHAnsi"/>
+          <w:b/>
+          <w:bCs/>
+          <w:color w:val="000000" w:themeColor="text1"/>
         </w:rPr>
         <w:t>Sort Check:</w:t>
       </w:r>
@@ -9231,7 +9259,6 @@
         <w:rPr>
           <w:rFonts w:cstheme="minorHAnsi"/>
           <w:color w:val="000000" w:themeColor="text1"/>
-          <w:lang w:val="en-DE"/>
         </w:rPr>
         <w:t> Verifies that every address in the batch has a balance greater than or equal to the previous address (balance[</w:t>
       </w:r>
@@ -9240,7 +9267,6 @@
         <w:rPr>
           <w:rFonts w:cstheme="minorHAnsi"/>
           <w:color w:val="000000" w:themeColor="text1"/>
-          <w:lang w:val="en-DE"/>
         </w:rPr>
         <w:t>i</w:t>
       </w:r>
@@ -9249,7 +9275,6 @@
         <w:rPr>
           <w:rFonts w:cstheme="minorHAnsi"/>
           <w:color w:val="000000" w:themeColor="text1"/>
-          <w:lang w:val="en-DE"/>
         </w:rPr>
         <w:t>] &gt;= balance[i-1]).</w:t>
       </w:r>
@@ -9264,16 +9289,14 @@
         <w:rPr>
           <w:rFonts w:cstheme="minorHAnsi"/>
           <w:color w:val="000000" w:themeColor="text1"/>
-          <w:lang w:val="en-DE"/>
-        </w:rPr>
-      </w:pPr>
-      <w:r>
-        <w:rPr>
-          <w:rFonts w:cstheme="minorHAnsi"/>
-          <w:b/>
-          <w:bCs/>
-          <w:color w:val="000000" w:themeColor="text1"/>
-          <w:lang w:val="en-DE"/>
+        </w:rPr>
+      </w:pPr>
+      <w:r>
+        <w:rPr>
+          <w:rFonts w:cstheme="minorHAnsi"/>
+          <w:b/>
+          <w:bCs/>
+          <w:color w:val="000000" w:themeColor="text1"/>
         </w:rPr>
         <w:t>Integrity Check:</w:t>
       </w:r>
@@ -9281,7 +9304,6 @@
         <w:rPr>
           <w:rFonts w:cstheme="minorHAnsi"/>
           <w:color w:val="000000" w:themeColor="text1"/>
-          <w:lang w:val="en-DE"/>
         </w:rPr>
         <w:t> Verifies that the sum of the processed balances matches the total known on-chain supply.</w:t>
       </w:r>
@@ -9296,16 +9318,14 @@
         <w:rPr>
           <w:rFonts w:cstheme="minorHAnsi"/>
           <w:color w:val="000000" w:themeColor="text1"/>
-          <w:lang w:val="en-DE"/>
-        </w:rPr>
-      </w:pPr>
-      <w:r>
-        <w:rPr>
-          <w:rFonts w:cstheme="minorHAnsi"/>
-          <w:b/>
-          <w:bCs/>
-          <w:color w:val="000000" w:themeColor="text1"/>
-          <w:lang w:val="en-DE"/>
+        </w:rPr>
+      </w:pPr>
+      <w:r>
+        <w:rPr>
+          <w:rFonts w:cstheme="minorHAnsi"/>
+          <w:b/>
+          <w:bCs/>
+          <w:color w:val="000000" w:themeColor="text1"/>
         </w:rPr>
         <w:t>Dust Filter:</w:t>
       </w:r>
@@ -9313,7 +9333,6 @@
         <w:rPr>
           <w:rFonts w:cstheme="minorHAnsi"/>
           <w:color w:val="000000" w:themeColor="text1"/>
-          <w:lang w:val="en-DE"/>
         </w:rPr>
         <w:t> Automatically excludes any account with a balance below the </w:t>
       </w:r>
@@ -9323,7 +9342,6 @@
           <w:b/>
           <w:bCs/>
           <w:color w:val="000000" w:themeColor="text1"/>
-          <w:lang w:val="en-DE"/>
         </w:rPr>
         <w:t>Existential Threshold</w:t>
       </w:r>
@@ -9331,7 +9349,6 @@
         <w:rPr>
           <w:rFonts w:cstheme="minorHAnsi"/>
           <w:color w:val="000000" w:themeColor="text1"/>
-          <w:lang w:val="en-DE"/>
         </w:rPr>
         <w:t> (e.g., 5 $FIM). These "dust" accounts are mathematically removed from the Gini calculation to prevent population inflation attacks.</w:t>
       </w:r>
@@ -9346,16 +9363,14 @@
         <w:rPr>
           <w:rFonts w:cstheme="minorHAnsi"/>
           <w:color w:val="000000" w:themeColor="text1"/>
-          <w:lang w:val="en-DE"/>
-        </w:rPr>
-      </w:pPr>
-      <w:r>
-        <w:rPr>
-          <w:rFonts w:cstheme="minorHAnsi"/>
-          <w:b/>
-          <w:bCs/>
-          <w:color w:val="000000" w:themeColor="text1"/>
-          <w:lang w:val="en-DE"/>
+        </w:rPr>
+      </w:pPr>
+      <w:r>
+        <w:rPr>
+          <w:rFonts w:cstheme="minorHAnsi"/>
+          <w:b/>
+          <w:bCs/>
+          <w:color w:val="000000" w:themeColor="text1"/>
         </w:rPr>
         <w:t>Incentive Mechanism:</w:t>
       </w:r>
@@ -9363,7 +9378,6 @@
         <w:rPr>
           <w:rFonts w:cstheme="minorHAnsi"/>
           <w:color w:val="000000" w:themeColor="text1"/>
-          <w:lang w:val="en-DE"/>
         </w:rPr>
         <w:t> If the batch is valid and processed successfully, the </w:t>
       </w:r>
@@ -9373,7 +9387,6 @@
           <w:b/>
           <w:bCs/>
           <w:color w:val="000000" w:themeColor="text1"/>
-          <w:lang w:val="en-DE"/>
         </w:rPr>
         <w:t>Bond</w:t>
       </w:r>
@@ -9381,7 +9394,6 @@
         <w:rPr>
           <w:rFonts w:cstheme="minorHAnsi"/>
           <w:color w:val="000000" w:themeColor="text1"/>
-          <w:lang w:val="en-DE"/>
         </w:rPr>
         <w:t xml:space="preserve"> is returned to the submitter. If the batch is invalid or fraudulent, the Bond is slashed, creating a robust </w:t>
       </w:r>
@@ -9390,7 +9402,6 @@
         <w:rPr>
           <w:rFonts w:cstheme="minorHAnsi"/>
           <w:color w:val="000000" w:themeColor="text1"/>
-          <w:lang w:val="en-DE"/>
         </w:rPr>
         <w:t>cryptoeconomic</w:t>
       </w:r>
@@ -9399,7 +9410,6 @@
         <w:rPr>
           <w:rFonts w:cstheme="minorHAnsi"/>
           <w:color w:val="000000" w:themeColor="text1"/>
-          <w:lang w:val="en-DE"/>
         </w:rPr>
         <w:t xml:space="preserve"> </w:t>
       </w:r>
@@ -9408,7 +9418,6 @@
         <w:rPr>
           <w:rFonts w:cstheme="minorHAnsi"/>
           <w:color w:val="000000" w:themeColor="text1"/>
-          <w:lang w:val="en-DE"/>
         </w:rPr>
         <w:t>defense</w:t>
       </w:r>
@@ -9417,7 +9426,6 @@
         <w:rPr>
           <w:rFonts w:cstheme="minorHAnsi"/>
           <w:color w:val="000000" w:themeColor="text1"/>
-          <w:lang w:val="en-DE"/>
         </w:rPr>
         <w:t xml:space="preserve"> against spam.</w:t>
       </w:r>
@@ -9432,16 +9440,14 @@
         <w:rPr>
           <w:rFonts w:cstheme="minorHAnsi"/>
           <w:color w:val="000000" w:themeColor="text1"/>
-          <w:lang w:val="en-DE"/>
-        </w:rPr>
-      </w:pPr>
-      <w:r>
-        <w:rPr>
-          <w:rFonts w:cstheme="minorHAnsi"/>
-          <w:b/>
-          <w:bCs/>
-          <w:color w:val="000000" w:themeColor="text1"/>
-          <w:lang w:val="en-DE"/>
+        </w:rPr>
+      </w:pPr>
+      <w:r>
+        <w:rPr>
+          <w:rFonts w:cstheme="minorHAnsi"/>
+          <w:b/>
+          <w:bCs/>
+          <w:color w:val="000000" w:themeColor="text1"/>
         </w:rPr>
         <w:t>The Multiplier Logic:</w:t>
       </w:r>
@@ -9449,7 +9455,6 @@
         <w:rPr>
           <w:rFonts w:cstheme="minorHAnsi"/>
           <w:color w:val="000000" w:themeColor="text1"/>
-          <w:lang w:val="en-DE"/>
         </w:rPr>
         <w:t> It calculates the win condition dynamically. For the Socialist faction, it applies the compensation formula M=β+(1−Ginitial)2</w:t>
       </w:r>
@@ -9457,7 +9462,6 @@
         <w:rPr>
           <w:rFonts w:cstheme="minorHAnsi"/>
           <w:color w:val="000000" w:themeColor="text1"/>
-          <w:lang w:val="en-DE"/>
         </w:rPr>
         <w:t xml:space="preserve"> </w:t>
       </w:r>
@@ -9465,7 +9469,6 @@
         <w:rPr>
           <w:rFonts w:cstheme="minorHAnsi"/>
           <w:color w:val="000000" w:themeColor="text1"/>
-          <w:lang w:val="en-DE"/>
         </w:rPr>
         <w:t>to the progress metric.</w:t>
       </w:r>
@@ -9480,16 +9483,14 @@
         <w:rPr>
           <w:rFonts w:cstheme="minorHAnsi"/>
           <w:color w:val="000000" w:themeColor="text1"/>
-          <w:lang w:val="en-DE"/>
-        </w:rPr>
-      </w:pPr>
-      <w:r>
-        <w:rPr>
-          <w:rFonts w:cstheme="minorHAnsi"/>
-          <w:b/>
-          <w:bCs/>
-          <w:color w:val="000000" w:themeColor="text1"/>
-          <w:lang w:val="en-DE"/>
+        </w:rPr>
+      </w:pPr>
+      <w:r>
+        <w:rPr>
+          <w:rFonts w:cstheme="minorHAnsi"/>
+          <w:b/>
+          <w:bCs/>
+          <w:color w:val="000000" w:themeColor="text1"/>
         </w:rPr>
         <w:t>Settlement Engine:</w:t>
       </w:r>
@@ -9497,7 +9498,6 @@
         <w:rPr>
           <w:rFonts w:cstheme="minorHAnsi"/>
           <w:color w:val="000000" w:themeColor="text1"/>
-          <w:lang w:val="en-DE"/>
         </w:rPr>
         <w:t> Upon the successful verification of a victory condition or time expiry during the SETTLING phase, the contract executes the </w:t>
       </w:r>
@@ -9507,7 +9507,6 @@
           <w:b/>
           <w:bCs/>
           <w:color w:val="000000" w:themeColor="text1"/>
-          <w:lang w:val="en-DE"/>
         </w:rPr>
         <w:t>"Finalization Cascade"</w:t>
       </w:r>
@@ -9515,7 +9514,6 @@
         <w:rPr>
           <w:rFonts w:cstheme="minorHAnsi"/>
           <w:color w:val="000000" w:themeColor="text1"/>
-          <w:lang w:val="en-DE"/>
         </w:rPr>
         <w:t>:</w:t>
       </w:r>
@@ -9530,16 +9528,14 @@
         <w:rPr>
           <w:rFonts w:cstheme="minorHAnsi"/>
           <w:color w:val="000000" w:themeColor="text1"/>
-          <w:lang w:val="en-DE"/>
-        </w:rPr>
-      </w:pPr>
-      <w:r>
-        <w:rPr>
-          <w:rFonts w:cstheme="minorHAnsi"/>
-          <w:b/>
-          <w:bCs/>
-          <w:color w:val="000000" w:themeColor="text1"/>
-          <w:lang w:val="en-DE"/>
+        </w:rPr>
+      </w:pPr>
+      <w:r>
+        <w:rPr>
+          <w:rFonts w:cstheme="minorHAnsi"/>
+          <w:b/>
+          <w:bCs/>
+          <w:color w:val="000000" w:themeColor="text1"/>
         </w:rPr>
         <w:t>Oligarchy Calculation (Capitalist Win):</w:t>
       </w:r>
@@ -9547,7 +9543,6 @@
         <w:rPr>
           <w:rFonts w:cstheme="minorHAnsi"/>
           <w:color w:val="000000" w:themeColor="text1"/>
-          <w:lang w:val="en-DE"/>
         </w:rPr>
         <w:t> Identifies the top N</w:t>
       </w:r>
@@ -9555,7 +9550,6 @@
         <w:rPr>
           <w:rFonts w:cstheme="minorHAnsi"/>
           <w:color w:val="000000" w:themeColor="text1"/>
-          <w:lang w:val="en-DE"/>
         </w:rPr>
         <w:t xml:space="preserve"> </w:t>
       </w:r>
@@ -9563,7 +9557,6 @@
         <w:rPr>
           <w:rFonts w:cstheme="minorHAnsi"/>
           <w:color w:val="000000" w:themeColor="text1"/>
-          <w:lang w:val="en-DE"/>
         </w:rPr>
         <w:t>holders holding &gt;50%</w:t>
       </w:r>
@@ -9571,7 +9564,6 @@
         <w:rPr>
           <w:rFonts w:cstheme="minorHAnsi"/>
           <w:color w:val="000000" w:themeColor="text1"/>
-          <w:lang w:val="en-DE"/>
         </w:rPr>
         <w:t xml:space="preserve"> </w:t>
       </w:r>
@@ -9579,7 +9571,6 @@
         <w:rPr>
           <w:rFonts w:cstheme="minorHAnsi"/>
           <w:color w:val="000000" w:themeColor="text1"/>
-          <w:lang w:val="en-DE"/>
         </w:rPr>
         <w:t>of supply and calculates their proportional payout.</w:t>
       </w:r>
@@ -9594,16 +9585,14 @@
         <w:rPr>
           <w:rFonts w:cstheme="minorHAnsi"/>
           <w:color w:val="000000" w:themeColor="text1"/>
-          <w:lang w:val="en-DE"/>
-        </w:rPr>
-      </w:pPr>
-      <w:r>
-        <w:rPr>
-          <w:rFonts w:cstheme="minorHAnsi"/>
-          <w:b/>
-          <w:bCs/>
-          <w:color w:val="000000" w:themeColor="text1"/>
-          <w:lang w:val="en-DE"/>
+        </w:rPr>
+      </w:pPr>
+      <w:r>
+        <w:rPr>
+          <w:rFonts w:cstheme="minorHAnsi"/>
+          <w:b/>
+          <w:bCs/>
+          <w:color w:val="000000" w:themeColor="text1"/>
         </w:rPr>
         <w:t>Solidarity Calculation (Socialist Win):</w:t>
       </w:r>
@@ -9618,14 +9607,12 @@
         <w:rPr>
           <w:rFonts w:cstheme="minorHAnsi"/>
           <w:color w:val="000000" w:themeColor="text1"/>
-          <w:lang w:val="en-DE"/>
-        </w:rPr>
-      </w:pPr>
-      <w:r>
-        <w:rPr>
-          <w:rFonts w:cstheme="minorHAnsi"/>
-          <w:color w:val="000000" w:themeColor="text1"/>
-          <w:lang w:val="en-DE"/>
+        </w:rPr>
+      </w:pPr>
+      <w:r>
+        <w:rPr>
+          <w:rFonts w:cstheme="minorHAnsi"/>
+          <w:color w:val="000000" w:themeColor="text1"/>
         </w:rPr>
         <w:t>Calculates the </w:t>
       </w:r>
@@ -9634,7 +9621,6 @@
         <w:rPr>
           <w:rFonts w:cstheme="minorHAnsi"/>
           <w:color w:val="000000" w:themeColor="text1"/>
-          <w:lang w:val="en-DE"/>
         </w:rPr>
         <w:t>Cap_Value</w:t>
       </w:r>
@@ -9643,7 +9629,6 @@
         <w:rPr>
           <w:rFonts w:cstheme="minorHAnsi"/>
           <w:color w:val="000000" w:themeColor="text1"/>
-          <w:lang w:val="en-DE"/>
         </w:rPr>
         <w:t> based on the median holdings.</w:t>
       </w:r>
@@ -9658,14 +9643,12 @@
         <w:rPr>
           <w:rFonts w:cstheme="minorHAnsi"/>
           <w:color w:val="000000" w:themeColor="text1"/>
-          <w:lang w:val="en-DE"/>
-        </w:rPr>
-      </w:pPr>
-      <w:r>
-        <w:rPr>
-          <w:rFonts w:cstheme="minorHAnsi"/>
-          <w:color w:val="000000" w:themeColor="text1"/>
-          <w:lang w:val="en-DE"/>
+        </w:rPr>
+      </w:pPr>
+      <w:r>
+        <w:rPr>
+          <w:rFonts w:cstheme="minorHAnsi"/>
+          <w:color w:val="000000" w:themeColor="text1"/>
         </w:rPr>
         <w:t>Skims excess value from the "Elite" (Top 50%) to the Solidarity Fund.</w:t>
       </w:r>
@@ -9680,14 +9663,12 @@
         <w:rPr>
           <w:rFonts w:cstheme="minorHAnsi"/>
           <w:color w:val="000000" w:themeColor="text1"/>
-          <w:lang w:val="en-DE"/>
-        </w:rPr>
-      </w:pPr>
-      <w:r>
-        <w:rPr>
-          <w:rFonts w:cstheme="minorHAnsi"/>
-          <w:color w:val="000000" w:themeColor="text1"/>
-          <w:lang w:val="en-DE"/>
+        </w:rPr>
+      </w:pPr>
+      <w:r>
+        <w:rPr>
+          <w:rFonts w:cstheme="minorHAnsi"/>
+          <w:color w:val="000000" w:themeColor="text1"/>
         </w:rPr>
         <w:t>Calculates the </w:t>
       </w:r>
@@ -9696,7 +9677,6 @@
         <w:rPr>
           <w:rFonts w:cstheme="minorHAnsi"/>
           <w:color w:val="000000" w:themeColor="text1"/>
-          <w:lang w:val="en-DE"/>
         </w:rPr>
         <w:t>Net_Contribution</w:t>
       </w:r>
@@ -9705,7 +9685,6 @@
         <w:rPr>
           <w:rFonts w:cstheme="minorHAnsi"/>
           <w:color w:val="000000" w:themeColor="text1"/>
-          <w:lang w:val="en-DE"/>
         </w:rPr>
         <w:t> (</w:t>
       </w:r>
@@ -9714,7 +9693,6 @@
         <w:rPr>
           <w:rFonts w:cstheme="minorHAnsi"/>
           <w:color w:val="000000" w:themeColor="text1"/>
-          <w:lang w:val="en-DE"/>
         </w:rPr>
         <w:t>Money_In</w:t>
       </w:r>
@@ -9723,7 +9701,6 @@
         <w:rPr>
           <w:rFonts w:cstheme="minorHAnsi"/>
           <w:color w:val="000000" w:themeColor="text1"/>
-          <w:lang w:val="en-DE"/>
         </w:rPr>
         <w:t> - </w:t>
       </w:r>
@@ -9732,7 +9709,6 @@
         <w:rPr>
           <w:rFonts w:cstheme="minorHAnsi"/>
           <w:color w:val="000000" w:themeColor="text1"/>
-          <w:lang w:val="en-DE"/>
         </w:rPr>
         <w:t>Money_Out</w:t>
       </w:r>
@@ -9741,7 +9717,6 @@
         <w:rPr>
           <w:rFonts w:cstheme="minorHAnsi"/>
           <w:color w:val="000000" w:themeColor="text1"/>
-          <w:lang w:val="en-DE"/>
         </w:rPr>
         <w:t>) for all players.</w:t>
       </w:r>
@@ -9756,14 +9731,12 @@
         <w:rPr>
           <w:rFonts w:cstheme="minorHAnsi"/>
           <w:color w:val="000000" w:themeColor="text1"/>
-          <w:lang w:val="en-DE"/>
-        </w:rPr>
-      </w:pPr>
-      <w:r>
-        <w:rPr>
-          <w:rFonts w:cstheme="minorHAnsi"/>
-          <w:color w:val="000000" w:themeColor="text1"/>
-          <w:lang w:val="en-DE"/>
+        </w:rPr>
+      </w:pPr>
+      <w:r>
+        <w:rPr>
+          <w:rFonts w:cstheme="minorHAnsi"/>
+          <w:color w:val="000000" w:themeColor="text1"/>
         </w:rPr>
         <w:t>Distributes the fund proportionally to </w:t>
       </w:r>
@@ -9772,7 +9745,6 @@
         <w:rPr>
           <w:rFonts w:cstheme="minorHAnsi"/>
           <w:color w:val="000000" w:themeColor="text1"/>
-          <w:lang w:val="en-DE"/>
         </w:rPr>
         <w:t>Net_Contribution</w:t>
       </w:r>
@@ -9781,7 +9753,6 @@
         <w:rPr>
           <w:rFonts w:cstheme="minorHAnsi"/>
           <w:color w:val="000000" w:themeColor="text1"/>
-          <w:lang w:val="en-DE"/>
         </w:rPr>
         <w:t>.</w:t>
       </w:r>
@@ -9799,16 +9770,14 @@
         <w:rPr>
           <w:rFonts w:cstheme="minorHAnsi"/>
           <w:color w:val="000000" w:themeColor="text1"/>
-          <w:lang w:val="en-DE"/>
-        </w:rPr>
-      </w:pPr>
-      <w:r>
-        <w:rPr>
-          <w:rFonts w:cstheme="minorHAnsi"/>
-          <w:b/>
-          <w:bCs/>
-          <w:color w:val="000000" w:themeColor="text1"/>
-          <w:lang w:val="en-DE"/>
+        </w:rPr>
+      </w:pPr>
+      <w:r>
+        <w:rPr>
+          <w:rFonts w:cstheme="minorHAnsi"/>
+          <w:b/>
+          <w:bCs/>
+          <w:color w:val="000000" w:themeColor="text1"/>
         </w:rPr>
         <w:t>Instruction:</w:t>
       </w:r>
@@ -9816,7 +9785,6 @@
         <w:rPr>
           <w:rFonts w:cstheme="minorHAnsi"/>
           <w:color w:val="000000" w:themeColor="text1"/>
-          <w:lang w:val="en-DE"/>
         </w:rPr>
         <w:t> Sends the final array of {</w:t>
       </w:r>
@@ -9825,7 +9793,6 @@
         <w:rPr>
           <w:rFonts w:cstheme="minorHAnsi"/>
           <w:color w:val="000000" w:themeColor="text1"/>
-          <w:lang w:val="en-DE"/>
         </w:rPr>
         <w:t>WinnerAddress</w:t>
       </w:r>
@@ -9834,7 +9801,6 @@
         <w:rPr>
           <w:rFonts w:cstheme="minorHAnsi"/>
           <w:color w:val="000000" w:themeColor="text1"/>
-          <w:lang w:val="en-DE"/>
         </w:rPr>
         <w:t>, Amount} to the Treasury for execution.</w:t>
       </w:r>
@@ -10735,16 +10701,14 @@
         <w:rPr>
           <w:rFonts w:cstheme="minorHAnsi"/>
           <w:color w:val="000000" w:themeColor="text1"/>
-          <w:lang w:val="en-DE"/>
-        </w:rPr>
-      </w:pPr>
-      <w:r>
-        <w:rPr>
-          <w:rFonts w:cstheme="minorHAnsi"/>
-          <w:b/>
-          <w:bCs/>
-          <w:color w:val="000000" w:themeColor="text1"/>
-          <w:lang w:val="en-DE"/>
+        </w:rPr>
+      </w:pPr>
+      <w:r>
+        <w:rPr>
+          <w:rFonts w:cstheme="minorHAnsi"/>
+          <w:b/>
+          <w:bCs/>
+          <w:color w:val="000000" w:themeColor="text1"/>
         </w:rPr>
         <w:t>The Operational Lifecycle</w:t>
       </w:r>
@@ -10759,16 +10723,14 @@
         <w:rPr>
           <w:rFonts w:cstheme="minorHAnsi"/>
           <w:color w:val="000000" w:themeColor="text1"/>
-          <w:lang w:val="en-DE"/>
-        </w:rPr>
-      </w:pPr>
-      <w:r>
-        <w:rPr>
-          <w:rFonts w:cstheme="minorHAnsi"/>
-          <w:b/>
-          <w:bCs/>
-          <w:color w:val="000000" w:themeColor="text1"/>
-          <w:lang w:val="en-DE"/>
+        </w:rPr>
+      </w:pPr>
+      <w:r>
+        <w:rPr>
+          <w:rFonts w:cstheme="minorHAnsi"/>
+          <w:b/>
+          <w:bCs/>
+          <w:color w:val="000000" w:themeColor="text1"/>
         </w:rPr>
         <w:t>Auction:</w:t>
       </w:r>
@@ -10776,7 +10738,6 @@
         <w:rPr>
           <w:rFonts w:cstheme="minorHAnsi"/>
           <w:color w:val="000000" w:themeColor="text1"/>
-          <w:lang w:val="en-DE"/>
         </w:rPr>
         <w:t> Users mint FIM</w:t>
       </w:r>
@@ -10784,7 +10745,6 @@
         <w:rPr>
           <w:rFonts w:cstheme="minorHAnsi"/>
           <w:color w:val="000000" w:themeColor="text1"/>
-          <w:lang w:val="en-DE"/>
         </w:rPr>
         <w:t xml:space="preserve"> </w:t>
       </w:r>
@@ -10792,7 +10752,6 @@
         <w:rPr>
           <w:rFonts w:cstheme="minorHAnsi"/>
           <w:color w:val="000000" w:themeColor="text1"/>
-          <w:lang w:val="en-DE"/>
         </w:rPr>
         <w:t>via the Auction contract.</w:t>
       </w:r>
@@ -10807,16 +10766,14 @@
         <w:rPr>
           <w:rFonts w:cstheme="minorHAnsi"/>
           <w:color w:val="000000" w:themeColor="text1"/>
-          <w:lang w:val="en-DE"/>
-        </w:rPr>
-      </w:pPr>
-      <w:r>
-        <w:rPr>
-          <w:rFonts w:cstheme="minorHAnsi"/>
-          <w:b/>
-          <w:bCs/>
-          <w:color w:val="000000" w:themeColor="text1"/>
-          <w:lang w:val="en-DE"/>
+        </w:rPr>
+      </w:pPr>
+      <w:r>
+        <w:rPr>
+          <w:rFonts w:cstheme="minorHAnsi"/>
+          <w:b/>
+          <w:bCs/>
+          <w:color w:val="000000" w:themeColor="text1"/>
         </w:rPr>
         <w:t>Bootstrap:</w:t>
       </w:r>
@@ -10824,7 +10781,6 @@
         <w:rPr>
           <w:rFonts w:cstheme="minorHAnsi"/>
           <w:color w:val="000000" w:themeColor="text1"/>
-          <w:lang w:val="en-DE"/>
         </w:rPr>
         <w:t> The Game enters a waiting state. The Bot calculates and submits </w:t>
       </w:r>
@@ -10834,7 +10790,6 @@
         <w:rPr>
           <w:rFonts w:cstheme="minorHAnsi"/>
           <w:color w:val="000000" w:themeColor="text1"/>
-          <w:lang w:val="en-DE"/>
         </w:rPr>
         <w:t>Ginitial</w:t>
       </w:r>
@@ -10843,7 +10798,6 @@
         <w:rPr>
           <w:rFonts w:cstheme="minorHAnsi"/>
           <w:color w:val="000000" w:themeColor="text1"/>
-          <w:lang w:val="en-DE"/>
         </w:rPr>
         <w:t xml:space="preserve"> </w:t>
       </w:r>
@@ -10851,7 +10805,6 @@
         <w:rPr>
           <w:rFonts w:cstheme="minorHAnsi"/>
           <w:color w:val="000000" w:themeColor="text1"/>
-          <w:lang w:val="en-DE"/>
         </w:rPr>
         <w:t>.</w:t>
       </w:r>
@@ -10860,7 +10813,6 @@
         <w:rPr>
           <w:rFonts w:cstheme="minorHAnsi"/>
           <w:color w:val="000000" w:themeColor="text1"/>
-          <w:lang w:val="en-DE"/>
         </w:rPr>
         <w:t xml:space="preserve"> Trading opens only after this verification is complete.</w:t>
       </w:r>
@@ -10875,16 +10827,14 @@
         <w:rPr>
           <w:rFonts w:cstheme="minorHAnsi"/>
           <w:color w:val="000000" w:themeColor="text1"/>
-          <w:lang w:val="en-DE"/>
-        </w:rPr>
-      </w:pPr>
-      <w:r>
-        <w:rPr>
-          <w:rFonts w:cstheme="minorHAnsi"/>
-          <w:b/>
-          <w:bCs/>
-          <w:color w:val="000000" w:themeColor="text1"/>
-          <w:lang w:val="en-DE"/>
+        </w:rPr>
+      </w:pPr>
+      <w:r>
+        <w:rPr>
+          <w:rFonts w:cstheme="minorHAnsi"/>
+          <w:b/>
+          <w:bCs/>
+          <w:color w:val="000000" w:themeColor="text1"/>
         </w:rPr>
         <w:t>Trading:</w:t>
       </w:r>
@@ -10892,7 +10842,6 @@
         <w:rPr>
           <w:rFonts w:cstheme="minorHAnsi"/>
           <w:color w:val="000000" w:themeColor="text1"/>
-          <w:lang w:val="en-DE"/>
         </w:rPr>
         <w:t> The active market phase where </w:t>
       </w:r>
@@ -10901,7 +10850,6 @@
         <w:rPr>
           <w:rFonts w:cstheme="minorHAnsi"/>
           <w:color w:val="000000" w:themeColor="text1"/>
-          <w:lang w:val="en-DE"/>
         </w:rPr>
         <w:t>FIMis</w:t>
       </w:r>
@@ -10910,7 +10858,6 @@
         <w:rPr>
           <w:rFonts w:cstheme="minorHAnsi"/>
           <w:color w:val="000000" w:themeColor="text1"/>
-          <w:lang w:val="en-DE"/>
         </w:rPr>
         <w:t xml:space="preserve"> exchanged.</w:t>
       </w:r>
@@ -10925,16 +10872,14 @@
         <w:rPr>
           <w:rFonts w:cstheme="minorHAnsi"/>
           <w:color w:val="000000" w:themeColor="text1"/>
-          <w:lang w:val="en-DE"/>
-        </w:rPr>
-      </w:pPr>
-      <w:r>
-        <w:rPr>
-          <w:rFonts w:cstheme="minorHAnsi"/>
-          <w:b/>
-          <w:bCs/>
-          <w:color w:val="000000" w:themeColor="text1"/>
-          <w:lang w:val="en-DE"/>
+        </w:rPr>
+      </w:pPr>
+      <w:r>
+        <w:rPr>
+          <w:rFonts w:cstheme="minorHAnsi"/>
+          <w:b/>
+          <w:bCs/>
+          <w:color w:val="000000" w:themeColor="text1"/>
         </w:rPr>
         <w:t>Settling:</w:t>
       </w:r>
@@ -10942,7 +10887,6 @@
         <w:rPr>
           <w:rFonts w:cstheme="minorHAnsi"/>
           <w:color w:val="000000" w:themeColor="text1"/>
-          <w:lang w:val="en-DE"/>
         </w:rPr>
         <w:t> Upon a victory trigger or time expiry, the Bot submits the final sorted state to verify the outcome.</w:t>
       </w:r>
@@ -10957,16 +10901,14 @@
         <w:rPr>
           <w:rFonts w:cstheme="minorHAnsi"/>
           <w:color w:val="000000" w:themeColor="text1"/>
-          <w:lang w:val="en-DE"/>
-        </w:rPr>
-      </w:pPr>
-      <w:r>
-        <w:rPr>
-          <w:rFonts w:cstheme="minorHAnsi"/>
-          <w:b/>
-          <w:bCs/>
-          <w:color w:val="000000" w:themeColor="text1"/>
-          <w:lang w:val="en-DE"/>
+        </w:rPr>
+      </w:pPr>
+      <w:r>
+        <w:rPr>
+          <w:rFonts w:cstheme="minorHAnsi"/>
+          <w:b/>
+          <w:bCs/>
+          <w:color w:val="000000" w:themeColor="text1"/>
         </w:rPr>
         <w:t>Payout:</w:t>
       </w:r>
@@ -10974,7 +10916,6 @@
         <w:rPr>
           <w:rFonts w:cstheme="minorHAnsi"/>
           <w:color w:val="000000" w:themeColor="text1"/>
-          <w:lang w:val="en-DE"/>
         </w:rPr>
         <w:t> Users claim prizes and unlock their RTD</w:t>
       </w:r>
@@ -10982,7 +10923,6 @@
         <w:rPr>
           <w:rFonts w:cstheme="minorHAnsi"/>
           <w:color w:val="000000" w:themeColor="text1"/>
-          <w:lang w:val="en-DE"/>
         </w:rPr>
         <w:t xml:space="preserve"> </w:t>
       </w:r>
@@ -10990,7 +10930,6 @@
         <w:rPr>
           <w:rFonts w:cstheme="minorHAnsi"/>
           <w:color w:val="000000" w:themeColor="text1"/>
-          <w:lang w:val="en-DE"/>
         </w:rPr>
         <w:t>collateral.</w:t>
       </w:r>
@@ -14828,6 +14767,9 @@
     <w:p>
       <w:pPr>
         <w:spacing w:after="120"/>
+        <w:rPr>
+          <w:lang w:val="en-DE"/>
+        </w:rPr>
       </w:pPr>
       <w:r>
         <w:t>The Gini Coefficient is calculated as:</w:t>
@@ -14886,37 +14828,76 @@
       </w:r>
       <w:r>
         <w:br/>
-        <w:t>This formula is computed on-chain to provide </w:t>
+      </w:r>
+      <w:r>
+        <w:rPr>
+          <w:lang w:val="en-DE"/>
+        </w:rPr>
+        <w:t>This formula is computed off-chain by the Solver Bot and </w:t>
+      </w:r>
+      <w:r>
+        <w:rPr>
+          <w:b/>
+          <w:bCs/>
+          <w:lang w:val="en-DE"/>
+        </w:rPr>
+        <w:t>verified on-chain</w:t>
+      </w:r>
+      <w:r>
+        <w:rPr>
+          <w:lang w:val="en-DE"/>
+        </w:rPr>
+        <w:t> via sorted batch processing to establish </w:t>
       </w:r>
       <w:proofErr w:type="spellStart"/>
       <w:r>
         <w:rPr>
-          <w:i/>
-          <w:iCs/>
-        </w:rPr>
-        <w:t>G_initial</w:t>
+          <w:lang w:val="en-DE"/>
+        </w:rPr>
+        <w:t>Ginitial</w:t>
       </w:r>
       <w:proofErr w:type="spellEnd"/>
       <w:r>
-        <w:t> (at the end of the Auction) and </w:t>
+        <w:rPr>
+          <w:lang w:val="en-DE"/>
+        </w:rPr>
+        <w:t xml:space="preserve"> </w:t>
+      </w:r>
+      <w:r>
+        <w:rPr>
+          <w:lang w:val="en-DE"/>
+        </w:rPr>
+        <w:t>(during the Bootstrap Phase) and </w:t>
       </w:r>
       <w:proofErr w:type="spellStart"/>
-      <w:r>
-        <w:rPr>
-          <w:i/>
-          <w:iCs/>
-        </w:rPr>
-        <w:t>G_current</w:t>
+      <w:proofErr w:type="gramStart"/>
+      <w:r>
+        <w:rPr>
+          <w:lang w:val="en-DE"/>
+        </w:rPr>
+        <w:t>Gcurrent</w:t>
       </w:r>
       <w:proofErr w:type="spellEnd"/>
       <w:r>
-        <w:t> (live during the game).</w:t>
-      </w:r>
-    </w:p>
-    <w:p>
-      <w:pPr>
-        <w:pStyle w:val="Heading3"/>
-        <w:spacing w:after="120"/>
+        <w:rPr>
+          <w:lang w:val="en-DE"/>
+        </w:rPr>
+        <w:t>(</w:t>
+      </w:r>
+      <w:proofErr w:type="gramEnd"/>
+      <w:r>
+        <w:rPr>
+          <w:lang w:val="en-DE"/>
+        </w:rPr>
+        <w:t>during the Settlement Phase).</w:t>
+      </w:r>
+    </w:p>
+    <w:p>
+      <w:pPr>
+        <w:spacing w:after="120"/>
+        <w:rPr>
+          <w:lang w:val="en-DE"/>
+        </w:rPr>
       </w:pPr>
       <w:r>
         <w:t>Victory Conditions:</w:t>
@@ -15174,6 +15155,7 @@
         <w:spacing w:after="120"/>
       </w:pPr>
       <w:r>
+        <w:lastRenderedPageBreak/>
         <w:t>For a player </w:t>
       </w:r>
       <w:proofErr w:type="spellStart"/>
@@ -15257,7 +15239,6 @@
         <w:spacing w:after="120"/>
       </w:pPr>
       <w:r>
-        <w:lastRenderedPageBreak/>
         <w:t>For a player </w:t>
       </w:r>
       <w:proofErr w:type="spellStart"/>
@@ -15748,6 +15729,7 @@
           <w:b/>
           <w:bCs/>
         </w:rPr>
+        <w:lastRenderedPageBreak/>
         <w:t>The Capitalist Discount:</w:t>
       </w:r>
       <w:r>
@@ -15766,7 +15748,6 @@
           <w:b/>
           <w:bCs/>
         </w:rPr>
-        <w:lastRenderedPageBreak/>
         <w:t>Strategic Matching:</w:t>
       </w:r>
       <w:r>
@@ -15864,63 +15845,54 @@
           <w:b/>
           <w:bCs/>
         </w:rPr>
-        <w:t>The Mitigation:</w:t>
-      </w:r>
-      <w:r>
-        <w:t> This is primarily countered by the </w:t>
-      </w:r>
-      <w:r>
-        <w:rPr>
-          <w:b/>
-          <w:bCs/>
-        </w:rPr>
-        <w:t>RTD Collateral Rule</w:t>
-      </w:r>
-      <w:r>
-        <w:t>. The wallet must hold a 10% collateral stake in </w:t>
+        <w:t xml:space="preserve">The Mitigation: </w:t>
+      </w:r>
+      <w:r>
+        <w:t>This is primarily countered by the RTD Collateral Rule. The wallet must hold a collateral stake in RTD</w:t>
+      </w:r>
+      <w:r>
+        <w:t xml:space="preserve"> </w:t>
+      </w:r>
+      <w:r>
+        <w:t xml:space="preserve">determined by the Static Collateral Ratio (e.g., 10 $RTD for every 100 $FIM). This creates a two-fold </w:t>
       </w:r>
       <w:proofErr w:type="spellStart"/>
       <w:r>
-        <w:rPr>
-          <w:i/>
-          <w:iCs/>
-        </w:rPr>
-        <w:t>RTD</w:t>
-      </w:r>
-      <w:r>
-        <w:t>for</w:t>
+        <w:t>defense</w:t>
       </w:r>
       <w:proofErr w:type="spellEnd"/>
       <w:r>
-        <w:t xml:space="preserve"> every dollar of </w:t>
-      </w:r>
-      <w:r>
-        <w:rPr>
-          <w:i/>
-          <w:iCs/>
-        </w:rPr>
-        <w:t>FIM</w:t>
+        <w:t>:</w:t>
+      </w:r>
+    </w:p>
+    <w:p>
+      <w:pPr>
+        <w:numPr>
+          <w:ilvl w:val="2"/>
+          <w:numId w:val="48"/>
+        </w:numPr>
+        <w:spacing w:after="120"/>
+      </w:pPr>
+      <w:r>
+        <w:t>Capital Cost: It makes the funding of thousands of "minion" wallets prohibitively expensive, as the attacker must acquire and lock a proportional amount of the governance token for every active address.</w:t>
+      </w:r>
+    </w:p>
+    <w:p>
+      <w:pPr>
+        <w:numPr>
+          <w:ilvl w:val="2"/>
+          <w:numId w:val="48"/>
+        </w:numPr>
+        <w:spacing w:after="120"/>
+      </w:pPr>
+      <w:r>
+        <w:t>Incentive Alignment: By forcing the attacker to hold a significant position in the governance asset to execute the attack, the protocol aligns their incentives with the ecosystem's health. Any manipulation that undermines the integrity of the game would likely degrade the market value of the very RTD</w:t>
       </w:r>
       <w:r>
         <w:t xml:space="preserve"> </w:t>
       </w:r>
       <w:r>
-        <w:t>they buy. This makes the creation and funding of thousands of "minion" wallets prohibitively expensive, as they would need an equal amount of </w:t>
-      </w:r>
-      <w:proofErr w:type="spellStart"/>
-      <w:r>
-        <w:rPr>
-          <w:i/>
-          <w:iCs/>
-        </w:rPr>
-        <w:t>RTD</w:t>
-      </w:r>
-      <w:r>
-        <w:t>collateral</w:t>
-      </w:r>
-      <w:proofErr w:type="spellEnd"/>
-      <w:r>
-        <w:t>.</w:t>
+        <w:t>collateral they are holding, rendering the attack economically irrational or self-defeating.</w:t>
       </w:r>
     </w:p>
     <w:p>
@@ -16087,6 +16059,7 @@
       </w:pPr>
       <w:bookmarkStart w:id="30" w:name="_Toc216525091"/>
       <w:r>
+        <w:lastRenderedPageBreak/>
         <w:t>Appendix C: Glossary</w:t>
       </w:r>
       <w:bookmarkEnd w:id="30"/>
@@ -16166,7 +16139,6 @@
         <w:spacing w:after="120"/>
       </w:pPr>
       <w:r>
-        <w:lastRenderedPageBreak/>
         <w:t xml:space="preserve">Net Contribution: A core metric calculated as a player's total </w:t>
       </w:r>
       <w:proofErr w:type="spellStart"/>
@@ -17547,7 +17519,7 @@
         <w:sz w:val="20"/>
       </w:rPr>
     </w:lvl>
-    <w:lvl w:ilvl="2" w:tentative="1">
+    <w:lvl w:ilvl="2">
       <w:start w:val="1"/>
       <w:numFmt w:val="bullet"/>
       <w:lvlText w:val=""/>

</xml_diff>